<commit_message>
Update cooperative report chapters 2 and 5; backup previous DOCX
</commit_message>
<xml_diff>
--- a/รายงานสหกิจ.docx
+++ b/รายงานสหกิจ.docx
@@ -7710,2051 +7710,672 @@
     </w:p>
     <w:p>
       <w:pPr>
-        <w:spacing w:after="280"/>
         <w:jc w:val="center"/>
       </w:pPr>
-      <w:proofErr w:type="spellStart"/>
-      <w:r>
-        <w:rPr>
-          <w:rFonts w:cs="Noto Sans Thai"/>
+      <w:r>
+        <w:rPr>
           <w:b/>
-          <w:sz w:val="40"/>
-        </w:rPr>
-        <w:t>หลักการ</w:t>
-      </w:r>
-      <w:proofErr w:type="spellEnd"/>
-      <w:r>
-        <w:rPr>
-          <w:rFonts w:cs="Noto Sans Thai"/>
-          <w:b/>
-          <w:sz w:val="40"/>
-        </w:rPr>
-        <w:t xml:space="preserve"> </w:t>
-      </w:r>
-      <w:proofErr w:type="spellStart"/>
-      <w:r>
-        <w:rPr>
-          <w:rFonts w:cs="Noto Sans Thai"/>
-          <w:b/>
-          <w:sz w:val="40"/>
-        </w:rPr>
-        <w:t>ทฤษฎี</w:t>
-      </w:r>
-      <w:proofErr w:type="spellEnd"/>
-      <w:r>
-        <w:rPr>
-          <w:rFonts w:cs="Noto Sans Thai"/>
-          <w:b/>
-          <w:sz w:val="40"/>
-        </w:rPr>
-        <w:t xml:space="preserve"> </w:t>
-      </w:r>
-      <w:proofErr w:type="spellStart"/>
-      <w:r>
-        <w:rPr>
-          <w:rFonts w:cs="Noto Sans Thai"/>
-          <w:b/>
-          <w:sz w:val="40"/>
-        </w:rPr>
-        <w:t>และงานวิจัยที่เกี่ยวข้อง</w:t>
-      </w:r>
-      <w:proofErr w:type="spellEnd"/>
+        </w:rPr>
+        <w:t>หลักการ ทฤษฎี และงานวิจัยที่เกี่ยวข้อง</w:t>
+      </w:r>
     </w:p>
     <w:p>
       <w:pPr>
         <w:pStyle w:val="Heading1"/>
-        <w:spacing w:before="160" w:after="100"/>
       </w:pPr>
       <w:r>
-        <w:rPr>
-          <w:rFonts w:ascii="Noto Sans Thai" w:eastAsia="Noto Sans Thai" w:hAnsi="Noto Sans Thai" w:cs="Noto Sans Thai"/>
-        </w:rPr>
-        <w:t xml:space="preserve">2.1 </w:t>
-      </w:r>
-      <w:proofErr w:type="spellStart"/>
-      <w:r>
-        <w:rPr>
-          <w:rFonts w:ascii="Noto Sans Thai" w:eastAsia="Noto Sans Thai" w:hAnsi="Noto Sans Thai" w:cs="Noto Sans Thai"/>
-        </w:rPr>
-        <w:t>แบบวิศวกรรมและการปรับมาตรฐาน</w:t>
-      </w:r>
-      <w:proofErr w:type="spellEnd"/>
-      <w:r>
-        <w:rPr>
-          <w:rFonts w:ascii="Noto Sans Thai" w:eastAsia="Noto Sans Thai" w:hAnsi="Noto Sans Thai" w:cs="Noto Sans Thai"/>
-        </w:rPr>
-        <w:t xml:space="preserve"> Drawing</w:t>
+        <w:t>2.1 แบบวิศวกรรมและการปรับมาตรฐาน Drawing</w:t>
+      </w:r>
+    </w:p>
+    <w:p>
+      <w:pPr/>
+      <w:r>
+        <w:t>แบบวิศวกรรมเป็นเอกสารสำคัญที่ใช้สื่อสารข้อมูลด้านรูปทรง ขนาด มาตราส่วน รหัสแบบ รายละเอียดประกอบ และข้อมูลสำหรับการก่อสร้างหรือการผลิตระหว่างผู้เกี่ยวข้องหลายฝ่าย ความถูกต้องของเนื้อหาเพียงอย่างเดียวจึงไม่เพียงพอ หากรูปแบบการนำเสนอ ข้อมูลในกรอบแบบ หรือการตั้งค่าการพิมพ์ไม่สอดคล้องกัน อาจทำให้เกิดความคลาดเคลื่อนในการตีความและเพิ่มภาระในการตรวจสอบก่อนส่งมอบ งานด้านการควบคุมคุณภาพของแบบจึงให้ความสำคัญทั้งกับความถูกต้องของข้อมูลและความสม่ำเสมอของรูปแบบเอกสาร (Parfitt et al., 1993; Murakami et al., 1995).</w:t>
+      </w:r>
+    </w:p>
+    <w:p>
+      <w:pPr/>
+      <w:r>
+        <w:t>แนวคิดการปรับมาตรฐาน Drawing ในโครงงานนี้หมายถึงการทำให้องค์ประกอบที่กำหนดไว้ล่วงหน้ามีรูปแบบตรงตาม Ground Truth ของโครงการ เช่น รูปแบบตัวอักษร ขนาดตัวอักษร Drawing Code มาตราส่วน ขนาดกระดาษ Plot Style และข้อมูลใน Title Block โดย Ground Truth หลักมาจาก Reference Drawing, Template, การตั้งค่า Plot ของโครงการ และข้อกำหนดที่ได้รับการยืนยันจากผู้ปฏิบัติงาน ทั้งนี้มาตรฐานสากลถูกใช้เพื่ออธิบายหลักการทั่วไปของเอกสารทางเทคนิค ส่วนค่าที่เฉพาะเจาะจง เช่น Cordia SHX, Text Height 0.0015 และ SIPHYA_LT_R1.ctb ถือเป็นมาตรฐานของโครงการ ไม่ได้อ้างว่าเป็นค่าที่ ISO กำหนดโดยตรง.</w:t>
+      </w:r>
+    </w:p>
+    <w:p>
+      <w:pPr/>
+      <w:r>
+        <w:t>Murakami et al. (1995) แสดงให้เห็นแนวคิดการแปลงกฎการเขียนแบบเป็นเงื่อนไขที่คอมพิวเตอร์สามารถตรวจสอบได้ ซึ่งสอดคล้องกับแนวทางของ AUTOSHEET ที่แปลง Requirement ของ Drawing เป็นรายการตรวจ R01–R27 แล้วนำไปใช้กับกระบวนการ Standardization และ QA.</w:t>
+      </w:r>
+    </w:p>
+    <w:p>
+      <w:pPr/>
+    </w:p>
+    <w:p>
+      <w:pPr>
+        <w:pStyle w:val="Heading1"/>
+      </w:pPr>
+      <w:r>
+        <w:t>2.2 โครงสร้างการทำงานของ AutoCAD</w:t>
+      </w:r>
+    </w:p>
+    <w:p>
+      <w:pPr/>
+      <w:r>
+        <w:t>AutoCAD แยกพื้นที่ทำงานหลักออกเป็น Model Space และ Paper Space โดย Model Space ใช้สำหรับสร้างและแก้ไขแบบจำลองหรือข้อมูลแบบในพิกัดงานจริง ขณะที่ Paper Space ใช้จัดวางแผ่นงานสำหรับการพิมพ์ผ่าน Layout แต่ละ Layout สามารถกำหนดขนาดกระดาษ กรอบแบบ Title Block และการตั้งค่า Plot ของตนเองได้ รวมทั้งสามารถสร้าง Viewport เพื่อแสดงมุมมองจาก Model Space ในมาตราส่วนที่ต้องการ.</w:t>
+      </w:r>
+    </w:p>
+    <w:p>
+      <w:pPr/>
+      <w:r>
+        <w:t>Viewport จึงเป็นองค์ประกอบสำคัญของ Drawing ที่ต้องรักษาความถูกต้องเมื่อมีการทำ Automation เพราะการเปลี่ยน View, Viewport Scale หรือสถานะ Lock โดยไม่ตั้งใจอาจทำให้ข้อมูลที่พิมพ์ออกมาไม่ตรงกับแบบเดิม ในโครงงานนี้จึงกำหนด Requirement ด้านความปลอดภัยให้ AUTOSHEET รักษา View, Viewport Scale และ Lock เดิมไว้ และย้าย floating viewport หรือวัตถุสนับสนุนที่เกี่ยวข้องไปยังชั้น Defpoints เฉพาะเมื่อเป็นไปตามเงื่อนไขที่กำหนด.</w:t>
+      </w:r>
+    </w:p>
+    <w:p>
+      <w:pPr/>
+      <w:r>
+        <w:t>เอกสารของ Autodesk ระบุว่า Layout และ Page Setup เป็นกลไกหลักสำหรับกำหนด Plotter, Paper Size, Plot Style Table, Plot Area และ Plot Scale ของการพิมพ์ ดังนั้นการประเมิน AUTOSHEET จึงตรวจทั้งข้อมูลในแบบและค่าการพิมพ์ของแต่ละ Paper Space Layout (Autodesk, n.d.-a).</w:t>
+      </w:r>
+    </w:p>
+    <w:p>
+      <w:pPr/>
+    </w:p>
+    <w:p>
+      <w:pPr>
+        <w:pStyle w:val="Heading1"/>
+      </w:pPr>
+      <w:r>
+        <w:t>2.3 Title Block และข้อมูลแบบ</w:t>
+      </w:r>
+    </w:p>
+    <w:p>
+      <w:pPr/>
+      <w:r>
+        <w:t>Title Block หรือกรอบข้อมูลแบบทำหน้าที่รวบรวมข้อมูลที่ใช้ระบุเอกสาร เช่น ชื่อแบบ รหัสแบบ ผู้จัดทำ ผู้ตรวจสอบ สถานะหรือประเภทของแบบ และข้อมูลอื่นที่จำเป็นต่อการบริหารเอกสาร ISO 7200:2004 กำหนดแนวทางเกี่ยวกับ data fields ใน title blocks และ document headers เพื่อสนับสนุนความเข้ากันได้และการแลกเปลี่ยนเอกสารทางเทคนิค (International Organization for Standardization [ISO], 2004).</w:t>
+      </w:r>
+    </w:p>
+    <w:p>
+      <w:pPr/>
+      <w:r>
+        <w:t>สำหรับ AUTOSHEET การจัดการ Title Block ไม่ได้ใช้วิธีลบหรือแทน Block ทุกชนิดโดยอัตโนมัติ เนื่องจากจากการทดสอบจริงพบว่าบาง Block ทำหน้าที่เป็น Full Sheet Frame ที่รวมเส้นกรอบและองค์ประกอบสำคัญของทั้งแผ่น การลบ Block ดังกล่าวจะทำให้ข้อมูลที่ไม่เกี่ยวข้องกับ Title Block สูญหาย จึงพัฒนาแนวทางให้ระบบตรวจ profile ของ Drawing และ preserve กรอบเดิมเมื่อจำเป็น ก่อนแก้เฉพาะข้อมูลเป้าหมาย เช่น Drawing Title, Drawing Code และ Scale.</w:t>
+      </w:r>
+    </w:p>
+    <w:p>
+      <w:pPr/>
+      <w:r>
+        <w:t>แนวทางดังกล่าวสะท้อนหลักการของ safe automation คือการจำกัดขอบเขตการแก้ไขให้อยู่เฉพาะวัตถุหรือ property ที่มี Ground Truth ชัดเจน และใช้การแจ้งเตือนหรือ skip เมื่อพบ Drawing profile ที่ระบบยังไม่รองรับ.</w:t>
+      </w:r>
+    </w:p>
+    <w:p>
+      <w:pPr/>
+    </w:p>
+    <w:p>
+      <w:pPr>
+        <w:pStyle w:val="Heading1"/>
+      </w:pPr>
+      <w:r>
+        <w:t>2.4 มาตราส่วนและขนาดกระดาษ</w:t>
+      </w:r>
+    </w:p>
+    <w:p>
+      <w:pPr/>
+      <w:r>
+        <w:t>มาตราส่วนเป็นอัตราส่วนระหว่างขนาดที่แสดงในแบบกับขนาดจริงของวัตถุ ISO 5455:1979 กำหนดหลักการและการระบุมาตราส่วนสำหรับแบบเทคนิค ส่วน ISO 5457:1999 กำหนดขนาดและการจัดวางของ drawing sheets รวมถึงแบบที่ผลิตด้วยคอมพิวเตอร์ (ISO, 1979, 1999).</w:t>
+      </w:r>
+    </w:p>
+    <w:p>
+      <w:pPr/>
+      <w:r>
+        <w:t>ในโครงงานนี้ Drawing ถูกจัดเตรียมในรูปแบบ A3 Landscape และมีการแสดงมาตราส่วนที่สัมพันธ์กับการใช้งาน A3/A1 ตัวอย่างเช่น 1:100 A3 และ 1:50 A1 การตรวจ AUTOSHEET จึงแยกการตรวจ Scale ออกเป็นด้านเนื้อหาและด้านตำแหน่ง เพราะระบบสามารถกำหนดค่าหรือข้อความมาตราส่วนได้ถูกต้อง แต่ผลการทดลองพบว่าการจัดเรียงตำแหน่ง A3/A1 ยังต้องใช้ Manual Touch-up ในทุก Test Case.</w:t>
+      </w:r>
+    </w:p>
+    <w:p>
+      <w:pPr/>
+      <w:r>
+        <w:t>ประเด็นดังกล่าวมีความสำคัญต่อการอภิปรายผล เนื่องจากกฎที่ตรวจได้จากค่าหรือ property โดยตรงมีความชัดเจนกว่ากฎที่ต้องประเมินความสัมพันธ์เชิงตำแหน่งของหลายวัตถุใน Layout ซึ่งมีความซับซ้อนเชิงบริบทมากกว่า (Solihin &amp; Eastman, 2015).</w:t>
+      </w:r>
+    </w:p>
+    <w:p>
+      <w:pPr/>
+    </w:p>
+    <w:p>
+      <w:pPr>
+        <w:pStyle w:val="Heading1"/>
+      </w:pPr>
+      <w:r>
+        <w:t>2.5 Plot Configuration และ Plot Style</w:t>
+      </w:r>
+    </w:p>
+    <w:p>
+      <w:pPr/>
+      <w:r>
+        <w:t>การจัดเตรียม Drawing ก่อนส่งมอบไม่ได้จบที่การแก้ข้อความหรือกรอบแบบ แต่ต้องกำหนดค่า Plot ให้สอดคล้องกับกระดาษและมาตรฐานของโครงการด้วย โดยค่าที่สำคัญ ได้แก่ Plotter/Printer, Paper Size, Orientation, Plot Area, Plot Scale, Plot Style Table และการเปิดหรือปิดตัวเลือกที่เกี่ยวข้องกับ lineweight และ plot style Autodesk อธิบายการตั้งค่าดังกล่าวผ่าน Page Setup ของแต่ละ Layout ซึ่งช่วยให้การพิมพ์มีความสม่ำเสมอระหว่างหลายแผ่น (Autodesk, n.d.-a).</w:t>
+      </w:r>
+    </w:p>
+    <w:p>
+      <w:pPr/>
+      <w:r>
+        <w:t>Ground Truth ของโครงงานกำหนดให้ใช้ DWG To PDF.pc3, ISO Full Bleed A3, Landscape, Plot Area แบบ Window, Center Plot, Custom Scale 1 mm : 0.001 unit และ Plot Style SIPHYA_LT_R1.ctb รวมถึงเปิด Plot with plot styles, Plot object lineweights และ Plot paperspace last ขณะที่ปิด Scale lineweights. AUTOSHEET จึงต้องตั้งค่าและตรวจสอบ property เหล่านี้ในทุก Paper Space Layout ที่นำมาประเมิน.</w:t>
+      </w:r>
+    </w:p>
+    <w:p>
+      <w:pPr/>
+      <w:r>
+        <w:t>ระหว่างการพัฒนาพบว่าการตรวจหา CTB ด้วยการค้นหาไฟล์เพียงอย่างเดียวอาจไม่สะท้อนค่าที่ AutoCAD Layout ใช้อยู่จริง จึงปรับวิธีตรวจสอบให้ใช้ค่าจาก Layout/AutoCAD โดยตรง แล้ว verify หลังการตั้งค่า เพื่อลด false warning ในขั้นตอน QA.</w:t>
+      </w:r>
+    </w:p>
+    <w:p>
+      <w:pPr/>
+    </w:p>
+    <w:p>
+      <w:pPr>
+        <w:pStyle w:val="Heading1"/>
+      </w:pPr>
+      <w:r>
+        <w:t>2.6 AutoLISP</w:t>
+      </w:r>
+    </w:p>
+    <w:p>
+      <w:pPr/>
+      <w:r>
+        <w:t>AutoLISP เป็นภาษาสำหรับการปรับแต่งและขยายความสามารถของ AutoCAD โดยสามารถเรียกใช้คำสั่งของ AutoCAD รับข้อมูลจากผู้ใช้ และเข้าถึงหรือแก้ไขวัตถุในฐานข้อมูล Drawing ได้ Autodesk ระบุว่า AutoLISP สามารถใช้สร้างคำสั่งเฉพาะสาขาหรือคำสั่งตาม workflow เพื่อ automate design tasks ได้ (Autodesk, n.d.-b, n.d.-c).</w:t>
+      </w:r>
+    </w:p>
+    <w:p>
+      <w:pPr/>
+      <w:r>
+        <w:t>ลักษณะดังกล่าวเหมาะกับงานในโครงงานนี้ เพราะปัญหาหลายส่วนเกิดจากการทำขั้นตอนเดิมซ้ำในหลาย Layout เช่น การแก้ข้อความเป้าหมาย การตั้งค่ากระดาษและ Plot Style การจัดการ Title Block หรือการลบข้อมูลที่ไม่ต้องการ ผู้จัดทำจึงเริ่มจาก LISP เฉพาะงานและค่อย ๆ รวมความสามารถเหล่านั้นเป็น workflow ของ AUTOSHEET.</w:t>
+      </w:r>
+    </w:p>
+    <w:p>
+      <w:pPr/>
+      <w:r>
+        <w:t>แนวทางการพัฒนาใช้การทดลองกับ Drawing จริงเป็นรอบสั้น ๆ คือ Implement → Test → Diagnose → Fix → Re-test โดยเพิ่มคำสั่ง Scan, Diagnostic และ Preview ในรุ่นหลังเพื่อให้สามารถตรวจสอบผลก่อนแก้ Drawing และลดความเสี่ยงจาก destructive edit.</w:t>
+      </w:r>
+    </w:p>
+    <w:p>
+      <w:pPr/>
+    </w:p>
+    <w:p>
+      <w:pPr>
+        <w:pStyle w:val="Heading1"/>
+      </w:pPr>
+      <w:r>
+        <w:t>2.7 CAD Automation และ Drawing QA/QC</w:t>
+      </w:r>
+    </w:p>
+    <w:p>
+      <w:pPr/>
+      <w:r>
+        <w:t>CAD automation มีเป้าหมายลดงานซ้ำและเพิ่มความสม่ำเสมอของกระบวนการ แต่ไม่ได้หมายความว่าทุกขั้นตอนควรถูกทำโดยอัตโนมัติทั้งหมด Sofias et al. (2025) แสดงตัวอย่างการใช้ CAD API เพื่อ automate ขั้นตอนการออกแบบที่ทำซ้ำและประเมินผลใน workflow จริง ขณะที่ Rica et al. (2020) เสนอแนวทางลดภาระการตรวจของวิศวกรโดยให้ระบบอัตโนมัติช่วยชี้จุดที่ต้องพิจารณาและยังคง human validation ไว้.</w:t>
+      </w:r>
+    </w:p>
+    <w:p>
+      <w:pPr/>
+      <w:r>
+        <w:t>ในด้าน rule-based checking งานของ Eastman et al. (2009) แบ่งกระบวนการตรวจตามกฎออกเป็นขั้นตอนของการตีความกฎ การเตรียมข้อมูล การประมวลผลกฎ และการรายงานผล ส่วน Solihin and Eastman (2015) ชี้ว่าความซับซ้อนของกฎมีผลต่อวิธีที่สามารถทำ automation ได้ แนวคิดนี้สอดคล้องกับผลของ AUTOSHEET ที่ Requirement เชิง property เช่น Font, Text Height, Drawing Code, Paper และ Plot Setting สามารถตรวจและแก้ได้สม่ำเสมอกว่า R08 ซึ่งต้องพิจารณาความสัมพันธ์เชิงเรขาคณิตของข้อความ A3/A1.</w:t>
+      </w:r>
+    </w:p>
+    <w:p>
+      <w:pPr/>
+      <w:r>
+        <w:t>Scheibel et al. (2021) แสดงให้เห็นว่า information จาก engineering drawings สามารถถูกสกัดและนำไปใช้สนับสนุน quality control ในกระบวนการผลิตได้ ซึ่งสนับสนุนแนวคิดว่าข้อมูลใน Drawing ไม่จำเป็นต้องถูกตรวจด้วยสายตาเพียงอย่างเดียว แต่สามารถแปลงบางส่วนเป็นข้อมูลหรือเงื่อนไขที่เครื่องตรวจสอบได้.</w:t>
+      </w:r>
+    </w:p>
+    <w:p>
+      <w:pPr/>
+    </w:p>
+    <w:p>
+      <w:pPr>
+        <w:pStyle w:val="Heading1"/>
+      </w:pPr>
+      <w:r>
+        <w:t>2.8 งานวิจัยที่เกี่ยวข้อง</w:t>
+      </w:r>
+    </w:p>
+    <w:p>
+      <w:pPr/>
+      <w:r>
+        <w:t>งานวิจัยที่เกี่ยวข้องสามารถจัดกลุ่มได้เป็นสามแนวทางหลัก ได้แก่ (1) การตรวจแบบตามกฎหรือมาตรฐาน (rule-based drawing checking) (2) การใช้ CAD/API automation เพื่อลดงานซ้ำ และ (3) การออกแบบ human-in-the-loop validation เพื่อให้ระบบอัตโนมัติทำงานร่วมกับผู้ตรวจสอบ.</w:t>
+      </w:r>
+    </w:p>
+    <w:p>
+      <w:pPr/>
+      <w:r>
+        <w:t>Murakami et al. (1995) เป็นงานที่ใกล้กับ AUTOSHEET ในเชิงแนวคิดมากที่สุด เพราะศึกษาการตรวจ CAD drawing โดยอาศัย drafting rules ขณะที่ Parfitt et al. (1993) เสนอ framework สำหรับ automated quality control ของ working drawings ทั้งสองงานสนับสนุนการกำหนด Requirement ที่ตรวจได้ด้วยเครื่องและการสร้างขั้นตอน QA ก่อนส่งมอบ.</w:t>
+      </w:r>
+    </w:p>
+    <w:p>
+      <w:pPr/>
+      <w:r>
+        <w:t>Rica et al. (2020) เน้นการลด human effort ในการ validate engineering drawings โดยยังรักษาความถูกต้องของกระบวนการไว้ ส่วน Sofias et al. (2025) แสดงการประยุกต์ CAD API automation กับงานวิศวกรรมจริงและใช้ case studies ประเมินผลใน workflow แนวคิดทั้งสองสนับสนุนวิธีประเมินของโครงงานนี้ที่เปรียบเทียบ Manual กับ Auto-assisted workflow โดยนับเวลารวมของ Automation และ Manual Touch-up จนถึงสถานะ Ready to Plot แทนการใช้ runtime ของ script เพียงอย่างเดียว.</w:t>
+      </w:r>
+    </w:p>
+    <w:p>
+      <w:pPr/>
+      <w:r>
+        <w:t>Eastman et al. (2009) และ Solihin and Eastman (2015) แม้เน้น BIM rule checking แต่ให้กรอบแนวคิดที่มีประโยชน์ต่อการอธิบายความแตกต่างระหว่างกฎที่ตรวจได้จาก property โดยตรงกับกฎที่ซับซ้อนด้านบริบทและ geometry ส่วน Scheibel et al. (2021) สนับสนุนแนวคิดการใช้ข้อมูลจาก engineering drawings เพื่อ quality control. จากการสังเคราะห์ดังกล่าว AUTOSHEET จึงถูกออกแบบเป็นระบบต้นแบบที่ automate เฉพาะส่วนที่มีกฎชัดเจน และเก็บ Manual Final QA ไว้สำหรับส่วนที่ยังต้องอาศัยการตัดสินใจหรือการจัดตำแหน่ง.</w:t>
+      </w:r>
+    </w:p>
+    <w:p>
+      <w:pPr/>
+    </w:p>
+    <w:p>
+      <w:pPr>
+        <w:pStyle w:val="Heading2"/>
+      </w:pPr>
+      <w:r>
+        <w:t>2.8.1 Literature Matrix เบื้องต้น</w:t>
+      </w:r>
+    </w:p>
+    <w:p>
+      <w:pPr/>
+      <w:r>
+        <w:t>ตาราง 2.1 Literature Matrix เบื้องต้น</w:t>
       </w:r>
     </w:p>
     <w:tbl>
       <w:tblPr>
         <w:tblStyle w:val="TableGrid"/>
-        <w:tblW w:w="0" w:type="auto"/>
-        <w:jc w:val="center"/>
-        <w:tblLook w:val="04A0" w:firstRow="1" w:lastRow="0" w:firstColumn="1" w:lastColumn="0" w:noHBand="0" w:noVBand="1"/>
+        <w:tblW w:type="auto" w:w="0"/>
+        <w:tblLook w:firstColumn="1" w:firstRow="1" w:lastColumn="0" w:lastRow="0" w:noHBand="0" w:noVBand="1" w:val="04A0"/>
       </w:tblPr>
       <w:tblGrid>
-        <w:gridCol w:w="8642"/>
+        <w:gridCol w:w="2163"/>
+        <w:gridCol w:w="2163"/>
+        <w:gridCol w:w="2163"/>
+        <w:gridCol w:w="2163"/>
       </w:tblGrid>
       <w:tr>
-        <w:trPr>
-          <w:cantSplit/>
-          <w:jc w:val="center"/>
-        </w:trPr>
-        <w:tc>
-          <w:tcPr>
-            <w:tcW w:w="8652" w:type="dxa"/>
-            <w:shd w:val="clear" w:color="auto" w:fill="F3F3F3"/>
-            <w:tcMar>
-              <w:top w:w="120" w:type="dxa"/>
-              <w:left w:w="140" w:type="dxa"/>
-              <w:bottom w:w="120" w:type="dxa"/>
-              <w:right w:w="140" w:type="dxa"/>
-            </w:tcMar>
-          </w:tcPr>
-          <w:p>
-            <w:r>
-              <w:rPr>
-                <w:rFonts w:cs="Noto Sans Thai"/>
-                <w:i/>
-                <w:color w:val="666666"/>
-                <w:sz w:val="24"/>
-              </w:rPr>
-              <w:t>[</w:t>
-            </w:r>
-            <w:proofErr w:type="spellStart"/>
-            <w:r>
-              <w:rPr>
-                <w:rFonts w:cs="Noto Sans Thai"/>
-                <w:i/>
-                <w:color w:val="666666"/>
-                <w:sz w:val="24"/>
-              </w:rPr>
-              <w:t>เว้นไว้สำหรับเติมภายหลัง</w:t>
-            </w:r>
-            <w:proofErr w:type="spellEnd"/>
-            <w:r>
-              <w:rPr>
-                <w:rFonts w:cs="Noto Sans Thai"/>
-                <w:i/>
-                <w:color w:val="666666"/>
-                <w:sz w:val="24"/>
-              </w:rPr>
-              <w:t xml:space="preserve">] </w:t>
-            </w:r>
-            <w:proofErr w:type="spellStart"/>
-            <w:r>
-              <w:rPr>
-                <w:rFonts w:cs="Noto Sans Thai"/>
-                <w:i/>
-                <w:color w:val="666666"/>
-                <w:sz w:val="24"/>
-              </w:rPr>
-              <w:t>อธิบายความสำคัญของ</w:t>
-            </w:r>
-            <w:proofErr w:type="spellEnd"/>
-            <w:r>
-              <w:rPr>
-                <w:rFonts w:cs="Noto Sans Thai"/>
-                <w:i/>
-                <w:color w:val="666666"/>
-                <w:sz w:val="24"/>
-              </w:rPr>
-              <w:t xml:space="preserve"> Drawing Standardization, consistency </w:t>
-            </w:r>
-            <w:proofErr w:type="spellStart"/>
-            <w:r>
-              <w:rPr>
-                <w:rFonts w:cs="Noto Sans Thai"/>
-                <w:i/>
-                <w:color w:val="666666"/>
-                <w:sz w:val="24"/>
-              </w:rPr>
-              <w:t>และความสัมพันธ์กับ</w:t>
-            </w:r>
-            <w:proofErr w:type="spellEnd"/>
-            <w:r>
-              <w:rPr>
-                <w:rFonts w:cs="Noto Sans Thai"/>
-                <w:i/>
-                <w:color w:val="666666"/>
-                <w:sz w:val="24"/>
-              </w:rPr>
-              <w:t xml:space="preserve"> QA/QC</w:t>
+        <w:tc>
+          <w:tcPr>
+            <w:tcW w:type="dxa" w:w="2163"/>
+          </w:tcPr>
+          <w:p>
+            <w:r>
+              <w:rPr>
+                <w:b/>
+              </w:rPr>
+              <w:t>งานวิจัย/มาตรฐาน</w:t>
+            </w:r>
+          </w:p>
+        </w:tc>
+        <w:tc>
+          <w:tcPr>
+            <w:tcW w:type="dxa" w:w="2163"/>
+          </w:tcPr>
+          <w:p>
+            <w:r>
+              <w:rPr>
+                <w:b/>
+              </w:rPr>
+              <w:t>ประเด็นที่ใช้</w:t>
+            </w:r>
+          </w:p>
+        </w:tc>
+        <w:tc>
+          <w:tcPr>
+            <w:tcW w:type="dxa" w:w="2163"/>
+          </w:tcPr>
+          <w:p>
+            <w:r>
+              <w:rPr>
+                <w:b/>
+              </w:rPr>
+              <w:t>การเชื่อมโยงกับ AUTOSHEET</w:t>
+            </w:r>
+          </w:p>
+        </w:tc>
+        <w:tc>
+          <w:tcPr>
+            <w:tcW w:type="dxa" w:w="2163"/>
+          </w:tcPr>
+          <w:p>
+            <w:r>
+              <w:rPr>
+                <w:b/>
+              </w:rPr>
+              <w:t>ส่วนของรายงาน</w:t>
+            </w:r>
+          </w:p>
+        </w:tc>
+      </w:tr>
+      <w:tr>
+        <w:tc>
+          <w:tcPr>
+            <w:tcW w:type="dxa" w:w="2163"/>
+          </w:tcPr>
+          <w:p>
+            <w:r>
+              <w:t>Murakami et al. (1995)</w:t>
+            </w:r>
+          </w:p>
+        </w:tc>
+        <w:tc>
+          <w:tcPr>
+            <w:tcW w:type="dxa" w:w="2163"/>
+          </w:tcPr>
+          <w:p>
+            <w:r>
+              <w:t>Rule-based CAD drawing checking</w:t>
+            </w:r>
+          </w:p>
+        </w:tc>
+        <w:tc>
+          <w:tcPr>
+            <w:tcW w:type="dxa" w:w="2163"/>
+          </w:tcPr>
+          <w:p>
+            <w:r>
+              <w:t>Ground Truth → Requirement → machine-checkable rule</w:t>
+            </w:r>
+          </w:p>
+        </w:tc>
+        <w:tc>
+          <w:tcPr>
+            <w:tcW w:type="dxa" w:w="2163"/>
+          </w:tcPr>
+          <w:p>
+            <w:r>
+              <w:t>2.1, 2.8, 5.2</w:t>
+            </w:r>
+          </w:p>
+        </w:tc>
+      </w:tr>
+      <w:tr>
+        <w:tc>
+          <w:tcPr>
+            <w:tcW w:type="dxa" w:w="2163"/>
+          </w:tcPr>
+          <w:p>
+            <w:r>
+              <w:t>Parfitt et al. (1993)</w:t>
+            </w:r>
+          </w:p>
+        </w:tc>
+        <w:tc>
+          <w:tcPr>
+            <w:tcW w:type="dxa" w:w="2163"/>
+          </w:tcPr>
+          <w:p>
+            <w:r>
+              <w:t>Automated QC of working drawings</w:t>
+            </w:r>
+          </w:p>
+        </w:tc>
+        <w:tc>
+          <w:tcPr>
+            <w:tcW w:type="dxa" w:w="2163"/>
+          </w:tcPr>
+          <w:p>
+            <w:r>
+              <w:t>สนับสนุนแนวคิด Drawing QA/QC</w:t>
+            </w:r>
+          </w:p>
+        </w:tc>
+        <w:tc>
+          <w:tcPr>
+            <w:tcW w:type="dxa" w:w="2163"/>
+          </w:tcPr>
+          <w:p>
+            <w:r>
+              <w:t>2.1, 2.8</w:t>
+            </w:r>
+          </w:p>
+        </w:tc>
+      </w:tr>
+      <w:tr>
+        <w:tc>
+          <w:tcPr>
+            <w:tcW w:type="dxa" w:w="2163"/>
+          </w:tcPr>
+          <w:p>
+            <w:r>
+              <w:t>Rica et al. (2020)</w:t>
+            </w:r>
+          </w:p>
+        </w:tc>
+        <w:tc>
+          <w:tcPr>
+            <w:tcW w:type="dxa" w:w="2163"/>
+          </w:tcPr>
+          <w:p>
+            <w:r>
+              <w:t>ลด human effort ใน drawing validation</w:t>
+            </w:r>
+          </w:p>
+        </w:tc>
+        <w:tc>
+          <w:tcPr>
+            <w:tcW w:type="dxa" w:w="2163"/>
+          </w:tcPr>
+          <w:p>
+            <w:r>
+              <w:t>รองรับ Human-in-the-loop และ Final QA</w:t>
+            </w:r>
+          </w:p>
+        </w:tc>
+        <w:tc>
+          <w:tcPr>
+            <w:tcW w:type="dxa" w:w="2163"/>
+          </w:tcPr>
+          <w:p>
+            <w:r>
+              <w:t>2.7, 2.8, 5.2</w:t>
+            </w:r>
+          </w:p>
+        </w:tc>
+      </w:tr>
+      <w:tr>
+        <w:tc>
+          <w:tcPr>
+            <w:tcW w:type="dxa" w:w="2163"/>
+          </w:tcPr>
+          <w:p>
+            <w:r>
+              <w:t>Sofias et al. (2025)</w:t>
+            </w:r>
+          </w:p>
+        </w:tc>
+        <w:tc>
+          <w:tcPr>
+            <w:tcW w:type="dxa" w:w="2163"/>
+          </w:tcPr>
+          <w:p>
+            <w:r>
+              <w:t>CAD API automation ใน workflow วิศวกรรมจริง</w:t>
+            </w:r>
+          </w:p>
+        </w:tc>
+        <w:tc>
+          <w:tcPr>
+            <w:tcW w:type="dxa" w:w="2163"/>
+          </w:tcPr>
+          <w:p>
+            <w:r>
+              <w:t>รองรับ repetitive-task automation และ case-study evaluation</w:t>
+            </w:r>
+          </w:p>
+        </w:tc>
+        <w:tc>
+          <w:tcPr>
+            <w:tcW w:type="dxa" w:w="2163"/>
+          </w:tcPr>
+          <w:p>
+            <w:r>
+              <w:t>2.7, 2.8, 5.2</w:t>
+            </w:r>
+          </w:p>
+        </w:tc>
+      </w:tr>
+      <w:tr>
+        <w:tc>
+          <w:tcPr>
+            <w:tcW w:type="dxa" w:w="2163"/>
+          </w:tcPr>
+          <w:p>
+            <w:r>
+              <w:t>Eastman et al. (2009)</w:t>
+            </w:r>
+          </w:p>
+        </w:tc>
+        <w:tc>
+          <w:tcPr>
+            <w:tcW w:type="dxa" w:w="2163"/>
+          </w:tcPr>
+          <w:p>
+            <w:r>
+              <w:t>Automatic rule-based checking</w:t>
+            </w:r>
+          </w:p>
+        </w:tc>
+        <w:tc>
+          <w:tcPr>
+            <w:tcW w:type="dxa" w:w="2163"/>
+          </w:tcPr>
+          <w:p>
+            <w:r>
+              <w:t>กรอบ Rule interpretation → execution → reporting</w:t>
+            </w:r>
+          </w:p>
+        </w:tc>
+        <w:tc>
+          <w:tcPr>
+            <w:tcW w:type="dxa" w:w="2163"/>
+          </w:tcPr>
+          <w:p>
+            <w:r>
+              <w:t>2.7, 2.8</w:t>
+            </w:r>
+          </w:p>
+        </w:tc>
+      </w:tr>
+      <w:tr>
+        <w:tc>
+          <w:tcPr>
+            <w:tcW w:type="dxa" w:w="2163"/>
+          </w:tcPr>
+          <w:p>
+            <w:r>
+              <w:t>Solihin &amp; Eastman (2015)</w:t>
+            </w:r>
+          </w:p>
+        </w:tc>
+        <w:tc>
+          <w:tcPr>
+            <w:tcW w:type="dxa" w:w="2163"/>
+          </w:tcPr>
+          <w:p>
+            <w:r>
+              <w:t>Rule complexity</w:t>
+            </w:r>
+          </w:p>
+        </w:tc>
+        <w:tc>
+          <w:tcPr>
+            <w:tcW w:type="dxa" w:w="2163"/>
+          </w:tcPr>
+          <w:p>
+            <w:r>
+              <w:t>อธิบาย property-based vs geometry/context-dependent rule</w:t>
+            </w:r>
+          </w:p>
+        </w:tc>
+        <w:tc>
+          <w:tcPr>
+            <w:tcW w:type="dxa" w:w="2163"/>
+          </w:tcPr>
+          <w:p>
+            <w:r>
+              <w:t>2.4, 2.7, 5.2</w:t>
+            </w:r>
+          </w:p>
+        </w:tc>
+      </w:tr>
+      <w:tr>
+        <w:tc>
+          <w:tcPr>
+            <w:tcW w:type="dxa" w:w="2163"/>
+          </w:tcPr>
+          <w:p>
+            <w:r>
+              <w:t>Scheibel et al. (2021)</w:t>
+            </w:r>
+          </w:p>
+        </w:tc>
+        <w:tc>
+          <w:tcPr>
+            <w:tcW w:type="dxa" w:w="2163"/>
+          </w:tcPr>
+          <w:p>
+            <w:r>
+              <w:t>Engineering drawing information for QC</w:t>
+            </w:r>
+          </w:p>
+        </w:tc>
+        <w:tc>
+          <w:tcPr>
+            <w:tcW w:type="dxa" w:w="2163"/>
+          </w:tcPr>
+          <w:p>
+            <w:r>
+              <w:t>รองรับการนำข้อมูล Drawing ไปตรวจเชิงระบบ</w:t>
+            </w:r>
+          </w:p>
+        </w:tc>
+        <w:tc>
+          <w:tcPr>
+            <w:tcW w:type="dxa" w:w="2163"/>
+          </w:tcPr>
+          <w:p>
+            <w:r>
+              <w:t>2.7, 2.8</w:t>
+            </w:r>
+          </w:p>
+        </w:tc>
+      </w:tr>
+      <w:tr>
+        <w:tc>
+          <w:tcPr>
+            <w:tcW w:type="dxa" w:w="2163"/>
+          </w:tcPr>
+          <w:p>
+            <w:r>
+              <w:t>ISO 5455 / 5457 / 7200 / 3098-1</w:t>
+            </w:r>
+          </w:p>
+        </w:tc>
+        <w:tc>
+          <w:tcPr>
+            <w:tcW w:type="dxa" w:w="2163"/>
+          </w:tcPr>
+          <w:p>
+            <w:r>
+              <w:t>Scale, sheet, title-block data, lettering</w:t>
+            </w:r>
+          </w:p>
+        </w:tc>
+        <w:tc>
+          <w:tcPr>
+            <w:tcW w:type="dxa" w:w="2163"/>
+          </w:tcPr>
+          <w:p>
+            <w:r>
+              <w:t>ใช้เป็นหลักการมาตรฐานทั่วไป ไม่ใช้แทน project-specific Ground Truth</w:t>
+            </w:r>
+          </w:p>
+        </w:tc>
+        <w:tc>
+          <w:tcPr>
+            <w:tcW w:type="dxa" w:w="2163"/>
+          </w:tcPr>
+          <w:p>
+            <w:r>
+              <w:t>2.1–2.5</w:t>
             </w:r>
           </w:p>
         </w:tc>
       </w:tr>
     </w:tbl>
     <w:p>
-      <w:pPr>
-        <w:spacing w:after="0"/>
-      </w:pPr>
-    </w:p>
-    <w:p>
-      <w:pPr>
-        <w:pStyle w:val="Heading1"/>
-        <w:spacing w:before="160" w:after="100"/>
-        <w:rPr>
-          <w:cs/>
-          <w:lang w:bidi="th-TH"/>
-        </w:rPr>
-      </w:pPr>
-      <w:r>
-        <w:rPr>
-          <w:rFonts w:ascii="Noto Sans Thai" w:eastAsia="Noto Sans Thai" w:hAnsi="Noto Sans Thai" w:cs="Noto Sans Thai"/>
-        </w:rPr>
-        <w:t xml:space="preserve">2.2 </w:t>
-      </w:r>
-      <w:proofErr w:type="spellStart"/>
-      <w:r>
-        <w:rPr>
-          <w:rFonts w:ascii="Noto Sans Thai" w:eastAsia="Noto Sans Thai" w:hAnsi="Noto Sans Thai" w:cs="Noto Sans Thai"/>
-        </w:rPr>
-        <w:t>โครงสร้างการทำงานของ</w:t>
-      </w:r>
-      <w:proofErr w:type="spellEnd"/>
-      <w:r>
-        <w:rPr>
-          <w:rFonts w:ascii="Noto Sans Thai" w:eastAsia="Noto Sans Thai" w:hAnsi="Noto Sans Thai" w:cs="Noto Sans Thai"/>
-        </w:rPr>
-        <w:t xml:space="preserve"> AutoCAD</w:t>
-      </w:r>
-    </w:p>
-    <w:tbl>
-      <w:tblPr>
-        <w:tblStyle w:val="TableGrid"/>
-        <w:tblW w:w="0" w:type="auto"/>
-        <w:jc w:val="center"/>
-        <w:tblLook w:val="04A0" w:firstRow="1" w:lastRow="0" w:firstColumn="1" w:lastColumn="0" w:noHBand="0" w:noVBand="1"/>
-      </w:tblPr>
-      <w:tblGrid>
-        <w:gridCol w:w="8642"/>
-      </w:tblGrid>
-      <w:tr>
-        <w:trPr>
-          <w:cantSplit/>
-          <w:jc w:val="center"/>
-        </w:trPr>
-        <w:tc>
-          <w:tcPr>
-            <w:tcW w:w="8652" w:type="dxa"/>
-            <w:shd w:val="clear" w:color="auto" w:fill="F3F3F3"/>
-            <w:tcMar>
-              <w:top w:w="120" w:type="dxa"/>
-              <w:left w:w="140" w:type="dxa"/>
-              <w:bottom w:w="120" w:type="dxa"/>
-              <w:right w:w="140" w:type="dxa"/>
-            </w:tcMar>
-          </w:tcPr>
-          <w:p>
-            <w:r>
-              <w:rPr>
-                <w:rFonts w:cs="Noto Sans Thai"/>
-                <w:i/>
-                <w:color w:val="666666"/>
-                <w:sz w:val="24"/>
-              </w:rPr>
-              <w:t>[</w:t>
-            </w:r>
-            <w:proofErr w:type="spellStart"/>
-            <w:r>
-              <w:rPr>
-                <w:rFonts w:cs="Noto Sans Thai"/>
-                <w:i/>
-                <w:color w:val="666666"/>
-                <w:sz w:val="24"/>
-              </w:rPr>
-              <w:t>เว้นไว้สำหรับเติมภายหลัง</w:t>
-            </w:r>
-            <w:proofErr w:type="spellEnd"/>
-            <w:r>
-              <w:rPr>
-                <w:rFonts w:cs="Noto Sans Thai"/>
-                <w:i/>
-                <w:color w:val="666666"/>
-                <w:sz w:val="24"/>
-              </w:rPr>
-              <w:t xml:space="preserve">] </w:t>
-            </w:r>
-            <w:proofErr w:type="spellStart"/>
-            <w:r>
-              <w:rPr>
-                <w:rFonts w:cs="Noto Sans Thai"/>
-                <w:i/>
-                <w:color w:val="666666"/>
-                <w:sz w:val="24"/>
-              </w:rPr>
-              <w:t>อธิบาย</w:t>
-            </w:r>
-            <w:proofErr w:type="spellEnd"/>
-            <w:r>
-              <w:rPr>
-                <w:rFonts w:cs="Noto Sans Thai"/>
-                <w:i/>
-                <w:color w:val="666666"/>
-                <w:sz w:val="24"/>
-              </w:rPr>
-              <w:t xml:space="preserve"> Model Space, Paper Space, Layout </w:t>
-            </w:r>
-            <w:proofErr w:type="spellStart"/>
-            <w:r>
-              <w:rPr>
-                <w:rFonts w:cs="Noto Sans Thai"/>
-                <w:i/>
-                <w:color w:val="666666"/>
-                <w:sz w:val="24"/>
-              </w:rPr>
-              <w:t>และ</w:t>
-            </w:r>
-            <w:proofErr w:type="spellEnd"/>
-            <w:r>
-              <w:rPr>
-                <w:rFonts w:cs="Noto Sans Thai"/>
-                <w:i/>
-                <w:color w:val="666666"/>
-                <w:sz w:val="24"/>
-              </w:rPr>
-              <w:t xml:space="preserve"> Viewport </w:t>
-            </w:r>
-            <w:proofErr w:type="spellStart"/>
-            <w:r>
-              <w:rPr>
-                <w:rFonts w:cs="Noto Sans Thai"/>
-                <w:i/>
-                <w:color w:val="666666"/>
-                <w:sz w:val="24"/>
-              </w:rPr>
-              <w:t>พร้อมรูปประกอบที่เกี่ยวข้อง</w:t>
-            </w:r>
-            <w:proofErr w:type="spellEnd"/>
-          </w:p>
-        </w:tc>
-      </w:tr>
-    </w:tbl>
-    <w:p>
-      <w:pPr>
-        <w:spacing w:after="0"/>
-      </w:pPr>
-    </w:p>
-    <w:p>
-      <w:pPr>
-        <w:pStyle w:val="Heading1"/>
-        <w:spacing w:before="160" w:after="100"/>
-      </w:pPr>
-      <w:r>
-        <w:rPr>
-          <w:rFonts w:ascii="Noto Sans Thai" w:eastAsia="Noto Sans Thai" w:hAnsi="Noto Sans Thai" w:cs="Noto Sans Thai"/>
-        </w:rPr>
-        <w:t xml:space="preserve">2.3 Title Block </w:t>
-      </w:r>
-      <w:proofErr w:type="spellStart"/>
-      <w:r>
-        <w:rPr>
-          <w:rFonts w:ascii="Noto Sans Thai" w:eastAsia="Noto Sans Thai" w:hAnsi="Noto Sans Thai" w:cs="Noto Sans Thai"/>
-        </w:rPr>
-        <w:t>และข้อมูลแบบ</w:t>
-      </w:r>
-      <w:proofErr w:type="spellEnd"/>
-    </w:p>
-    <w:tbl>
-      <w:tblPr>
-        <w:tblStyle w:val="TableGrid"/>
-        <w:tblW w:w="0" w:type="auto"/>
-        <w:jc w:val="center"/>
-        <w:tblLook w:val="04A0" w:firstRow="1" w:lastRow="0" w:firstColumn="1" w:lastColumn="0" w:noHBand="0" w:noVBand="1"/>
-      </w:tblPr>
-      <w:tblGrid>
-        <w:gridCol w:w="8642"/>
-      </w:tblGrid>
-      <w:tr>
-        <w:trPr>
-          <w:cantSplit/>
-          <w:jc w:val="center"/>
-        </w:trPr>
-        <w:tc>
-          <w:tcPr>
-            <w:tcW w:w="8652" w:type="dxa"/>
-            <w:shd w:val="clear" w:color="auto" w:fill="F3F3F3"/>
-            <w:tcMar>
-              <w:top w:w="120" w:type="dxa"/>
-              <w:left w:w="140" w:type="dxa"/>
-              <w:bottom w:w="120" w:type="dxa"/>
-              <w:right w:w="140" w:type="dxa"/>
-            </w:tcMar>
-          </w:tcPr>
-          <w:p>
-            <w:r>
-              <w:rPr>
-                <w:rFonts w:cs="Noto Sans Thai"/>
-                <w:i/>
-                <w:color w:val="666666"/>
-                <w:sz w:val="24"/>
-              </w:rPr>
-              <w:t>[</w:t>
-            </w:r>
-            <w:proofErr w:type="spellStart"/>
-            <w:r>
-              <w:rPr>
-                <w:rFonts w:cs="Noto Sans Thai"/>
-                <w:i/>
-                <w:color w:val="666666"/>
-                <w:sz w:val="24"/>
-              </w:rPr>
-              <w:t>เว้นไว้สำหรับเติมภายหลัง</w:t>
-            </w:r>
-            <w:proofErr w:type="spellEnd"/>
-            <w:r>
-              <w:rPr>
-                <w:rFonts w:cs="Noto Sans Thai"/>
-                <w:i/>
-                <w:color w:val="666666"/>
-                <w:sz w:val="24"/>
-              </w:rPr>
-              <w:t xml:space="preserve">] </w:t>
-            </w:r>
-            <w:proofErr w:type="spellStart"/>
-            <w:r>
-              <w:rPr>
-                <w:rFonts w:cs="Noto Sans Thai"/>
-                <w:i/>
-                <w:color w:val="666666"/>
-                <w:sz w:val="24"/>
-              </w:rPr>
-              <w:t>อธิบายบทบาทของ</w:t>
-            </w:r>
-            <w:proofErr w:type="spellEnd"/>
-            <w:r>
-              <w:rPr>
-                <w:rFonts w:cs="Noto Sans Thai"/>
-                <w:i/>
-                <w:color w:val="666666"/>
-                <w:sz w:val="24"/>
-              </w:rPr>
-              <w:t xml:space="preserve"> Title Block, Drawing Title, Drawing Code </w:t>
-            </w:r>
-            <w:proofErr w:type="spellStart"/>
-            <w:r>
-              <w:rPr>
-                <w:rFonts w:cs="Noto Sans Thai"/>
-                <w:i/>
-                <w:color w:val="666666"/>
-                <w:sz w:val="24"/>
-              </w:rPr>
-              <w:t>และข้อมูลเอกสาร</w:t>
-            </w:r>
-            <w:proofErr w:type="spellEnd"/>
-          </w:p>
-        </w:tc>
-      </w:tr>
-    </w:tbl>
-    <w:p>
-      <w:pPr>
-        <w:spacing w:after="0"/>
-      </w:pPr>
-    </w:p>
-    <w:p>
-      <w:pPr>
-        <w:pStyle w:val="Heading1"/>
-        <w:spacing w:before="160" w:after="100"/>
-      </w:pPr>
-      <w:r>
-        <w:rPr>
-          <w:rFonts w:ascii="Noto Sans Thai" w:eastAsia="Noto Sans Thai" w:hAnsi="Noto Sans Thai" w:cs="Noto Sans Thai"/>
-        </w:rPr>
-        <w:t xml:space="preserve">2.4 </w:t>
-      </w:r>
-      <w:proofErr w:type="spellStart"/>
-      <w:r>
-        <w:rPr>
-          <w:rFonts w:ascii="Noto Sans Thai" w:eastAsia="Noto Sans Thai" w:hAnsi="Noto Sans Thai" w:cs="Noto Sans Thai"/>
-        </w:rPr>
-        <w:t>มาตราส่วนและขนาดกระดาษ</w:t>
-      </w:r>
-      <w:proofErr w:type="spellEnd"/>
-    </w:p>
-    <w:tbl>
-      <w:tblPr>
-        <w:tblStyle w:val="TableGrid"/>
-        <w:tblW w:w="0" w:type="auto"/>
-        <w:jc w:val="center"/>
-        <w:tblLook w:val="04A0" w:firstRow="1" w:lastRow="0" w:firstColumn="1" w:lastColumn="0" w:noHBand="0" w:noVBand="1"/>
-      </w:tblPr>
-      <w:tblGrid>
-        <w:gridCol w:w="8642"/>
-      </w:tblGrid>
-      <w:tr>
-        <w:trPr>
-          <w:cantSplit/>
-          <w:jc w:val="center"/>
-        </w:trPr>
-        <w:tc>
-          <w:tcPr>
-            <w:tcW w:w="8652" w:type="dxa"/>
-            <w:shd w:val="clear" w:color="auto" w:fill="F3F3F3"/>
-            <w:tcMar>
-              <w:top w:w="120" w:type="dxa"/>
-              <w:left w:w="140" w:type="dxa"/>
-              <w:bottom w:w="120" w:type="dxa"/>
-              <w:right w:w="140" w:type="dxa"/>
-            </w:tcMar>
-          </w:tcPr>
-          <w:p>
-            <w:r>
-              <w:rPr>
-                <w:rFonts w:cs="Noto Sans Thai"/>
-                <w:i/>
-                <w:color w:val="666666"/>
-                <w:sz w:val="24"/>
-              </w:rPr>
-              <w:t>[</w:t>
-            </w:r>
-            <w:proofErr w:type="spellStart"/>
-            <w:r>
-              <w:rPr>
-                <w:rFonts w:cs="Noto Sans Thai"/>
-                <w:i/>
-                <w:color w:val="666666"/>
-                <w:sz w:val="24"/>
-              </w:rPr>
-              <w:t>เว้นไว้สำหรับเติมภายหลัง</w:t>
-            </w:r>
-            <w:proofErr w:type="spellEnd"/>
-            <w:r>
-              <w:rPr>
-                <w:rFonts w:cs="Noto Sans Thai"/>
-                <w:i/>
-                <w:color w:val="666666"/>
-                <w:sz w:val="24"/>
-              </w:rPr>
-              <w:t xml:space="preserve">] </w:t>
-            </w:r>
-            <w:proofErr w:type="spellStart"/>
-            <w:r>
-              <w:rPr>
-                <w:rFonts w:cs="Noto Sans Thai"/>
-                <w:i/>
-                <w:color w:val="666666"/>
-                <w:sz w:val="24"/>
-              </w:rPr>
-              <w:t>อธิบาย</w:t>
-            </w:r>
-            <w:proofErr w:type="spellEnd"/>
-            <w:r>
-              <w:rPr>
-                <w:rFonts w:cs="Noto Sans Thai"/>
-                <w:i/>
-                <w:color w:val="666666"/>
-                <w:sz w:val="24"/>
-              </w:rPr>
-              <w:t xml:space="preserve"> Scale </w:t>
-            </w:r>
-            <w:proofErr w:type="spellStart"/>
-            <w:r>
-              <w:rPr>
-                <w:rFonts w:cs="Noto Sans Thai"/>
-                <w:i/>
-                <w:color w:val="666666"/>
-                <w:sz w:val="24"/>
-              </w:rPr>
-              <w:t>และ</w:t>
-            </w:r>
-            <w:proofErr w:type="spellEnd"/>
-            <w:r>
-              <w:rPr>
-                <w:rFonts w:cs="Noto Sans Thai"/>
-                <w:i/>
-                <w:color w:val="666666"/>
-                <w:sz w:val="24"/>
-              </w:rPr>
-              <w:t xml:space="preserve"> A-series drawing sheets </w:t>
-            </w:r>
-            <w:proofErr w:type="spellStart"/>
-            <w:r>
-              <w:rPr>
-                <w:rFonts w:cs="Noto Sans Thai"/>
-                <w:i/>
-                <w:color w:val="666666"/>
-                <w:sz w:val="24"/>
-              </w:rPr>
-              <w:t>พร้อมอ้างอิงมาตรฐานที่ใช้จริง</w:t>
-            </w:r>
-            <w:proofErr w:type="spellEnd"/>
-          </w:p>
-        </w:tc>
-      </w:tr>
-    </w:tbl>
-    <w:p>
-      <w:pPr>
-        <w:spacing w:after="0"/>
-      </w:pPr>
-    </w:p>
-    <w:p>
-      <w:pPr>
-        <w:pStyle w:val="Heading1"/>
-        <w:spacing w:before="160" w:after="100"/>
-      </w:pPr>
-      <w:r>
-        <w:rPr>
-          <w:rFonts w:ascii="Noto Sans Thai" w:eastAsia="Noto Sans Thai" w:hAnsi="Noto Sans Thai" w:cs="Noto Sans Thai"/>
-        </w:rPr>
-        <w:t xml:space="preserve">2.5 Plot Configuration </w:t>
-      </w:r>
-      <w:proofErr w:type="spellStart"/>
-      <w:r>
-        <w:rPr>
-          <w:rFonts w:ascii="Noto Sans Thai" w:eastAsia="Noto Sans Thai" w:hAnsi="Noto Sans Thai" w:cs="Noto Sans Thai"/>
-        </w:rPr>
-        <w:t>และ</w:t>
-      </w:r>
-      <w:proofErr w:type="spellEnd"/>
-      <w:r>
-        <w:rPr>
-          <w:rFonts w:ascii="Noto Sans Thai" w:eastAsia="Noto Sans Thai" w:hAnsi="Noto Sans Thai" w:cs="Noto Sans Thai"/>
-        </w:rPr>
-        <w:t xml:space="preserve"> Plot Style</w:t>
-      </w:r>
-    </w:p>
-    <w:tbl>
-      <w:tblPr>
-        <w:tblStyle w:val="TableGrid"/>
-        <w:tblW w:w="0" w:type="auto"/>
-        <w:jc w:val="center"/>
-        <w:tblLook w:val="04A0" w:firstRow="1" w:lastRow="0" w:firstColumn="1" w:lastColumn="0" w:noHBand="0" w:noVBand="1"/>
-      </w:tblPr>
-      <w:tblGrid>
-        <w:gridCol w:w="8642"/>
-      </w:tblGrid>
-      <w:tr>
-        <w:trPr>
-          <w:cantSplit/>
-          <w:jc w:val="center"/>
-        </w:trPr>
-        <w:tc>
-          <w:tcPr>
-            <w:tcW w:w="8652" w:type="dxa"/>
-            <w:shd w:val="clear" w:color="auto" w:fill="F3F3F3"/>
-            <w:tcMar>
-              <w:top w:w="120" w:type="dxa"/>
-              <w:left w:w="140" w:type="dxa"/>
-              <w:bottom w:w="120" w:type="dxa"/>
-              <w:right w:w="140" w:type="dxa"/>
-            </w:tcMar>
-          </w:tcPr>
-          <w:p>
-            <w:r>
-              <w:rPr>
-                <w:rFonts w:cs="Noto Sans Thai"/>
-                <w:i/>
-                <w:color w:val="666666"/>
-                <w:sz w:val="24"/>
-              </w:rPr>
-              <w:t>[</w:t>
-            </w:r>
-            <w:proofErr w:type="spellStart"/>
-            <w:r>
-              <w:rPr>
-                <w:rFonts w:cs="Noto Sans Thai"/>
-                <w:i/>
-                <w:color w:val="666666"/>
-                <w:sz w:val="24"/>
-              </w:rPr>
-              <w:t>เว้นไว้สำหรับเติมภายหลัง</w:t>
-            </w:r>
-            <w:proofErr w:type="spellEnd"/>
-            <w:r>
-              <w:rPr>
-                <w:rFonts w:cs="Noto Sans Thai"/>
-                <w:i/>
-                <w:color w:val="666666"/>
-                <w:sz w:val="24"/>
-              </w:rPr>
-              <w:t xml:space="preserve">] </w:t>
-            </w:r>
-            <w:proofErr w:type="spellStart"/>
-            <w:r>
-              <w:rPr>
-                <w:rFonts w:cs="Noto Sans Thai"/>
-                <w:i/>
-                <w:color w:val="666666"/>
-                <w:sz w:val="24"/>
-              </w:rPr>
-              <w:t>อธิบาย</w:t>
-            </w:r>
-            <w:proofErr w:type="spellEnd"/>
-            <w:r>
-              <w:rPr>
-                <w:rFonts w:cs="Noto Sans Thai"/>
-                <w:i/>
-                <w:color w:val="666666"/>
-                <w:sz w:val="24"/>
-              </w:rPr>
-              <w:t xml:space="preserve"> Plotter, paper, orientation, plot area, scale </w:t>
-            </w:r>
-            <w:proofErr w:type="spellStart"/>
-            <w:r>
-              <w:rPr>
-                <w:rFonts w:cs="Noto Sans Thai"/>
-                <w:i/>
-                <w:color w:val="666666"/>
-                <w:sz w:val="24"/>
-              </w:rPr>
-              <w:t>และ</w:t>
-            </w:r>
-            <w:proofErr w:type="spellEnd"/>
-            <w:r>
-              <w:rPr>
-                <w:rFonts w:cs="Noto Sans Thai"/>
-                <w:i/>
-                <w:color w:val="666666"/>
-                <w:sz w:val="24"/>
-              </w:rPr>
-              <w:t xml:space="preserve"> CTB</w:t>
-            </w:r>
-          </w:p>
-        </w:tc>
-      </w:tr>
-    </w:tbl>
-    <w:p>
-      <w:pPr>
-        <w:spacing w:after="0"/>
-      </w:pPr>
-    </w:p>
-    <w:p>
-      <w:pPr>
-        <w:pStyle w:val="Heading1"/>
-        <w:spacing w:before="160" w:after="100"/>
-      </w:pPr>
-      <w:r>
-        <w:rPr>
-          <w:rFonts w:ascii="Noto Sans Thai" w:eastAsia="Noto Sans Thai" w:hAnsi="Noto Sans Thai" w:cs="Noto Sans Thai"/>
-        </w:rPr>
-        <w:t xml:space="preserve">2.6 </w:t>
-      </w:r>
-      <w:proofErr w:type="spellStart"/>
-      <w:r>
-        <w:rPr>
-          <w:rFonts w:ascii="Noto Sans Thai" w:eastAsia="Noto Sans Thai" w:hAnsi="Noto Sans Thai" w:cs="Noto Sans Thai"/>
-        </w:rPr>
-        <w:t>AutoLISP</w:t>
-      </w:r>
-      <w:proofErr w:type="spellEnd"/>
-    </w:p>
-    <w:tbl>
-      <w:tblPr>
-        <w:tblStyle w:val="TableGrid"/>
-        <w:tblW w:w="0" w:type="auto"/>
-        <w:jc w:val="center"/>
-        <w:tblLook w:val="04A0" w:firstRow="1" w:lastRow="0" w:firstColumn="1" w:lastColumn="0" w:noHBand="0" w:noVBand="1"/>
-      </w:tblPr>
-      <w:tblGrid>
-        <w:gridCol w:w="8642"/>
-      </w:tblGrid>
-      <w:tr>
-        <w:trPr>
-          <w:cantSplit/>
-          <w:jc w:val="center"/>
-        </w:trPr>
-        <w:tc>
-          <w:tcPr>
-            <w:tcW w:w="8652" w:type="dxa"/>
-            <w:shd w:val="clear" w:color="auto" w:fill="F3F3F3"/>
-            <w:tcMar>
-              <w:top w:w="120" w:type="dxa"/>
-              <w:left w:w="140" w:type="dxa"/>
-              <w:bottom w:w="120" w:type="dxa"/>
-              <w:right w:w="140" w:type="dxa"/>
-            </w:tcMar>
-          </w:tcPr>
-          <w:p>
-            <w:r>
-              <w:rPr>
-                <w:rFonts w:cs="Noto Sans Thai"/>
-                <w:i/>
-                <w:color w:val="666666"/>
-                <w:sz w:val="24"/>
-              </w:rPr>
-              <w:t>[</w:t>
-            </w:r>
-            <w:proofErr w:type="spellStart"/>
-            <w:r>
-              <w:rPr>
-                <w:rFonts w:cs="Noto Sans Thai"/>
-                <w:i/>
-                <w:color w:val="666666"/>
-                <w:sz w:val="24"/>
-              </w:rPr>
-              <w:t>เว้นไว้สำหรับเติมภายหลัง</w:t>
-            </w:r>
-            <w:proofErr w:type="spellEnd"/>
-            <w:r>
-              <w:rPr>
-                <w:rFonts w:cs="Noto Sans Thai"/>
-                <w:i/>
-                <w:color w:val="666666"/>
-                <w:sz w:val="24"/>
-              </w:rPr>
-              <w:t xml:space="preserve">] </w:t>
-            </w:r>
-            <w:proofErr w:type="spellStart"/>
-            <w:r>
-              <w:rPr>
-                <w:rFonts w:cs="Noto Sans Thai"/>
-                <w:i/>
-                <w:color w:val="666666"/>
-                <w:sz w:val="24"/>
-              </w:rPr>
-              <w:t>อธิบาย</w:t>
-            </w:r>
-            <w:proofErr w:type="spellEnd"/>
-            <w:r>
-              <w:rPr>
-                <w:rFonts w:cs="Noto Sans Thai"/>
-                <w:i/>
-                <w:color w:val="666666"/>
-                <w:sz w:val="24"/>
-              </w:rPr>
-              <w:t xml:space="preserve"> </w:t>
-            </w:r>
-            <w:proofErr w:type="spellStart"/>
-            <w:r>
-              <w:rPr>
-                <w:rFonts w:cs="Noto Sans Thai"/>
-                <w:i/>
-                <w:color w:val="666666"/>
-                <w:sz w:val="24"/>
-              </w:rPr>
-              <w:t>AutoLISP</w:t>
-            </w:r>
-            <w:proofErr w:type="spellEnd"/>
-            <w:r>
-              <w:rPr>
-                <w:rFonts w:cs="Noto Sans Thai"/>
-                <w:i/>
-                <w:color w:val="666666"/>
-                <w:sz w:val="24"/>
-              </w:rPr>
-              <w:t xml:space="preserve"> </w:t>
-            </w:r>
-            <w:proofErr w:type="spellStart"/>
-            <w:r>
-              <w:rPr>
-                <w:rFonts w:cs="Noto Sans Thai"/>
-                <w:i/>
-                <w:color w:val="666666"/>
-                <w:sz w:val="24"/>
-              </w:rPr>
-              <w:t>และการใช้เพื่อ</w:t>
-            </w:r>
-            <w:proofErr w:type="spellEnd"/>
-            <w:r>
-              <w:rPr>
-                <w:rFonts w:cs="Noto Sans Thai"/>
-                <w:i/>
-                <w:color w:val="666666"/>
-                <w:sz w:val="24"/>
-              </w:rPr>
-              <w:t xml:space="preserve"> automate object/drawing properties </w:t>
-            </w:r>
-            <w:proofErr w:type="spellStart"/>
-            <w:r>
-              <w:rPr>
-                <w:rFonts w:cs="Noto Sans Thai"/>
-                <w:i/>
-                <w:color w:val="666666"/>
-                <w:sz w:val="24"/>
-              </w:rPr>
-              <w:t>ใน</w:t>
-            </w:r>
-            <w:proofErr w:type="spellEnd"/>
-            <w:r>
-              <w:rPr>
-                <w:rFonts w:cs="Noto Sans Thai"/>
-                <w:i/>
-                <w:color w:val="666666"/>
-                <w:sz w:val="24"/>
-              </w:rPr>
-              <w:t xml:space="preserve"> AutoCAD</w:t>
-            </w:r>
-          </w:p>
-        </w:tc>
-      </w:tr>
-    </w:tbl>
-    <w:p>
-      <w:pPr>
-        <w:spacing w:after="0"/>
-      </w:pPr>
-    </w:p>
-    <w:p>
-      <w:pPr>
-        <w:pStyle w:val="Heading1"/>
-        <w:spacing w:before="160" w:after="100"/>
-      </w:pPr>
-      <w:r>
-        <w:rPr>
-          <w:rFonts w:ascii="Noto Sans Thai" w:eastAsia="Noto Sans Thai" w:hAnsi="Noto Sans Thai" w:cs="Noto Sans Thai"/>
-        </w:rPr>
-        <w:lastRenderedPageBreak/>
-        <w:t xml:space="preserve">2.7 CAD Automation </w:t>
-      </w:r>
-      <w:proofErr w:type="spellStart"/>
-      <w:r>
-        <w:rPr>
-          <w:rFonts w:ascii="Noto Sans Thai" w:eastAsia="Noto Sans Thai" w:hAnsi="Noto Sans Thai" w:cs="Noto Sans Thai"/>
-        </w:rPr>
-        <w:t>และ</w:t>
-      </w:r>
-      <w:proofErr w:type="spellEnd"/>
-      <w:r>
-        <w:rPr>
-          <w:rFonts w:ascii="Noto Sans Thai" w:eastAsia="Noto Sans Thai" w:hAnsi="Noto Sans Thai" w:cs="Noto Sans Thai"/>
-        </w:rPr>
-        <w:t xml:space="preserve"> Drawing QA/QC</w:t>
-      </w:r>
-    </w:p>
-    <w:tbl>
-      <w:tblPr>
-        <w:tblStyle w:val="TableGrid"/>
-        <w:tblW w:w="0" w:type="auto"/>
-        <w:jc w:val="center"/>
-        <w:tblLook w:val="04A0" w:firstRow="1" w:lastRow="0" w:firstColumn="1" w:lastColumn="0" w:noHBand="0" w:noVBand="1"/>
-      </w:tblPr>
-      <w:tblGrid>
-        <w:gridCol w:w="8642"/>
-      </w:tblGrid>
-      <w:tr>
-        <w:trPr>
-          <w:cantSplit/>
-          <w:jc w:val="center"/>
-        </w:trPr>
-        <w:tc>
-          <w:tcPr>
-            <w:tcW w:w="8652" w:type="dxa"/>
-            <w:shd w:val="clear" w:color="auto" w:fill="F3F3F3"/>
-            <w:tcMar>
-              <w:top w:w="120" w:type="dxa"/>
-              <w:left w:w="140" w:type="dxa"/>
-              <w:bottom w:w="120" w:type="dxa"/>
-              <w:right w:w="140" w:type="dxa"/>
-            </w:tcMar>
-          </w:tcPr>
-          <w:p>
-            <w:r>
-              <w:rPr>
-                <w:rFonts w:cs="Noto Sans Thai"/>
-                <w:i/>
-                <w:color w:val="666666"/>
-                <w:sz w:val="24"/>
-              </w:rPr>
-              <w:t>[</w:t>
-            </w:r>
-            <w:proofErr w:type="spellStart"/>
-            <w:r>
-              <w:rPr>
-                <w:rFonts w:cs="Noto Sans Thai"/>
-                <w:i/>
-                <w:color w:val="666666"/>
-                <w:sz w:val="24"/>
-              </w:rPr>
-              <w:t>เว้นไว้สำหรับเติมภายหลัง</w:t>
-            </w:r>
-            <w:proofErr w:type="spellEnd"/>
-            <w:r>
-              <w:rPr>
-                <w:rFonts w:cs="Noto Sans Thai"/>
-                <w:i/>
-                <w:color w:val="666666"/>
-                <w:sz w:val="24"/>
-              </w:rPr>
-              <w:t xml:space="preserve">] </w:t>
-            </w:r>
-            <w:proofErr w:type="spellStart"/>
-            <w:r>
-              <w:rPr>
-                <w:rFonts w:cs="Noto Sans Thai"/>
-                <w:i/>
-                <w:color w:val="666666"/>
-                <w:sz w:val="24"/>
-              </w:rPr>
-              <w:t>สังเคราะห์แนวคิด</w:t>
-            </w:r>
-            <w:proofErr w:type="spellEnd"/>
-            <w:r>
-              <w:rPr>
-                <w:rFonts w:cs="Noto Sans Thai"/>
-                <w:i/>
-                <w:color w:val="666666"/>
-                <w:sz w:val="24"/>
-              </w:rPr>
-              <w:t xml:space="preserve"> rule-based checking, automated validation </w:t>
-            </w:r>
-            <w:proofErr w:type="spellStart"/>
-            <w:r>
-              <w:rPr>
-                <w:rFonts w:cs="Noto Sans Thai"/>
-                <w:i/>
-                <w:color w:val="666666"/>
-                <w:sz w:val="24"/>
-              </w:rPr>
-              <w:t>และ</w:t>
-            </w:r>
-            <w:proofErr w:type="spellEnd"/>
-            <w:r>
-              <w:rPr>
-                <w:rFonts w:cs="Noto Sans Thai"/>
-                <w:i/>
-                <w:color w:val="666666"/>
-                <w:sz w:val="24"/>
-              </w:rPr>
-              <w:t xml:space="preserve"> human-in-the-loop</w:t>
-            </w:r>
-          </w:p>
-        </w:tc>
-      </w:tr>
-    </w:tbl>
-    <w:p>
-      <w:pPr>
-        <w:spacing w:after="0"/>
-      </w:pPr>
-    </w:p>
-    <w:p>
-      <w:pPr>
-        <w:pStyle w:val="Heading1"/>
-        <w:spacing w:before="160" w:after="100"/>
-      </w:pPr>
-      <w:r>
-        <w:rPr>
-          <w:rFonts w:ascii="Noto Sans Thai" w:eastAsia="Noto Sans Thai" w:hAnsi="Noto Sans Thai" w:cs="Noto Sans Thai"/>
-        </w:rPr>
-        <w:t xml:space="preserve">2.8 </w:t>
-      </w:r>
-      <w:proofErr w:type="spellStart"/>
-      <w:r>
-        <w:rPr>
-          <w:rFonts w:ascii="Noto Sans Thai" w:eastAsia="Noto Sans Thai" w:hAnsi="Noto Sans Thai" w:cs="Noto Sans Thai"/>
-        </w:rPr>
-        <w:t>งานวิจัยที่เกี่ยวข้อง</w:t>
-      </w:r>
-      <w:proofErr w:type="spellEnd"/>
-    </w:p>
-    <w:tbl>
-      <w:tblPr>
-        <w:tblStyle w:val="TableGrid"/>
-        <w:tblW w:w="0" w:type="auto"/>
-        <w:jc w:val="center"/>
-        <w:tblLook w:val="04A0" w:firstRow="1" w:lastRow="0" w:firstColumn="1" w:lastColumn="0" w:noHBand="0" w:noVBand="1"/>
-      </w:tblPr>
-      <w:tblGrid>
-        <w:gridCol w:w="8642"/>
-      </w:tblGrid>
-      <w:tr>
-        <w:trPr>
-          <w:cantSplit/>
-          <w:jc w:val="center"/>
-        </w:trPr>
-        <w:tc>
-          <w:tcPr>
-            <w:tcW w:w="8652" w:type="dxa"/>
-            <w:shd w:val="clear" w:color="auto" w:fill="F3F3F3"/>
-            <w:tcMar>
-              <w:top w:w="120" w:type="dxa"/>
-              <w:left w:w="140" w:type="dxa"/>
-              <w:bottom w:w="120" w:type="dxa"/>
-              <w:right w:w="140" w:type="dxa"/>
-            </w:tcMar>
-          </w:tcPr>
-          <w:p>
-            <w:r>
-              <w:rPr>
-                <w:rFonts w:cs="Noto Sans Thai"/>
-                <w:i/>
-                <w:color w:val="666666"/>
-                <w:sz w:val="24"/>
-              </w:rPr>
-              <w:t>[</w:t>
-            </w:r>
-            <w:proofErr w:type="spellStart"/>
-            <w:r>
-              <w:rPr>
-                <w:rFonts w:cs="Noto Sans Thai"/>
-                <w:i/>
-                <w:color w:val="666666"/>
-                <w:sz w:val="24"/>
-              </w:rPr>
-              <w:t>เว้นไว้สำหรับเติมภายหลัง</w:t>
-            </w:r>
-            <w:proofErr w:type="spellEnd"/>
-            <w:r>
-              <w:rPr>
-                <w:rFonts w:cs="Noto Sans Thai"/>
-                <w:i/>
-                <w:color w:val="666666"/>
-                <w:sz w:val="24"/>
-              </w:rPr>
-              <w:t xml:space="preserve">] </w:t>
-            </w:r>
-            <w:proofErr w:type="spellStart"/>
-            <w:r>
-              <w:rPr>
-                <w:rFonts w:cs="Noto Sans Thai"/>
-                <w:i/>
-                <w:color w:val="666666"/>
-                <w:sz w:val="24"/>
-              </w:rPr>
-              <w:t>เขียนสังเคราะห์งานวิจัยด้าน</w:t>
-            </w:r>
-            <w:proofErr w:type="spellEnd"/>
-            <w:r>
-              <w:rPr>
-                <w:rFonts w:cs="Noto Sans Thai"/>
-                <w:i/>
-                <w:color w:val="666666"/>
-                <w:sz w:val="24"/>
-              </w:rPr>
-              <w:t xml:space="preserve"> rule-based CAD checking, drawing validation </w:t>
-            </w:r>
-            <w:proofErr w:type="spellStart"/>
-            <w:r>
-              <w:rPr>
-                <w:rFonts w:cs="Noto Sans Thai"/>
-                <w:i/>
-                <w:color w:val="666666"/>
-                <w:sz w:val="24"/>
-              </w:rPr>
-              <w:t>และ</w:t>
-            </w:r>
-            <w:proofErr w:type="spellEnd"/>
-            <w:r>
-              <w:rPr>
-                <w:rFonts w:cs="Noto Sans Thai"/>
-                <w:i/>
-                <w:color w:val="666666"/>
-                <w:sz w:val="24"/>
-              </w:rPr>
-              <w:t xml:space="preserve"> CAD API automation </w:t>
-            </w:r>
-            <w:proofErr w:type="spellStart"/>
-            <w:r>
-              <w:rPr>
-                <w:rFonts w:cs="Noto Sans Thai"/>
-                <w:i/>
-                <w:color w:val="666666"/>
-                <w:sz w:val="24"/>
-              </w:rPr>
-              <w:t>ให้เชื่อมกับ</w:t>
-            </w:r>
-            <w:proofErr w:type="spellEnd"/>
-            <w:r>
-              <w:rPr>
-                <w:rFonts w:cs="Noto Sans Thai"/>
-                <w:i/>
-                <w:color w:val="666666"/>
-                <w:sz w:val="24"/>
-              </w:rPr>
-              <w:t xml:space="preserve"> AUTOSHEET</w:t>
-            </w:r>
-          </w:p>
-        </w:tc>
-      </w:tr>
-    </w:tbl>
-    <w:p>
-      <w:pPr>
-        <w:spacing w:after="0"/>
-      </w:pPr>
-    </w:p>
-    <w:p>
-      <w:pPr>
-        <w:pStyle w:val="Heading2"/>
-        <w:spacing w:before="100" w:after="100"/>
-      </w:pPr>
-      <w:r>
-        <w:rPr>
-          <w:rFonts w:ascii="Noto Sans Thai" w:eastAsia="Noto Sans Thai" w:hAnsi="Noto Sans Thai" w:cs="Noto Sans Thai"/>
-        </w:rPr>
-        <w:t xml:space="preserve">2.8.1 Literature Matrix </w:t>
-      </w:r>
-      <w:proofErr w:type="spellStart"/>
-      <w:r>
-        <w:rPr>
-          <w:rFonts w:ascii="Noto Sans Thai" w:eastAsia="Noto Sans Thai" w:hAnsi="Noto Sans Thai" w:cs="Noto Sans Thai"/>
-        </w:rPr>
-        <w:t>เบื้องต้น</w:t>
-      </w:r>
-      <w:proofErr w:type="spellEnd"/>
-    </w:p>
-    <w:tbl>
-      <w:tblPr>
-        <w:tblStyle w:val="TableGrid"/>
-        <w:tblW w:w="0" w:type="auto"/>
-        <w:jc w:val="center"/>
-        <w:tblLook w:val="04A0" w:firstRow="1" w:lastRow="0" w:firstColumn="1" w:lastColumn="0" w:noHBand="0" w:noVBand="1"/>
-      </w:tblPr>
-      <w:tblGrid>
-        <w:gridCol w:w="2161"/>
-        <w:gridCol w:w="2161"/>
-        <w:gridCol w:w="2161"/>
-        <w:gridCol w:w="2159"/>
-      </w:tblGrid>
-      <w:tr>
-        <w:trPr>
-          <w:cantSplit/>
-          <w:tblHeader/>
-          <w:jc w:val="center"/>
-        </w:trPr>
-        <w:tc>
-          <w:tcPr>
-            <w:tcW w:w="2163" w:type="dxa"/>
-            <w:shd w:val="clear" w:color="auto" w:fill="E7E6E6"/>
-            <w:tcMar>
-              <w:top w:w="80" w:type="dxa"/>
-              <w:left w:w="90" w:type="dxa"/>
-              <w:bottom w:w="80" w:type="dxa"/>
-              <w:right w:w="90" w:type="dxa"/>
-            </w:tcMar>
-            <w:vAlign w:val="center"/>
-          </w:tcPr>
-          <w:p>
-            <w:pPr>
-              <w:jc w:val="center"/>
-            </w:pPr>
-            <w:proofErr w:type="spellStart"/>
-            <w:r>
-              <w:rPr>
-                <w:rFonts w:cs="Noto Sans Thai"/>
-                <w:b/>
-                <w:sz w:val="21"/>
-              </w:rPr>
-              <w:t>งานวิจัย</w:t>
-            </w:r>
-            <w:proofErr w:type="spellEnd"/>
-          </w:p>
-        </w:tc>
-        <w:tc>
-          <w:tcPr>
-            <w:tcW w:w="2163" w:type="dxa"/>
-            <w:shd w:val="clear" w:color="auto" w:fill="E7E6E6"/>
-            <w:tcMar>
-              <w:top w:w="80" w:type="dxa"/>
-              <w:left w:w="90" w:type="dxa"/>
-              <w:bottom w:w="80" w:type="dxa"/>
-              <w:right w:w="90" w:type="dxa"/>
-            </w:tcMar>
-            <w:vAlign w:val="center"/>
-          </w:tcPr>
-          <w:p>
-            <w:pPr>
-              <w:jc w:val="center"/>
-            </w:pPr>
-            <w:proofErr w:type="spellStart"/>
-            <w:r>
-              <w:rPr>
-                <w:rFonts w:cs="Noto Sans Thai"/>
-                <w:b/>
-                <w:sz w:val="21"/>
-              </w:rPr>
-              <w:t>ประเด็นหลัก</w:t>
-            </w:r>
-            <w:proofErr w:type="spellEnd"/>
-          </w:p>
-        </w:tc>
-        <w:tc>
-          <w:tcPr>
-            <w:tcW w:w="2163" w:type="dxa"/>
-            <w:shd w:val="clear" w:color="auto" w:fill="E7E6E6"/>
-            <w:tcMar>
-              <w:top w:w="80" w:type="dxa"/>
-              <w:left w:w="90" w:type="dxa"/>
-              <w:bottom w:w="80" w:type="dxa"/>
-              <w:right w:w="90" w:type="dxa"/>
-            </w:tcMar>
-            <w:vAlign w:val="center"/>
-          </w:tcPr>
-          <w:p>
-            <w:pPr>
-              <w:jc w:val="center"/>
-            </w:pPr>
-            <w:proofErr w:type="spellStart"/>
-            <w:r>
-              <w:rPr>
-                <w:rFonts w:cs="Noto Sans Thai"/>
-                <w:b/>
-                <w:sz w:val="21"/>
-              </w:rPr>
-              <w:t>ใช้สนับสนุน</w:t>
-            </w:r>
-            <w:proofErr w:type="spellEnd"/>
-          </w:p>
-        </w:tc>
-        <w:tc>
-          <w:tcPr>
-            <w:tcW w:w="2163" w:type="dxa"/>
-            <w:shd w:val="clear" w:color="auto" w:fill="E7E6E6"/>
-            <w:tcMar>
-              <w:top w:w="80" w:type="dxa"/>
-              <w:left w:w="90" w:type="dxa"/>
-              <w:bottom w:w="80" w:type="dxa"/>
-              <w:right w:w="90" w:type="dxa"/>
-            </w:tcMar>
-            <w:vAlign w:val="center"/>
-          </w:tcPr>
-          <w:p>
-            <w:pPr>
-              <w:jc w:val="center"/>
-            </w:pPr>
-            <w:proofErr w:type="spellStart"/>
-            <w:r>
-              <w:rPr>
-                <w:rFonts w:cs="Noto Sans Thai"/>
-                <w:b/>
-                <w:sz w:val="21"/>
-              </w:rPr>
-              <w:t>ส่วนที่ใช้</w:t>
-            </w:r>
-            <w:proofErr w:type="spellEnd"/>
-          </w:p>
-        </w:tc>
-      </w:tr>
-      <w:tr>
-        <w:trPr>
-          <w:cantSplit/>
-          <w:jc w:val="center"/>
-        </w:trPr>
-        <w:tc>
-          <w:tcPr>
-            <w:tcW w:w="2163" w:type="dxa"/>
-            <w:tcMar>
-              <w:top w:w="80" w:type="dxa"/>
-              <w:left w:w="90" w:type="dxa"/>
-              <w:bottom w:w="80" w:type="dxa"/>
-              <w:right w:w="90" w:type="dxa"/>
-            </w:tcMar>
-            <w:vAlign w:val="center"/>
-          </w:tcPr>
-          <w:p>
-            <w:r>
-              <w:rPr>
-                <w:rFonts w:cs="Noto Sans Thai"/>
-                <w:sz w:val="21"/>
-              </w:rPr>
-              <w:t>Murakami et al. (1995)</w:t>
-            </w:r>
-          </w:p>
-        </w:tc>
-        <w:tc>
-          <w:tcPr>
-            <w:tcW w:w="2163" w:type="dxa"/>
-            <w:tcMar>
-              <w:top w:w="80" w:type="dxa"/>
-              <w:left w:w="90" w:type="dxa"/>
-              <w:bottom w:w="80" w:type="dxa"/>
-              <w:right w:w="90" w:type="dxa"/>
-            </w:tcMar>
-            <w:vAlign w:val="center"/>
-          </w:tcPr>
-          <w:p>
-            <w:r>
-              <w:rPr>
-                <w:rFonts w:cs="Noto Sans Thai"/>
-                <w:sz w:val="21"/>
-              </w:rPr>
-              <w:t>Computerized check of CAD drawings based on drafting rules</w:t>
-            </w:r>
-          </w:p>
-        </w:tc>
-        <w:tc>
-          <w:tcPr>
-            <w:tcW w:w="2163" w:type="dxa"/>
-            <w:tcMar>
-              <w:top w:w="80" w:type="dxa"/>
-              <w:left w:w="90" w:type="dxa"/>
-              <w:bottom w:w="80" w:type="dxa"/>
-              <w:right w:w="90" w:type="dxa"/>
-            </w:tcMar>
-            <w:vAlign w:val="center"/>
-          </w:tcPr>
-          <w:p>
-            <w:r>
-              <w:rPr>
-                <w:rFonts w:cs="Noto Sans Thai"/>
-                <w:sz w:val="21"/>
-              </w:rPr>
-              <w:t>Standard → Rule → Automatic Check</w:t>
-            </w:r>
-          </w:p>
-        </w:tc>
-        <w:tc>
-          <w:tcPr>
-            <w:tcW w:w="2163" w:type="dxa"/>
-            <w:tcMar>
-              <w:top w:w="80" w:type="dxa"/>
-              <w:left w:w="90" w:type="dxa"/>
-              <w:bottom w:w="80" w:type="dxa"/>
-              <w:right w:w="90" w:type="dxa"/>
-            </w:tcMar>
-            <w:vAlign w:val="center"/>
-          </w:tcPr>
-          <w:p>
-            <w:proofErr w:type="spellStart"/>
-            <w:r>
-              <w:rPr>
-                <w:rFonts w:cs="Noto Sans Thai"/>
-                <w:sz w:val="21"/>
-              </w:rPr>
-              <w:t>บทที่</w:t>
-            </w:r>
-            <w:proofErr w:type="spellEnd"/>
-            <w:r>
-              <w:rPr>
-                <w:rFonts w:cs="Noto Sans Thai"/>
-                <w:sz w:val="21"/>
-              </w:rPr>
-              <w:t xml:space="preserve"> 2, 3</w:t>
-            </w:r>
-          </w:p>
-        </w:tc>
-      </w:tr>
-      <w:tr>
-        <w:trPr>
-          <w:cantSplit/>
-          <w:jc w:val="center"/>
-        </w:trPr>
-        <w:tc>
-          <w:tcPr>
-            <w:tcW w:w="2163" w:type="dxa"/>
-            <w:tcMar>
-              <w:top w:w="80" w:type="dxa"/>
-              <w:left w:w="90" w:type="dxa"/>
-              <w:bottom w:w="80" w:type="dxa"/>
-              <w:right w:w="90" w:type="dxa"/>
-            </w:tcMar>
-            <w:vAlign w:val="center"/>
-          </w:tcPr>
-          <w:p>
-            <w:r>
-              <w:rPr>
-                <w:rFonts w:cs="Noto Sans Thai"/>
-                <w:sz w:val="21"/>
-              </w:rPr>
-              <w:t>Rica et al. (2020)</w:t>
-            </w:r>
-          </w:p>
-        </w:tc>
-        <w:tc>
-          <w:tcPr>
-            <w:tcW w:w="2163" w:type="dxa"/>
-            <w:tcMar>
-              <w:top w:w="80" w:type="dxa"/>
-              <w:left w:w="90" w:type="dxa"/>
-              <w:bottom w:w="80" w:type="dxa"/>
-              <w:right w:w="90" w:type="dxa"/>
-            </w:tcMar>
-            <w:vAlign w:val="center"/>
-          </w:tcPr>
-          <w:p>
-            <w:r>
-              <w:rPr>
-                <w:rFonts w:cs="Noto Sans Thai"/>
-                <w:sz w:val="21"/>
-              </w:rPr>
-              <w:t>Reducing human effort in engineering drawing validation</w:t>
-            </w:r>
-          </w:p>
-        </w:tc>
-        <w:tc>
-          <w:tcPr>
-            <w:tcW w:w="2163" w:type="dxa"/>
-            <w:tcMar>
-              <w:top w:w="80" w:type="dxa"/>
-              <w:left w:w="90" w:type="dxa"/>
-              <w:bottom w:w="80" w:type="dxa"/>
-              <w:right w:w="90" w:type="dxa"/>
-            </w:tcMar>
-            <w:vAlign w:val="center"/>
-          </w:tcPr>
-          <w:p>
-            <w:r>
-              <w:rPr>
-                <w:rFonts w:cs="Noto Sans Thai"/>
-                <w:sz w:val="21"/>
-              </w:rPr>
-              <w:t>Automation + Human Validation</w:t>
-            </w:r>
-          </w:p>
-        </w:tc>
-        <w:tc>
-          <w:tcPr>
-            <w:tcW w:w="2163" w:type="dxa"/>
-            <w:tcMar>
-              <w:top w:w="80" w:type="dxa"/>
-              <w:left w:w="90" w:type="dxa"/>
-              <w:bottom w:w="80" w:type="dxa"/>
-              <w:right w:w="90" w:type="dxa"/>
-            </w:tcMar>
-            <w:vAlign w:val="center"/>
-          </w:tcPr>
-          <w:p>
-            <w:proofErr w:type="spellStart"/>
-            <w:r>
-              <w:rPr>
-                <w:rFonts w:cs="Noto Sans Thai"/>
-                <w:sz w:val="21"/>
-              </w:rPr>
-              <w:t>บทที่</w:t>
-            </w:r>
-            <w:proofErr w:type="spellEnd"/>
-            <w:r>
-              <w:rPr>
-                <w:rFonts w:cs="Noto Sans Thai"/>
-                <w:sz w:val="21"/>
-              </w:rPr>
-              <w:t xml:space="preserve"> 2, 4, 5</w:t>
-            </w:r>
-          </w:p>
-        </w:tc>
-      </w:tr>
-      <w:tr>
-        <w:trPr>
-          <w:cantSplit/>
-          <w:jc w:val="center"/>
-        </w:trPr>
-        <w:tc>
-          <w:tcPr>
-            <w:tcW w:w="2163" w:type="dxa"/>
-            <w:tcMar>
-              <w:top w:w="80" w:type="dxa"/>
-              <w:left w:w="90" w:type="dxa"/>
-              <w:bottom w:w="80" w:type="dxa"/>
-              <w:right w:w="90" w:type="dxa"/>
-            </w:tcMar>
-            <w:vAlign w:val="center"/>
-          </w:tcPr>
-          <w:p>
-            <w:r>
-              <w:rPr>
-                <w:rFonts w:cs="Noto Sans Thai"/>
-                <w:sz w:val="21"/>
-              </w:rPr>
-              <w:t>Sofias et al. (2025)</w:t>
-            </w:r>
-          </w:p>
-        </w:tc>
-        <w:tc>
-          <w:tcPr>
-            <w:tcW w:w="2163" w:type="dxa"/>
-            <w:tcMar>
-              <w:top w:w="80" w:type="dxa"/>
-              <w:left w:w="90" w:type="dxa"/>
-              <w:bottom w:w="80" w:type="dxa"/>
-              <w:right w:w="90" w:type="dxa"/>
-            </w:tcMar>
-            <w:vAlign w:val="center"/>
-          </w:tcPr>
-          <w:p>
-            <w:r>
-              <w:rPr>
-                <w:rFonts w:cs="Noto Sans Thai"/>
-                <w:sz w:val="21"/>
-              </w:rPr>
-              <w:t>CAD API automation in engineering design</w:t>
-            </w:r>
-          </w:p>
-        </w:tc>
-        <w:tc>
-          <w:tcPr>
-            <w:tcW w:w="2163" w:type="dxa"/>
-            <w:tcMar>
-              <w:top w:w="80" w:type="dxa"/>
-              <w:left w:w="90" w:type="dxa"/>
-              <w:bottom w:w="80" w:type="dxa"/>
-              <w:right w:w="90" w:type="dxa"/>
-            </w:tcMar>
-            <w:vAlign w:val="center"/>
-          </w:tcPr>
-          <w:p>
-            <w:r>
-              <w:rPr>
-                <w:rFonts w:cs="Noto Sans Thai"/>
-                <w:sz w:val="21"/>
-              </w:rPr>
-              <w:t>Repetitive task automation in industrial workflow</w:t>
-            </w:r>
-          </w:p>
-        </w:tc>
-        <w:tc>
-          <w:tcPr>
-            <w:tcW w:w="2163" w:type="dxa"/>
-            <w:tcMar>
-              <w:top w:w="80" w:type="dxa"/>
-              <w:left w:w="90" w:type="dxa"/>
-              <w:bottom w:w="80" w:type="dxa"/>
-              <w:right w:w="90" w:type="dxa"/>
-            </w:tcMar>
-            <w:vAlign w:val="center"/>
-          </w:tcPr>
-          <w:p>
-            <w:proofErr w:type="spellStart"/>
-            <w:r>
-              <w:rPr>
-                <w:rFonts w:cs="Noto Sans Thai"/>
-                <w:sz w:val="21"/>
-              </w:rPr>
-              <w:t>บทที่</w:t>
-            </w:r>
-            <w:proofErr w:type="spellEnd"/>
-            <w:r>
-              <w:rPr>
-                <w:rFonts w:cs="Noto Sans Thai"/>
-                <w:sz w:val="21"/>
-              </w:rPr>
-              <w:t xml:space="preserve"> 2, 3</w:t>
-            </w:r>
-          </w:p>
-        </w:tc>
-      </w:tr>
-      <w:tr>
-        <w:trPr>
-          <w:cantSplit/>
-          <w:jc w:val="center"/>
-        </w:trPr>
-        <w:tc>
-          <w:tcPr>
-            <w:tcW w:w="2163" w:type="dxa"/>
-            <w:tcMar>
-              <w:top w:w="80" w:type="dxa"/>
-              <w:left w:w="90" w:type="dxa"/>
-              <w:bottom w:w="80" w:type="dxa"/>
-              <w:right w:w="90" w:type="dxa"/>
-            </w:tcMar>
-            <w:vAlign w:val="center"/>
-          </w:tcPr>
-          <w:p>
-            <w:r>
-              <w:rPr>
-                <w:rFonts w:cs="Noto Sans Thai"/>
-                <w:sz w:val="21"/>
-              </w:rPr>
-              <w:t>Parfitt et al. (1993)</w:t>
-            </w:r>
-          </w:p>
-        </w:tc>
-        <w:tc>
-          <w:tcPr>
-            <w:tcW w:w="2163" w:type="dxa"/>
-            <w:tcMar>
-              <w:top w:w="80" w:type="dxa"/>
-              <w:left w:w="90" w:type="dxa"/>
-              <w:bottom w:w="80" w:type="dxa"/>
-              <w:right w:w="90" w:type="dxa"/>
-            </w:tcMar>
-            <w:vAlign w:val="center"/>
-          </w:tcPr>
-          <w:p>
-            <w:r>
-              <w:rPr>
-                <w:rFonts w:cs="Noto Sans Thai"/>
-                <w:sz w:val="21"/>
-              </w:rPr>
-              <w:t>Automated quality control for working drawings</w:t>
-            </w:r>
-          </w:p>
-        </w:tc>
-        <w:tc>
-          <w:tcPr>
-            <w:tcW w:w="2163" w:type="dxa"/>
-            <w:tcMar>
-              <w:top w:w="80" w:type="dxa"/>
-              <w:left w:w="90" w:type="dxa"/>
-              <w:bottom w:w="80" w:type="dxa"/>
-              <w:right w:w="90" w:type="dxa"/>
-            </w:tcMar>
-            <w:vAlign w:val="center"/>
-          </w:tcPr>
-          <w:p>
-            <w:r>
-              <w:rPr>
-                <w:rFonts w:cs="Noto Sans Thai"/>
-                <w:sz w:val="21"/>
-              </w:rPr>
-              <w:t>Drawing QA/QC automation</w:t>
-            </w:r>
-          </w:p>
-        </w:tc>
-        <w:tc>
-          <w:tcPr>
-            <w:tcW w:w="2163" w:type="dxa"/>
-            <w:tcMar>
-              <w:top w:w="80" w:type="dxa"/>
-              <w:left w:w="90" w:type="dxa"/>
-              <w:bottom w:w="80" w:type="dxa"/>
-              <w:right w:w="90" w:type="dxa"/>
-            </w:tcMar>
-            <w:vAlign w:val="center"/>
-          </w:tcPr>
-          <w:p>
-            <w:proofErr w:type="spellStart"/>
-            <w:r>
-              <w:rPr>
-                <w:rFonts w:cs="Noto Sans Thai"/>
-                <w:sz w:val="21"/>
-              </w:rPr>
-              <w:t>บทที่</w:t>
-            </w:r>
-            <w:proofErr w:type="spellEnd"/>
-            <w:r>
-              <w:rPr>
-                <w:rFonts w:cs="Noto Sans Thai"/>
-                <w:sz w:val="21"/>
-              </w:rPr>
-              <w:t xml:space="preserve"> 2</w:t>
-            </w:r>
-          </w:p>
-        </w:tc>
-      </w:tr>
-      <w:tr>
-        <w:trPr>
-          <w:cantSplit/>
-          <w:jc w:val="center"/>
-        </w:trPr>
-        <w:tc>
-          <w:tcPr>
-            <w:tcW w:w="2163" w:type="dxa"/>
-            <w:tcMar>
-              <w:top w:w="80" w:type="dxa"/>
-              <w:left w:w="90" w:type="dxa"/>
-              <w:bottom w:w="80" w:type="dxa"/>
-              <w:right w:w="90" w:type="dxa"/>
-            </w:tcMar>
-            <w:vAlign w:val="center"/>
-          </w:tcPr>
-          <w:p>
-            <w:r>
-              <w:rPr>
-                <w:rFonts w:cs="Noto Sans Thai"/>
-                <w:sz w:val="21"/>
-              </w:rPr>
-              <w:t>Scheibel et al. (2021)</w:t>
-            </w:r>
-          </w:p>
-        </w:tc>
-        <w:tc>
-          <w:tcPr>
-            <w:tcW w:w="2163" w:type="dxa"/>
-            <w:tcMar>
-              <w:top w:w="80" w:type="dxa"/>
-              <w:left w:w="90" w:type="dxa"/>
-              <w:bottom w:w="80" w:type="dxa"/>
-              <w:right w:w="90" w:type="dxa"/>
-            </w:tcMar>
-            <w:vAlign w:val="center"/>
-          </w:tcPr>
-          <w:p>
-            <w:r>
-              <w:rPr>
-                <w:rFonts w:cs="Noto Sans Thai"/>
-                <w:sz w:val="21"/>
-              </w:rPr>
-              <w:t>Engineering drawing information for QC</w:t>
-            </w:r>
-          </w:p>
-        </w:tc>
-        <w:tc>
-          <w:tcPr>
-            <w:tcW w:w="2163" w:type="dxa"/>
-            <w:tcMar>
-              <w:top w:w="80" w:type="dxa"/>
-              <w:left w:w="90" w:type="dxa"/>
-              <w:bottom w:w="80" w:type="dxa"/>
-              <w:right w:w="90" w:type="dxa"/>
-            </w:tcMar>
-            <w:vAlign w:val="center"/>
-          </w:tcPr>
-          <w:p>
-            <w:r>
-              <w:rPr>
-                <w:rFonts w:cs="Noto Sans Thai"/>
-                <w:sz w:val="21"/>
-              </w:rPr>
-              <w:t>Automated drawing information processing</w:t>
-            </w:r>
-          </w:p>
-        </w:tc>
-        <w:tc>
-          <w:tcPr>
-            <w:tcW w:w="2163" w:type="dxa"/>
-            <w:tcMar>
-              <w:top w:w="80" w:type="dxa"/>
-              <w:left w:w="90" w:type="dxa"/>
-              <w:bottom w:w="80" w:type="dxa"/>
-              <w:right w:w="90" w:type="dxa"/>
-            </w:tcMar>
-            <w:vAlign w:val="center"/>
-          </w:tcPr>
-          <w:p>
-            <w:proofErr w:type="spellStart"/>
-            <w:r>
-              <w:rPr>
-                <w:rFonts w:cs="Noto Sans Thai"/>
-                <w:sz w:val="21"/>
-              </w:rPr>
-              <w:t>บทที่</w:t>
-            </w:r>
-            <w:proofErr w:type="spellEnd"/>
-            <w:r>
-              <w:rPr>
-                <w:rFonts w:cs="Noto Sans Thai"/>
-                <w:sz w:val="21"/>
-              </w:rPr>
-              <w:t xml:space="preserve"> 2</w:t>
-            </w:r>
-          </w:p>
-        </w:tc>
-      </w:tr>
-      <w:tr>
-        <w:trPr>
-          <w:cantSplit/>
-          <w:jc w:val="center"/>
-        </w:trPr>
-        <w:tc>
-          <w:tcPr>
-            <w:tcW w:w="2163" w:type="dxa"/>
-            <w:tcMar>
-              <w:top w:w="80" w:type="dxa"/>
-              <w:left w:w="90" w:type="dxa"/>
-              <w:bottom w:w="80" w:type="dxa"/>
-              <w:right w:w="90" w:type="dxa"/>
-            </w:tcMar>
-            <w:vAlign w:val="center"/>
-          </w:tcPr>
-          <w:p>
-            <w:r>
-              <w:rPr>
-                <w:rFonts w:cs="Noto Sans Thai"/>
-                <w:sz w:val="21"/>
-              </w:rPr>
-              <w:t>Eastman et al. (2009)</w:t>
-            </w:r>
-          </w:p>
-        </w:tc>
-        <w:tc>
-          <w:tcPr>
-            <w:tcW w:w="2163" w:type="dxa"/>
-            <w:tcMar>
-              <w:top w:w="80" w:type="dxa"/>
-              <w:left w:w="90" w:type="dxa"/>
-              <w:bottom w:w="80" w:type="dxa"/>
-              <w:right w:w="90" w:type="dxa"/>
-            </w:tcMar>
-            <w:vAlign w:val="center"/>
-          </w:tcPr>
-          <w:p>
-            <w:r>
-              <w:rPr>
-                <w:rFonts w:cs="Noto Sans Thai"/>
-                <w:sz w:val="21"/>
-              </w:rPr>
-              <w:t>Automatic rule-based checking</w:t>
-            </w:r>
-          </w:p>
-        </w:tc>
-        <w:tc>
-          <w:tcPr>
-            <w:tcW w:w="2163" w:type="dxa"/>
-            <w:tcMar>
-              <w:top w:w="80" w:type="dxa"/>
-              <w:left w:w="90" w:type="dxa"/>
-              <w:bottom w:w="80" w:type="dxa"/>
-              <w:right w:w="90" w:type="dxa"/>
-            </w:tcMar>
-            <w:vAlign w:val="center"/>
-          </w:tcPr>
-          <w:p>
-            <w:r>
-              <w:rPr>
-                <w:rFonts w:cs="Noto Sans Thai"/>
-                <w:sz w:val="21"/>
-              </w:rPr>
-              <w:t>Rule checking framework</w:t>
-            </w:r>
-          </w:p>
-        </w:tc>
-        <w:tc>
-          <w:tcPr>
-            <w:tcW w:w="2163" w:type="dxa"/>
-            <w:tcMar>
-              <w:top w:w="80" w:type="dxa"/>
-              <w:left w:w="90" w:type="dxa"/>
-              <w:bottom w:w="80" w:type="dxa"/>
-              <w:right w:w="90" w:type="dxa"/>
-            </w:tcMar>
-            <w:vAlign w:val="center"/>
-          </w:tcPr>
-          <w:p>
-            <w:proofErr w:type="spellStart"/>
-            <w:r>
-              <w:rPr>
-                <w:rFonts w:cs="Noto Sans Thai"/>
-                <w:sz w:val="21"/>
-              </w:rPr>
-              <w:t>บทที่</w:t>
-            </w:r>
-            <w:proofErr w:type="spellEnd"/>
-            <w:r>
-              <w:rPr>
-                <w:rFonts w:cs="Noto Sans Thai"/>
-                <w:sz w:val="21"/>
-              </w:rPr>
-              <w:t xml:space="preserve"> 2, 3</w:t>
-            </w:r>
-          </w:p>
-        </w:tc>
-      </w:tr>
-      <w:tr>
-        <w:trPr>
-          <w:cantSplit/>
-          <w:jc w:val="center"/>
-        </w:trPr>
-        <w:tc>
-          <w:tcPr>
-            <w:tcW w:w="2163" w:type="dxa"/>
-            <w:tcMar>
-              <w:top w:w="80" w:type="dxa"/>
-              <w:left w:w="90" w:type="dxa"/>
-              <w:bottom w:w="80" w:type="dxa"/>
-              <w:right w:w="90" w:type="dxa"/>
-            </w:tcMar>
-            <w:vAlign w:val="center"/>
-          </w:tcPr>
-          <w:p>
-            <w:proofErr w:type="spellStart"/>
-            <w:r>
-              <w:rPr>
-                <w:rFonts w:cs="Noto Sans Thai"/>
-                <w:sz w:val="21"/>
-              </w:rPr>
-              <w:t>Solihin</w:t>
-            </w:r>
-            <w:proofErr w:type="spellEnd"/>
-            <w:r>
-              <w:rPr>
-                <w:rFonts w:cs="Noto Sans Thai"/>
-                <w:sz w:val="21"/>
-              </w:rPr>
-              <w:t xml:space="preserve"> &amp; Eastman (2015)</w:t>
-            </w:r>
-          </w:p>
-        </w:tc>
-        <w:tc>
-          <w:tcPr>
-            <w:tcW w:w="2163" w:type="dxa"/>
-            <w:tcMar>
-              <w:top w:w="80" w:type="dxa"/>
-              <w:left w:w="90" w:type="dxa"/>
-              <w:bottom w:w="80" w:type="dxa"/>
-              <w:right w:w="90" w:type="dxa"/>
-            </w:tcMar>
-            <w:vAlign w:val="center"/>
-          </w:tcPr>
-          <w:p>
-            <w:r>
-              <w:rPr>
-                <w:rFonts w:cs="Noto Sans Thai"/>
-                <w:sz w:val="21"/>
-              </w:rPr>
-              <w:t>Classification of automated checking rules</w:t>
-            </w:r>
-          </w:p>
-        </w:tc>
-        <w:tc>
-          <w:tcPr>
-            <w:tcW w:w="2163" w:type="dxa"/>
-            <w:tcMar>
-              <w:top w:w="80" w:type="dxa"/>
-              <w:left w:w="90" w:type="dxa"/>
-              <w:bottom w:w="80" w:type="dxa"/>
-              <w:right w:w="90" w:type="dxa"/>
-            </w:tcMar>
-            <w:vAlign w:val="center"/>
-          </w:tcPr>
-          <w:p>
-            <w:r>
-              <w:rPr>
-                <w:rFonts w:cs="Noto Sans Thai"/>
-                <w:sz w:val="21"/>
-              </w:rPr>
-              <w:t>Rule complexity and automation limits</w:t>
-            </w:r>
-          </w:p>
-        </w:tc>
-        <w:tc>
-          <w:tcPr>
-            <w:tcW w:w="2163" w:type="dxa"/>
-            <w:tcMar>
-              <w:top w:w="80" w:type="dxa"/>
-              <w:left w:w="90" w:type="dxa"/>
-              <w:bottom w:w="80" w:type="dxa"/>
-              <w:right w:w="90" w:type="dxa"/>
-            </w:tcMar>
-            <w:vAlign w:val="center"/>
-          </w:tcPr>
-          <w:p>
-            <w:proofErr w:type="spellStart"/>
-            <w:r>
-              <w:rPr>
-                <w:rFonts w:cs="Noto Sans Thai"/>
-                <w:sz w:val="21"/>
-              </w:rPr>
-              <w:t>บทที่</w:t>
-            </w:r>
-            <w:proofErr w:type="spellEnd"/>
-            <w:r>
-              <w:rPr>
-                <w:rFonts w:cs="Noto Sans Thai"/>
-                <w:sz w:val="21"/>
-              </w:rPr>
-              <w:t xml:space="preserve"> 2, 5</w:t>
-            </w:r>
-          </w:p>
-        </w:tc>
-      </w:tr>
-    </w:tbl>
-    <w:p>
-      <w:pPr>
-        <w:spacing w:before="80" w:after="100"/>
-        <w:jc w:val="center"/>
-      </w:pPr>
-      <w:proofErr w:type="spellStart"/>
-      <w:r>
-        <w:rPr>
-          <w:rFonts w:cs="Noto Sans Thai"/>
-          <w:b/>
-          <w:sz w:val="23"/>
-        </w:rPr>
-        <w:t>ตาราง</w:t>
-      </w:r>
-      <w:proofErr w:type="spellEnd"/>
-      <w:r>
-        <w:rPr>
-          <w:rFonts w:cs="Noto Sans Thai"/>
-          <w:b/>
-          <w:sz w:val="23"/>
-        </w:rPr>
-        <w:t xml:space="preserve"> 2.1 Literature Matrix </w:t>
-      </w:r>
-      <w:proofErr w:type="spellStart"/>
-      <w:r>
-        <w:rPr>
-          <w:rFonts w:cs="Noto Sans Thai"/>
-          <w:b/>
-          <w:sz w:val="23"/>
-        </w:rPr>
-        <w:t>เบื้องต้น</w:t>
-      </w:r>
-      <w:proofErr w:type="spellEnd"/>
-    </w:p>
-    <w:p>
-      <w:r>
-        <w:br w:type="page"/>
-      </w:r>
+      <w:pPr/>
     </w:p>
     <w:p>
       <w:pPr>
@@ -24408,6 +23029,11 @@
           <w:rFonts w:ascii="Noto Sans Thai" w:eastAsia="Noto Sans Thai" w:hAnsi="Noto Sans Thai" w:cs="Noto Sans Thai"/>
         </w:rPr>
         <w:t xml:space="preserve"> Before / After</w:t>
+      </w:r>
+    </w:p>
+    <w:p>
+      <w:r>
+        <w:t>เพื่อรักษาความลับของสถานประกอบการและโครงการ ภาพตัวอย่างในรายงานใช้การ Crop หรือปกปิดข้อมูลเฉพาะส่วนที่ไม่จำเป็นต่อการอธิบายผลของ AUTOSHEET เช่น รายละเอียดเชิงวิศวกรรม รหัสเอกสาร ลายเซ็น หรือข้อมูลโครงการ โดยคงไว้เฉพาะส่วนที่ใช้แสดง Before/After, Scale, Title Block, File Path และผลการจัดเตรียม Drawing ก่อน Plot. ไฟล์ต้นฉบับฉบับเต็มเก็บไว้เป็นหลักฐานภายในและไม่รวมในฉบับเผยแพร่ เว้นแต่ได้รับอนุญาตจากสถานประกอบการ.</w:t>
       </w:r>
     </w:p>
     <w:p>
@@ -25144,853 +23770,189 @@
     </w:p>
     <w:p>
       <w:pPr>
-        <w:spacing w:after="280"/>
         <w:jc w:val="center"/>
       </w:pPr>
-      <w:proofErr w:type="spellStart"/>
-      <w:r>
-        <w:rPr>
-          <w:rFonts w:cs="Noto Sans Thai"/>
+      <w:r>
+        <w:rPr>
           <w:b/>
-          <w:sz w:val="40"/>
-        </w:rPr>
-        <w:t>สรุป</w:t>
-      </w:r>
-      <w:proofErr w:type="spellEnd"/>
-      <w:r>
-        <w:rPr>
-          <w:rFonts w:cs="Noto Sans Thai"/>
-          <w:b/>
-          <w:sz w:val="40"/>
-        </w:rPr>
-        <w:t xml:space="preserve"> </w:t>
-      </w:r>
-      <w:proofErr w:type="spellStart"/>
-      <w:r>
-        <w:rPr>
-          <w:rFonts w:cs="Noto Sans Thai"/>
-          <w:b/>
-          <w:sz w:val="40"/>
-        </w:rPr>
-        <w:t>อภิปรายผล</w:t>
-      </w:r>
-      <w:proofErr w:type="spellEnd"/>
-      <w:r>
-        <w:rPr>
-          <w:rFonts w:cs="Noto Sans Thai"/>
-          <w:b/>
-          <w:sz w:val="40"/>
-        </w:rPr>
-        <w:t xml:space="preserve"> </w:t>
-      </w:r>
-      <w:proofErr w:type="spellStart"/>
-      <w:r>
-        <w:rPr>
-          <w:rFonts w:cs="Noto Sans Thai"/>
-          <w:b/>
-          <w:sz w:val="40"/>
-        </w:rPr>
-        <w:t>และข้อเสนอแนะ</w:t>
-      </w:r>
-      <w:proofErr w:type="spellEnd"/>
+        </w:rPr>
+        <w:t>สรุป อภิปรายผล และข้อเสนอแนะ</w:t>
+      </w:r>
     </w:p>
     <w:p>
       <w:pPr>
         <w:pStyle w:val="Heading1"/>
-        <w:spacing w:before="160" w:after="100"/>
       </w:pPr>
       <w:r>
-        <w:rPr>
-          <w:rFonts w:ascii="Noto Sans Thai" w:eastAsia="Noto Sans Thai" w:hAnsi="Noto Sans Thai" w:cs="Noto Sans Thai"/>
-        </w:rPr>
-        <w:t xml:space="preserve">5.1 </w:t>
-      </w:r>
-      <w:proofErr w:type="spellStart"/>
-      <w:r>
-        <w:rPr>
-          <w:rFonts w:ascii="Noto Sans Thai" w:eastAsia="Noto Sans Thai" w:hAnsi="Noto Sans Thai" w:cs="Noto Sans Thai"/>
-        </w:rPr>
-        <w:t>สรุปผลตามวัตถุประสงค์</w:t>
-      </w:r>
-      <w:proofErr w:type="spellEnd"/>
+        <w:t>5.1 สรุปผลตามวัตถุประสงค์</w:t>
+      </w:r>
     </w:p>
-    <w:tbl>
-      <w:tblPr>
-        <w:tblStyle w:val="TableGrid"/>
-        <w:tblW w:w="0" w:type="auto"/>
-        <w:jc w:val="center"/>
-        <w:tblLook w:val="04A0" w:firstRow="1" w:lastRow="0" w:firstColumn="1" w:lastColumn="0" w:noHBand="0" w:noVBand="1"/>
-      </w:tblPr>
-      <w:tblGrid>
-        <w:gridCol w:w="8642"/>
-      </w:tblGrid>
-      <w:tr>
-        <w:trPr>
-          <w:cantSplit/>
-          <w:jc w:val="center"/>
-        </w:trPr>
-        <w:tc>
-          <w:tcPr>
-            <w:tcW w:w="8652" w:type="dxa"/>
-            <w:shd w:val="clear" w:color="auto" w:fill="F3F3F3"/>
-            <w:tcMar>
-              <w:top w:w="120" w:type="dxa"/>
-              <w:left w:w="140" w:type="dxa"/>
-              <w:bottom w:w="120" w:type="dxa"/>
-              <w:right w:w="140" w:type="dxa"/>
-            </w:tcMar>
-          </w:tcPr>
-          <w:p>
-            <w:r>
-              <w:rPr>
-                <w:rFonts w:cs="Noto Sans Thai"/>
-                <w:i/>
-                <w:color w:val="666666"/>
-                <w:sz w:val="24"/>
-              </w:rPr>
-              <w:t>[</w:t>
-            </w:r>
-            <w:proofErr w:type="spellStart"/>
-            <w:r>
-              <w:rPr>
-                <w:rFonts w:cs="Noto Sans Thai"/>
-                <w:i/>
-                <w:color w:val="666666"/>
-                <w:sz w:val="24"/>
-              </w:rPr>
-              <w:t>เว้นไว้สำหรับเติมภายหลัง</w:t>
-            </w:r>
-            <w:proofErr w:type="spellEnd"/>
-            <w:r>
-              <w:rPr>
-                <w:rFonts w:cs="Noto Sans Thai"/>
-                <w:i/>
-                <w:color w:val="666666"/>
-                <w:sz w:val="24"/>
-              </w:rPr>
-              <w:t xml:space="preserve">] </w:t>
-            </w:r>
-            <w:proofErr w:type="spellStart"/>
-            <w:r>
-              <w:rPr>
-                <w:rFonts w:cs="Noto Sans Thai"/>
-                <w:i/>
-                <w:color w:val="666666"/>
-                <w:sz w:val="24"/>
-              </w:rPr>
-              <w:t>ตอบวัตถุประสงค์ทั้ง</w:t>
-            </w:r>
-            <w:proofErr w:type="spellEnd"/>
-            <w:r>
-              <w:rPr>
-                <w:rFonts w:cs="Noto Sans Thai"/>
-                <w:i/>
-                <w:color w:val="666666"/>
-                <w:sz w:val="24"/>
-              </w:rPr>
-              <w:t xml:space="preserve"> 4 </w:t>
-            </w:r>
-            <w:proofErr w:type="spellStart"/>
-            <w:r>
-              <w:rPr>
-                <w:rFonts w:cs="Noto Sans Thai"/>
-                <w:i/>
-                <w:color w:val="666666"/>
-                <w:sz w:val="24"/>
-              </w:rPr>
-              <w:t>ข้อโดยอ้างอิงผลจริงจากบทที่</w:t>
-            </w:r>
-            <w:proofErr w:type="spellEnd"/>
-            <w:r>
-              <w:rPr>
-                <w:rFonts w:cs="Noto Sans Thai"/>
-                <w:i/>
-                <w:color w:val="666666"/>
-                <w:sz w:val="24"/>
-              </w:rPr>
-              <w:t xml:space="preserve"> 4</w:t>
-            </w:r>
-          </w:p>
-        </w:tc>
-      </w:tr>
-    </w:tbl>
     <w:p>
-      <w:pPr>
-        <w:spacing w:after="0"/>
-      </w:pPr>
+      <w:pPr/>
+      <w:r>
+        <w:t>โครงงานนี้มีวัตถุประสงค์เพื่อศึกษากระบวนการจัดเตรียมและตรวจสอบแบบวิศวกรรมก่อนการ Plot วิเคราะห์งานซ้ำที่สามารถทำ Automation พัฒนาต้นแบบ AUTOSHEET ด้วย AutoLISP และประเมินผลเมื่อเทียบกับกระบวนการ Manual. ผลการดำเนินงานสามารถสรุปตามวัตถุประสงค์ได้ดังนี้:</w:t>
+      </w:r>
+    </w:p>
+    <w:p>
+      <w:pPr/>
+      <w:r>
+        <w:t>1) จากการศึกษากระบวนการเดิมพบว่าการจัดเตรียม Drawing จำนวนมากต้องดำเนินการซ้ำในหลาย Layout ทั้งการแก้ Title Block, Drawing Code, Font, Scale, Paper, Plot Setting และการลบข้อมูลที่ไม่ต้องการ จึงเหมาะกับการวิเคราะห์ในรูป Requirement ที่สามารถตรวจสอบและดำเนินการซ้ำอย่างเป็นระบบ.</w:t>
+      </w:r>
+    </w:p>
+    <w:p>
+      <w:pPr/>
+      <w:r>
+        <w:t>2) งานที่มี Target ชัดเจน เช่น Font, Text Height, Width Factor, Drawing Code, Paper, Plotter, CTB และ File Path สามารถกำหนดเป็น rule และดำเนินการอัตโนมัติได้ ส่วน Scale Alignment (R08) สามารถปรับเนื้อหาและรูปแบบได้แต่ยังต้อง Manual Touch-up ด้านตำแหน่ง.</w:t>
+      </w:r>
+    </w:p>
+    <w:p>
+      <w:pPr/>
+      <w:r>
+        <w:t>3) AUTOSHEET ถูกพัฒนาจาก LISP เฉพาะงานไปสู่ workflow ที่ใช้ AUTOSHEET ตามด้วย A3TITLEBOXALL และ Auto-only QA ก่อน Manual Final QA. ระบบรุ่นประเมินผลสามารถทำ Requirement ได้เต็มรูปแบบ 26 จาก 27 ข้อในทุก Test Case และหลัง Touch-up สามารถทำให้ Drawing ผ่านทั้ง 27 ข้อและอยู่ในสถานะ Ready to Plot.</w:t>
+      </w:r>
+    </w:p>
+    <w:p>
+      <w:pPr/>
+      <w:r>
+        <w:t>4) การประเมิน T01–T05 ครอบคลุม 5 DWG รวม 15 Layout. Manual ใช้เวลารวม 29 นาที 11.52 วินาที ขณะที่ Auto-assisted workflow ซึ่งรวมเวลา Automation และ Manual Touch-up ใช้ 15 นาที 51.80 วินาที คิดเป็นการลดเวลารวมประมาณ 45.7% ในชุดทดสอบนี้. ผลดังกล่าวแสดงว่าระบบสามารถลดภาระงานซ้ำได้ แม้ยังไม่สามารถแทนที่ Final Visual QA ได้ทั้งหมด.</w:t>
+      </w:r>
+    </w:p>
+    <w:p>
+      <w:pPr/>
     </w:p>
     <w:p>
       <w:pPr>
         <w:pStyle w:val="Heading1"/>
-        <w:spacing w:before="160" w:after="100"/>
       </w:pPr>
       <w:r>
-        <w:rPr>
-          <w:rFonts w:ascii="Noto Sans Thai" w:eastAsia="Noto Sans Thai" w:hAnsi="Noto Sans Thai" w:cs="Noto Sans Thai"/>
-        </w:rPr>
-        <w:t xml:space="preserve">5.2 </w:t>
-      </w:r>
-      <w:proofErr w:type="spellStart"/>
-      <w:r>
-        <w:rPr>
-          <w:rFonts w:ascii="Noto Sans Thai" w:eastAsia="Noto Sans Thai" w:hAnsi="Noto Sans Thai" w:cs="Noto Sans Thai"/>
-        </w:rPr>
-        <w:t>อภิปรายผล</w:t>
-      </w:r>
-      <w:proofErr w:type="spellEnd"/>
+        <w:t>5.2 อภิปรายผล</w:t>
+      </w:r>
     </w:p>
-    <w:tbl>
-      <w:tblPr>
-        <w:tblStyle w:val="TableGrid"/>
-        <w:tblW w:w="0" w:type="auto"/>
-        <w:jc w:val="center"/>
-        <w:tblLook w:val="04A0" w:firstRow="1" w:lastRow="0" w:firstColumn="1" w:lastColumn="0" w:noHBand="0" w:noVBand="1"/>
-      </w:tblPr>
-      <w:tblGrid>
-        <w:gridCol w:w="8642"/>
-      </w:tblGrid>
-      <w:tr>
-        <w:trPr>
-          <w:cantSplit/>
-          <w:jc w:val="center"/>
-        </w:trPr>
-        <w:tc>
-          <w:tcPr>
-            <w:tcW w:w="8652" w:type="dxa"/>
-            <w:shd w:val="clear" w:color="auto" w:fill="F3F3F3"/>
-            <w:tcMar>
-              <w:top w:w="120" w:type="dxa"/>
-              <w:left w:w="140" w:type="dxa"/>
-              <w:bottom w:w="120" w:type="dxa"/>
-              <w:right w:w="140" w:type="dxa"/>
-            </w:tcMar>
-          </w:tcPr>
-          <w:p>
-            <w:r>
-              <w:rPr>
-                <w:rFonts w:cs="Noto Sans Thai"/>
-                <w:i/>
-                <w:color w:val="666666"/>
-                <w:sz w:val="24"/>
-              </w:rPr>
-              <w:t>[</w:t>
-            </w:r>
-            <w:proofErr w:type="spellStart"/>
-            <w:r>
-              <w:rPr>
-                <w:rFonts w:cs="Noto Sans Thai"/>
-                <w:i/>
-                <w:color w:val="666666"/>
-                <w:sz w:val="24"/>
-              </w:rPr>
-              <w:t>เว้นไว้สำหรับเติมภายหลัง</w:t>
-            </w:r>
-            <w:proofErr w:type="spellEnd"/>
-            <w:r>
-              <w:rPr>
-                <w:rFonts w:cs="Noto Sans Thai"/>
-                <w:i/>
-                <w:color w:val="666666"/>
-                <w:sz w:val="24"/>
-              </w:rPr>
-              <w:t xml:space="preserve">] </w:t>
-            </w:r>
-            <w:proofErr w:type="spellStart"/>
-            <w:r>
-              <w:rPr>
-                <w:rFonts w:cs="Noto Sans Thai"/>
-                <w:i/>
-                <w:color w:val="666666"/>
-                <w:sz w:val="24"/>
-              </w:rPr>
-              <w:t>เชื่อมผลการทดลองกับงานวิจัยในบทที่</w:t>
-            </w:r>
-            <w:proofErr w:type="spellEnd"/>
-            <w:r>
-              <w:rPr>
-                <w:rFonts w:cs="Noto Sans Thai"/>
-                <w:i/>
-                <w:color w:val="666666"/>
-                <w:sz w:val="24"/>
-              </w:rPr>
-              <w:t xml:space="preserve"> 2 </w:t>
-            </w:r>
-            <w:proofErr w:type="spellStart"/>
-            <w:r>
-              <w:rPr>
-                <w:rFonts w:cs="Noto Sans Thai"/>
-                <w:i/>
-                <w:color w:val="666666"/>
-                <w:sz w:val="24"/>
-              </w:rPr>
-              <w:t>เช่น</w:t>
-            </w:r>
-            <w:proofErr w:type="spellEnd"/>
-            <w:r>
-              <w:rPr>
-                <w:rFonts w:cs="Noto Sans Thai"/>
-                <w:i/>
-                <w:color w:val="666666"/>
-                <w:sz w:val="24"/>
-              </w:rPr>
-              <w:t xml:space="preserve"> Rule-based checking, CAD automation </w:t>
-            </w:r>
-            <w:proofErr w:type="spellStart"/>
-            <w:r>
-              <w:rPr>
-                <w:rFonts w:cs="Noto Sans Thai"/>
-                <w:i/>
-                <w:color w:val="666666"/>
-                <w:sz w:val="24"/>
-              </w:rPr>
-              <w:t>และ</w:t>
-            </w:r>
-            <w:proofErr w:type="spellEnd"/>
-            <w:r>
-              <w:rPr>
-                <w:rFonts w:cs="Noto Sans Thai"/>
-                <w:i/>
-                <w:color w:val="666666"/>
-                <w:sz w:val="24"/>
-              </w:rPr>
-              <w:t xml:space="preserve"> Human Validation </w:t>
-            </w:r>
-            <w:proofErr w:type="spellStart"/>
-            <w:r>
-              <w:rPr>
-                <w:rFonts w:cs="Noto Sans Thai"/>
-                <w:i/>
-                <w:color w:val="666666"/>
-                <w:sz w:val="24"/>
-              </w:rPr>
-              <w:t>โดยไม่อ้างผลของงานวิจัยอื่นเป็นผลของ</w:t>
-            </w:r>
-            <w:proofErr w:type="spellEnd"/>
-            <w:r>
-              <w:rPr>
-                <w:rFonts w:cs="Noto Sans Thai"/>
-                <w:i/>
-                <w:color w:val="666666"/>
-                <w:sz w:val="24"/>
-              </w:rPr>
-              <w:t xml:space="preserve"> AUTOSHEET</w:t>
-            </w:r>
-          </w:p>
-        </w:tc>
-      </w:tr>
-    </w:tbl>
     <w:p>
-      <w:pPr>
-        <w:spacing w:after="0"/>
-      </w:pPr>
+      <w:pPr/>
+      <w:r>
+        <w:t>ผลการทดลองแสดงให้เห็นว่าประสิทธิผลของ Automation ขึ้นอยู่กับลักษณะของ Requirement. R01–R07 และ R09–R27 ซึ่งส่วนใหญ่เป็น property-based หรือ condition-based rules สามารถตรวจและแก้ได้สม่ำเสมอในทั้ง 5 Test Cases ขณะที่ R08 เกิด Partial result ซ้ำในทุกกรณี. Pattern ดังกล่าวสอดคล้องกับแนวคิดของ Solihin and Eastman (2015) ที่ชี้ว่าความซับซ้อนของกฎและเงื่อนไขเชิงบริบทมีผลโดยตรงต่อความสามารถในการทำ automated rule checking.</w:t>
+      </w:r>
+    </w:p>
+    <w:p>
+      <w:pPr/>
+      <w:r>
+        <w:t>เมื่อพิจารณาด้านเวลา พบว่า runtime ของคำสั่งอัตโนมัติอยู่ในระดับวินาที แต่เวลา Auto-assisted ที่ใช้เป็น KPI หลักยังต้องรวม Manual Touch-up และ Final QA. การเลือกใช้เวลารวมจนถึง Ready to Plot ทำให้การเปรียบเทียบกับ Manual มีความเป็นธรรมมากกว่าการเปรียบเทียบ runtime ของ script เพียงอย่างเดียว. แนวทางนี้สอดคล้องกับแนวคิดของ Rica et al. (2020) ซึ่งเสนอให้ Automation ลดภาระของผู้ตรวจโดยไม่ตัด human validation ออกจากกระบวนการ.</w:t>
+      </w:r>
+    </w:p>
+    <w:p>
+      <w:pPr/>
+      <w:r>
+        <w:t>ผลรวมลดเวลาประมาณ 45.7% ไม่ควรถูกตีความว่า AUTOSHEET จะลดเวลาได้เท่ากันกับ Drawing ทุกประเภท เนื่องจากแต่ละ Test Case มีจำนวน Layout และความซับซ้อนต่างกัน อย่างไรก็ตาม การที่ทุกกรณีสามารถลดเวลาจาก Manual และไปถึง Ready to Plot หลัง Touch-up แสดงให้เห็นศักยภาพของ workflow ในฐานะเครื่องมือช่วยเตรียมแบบ. ผลนี้สอดคล้องเชิงแนวคิดกับ Sofias et al. (2025) ที่แสดงให้เห็นประโยชน์ของ CAD/API automation ต่อ repetitive engineering tasks ใน workflow จริง.</w:t>
+      </w:r>
+    </w:p>
+    <w:p>
+      <w:pPr/>
+      <w:r>
+        <w:t>อีกประเด็นหนึ่งคือการรักษาความปลอดภัยของ Drawing. กรณี Full Sheet Frame ทำให้เห็นว่าการ automate โดยตั้งสมมติฐานกับ Block ทุกชนิดอาจก่อให้เกิด destructive edit ได้ จึงต้องมีขั้นตอน Scan, Diagnostic, Preserve และ Skip+Warn. ประเด็นนี้ทำให้ AUTOSHEET มีลักษณะเป็น assisted workflow มากกว่าระบบที่แก้ทุก Drawing โดยอัตโนมัติโดยไม่มีการตรวจสอบ.</w:t>
+      </w:r>
+    </w:p>
+    <w:p>
+      <w:pPr/>
     </w:p>
     <w:p>
       <w:pPr>
         <w:pStyle w:val="Heading1"/>
-        <w:spacing w:before="160" w:after="100"/>
       </w:pPr>
       <w:r>
-        <w:rPr>
-          <w:rFonts w:ascii="Noto Sans Thai" w:eastAsia="Noto Sans Thai" w:hAnsi="Noto Sans Thai" w:cs="Noto Sans Thai"/>
-        </w:rPr>
-        <w:t xml:space="preserve">5.3 </w:t>
-      </w:r>
-      <w:proofErr w:type="spellStart"/>
-      <w:r>
-        <w:rPr>
-          <w:rFonts w:ascii="Noto Sans Thai" w:eastAsia="Noto Sans Thai" w:hAnsi="Noto Sans Thai" w:cs="Noto Sans Thai"/>
-        </w:rPr>
-        <w:t>ข้อจำกัดของ</w:t>
-      </w:r>
-      <w:proofErr w:type="spellEnd"/>
-      <w:r>
-        <w:rPr>
-          <w:rFonts w:ascii="Noto Sans Thai" w:eastAsia="Noto Sans Thai" w:hAnsi="Noto Sans Thai" w:cs="Noto Sans Thai"/>
-        </w:rPr>
-        <w:t xml:space="preserve"> AUTOSHEET</w:t>
+        <w:t>5.3 ข้อจำกัดของ AUTOSHEET</w:t>
       </w:r>
     </w:p>
-    <w:tbl>
-      <w:tblPr>
-        <w:tblStyle w:val="TableGrid"/>
-        <w:tblW w:w="0" w:type="auto"/>
-        <w:jc w:val="center"/>
-        <w:tblLook w:val="04A0" w:firstRow="1" w:lastRow="0" w:firstColumn="1" w:lastColumn="0" w:noHBand="0" w:noVBand="1"/>
-      </w:tblPr>
-      <w:tblGrid>
-        <w:gridCol w:w="8642"/>
-      </w:tblGrid>
-      <w:tr>
-        <w:trPr>
-          <w:cantSplit/>
-          <w:jc w:val="center"/>
-        </w:trPr>
-        <w:tc>
-          <w:tcPr>
-            <w:tcW w:w="8652" w:type="dxa"/>
-            <w:shd w:val="clear" w:color="auto" w:fill="F3F3F3"/>
-            <w:tcMar>
-              <w:top w:w="120" w:type="dxa"/>
-              <w:left w:w="140" w:type="dxa"/>
-              <w:bottom w:w="120" w:type="dxa"/>
-              <w:right w:w="140" w:type="dxa"/>
-            </w:tcMar>
-          </w:tcPr>
-          <w:p>
-            <w:r>
-              <w:rPr>
-                <w:rFonts w:cs="Noto Sans Thai"/>
-                <w:i/>
-                <w:color w:val="666666"/>
-                <w:sz w:val="24"/>
-              </w:rPr>
-              <w:t>[</w:t>
-            </w:r>
-            <w:proofErr w:type="spellStart"/>
-            <w:r>
-              <w:rPr>
-                <w:rFonts w:cs="Noto Sans Thai"/>
-                <w:i/>
-                <w:color w:val="666666"/>
-                <w:sz w:val="24"/>
-              </w:rPr>
-              <w:t>เว้นไว้สำหรับเติมภายหลัง</w:t>
-            </w:r>
-            <w:proofErr w:type="spellEnd"/>
-            <w:r>
-              <w:rPr>
-                <w:rFonts w:cs="Noto Sans Thai"/>
-                <w:i/>
-                <w:color w:val="666666"/>
-                <w:sz w:val="24"/>
-              </w:rPr>
-              <w:t xml:space="preserve">] </w:t>
-            </w:r>
-            <w:proofErr w:type="spellStart"/>
-            <w:r>
-              <w:rPr>
-                <w:rFonts w:cs="Noto Sans Thai"/>
-                <w:i/>
-                <w:color w:val="666666"/>
-                <w:sz w:val="24"/>
-              </w:rPr>
-              <w:t>สรุปข้อจำกัดจากผลจริง</w:t>
-            </w:r>
-            <w:proofErr w:type="spellEnd"/>
-            <w:r>
-              <w:rPr>
-                <w:rFonts w:cs="Noto Sans Thai"/>
-                <w:i/>
-                <w:color w:val="666666"/>
-                <w:sz w:val="24"/>
-              </w:rPr>
-              <w:t xml:space="preserve"> </w:t>
-            </w:r>
-            <w:proofErr w:type="spellStart"/>
-            <w:r>
-              <w:rPr>
-                <w:rFonts w:cs="Noto Sans Thai"/>
-                <w:i/>
-                <w:color w:val="666666"/>
-                <w:sz w:val="24"/>
-              </w:rPr>
-              <w:t>เช่น</w:t>
-            </w:r>
-            <w:proofErr w:type="spellEnd"/>
-            <w:r>
-              <w:rPr>
-                <w:rFonts w:cs="Noto Sans Thai"/>
-                <w:i/>
-                <w:color w:val="666666"/>
-                <w:sz w:val="24"/>
-              </w:rPr>
-              <w:t xml:space="preserve"> </w:t>
-            </w:r>
-            <w:proofErr w:type="spellStart"/>
-            <w:r>
-              <w:rPr>
-                <w:rFonts w:cs="Noto Sans Thai"/>
-                <w:i/>
-                <w:color w:val="666666"/>
-                <w:sz w:val="24"/>
-              </w:rPr>
-              <w:t>ความหลากหลายของ</w:t>
-            </w:r>
-            <w:proofErr w:type="spellEnd"/>
-            <w:r>
-              <w:rPr>
-                <w:rFonts w:cs="Noto Sans Thai"/>
-                <w:i/>
-                <w:color w:val="666666"/>
-                <w:sz w:val="24"/>
-              </w:rPr>
-              <w:t xml:space="preserve"> Drawing, Scale alignment, Text positioning, profile-specific behavior </w:t>
-            </w:r>
-            <w:proofErr w:type="spellStart"/>
-            <w:r>
-              <w:rPr>
-                <w:rFonts w:cs="Noto Sans Thai"/>
-                <w:i/>
-                <w:color w:val="666666"/>
-                <w:sz w:val="24"/>
-              </w:rPr>
-              <w:t>และความจำเป็นของ</w:t>
-            </w:r>
-            <w:proofErr w:type="spellEnd"/>
-            <w:r>
-              <w:rPr>
-                <w:rFonts w:cs="Noto Sans Thai"/>
-                <w:i/>
-                <w:color w:val="666666"/>
-                <w:sz w:val="24"/>
-              </w:rPr>
-              <w:t xml:space="preserve"> Human Final QA</w:t>
-            </w:r>
-          </w:p>
-        </w:tc>
-      </w:tr>
-    </w:tbl>
     <w:p>
-      <w:pPr>
-        <w:spacing w:after="0"/>
-      </w:pPr>
+      <w:pPr/>
+      <w:r>
+        <w:t>ข้อจำกัดของผลการศึกษาควรพิจารณาควบคู่กับตัวเลขประสิทธิภาพ. ชุดประเมินประกอบด้วย 5 DWG รวม 15 Layout ซึ่งเพียงพอสำหรับการประเมินต้นแบบในบริบทสหกิจ แต่ยังไม่ครอบคลุม Drawing profile ทุกชนิด. Drawing ที่ใช้ทดสอบมาจากลักษณะงานที่ใกล้เคียงกัน จึงไม่ควรสรุปผลแทน Drawing ในทุกโครงการหรือทุกสาขาวิศวกรรม.</w:t>
+      </w:r>
+    </w:p>
+    <w:p>
+      <w:pPr/>
+      <w:r>
+        <w:t>ผู้พัฒนาเป็นผู้ดำเนินการทดสอบและจับเวลาเอง และแต่ละ Test Case วัดเวลาเพียงหนึ่งรอบ จึงอาจมีผลจากความชำนาญของผู้ปฏิบัติงาน ความคุ้นเคยกับ Drawing และความคลาดเคลื่อนจากการจับเวลาด้วย Stopwatch. การศึกษาต่อควรใช้ผู้ทดสอบมากกว่าหนึ่งคนและทำ repeated trials เพื่อประเมินความแปรปรวนของเวลา.</w:t>
+      </w:r>
+    </w:p>
+    <w:p>
+      <w:pPr/>
+      <w:r>
+        <w:t>ด้านความสามารถของระบบ R08 Scale Alignment ยังต้อง Manual Touch-up ในทุกกรณี แม้ค่ามาตราส่วนและรูปแบบตัวอักษรจะถูกต้อง. นอกจากนี้ workflow ที่ประเมินต้องใช้ลำดับ AUTOSHEET → A3TITLEBOXALL จึงยังไม่ใช่คำสั่งเดียวที่ครอบคลุมทุกขั้นตอน และระบบยังต้องพึ่งพา Final Visual QA ก่อน Plot.</w:t>
+      </w:r>
+    </w:p>
+    <w:p>
+      <w:pPr/>
+      <w:r>
+        <w:t>มาตรฐานเฉพาะโครงการ เช่น Cordia SHX, Text Height 0.0015 และ SIPHYA_LT_R1.ctb ถูกกำหนดจาก Ground Truth ภายในโครงการ ไม่ใช่ข้อกำหนดสากล จึงต้องสร้าง profile หรือ configuration ใหม่หากนำระบบไปใช้กับโครงการที่มีมาตรฐานต่างออกไป.</w:t>
+      </w:r>
+    </w:p>
+    <w:p>
+      <w:pPr/>
     </w:p>
     <w:p>
       <w:pPr>
         <w:pStyle w:val="Heading1"/>
-        <w:spacing w:before="160" w:after="100"/>
       </w:pPr>
       <w:r>
-        <w:rPr>
-          <w:rFonts w:ascii="Noto Sans Thai" w:eastAsia="Noto Sans Thai" w:hAnsi="Noto Sans Thai" w:cs="Noto Sans Thai"/>
-        </w:rPr>
-        <w:t xml:space="preserve">5.4 </w:t>
-      </w:r>
-      <w:proofErr w:type="spellStart"/>
-      <w:r>
-        <w:rPr>
-          <w:rFonts w:ascii="Noto Sans Thai" w:eastAsia="Noto Sans Thai" w:hAnsi="Noto Sans Thai" w:cs="Noto Sans Thai"/>
-        </w:rPr>
-        <w:t>ประโยชน์ต่อสถานประกอบการ</w:t>
-      </w:r>
-      <w:proofErr w:type="spellEnd"/>
+        <w:t>5.4 ประโยชน์ต่อสถานประกอบการ</w:t>
+      </w:r>
     </w:p>
-    <w:tbl>
-      <w:tblPr>
-        <w:tblStyle w:val="TableGrid"/>
-        <w:tblW w:w="0" w:type="auto"/>
-        <w:jc w:val="center"/>
-        <w:tblLook w:val="04A0" w:firstRow="1" w:lastRow="0" w:firstColumn="1" w:lastColumn="0" w:noHBand="0" w:noVBand="1"/>
-      </w:tblPr>
-      <w:tblGrid>
-        <w:gridCol w:w="8642"/>
-      </w:tblGrid>
-      <w:tr>
-        <w:trPr>
-          <w:cantSplit/>
-          <w:jc w:val="center"/>
-        </w:trPr>
-        <w:tc>
-          <w:tcPr>
-            <w:tcW w:w="8652" w:type="dxa"/>
-            <w:shd w:val="clear" w:color="auto" w:fill="F3F3F3"/>
-            <w:tcMar>
-              <w:top w:w="120" w:type="dxa"/>
-              <w:left w:w="140" w:type="dxa"/>
-              <w:bottom w:w="120" w:type="dxa"/>
-              <w:right w:w="140" w:type="dxa"/>
-            </w:tcMar>
-          </w:tcPr>
-          <w:p>
-            <w:r>
-              <w:rPr>
-                <w:rFonts w:cs="Noto Sans Thai"/>
-                <w:i/>
-                <w:color w:val="666666"/>
-                <w:sz w:val="24"/>
-              </w:rPr>
-              <w:t>[</w:t>
-            </w:r>
-            <w:proofErr w:type="spellStart"/>
-            <w:r>
-              <w:rPr>
-                <w:rFonts w:cs="Noto Sans Thai"/>
-                <w:i/>
-                <w:color w:val="666666"/>
-                <w:sz w:val="24"/>
-              </w:rPr>
-              <w:t>เว้นไว้สำหรับเติมภายหลัง</w:t>
-            </w:r>
-            <w:proofErr w:type="spellEnd"/>
-            <w:r>
-              <w:rPr>
-                <w:rFonts w:cs="Noto Sans Thai"/>
-                <w:i/>
-                <w:color w:val="666666"/>
-                <w:sz w:val="24"/>
-              </w:rPr>
-              <w:t xml:space="preserve">] </w:t>
-            </w:r>
-            <w:proofErr w:type="spellStart"/>
-            <w:r>
-              <w:rPr>
-                <w:rFonts w:cs="Noto Sans Thai"/>
-                <w:i/>
-                <w:color w:val="666666"/>
-                <w:sz w:val="24"/>
-              </w:rPr>
-              <w:t>สรุปประโยชน์ที่พิสูจน์ได้จากผลทดลอง</w:t>
-            </w:r>
-            <w:proofErr w:type="spellEnd"/>
-            <w:r>
-              <w:rPr>
-                <w:rFonts w:cs="Noto Sans Thai"/>
-                <w:i/>
-                <w:color w:val="666666"/>
-                <w:sz w:val="24"/>
-              </w:rPr>
-              <w:t xml:space="preserve"> </w:t>
-            </w:r>
-            <w:proofErr w:type="spellStart"/>
-            <w:r>
-              <w:rPr>
-                <w:rFonts w:cs="Noto Sans Thai"/>
-                <w:i/>
-                <w:color w:val="666666"/>
-                <w:sz w:val="24"/>
-              </w:rPr>
-              <w:t>เช่น</w:t>
-            </w:r>
-            <w:proofErr w:type="spellEnd"/>
-            <w:r>
-              <w:rPr>
-                <w:rFonts w:cs="Noto Sans Thai"/>
-                <w:i/>
-                <w:color w:val="666666"/>
-                <w:sz w:val="24"/>
-              </w:rPr>
-              <w:t xml:space="preserve"> </w:t>
-            </w:r>
-            <w:proofErr w:type="spellStart"/>
-            <w:r>
-              <w:rPr>
-                <w:rFonts w:cs="Noto Sans Thai"/>
-                <w:i/>
-                <w:color w:val="666666"/>
-                <w:sz w:val="24"/>
-              </w:rPr>
-              <w:t>การลดงานซ้ำ</w:t>
-            </w:r>
-            <w:proofErr w:type="spellEnd"/>
-            <w:r>
-              <w:rPr>
-                <w:rFonts w:cs="Noto Sans Thai"/>
-                <w:i/>
-                <w:color w:val="666666"/>
-                <w:sz w:val="24"/>
-              </w:rPr>
-              <w:t xml:space="preserve"> </w:t>
-            </w:r>
-            <w:proofErr w:type="spellStart"/>
-            <w:r>
-              <w:rPr>
-                <w:rFonts w:cs="Noto Sans Thai"/>
-                <w:i/>
-                <w:color w:val="666666"/>
-                <w:sz w:val="24"/>
-              </w:rPr>
-              <w:t>ความสม่ำเสมอของ</w:t>
-            </w:r>
-            <w:proofErr w:type="spellEnd"/>
-            <w:r>
-              <w:rPr>
-                <w:rFonts w:cs="Noto Sans Thai"/>
-                <w:i/>
-                <w:color w:val="666666"/>
-                <w:sz w:val="24"/>
-              </w:rPr>
-              <w:t xml:space="preserve"> Drawing </w:t>
-            </w:r>
-            <w:proofErr w:type="spellStart"/>
-            <w:r>
-              <w:rPr>
-                <w:rFonts w:cs="Noto Sans Thai"/>
-                <w:i/>
-                <w:color w:val="666666"/>
-                <w:sz w:val="24"/>
-              </w:rPr>
-              <w:t>และการลดภาระการตรวจแก้บางประเภท</w:t>
-            </w:r>
-            <w:proofErr w:type="spellEnd"/>
-          </w:p>
-        </w:tc>
-      </w:tr>
-    </w:tbl>
     <w:p>
-      <w:pPr>
-        <w:spacing w:after="0"/>
-      </w:pPr>
+      <w:pPr/>
+      <w:r>
+        <w:t>ประโยชน์ที่พิสูจน์ได้จากชุดทดสอบคือการลดเวลาการจัดเตรียม Drawing ก่อน Plot โดยยังคง Final QA ของผู้ปฏิบัติงานไว้. การลดเวลารวมประมาณ 45.7% ใน 15 Layout ช่วยลดภาระจากการแก้ property และ Plot Setting ซ้ำ ๆ และทำให้ผู้ปฏิบัติงานสามารถใช้เวลามากขึ้นกับการตรวจรายละเอียดที่ต้องอาศัย judgment.</w:t>
+      </w:r>
+    </w:p>
+    <w:p>
+      <w:pPr/>
+      <w:r>
+        <w:t>การกำหนด Requirement R01–R27 ยังช่วยเปลี่ยนความรู้ที่เดิมอาศัยประสบการณ์ของผู้ปฏิบัติงานให้เป็น checklist ที่ตรวจสอบได้ ทำให้การส่งต่องาน การตรวจย้อนกลับ และการพัฒนาระบบต่อมีโครงสร้างชัดเจนขึ้น. นอกจากนี้ Scan, Diagnostic และ Preserve/Skip+Warn ช่วยลดความเสี่ยงจากการแก้ไข Drawing ที่ไม่ตรงกับ profile ที่ระบบรู้จัก.</w:t>
+      </w:r>
+    </w:p>
+    <w:p>
+      <w:pPr/>
+      <w:r>
+        <w:t>ในเชิงการพัฒนางานภายในองค์กร AUTOSHEET สามารถใช้เป็นต้นแบบสำหรับสร้างเครื่องมือ CAD automation อื่นที่ยึดหลัก Ground Truth → Rule → Apply → QA → Human Final Check แทนการ automate ทุกอย่างในครั้งเดียว.</w:t>
+      </w:r>
+    </w:p>
+    <w:p>
+      <w:pPr/>
     </w:p>
     <w:p>
       <w:pPr>
         <w:pStyle w:val="Heading1"/>
-        <w:spacing w:before="160" w:after="100"/>
       </w:pPr>
       <w:r>
-        <w:rPr>
-          <w:rFonts w:ascii="Noto Sans Thai" w:eastAsia="Noto Sans Thai" w:hAnsi="Noto Sans Thai" w:cs="Noto Sans Thai"/>
-        </w:rPr>
-        <w:t xml:space="preserve">5.5 </w:t>
-      </w:r>
-      <w:proofErr w:type="spellStart"/>
-      <w:r>
-        <w:rPr>
-          <w:rFonts w:ascii="Noto Sans Thai" w:eastAsia="Noto Sans Thai" w:hAnsi="Noto Sans Thai" w:cs="Noto Sans Thai"/>
-        </w:rPr>
-        <w:t>แนวทางการพัฒนาต่อ</w:t>
-      </w:r>
-      <w:proofErr w:type="spellEnd"/>
-    </w:p>
-    <w:tbl>
-      <w:tblPr>
-        <w:tblStyle w:val="TableGrid"/>
-        <w:tblW w:w="0" w:type="auto"/>
-        <w:jc w:val="center"/>
-        <w:tblLook w:val="04A0" w:firstRow="1" w:lastRow="0" w:firstColumn="1" w:lastColumn="0" w:noHBand="0" w:noVBand="1"/>
-      </w:tblPr>
-      <w:tblGrid>
-        <w:gridCol w:w="8642"/>
-      </w:tblGrid>
-      <w:tr>
-        <w:trPr>
-          <w:cantSplit/>
-          <w:jc w:val="center"/>
-        </w:trPr>
-        <w:tc>
-          <w:tcPr>
-            <w:tcW w:w="8652" w:type="dxa"/>
-            <w:shd w:val="clear" w:color="auto" w:fill="F3F3F3"/>
-            <w:tcMar>
-              <w:top w:w="120" w:type="dxa"/>
-              <w:left w:w="140" w:type="dxa"/>
-              <w:bottom w:w="120" w:type="dxa"/>
-              <w:right w:w="140" w:type="dxa"/>
-            </w:tcMar>
-          </w:tcPr>
-          <w:p>
-            <w:r>
-              <w:rPr>
-                <w:rFonts w:cs="Noto Sans Thai"/>
-                <w:i/>
-                <w:color w:val="666666"/>
-                <w:sz w:val="24"/>
-              </w:rPr>
-              <w:t>[</w:t>
-            </w:r>
-            <w:proofErr w:type="spellStart"/>
-            <w:r>
-              <w:rPr>
-                <w:rFonts w:cs="Noto Sans Thai"/>
-                <w:i/>
-                <w:color w:val="666666"/>
-                <w:sz w:val="24"/>
-              </w:rPr>
-              <w:t>เว้นไว้สำหรับเติมภายหลัง</w:t>
-            </w:r>
-            <w:proofErr w:type="spellEnd"/>
-            <w:r>
-              <w:rPr>
-                <w:rFonts w:cs="Noto Sans Thai"/>
-                <w:i/>
-                <w:color w:val="666666"/>
-                <w:sz w:val="24"/>
-              </w:rPr>
-              <w:t xml:space="preserve">] </w:t>
-            </w:r>
-            <w:proofErr w:type="spellStart"/>
-            <w:r>
-              <w:rPr>
-                <w:rFonts w:cs="Noto Sans Thai"/>
-                <w:i/>
-                <w:color w:val="666666"/>
-                <w:sz w:val="24"/>
-              </w:rPr>
-              <w:t>เสนอแนวทาง</w:t>
-            </w:r>
-            <w:proofErr w:type="spellEnd"/>
-            <w:r>
-              <w:rPr>
-                <w:rFonts w:cs="Noto Sans Thai"/>
-                <w:i/>
-                <w:color w:val="666666"/>
-                <w:sz w:val="24"/>
-              </w:rPr>
-              <w:t xml:space="preserve"> </w:t>
-            </w:r>
-            <w:proofErr w:type="spellStart"/>
-            <w:r>
-              <w:rPr>
-                <w:rFonts w:cs="Noto Sans Thai"/>
-                <w:i/>
-                <w:color w:val="666666"/>
-                <w:sz w:val="24"/>
-              </w:rPr>
-              <w:t>เช่น</w:t>
-            </w:r>
-            <w:proofErr w:type="spellEnd"/>
-            <w:r>
-              <w:rPr>
-                <w:rFonts w:cs="Noto Sans Thai"/>
-                <w:i/>
-                <w:color w:val="666666"/>
-                <w:sz w:val="24"/>
-              </w:rPr>
-              <w:t xml:space="preserve"> configurable profiles, support drawing variants, geometry detection, rule configuration </w:t>
-            </w:r>
-            <w:proofErr w:type="spellStart"/>
-            <w:r>
-              <w:rPr>
-                <w:rFonts w:cs="Noto Sans Thai"/>
-                <w:i/>
-                <w:color w:val="666666"/>
-                <w:sz w:val="24"/>
-              </w:rPr>
-              <w:t>และ</w:t>
-            </w:r>
-            <w:proofErr w:type="spellEnd"/>
-            <w:r>
-              <w:rPr>
-                <w:rFonts w:cs="Noto Sans Thai"/>
-                <w:i/>
-                <w:color w:val="666666"/>
-                <w:sz w:val="24"/>
-              </w:rPr>
-              <w:t xml:space="preserve"> reporting/audit trail </w:t>
-            </w:r>
-            <w:proofErr w:type="spellStart"/>
-            <w:r>
-              <w:rPr>
-                <w:rFonts w:cs="Noto Sans Thai"/>
-                <w:i/>
-                <w:color w:val="666666"/>
-                <w:sz w:val="24"/>
-              </w:rPr>
-              <w:t>ตามข้อจำกัดที่พบจริง</w:t>
-            </w:r>
-            <w:proofErr w:type="spellEnd"/>
-          </w:p>
-        </w:tc>
-      </w:tr>
-    </w:tbl>
-    <w:p>
-      <w:pPr>
-        <w:spacing w:after="0"/>
-      </w:pPr>
+        <w:t>5.5 แนวทางการพัฒนาต่อ</w:t>
+      </w:r>
     </w:p>
     <w:p>
-      <w:r>
-        <w:br w:type="page"/>
-      </w:r>
+      <w:pPr/>
+      <w:r>
+        <w:t>แนวทางพัฒนาระยะถัดไปควรให้ความสำคัญกับ R08 โดยเปลี่ยนจากการจัดตำแหน่งด้วยกฎคงที่ไปสู่การอ้างอิง geometry ของ Title Block, bounding box, anchor point หรือ relative alignment เพื่อให้ระบบปรับตำแหน่ง A3/A1 ได้แม่นยำขึ้นใน Drawing ที่มี layout แตกต่างกัน.</w:t>
+      </w:r>
+    </w:p>
+    <w:p>
+      <w:pPr/>
+      <w:r>
+        <w:t>ควรรวม AUTOSHEET และ A3TITLEBOXALL ให้เป็น workflow ที่เรียกใช้จาก command เดียวหรือ controller เดียว พร้อมบันทึก log ของแต่ละ Requirement ต่อ Layout เพื่อให้มีหลักฐาน runtime, PASS/PARTIAL/FAIL และรายการ Manual Touch-up โดยอัตโนมัติ.</w:t>
+      </w:r>
+    </w:p>
+    <w:p>
+      <w:pPr/>
+      <w:r>
+        <w:t>ด้านการรองรับโครงการอื่น ควรแยกค่ามาตรฐานออกจาก code เป็น configurable profile เช่น Font, Height, Plotter, Paper, CTB, Scale format และ Title Block mapping เพื่อให้เปลี่ยนมาตรฐานโดยไม่ต้องแก้ source code. ระบบควรมี profile validation และ unknown-profile handling ที่ชัดเจน.</w:t>
+      </w:r>
+    </w:p>
+    <w:p>
+      <w:pPr/>
+      <w:r>
+        <w:t>ด้านการประเมิน ควรขยายจำนวน Drawing และความหลากหลายของ profile ใช้ผู้ทดสอบหลายคน ทำ repeated timing และรายงานค่าเฉลี่ย/ส่วนเบี่ยงเบนมาตรฐาน รวมถึงเก็บ operation count หรือ event log อัตโนมัติ. แนวทางดังกล่าวจะช่วยประเมินทั้งประสิทธิภาพ ความเสถียร และความสามารถในการขยายระบบได้ดีกว่าการใช้เวลาเพียงตัวเดียว.</w:t>
+      </w:r>
+    </w:p>
+    <w:p>
+      <w:pPr/>
     </w:p>
     <w:p>
       <w:pPr>
@@ -26009,309 +23971,91 @@
       <w:proofErr w:type="spellEnd"/>
     </w:p>
     <w:p>
-      <w:pPr>
-        <w:spacing w:after="120" w:line="259" w:lineRule="auto"/>
-        <w:ind w:left="567" w:hanging="567"/>
-      </w:pPr>
-      <w:r>
-        <w:rPr>
-          <w:rFonts w:cs="Noto Sans Thai"/>
-          <w:sz w:val="23"/>
-        </w:rPr>
-        <w:t>Murakami, T., Zhang, G., &amp; Nakajima, N. (1995). Research on computerized check of CAD drawings based on drafting rules. Journal of Graphic Science of Japan, 29(3), 3–9. https://doi.org/10.5989/jsgs.29.3_3</w:t>
+      <w:pPr/>
+      <w:r>
+        <w:t>Autodesk. (n.d.-a). How to setup layouts in template drawing in AutoCAD. https://www.autodesk.com/support/technical/article/caas/sfdcarticles/sfdcarticles/How-to-setup-Layouts-in-template-drawing-in-AutoCAD.html</w:t>
       </w:r>
     </w:p>
     <w:p>
-      <w:pPr>
-        <w:spacing w:after="120" w:line="259" w:lineRule="auto"/>
-        <w:ind w:left="567" w:hanging="567"/>
-      </w:pPr>
-      <w:r>
-        <w:rPr>
-          <w:rFonts w:cs="Noto Sans Thai"/>
-          <w:sz w:val="23"/>
-        </w:rPr>
-        <w:t>Parfitt, M. K., Syal, M. G., &amp; Hroarsson, H. (1993). Framework for an automated quality control system in working drawing production. In Computing in Civil and Building Engineering (pp. 1026–1033). ASCE.</w:t>
+      <w:pPr/>
+      <w:r>
+        <w:t>Autodesk. (n.d.-b). About AutoLISP applications. AutoCAD 2026 Help. https://help.autodesk.com/view/ACD/2026/ENU/</w:t>
       </w:r>
     </w:p>
     <w:p>
-      <w:pPr>
-        <w:spacing w:after="120" w:line="259" w:lineRule="auto"/>
-        <w:ind w:left="567" w:hanging="567"/>
-      </w:pPr>
-      <w:r>
-        <w:rPr>
-          <w:rFonts w:cs="Noto Sans Thai"/>
-          <w:sz w:val="23"/>
-        </w:rPr>
-        <w:t xml:space="preserve">Rica, E., Moreno-García, C. F., Álvarez, S., &amp; </w:t>
-      </w:r>
-      <w:proofErr w:type="spellStart"/>
-      <w:r>
-        <w:rPr>
-          <w:rFonts w:cs="Noto Sans Thai"/>
-          <w:sz w:val="23"/>
-        </w:rPr>
-        <w:t>Serratosa</w:t>
-      </w:r>
-      <w:proofErr w:type="spellEnd"/>
-      <w:r>
-        <w:rPr>
-          <w:rFonts w:cs="Noto Sans Thai"/>
-          <w:sz w:val="23"/>
-        </w:rPr>
-        <w:t>, F. (2020). Reducing human effort in engineering drawing validation. Computers in Industry, 117, 103198. https://doi.org/10.1016/j.compind.2020.103198</w:t>
+      <w:pPr/>
+      <w:r>
+        <w:t>Autodesk. (n.d.-c). Introduction (AutoLISP). AutoCAD 2026 Help. https://help.autodesk.com/cloudhelp/2026/ENU/AutoCAD-AutoLISP/</w:t>
       </w:r>
     </w:p>
     <w:p>
-      <w:pPr>
-        <w:spacing w:after="120" w:line="259" w:lineRule="auto"/>
-        <w:ind w:left="567" w:hanging="567"/>
-      </w:pPr>
-      <w:r>
-        <w:rPr>
-          <w:rFonts w:cs="Noto Sans Thai"/>
-          <w:sz w:val="23"/>
-        </w:rPr>
-        <w:t>Scheibel, B., Mangler, J., &amp; Rinderle-Ma, S. (2021). Extraction of dimension requirements from engineering drawings for supporting quality control in production processes. Computers in Industry, 129, 103442. https://doi.org/10.1016/j.compind.2021.103442</w:t>
+      <w:pPr/>
+      <w:r>
+        <w:t>Eastman, C., Lee, J.-M., Jeong, Y.-S., &amp; Lee, J.-K. (2009). Automatic rule-based checking of building designs. Automation in Construction, 18(8), 1011–1033. https://doi.org/10.1016/j.autcon.2009.07.002</w:t>
       </w:r>
     </w:p>
     <w:p>
-      <w:pPr>
-        <w:spacing w:after="120" w:line="259" w:lineRule="auto"/>
-        <w:ind w:left="567" w:hanging="567"/>
-      </w:pPr>
-      <w:r>
-        <w:rPr>
-          <w:rFonts w:cs="Noto Sans Thai"/>
-          <w:sz w:val="23"/>
-        </w:rPr>
-        <w:t>Eastman, C., Lee, J.-M., Jeong, Y.-S., &amp; Lee, J.-K. (2009). Automatic rule-based checking of building designs. Automation in Construction, 18(8), 1011–1033. https://doi.org/10.1016/j.autcon.2009.07.002</w:t>
+      <w:pPr/>
+      <w:r>
+        <w:t>International Organization for Standardization. (1979). ISO 5455:1979 Technical drawings—Scales. https://www.iso.org/standard/11500.html</w:t>
       </w:r>
     </w:p>
     <w:p>
-      <w:pPr>
-        <w:spacing w:after="120" w:line="259" w:lineRule="auto"/>
-        <w:ind w:left="567" w:hanging="567"/>
-      </w:pPr>
-      <w:proofErr w:type="spellStart"/>
-      <w:r>
-        <w:rPr>
-          <w:rFonts w:cs="Noto Sans Thai"/>
-          <w:sz w:val="23"/>
-        </w:rPr>
-        <w:t>Solihin</w:t>
-      </w:r>
-      <w:proofErr w:type="spellEnd"/>
-      <w:r>
-        <w:rPr>
-          <w:rFonts w:cs="Noto Sans Thai"/>
-          <w:sz w:val="23"/>
-        </w:rPr>
-        <w:t>, W., &amp; Eastman, C. (2015). Classification of rules for automated BIM rule checking development. Automation in Construction, 53, 69–82. https://doi.org/10.1016/j.autcon.2015.03.003</w:t>
+      <w:pPr/>
+      <w:r>
+        <w:t>International Organization for Standardization. (1999). ISO 5457:1999 Technical product documentation—Sizes and layout of drawing sheets. https://www.iso.org/standard/29017.html</w:t>
       </w:r>
     </w:p>
     <w:p>
-      <w:pPr>
-        <w:spacing w:after="120" w:line="259" w:lineRule="auto"/>
-        <w:ind w:left="567" w:hanging="567"/>
-      </w:pPr>
-      <w:r>
-        <w:rPr>
-          <w:rFonts w:cs="Noto Sans Thai"/>
-          <w:sz w:val="23"/>
-        </w:rPr>
-        <w:t xml:space="preserve">Sofias, K., </w:t>
-      </w:r>
-      <w:proofErr w:type="spellStart"/>
-      <w:r>
-        <w:rPr>
-          <w:rFonts w:cs="Noto Sans Thai"/>
-          <w:sz w:val="23"/>
-        </w:rPr>
-        <w:t>Kanetaki</w:t>
-      </w:r>
-      <w:proofErr w:type="spellEnd"/>
-      <w:r>
-        <w:rPr>
-          <w:rFonts w:cs="Noto Sans Thai"/>
-          <w:sz w:val="23"/>
-        </w:rPr>
-        <w:t xml:space="preserve">, Z., Stergiou, C., </w:t>
-      </w:r>
-      <w:proofErr w:type="spellStart"/>
-      <w:r>
-        <w:rPr>
-          <w:rFonts w:cs="Noto Sans Thai"/>
-          <w:sz w:val="23"/>
-        </w:rPr>
-        <w:t>Kantaros</w:t>
-      </w:r>
-      <w:proofErr w:type="spellEnd"/>
-      <w:r>
-        <w:rPr>
-          <w:rFonts w:cs="Noto Sans Thai"/>
-          <w:sz w:val="23"/>
-        </w:rPr>
-        <w:t xml:space="preserve">, A., Jacques, S., &amp; </w:t>
-      </w:r>
-      <w:proofErr w:type="spellStart"/>
-      <w:r>
-        <w:rPr>
-          <w:rFonts w:cs="Noto Sans Thai"/>
-          <w:sz w:val="23"/>
-        </w:rPr>
-        <w:t>Ganetsos</w:t>
-      </w:r>
-      <w:proofErr w:type="spellEnd"/>
-      <w:r>
-        <w:rPr>
-          <w:rFonts w:cs="Noto Sans Thai"/>
-          <w:sz w:val="23"/>
-        </w:rPr>
-        <w:t>, T. (2025). Implementing CAD API automated processes in engineering design: A case study approach. Applied Sciences, 15(14), 7692. https://doi.org/10.3390/app15147692</w:t>
-      </w:r>
-    </w:p>
-    <w:tbl>
-      <w:tblPr>
-        <w:tblStyle w:val="TableGrid"/>
-        <w:tblW w:w="0" w:type="auto"/>
-        <w:jc w:val="center"/>
-        <w:tblLook w:val="04A0" w:firstRow="1" w:lastRow="0" w:firstColumn="1" w:lastColumn="0" w:noHBand="0" w:noVBand="1"/>
-      </w:tblPr>
-      <w:tblGrid>
-        <w:gridCol w:w="8642"/>
-      </w:tblGrid>
-      <w:tr>
-        <w:trPr>
-          <w:cantSplit/>
-          <w:jc w:val="center"/>
-        </w:trPr>
-        <w:tc>
-          <w:tcPr>
-            <w:tcW w:w="8652" w:type="dxa"/>
-            <w:shd w:val="clear" w:color="auto" w:fill="F3F3F3"/>
-            <w:tcMar>
-              <w:top w:w="120" w:type="dxa"/>
-              <w:left w:w="140" w:type="dxa"/>
-              <w:bottom w:w="120" w:type="dxa"/>
-              <w:right w:w="140" w:type="dxa"/>
-            </w:tcMar>
-          </w:tcPr>
-          <w:p>
-            <w:r>
-              <w:rPr>
-                <w:rFonts w:cs="Noto Sans Thai"/>
-                <w:i/>
-                <w:color w:val="666666"/>
-                <w:sz w:val="24"/>
-              </w:rPr>
-              <w:t>[</w:t>
-            </w:r>
-            <w:proofErr w:type="spellStart"/>
-            <w:r>
-              <w:rPr>
-                <w:rFonts w:cs="Noto Sans Thai"/>
-                <w:i/>
-                <w:color w:val="666666"/>
-                <w:sz w:val="24"/>
-              </w:rPr>
-              <w:t>เว้นไว้สำหรับเติมภายหลัง</w:t>
-            </w:r>
-            <w:proofErr w:type="spellEnd"/>
-            <w:r>
-              <w:rPr>
-                <w:rFonts w:cs="Noto Sans Thai"/>
-                <w:i/>
-                <w:color w:val="666666"/>
-                <w:sz w:val="24"/>
-              </w:rPr>
-              <w:t xml:space="preserve">] </w:t>
-            </w:r>
-            <w:proofErr w:type="spellStart"/>
-            <w:r>
-              <w:rPr>
-                <w:rFonts w:cs="Noto Sans Thai"/>
-                <w:i/>
-                <w:color w:val="666666"/>
-                <w:sz w:val="24"/>
-              </w:rPr>
-              <w:t>เพิ่มเติม</w:t>
-            </w:r>
-            <w:proofErr w:type="spellEnd"/>
-            <w:r>
-              <w:rPr>
-                <w:rFonts w:cs="Noto Sans Thai"/>
-                <w:i/>
-                <w:color w:val="666666"/>
-                <w:sz w:val="24"/>
-              </w:rPr>
-              <w:t xml:space="preserve"> Autodesk Official Documentation, ISO 5455/5457/7200/3098 </w:t>
-            </w:r>
-            <w:proofErr w:type="spellStart"/>
-            <w:r>
-              <w:rPr>
-                <w:rFonts w:cs="Noto Sans Thai"/>
-                <w:i/>
-                <w:color w:val="666666"/>
-                <w:sz w:val="24"/>
-              </w:rPr>
-              <w:t>และ</w:t>
-            </w:r>
-            <w:proofErr w:type="spellEnd"/>
-            <w:r>
-              <w:rPr>
-                <w:rFonts w:cs="Noto Sans Thai"/>
-                <w:i/>
-                <w:color w:val="666666"/>
-                <w:sz w:val="24"/>
-              </w:rPr>
-              <w:t xml:space="preserve"> Company/Project Standards </w:t>
-            </w:r>
-            <w:proofErr w:type="spellStart"/>
-            <w:r>
-              <w:rPr>
-                <w:rFonts w:cs="Noto Sans Thai"/>
-                <w:i/>
-                <w:color w:val="666666"/>
-                <w:sz w:val="24"/>
-              </w:rPr>
-              <w:t>ที่ใช้จริง</w:t>
-            </w:r>
-            <w:proofErr w:type="spellEnd"/>
-            <w:r>
-              <w:rPr>
-                <w:rFonts w:cs="Noto Sans Thai"/>
-                <w:i/>
-                <w:color w:val="666666"/>
-                <w:sz w:val="24"/>
-              </w:rPr>
-              <w:t xml:space="preserve"> </w:t>
-            </w:r>
-            <w:proofErr w:type="spellStart"/>
-            <w:r>
-              <w:rPr>
-                <w:rFonts w:cs="Noto Sans Thai"/>
-                <w:i/>
-                <w:color w:val="666666"/>
-                <w:sz w:val="24"/>
-              </w:rPr>
-              <w:t>พร้อมตรวจรูปแบบอ้างอิงให้เป็นมาตรฐานเดียวกันทั้งเล่ม</w:t>
-            </w:r>
-            <w:proofErr w:type="spellEnd"/>
-          </w:p>
-        </w:tc>
-      </w:tr>
-    </w:tbl>
-    <w:p>
-      <w:pPr>
-        <w:spacing w:after="0"/>
-      </w:pPr>
+      <w:pPr/>
+      <w:r>
+        <w:t>International Organization for Standardization. (2004). ISO 7200:2004 Technical product documentation—Data fields in title blocks and document headers. https://www.iso.org/standard/35446.html</w:t>
+      </w:r>
     </w:p>
     <w:p>
-      <w:r>
-        <w:br w:type="page"/>
-      </w:r>
+      <w:pPr/>
+      <w:r>
+        <w:t>International Organization for Standardization. (2015). ISO 3098-1:2015 Technical product documentation—Lettering—Part 1: General requirements. https://www.iso.org/standard/65679.html</w:t>
+      </w:r>
+    </w:p>
+    <w:p>
+      <w:pPr/>
+      <w:r>
+        <w:t>Murakami, T., Zhang, G., &amp; Nakajima, N. (1995). Research on computerized check of CAD drawings based on drafting rules. Journal of Graphic Science of Japan, 29(3), 3–9. https://doi.org/10.5989/jsgs.29.3_3</w:t>
+      </w:r>
+    </w:p>
+    <w:p>
+      <w:pPr/>
+      <w:r>
+        <w:t>Parfitt, M. K., Syal, M. G., &amp; Hroarsson, H. (1993). Framework for an automated quality control system in working drawing production. In Computing in Civil and Building Engineering (pp. 1026–1033). ASCE.</w:t>
+      </w:r>
+    </w:p>
+    <w:p>
+      <w:pPr/>
+      <w:r>
+        <w:t>Rica, E., Moreno-García, C. F., Álvarez, S., &amp; Serratosa, F. (2020). Reducing human effort in engineering drawing validation. Computers in Industry, 117, 103198. https://doi.org/10.1016/j.compind.2020.103198</w:t>
+      </w:r>
+    </w:p>
+    <w:p>
+      <w:pPr/>
+      <w:r>
+        <w:t>Scheibel, B., Mangler, J., &amp; Rinderle-Ma, S. (2021). Extraction of dimension requirements from engineering drawings for supporting quality control in production processes. Computers in Industry, 129, 103442. https://doi.org/10.1016/j.compind.2021.103442</w:t>
+      </w:r>
+    </w:p>
+    <w:p>
+      <w:pPr/>
+      <w:r>
+        <w:t>Sofias, K., Kanetaki, Z., Stergiou, C., Kantaros, A., Jacques, S., &amp; Ganetsos, T. (2025). Implementing CAD API automated processes in engineering design: A case study approach. Applied Sciences, 15(14), 7692. https://doi.org/10.3390/app15147692</w:t>
+      </w:r>
+    </w:p>
+    <w:p>
+      <w:pPr/>
+      <w:r>
+        <w:t>Solihin, W., &amp; Eastman, C. (2015). Classification of rules for automated BIM rule checking development. Automation in Construction, 53, 69–82. https://doi.org/10.1016/j.autcon.2015.03.003</w:t>
+      </w:r>
+    </w:p>
+    <w:p>
+      <w:pPr/>
     </w:p>
     <w:p>
       <w:pPr>

</xml_diff>

<commit_message>
Update cooperative report chapters 2 and 5; add backup
</commit_message>
<xml_diff>
--- a/รายงานสหกิจ.docx
+++ b/รายงานสหกิจ.docx
@@ -6781,165 +6781,38 @@
     </w:p>
     <w:p>
       <w:pPr>
-        <w:pStyle w:val="ListNumber"/>
         <w:spacing w:after="60" w:line="269" w:lineRule="auto"/>
-        <w:ind w:left="567" w:hanging="198"/>
+        <w:ind w:left="360" w:hanging="360"/>
       </w:pPr>
-      <w:proofErr w:type="spellStart"/>
-      <w:r>
-        <w:rPr>
-          <w:rFonts w:cs="Noto Sans Thai"/>
-        </w:rPr>
-        <w:t>เพื่อศึกษากระบวนการจัดเตรียมและตรวจสอบแบบวิศวกรรมใน</w:t>
-      </w:r>
-      <w:proofErr w:type="spellEnd"/>
-      <w:r>
-        <w:rPr>
-          <w:rFonts w:cs="Noto Sans Thai"/>
-        </w:rPr>
-        <w:t xml:space="preserve"> AutoCAD </w:t>
-      </w:r>
-      <w:proofErr w:type="spellStart"/>
-      <w:r>
-        <w:rPr>
-          <w:rFonts w:cs="Noto Sans Thai"/>
-        </w:rPr>
-        <w:t>ก่อนการจัดพิมพ์หรือส่งมอบ</w:t>
-      </w:r>
-      <w:proofErr w:type="spellEnd"/>
+      <w:r>
+        <w:t>1. เพื่อศึกษากระบวนการจัดเตรียมและตรวจสอบแบบวิศวกรรมใน AutoCAD ก่อนการจัดพิมพ์หรือส่งมอบ</w:t>
+      </w:r>
     </w:p>
     <w:p>
       <w:pPr>
-        <w:pStyle w:val="ListNumber"/>
         <w:spacing w:after="60" w:line="269" w:lineRule="auto"/>
-        <w:ind w:left="567" w:hanging="198"/>
+        <w:ind w:left="360" w:hanging="360"/>
       </w:pPr>
       <w:r>
-        <w:rPr>
-          <w:rFonts w:cs="Noto Sans Thai"/>
-        </w:rPr>
-        <w:t xml:space="preserve">เพื่อวิเคราะห์ขั้นตอนการทำงานซ้ำที่สามารถประยุกต์ใช้ระบบอัตโนมัติในการตรวจสอบและปรับมาตรฐาน Drawing </w:t>
-      </w:r>
-      <w:proofErr w:type="spellStart"/>
-      <w:r>
-        <w:rPr>
-          <w:rFonts w:cs="Noto Sans Thai"/>
-        </w:rPr>
-        <w:t>ได้</w:t>
-      </w:r>
-      <w:proofErr w:type="spellEnd"/>
+        <w:t>2. เพื่อวิเคราะห์ขั้นตอนการทำงานซ้ำที่สามารถประยุกต์ใช้ระบบอัตโนมัติในการตรวจสอบและปรับมาตรฐาน Drawing ได้</w:t>
+      </w:r>
     </w:p>
     <w:p>
       <w:pPr>
-        <w:pStyle w:val="ListNumber"/>
         <w:spacing w:after="60" w:line="269" w:lineRule="auto"/>
-        <w:ind w:left="567" w:hanging="198"/>
+        <w:ind w:left="360" w:hanging="360"/>
       </w:pPr>
-      <w:proofErr w:type="spellStart"/>
-      <w:r>
-        <w:rPr>
-          <w:rFonts w:cs="Noto Sans Thai"/>
-        </w:rPr>
-        <w:t>เพื่อพัฒนาต้นแบบ</w:t>
-      </w:r>
-      <w:proofErr w:type="spellEnd"/>
-      <w:r>
-        <w:rPr>
-          <w:rFonts w:cs="Noto Sans Thai"/>
-        </w:rPr>
-        <w:t xml:space="preserve"> AUTOSHEET </w:t>
-      </w:r>
-      <w:proofErr w:type="spellStart"/>
-      <w:r>
-        <w:rPr>
-          <w:rFonts w:cs="Noto Sans Thai"/>
-        </w:rPr>
-        <w:t>ด้วย</w:t>
-      </w:r>
-      <w:proofErr w:type="spellEnd"/>
-      <w:r>
-        <w:rPr>
-          <w:rFonts w:cs="Noto Sans Thai"/>
-        </w:rPr>
-        <w:t xml:space="preserve"> </w:t>
-      </w:r>
-      <w:proofErr w:type="spellStart"/>
-      <w:r>
-        <w:rPr>
-          <w:rFonts w:cs="Noto Sans Thai"/>
-        </w:rPr>
-        <w:t>AutoLISP</w:t>
-      </w:r>
-      <w:proofErr w:type="spellEnd"/>
-      <w:r>
-        <w:rPr>
-          <w:rFonts w:cs="Noto Sans Thai"/>
-        </w:rPr>
-        <w:t xml:space="preserve"> </w:t>
-      </w:r>
-      <w:proofErr w:type="spellStart"/>
-      <w:r>
-        <w:rPr>
-          <w:rFonts w:cs="Noto Sans Thai"/>
-        </w:rPr>
-        <w:t>สำหรับช่วยปรับมาตรฐานและตรวจสอบ</w:t>
-      </w:r>
-      <w:proofErr w:type="spellEnd"/>
-      <w:r>
-        <w:rPr>
-          <w:rFonts w:cs="Noto Sans Thai"/>
-        </w:rPr>
-        <w:t xml:space="preserve"> Drawing </w:t>
-      </w:r>
-      <w:proofErr w:type="spellStart"/>
-      <w:r>
-        <w:rPr>
-          <w:rFonts w:cs="Noto Sans Thai"/>
-        </w:rPr>
-        <w:t>ก่อนการ</w:t>
-      </w:r>
-      <w:proofErr w:type="spellEnd"/>
-      <w:r>
-        <w:rPr>
-          <w:rFonts w:cs="Noto Sans Thai"/>
-        </w:rPr>
-        <w:t xml:space="preserve"> Plot</w:t>
+      <w:r>
+        <w:t>3. เพื่อพัฒนาต้นแบบ AUTOSHEET ด้วย AutoLISP สำหรับช่วยปรับมาตรฐานและตรวจสอบ Drawing ก่อนการ Plot</w:t>
       </w:r>
     </w:p>
     <w:p>
       <w:pPr>
-        <w:pStyle w:val="ListNumber"/>
         <w:spacing w:after="60" w:line="269" w:lineRule="auto"/>
-        <w:ind w:left="567" w:hanging="198"/>
+        <w:ind w:left="360" w:hanging="360"/>
       </w:pPr>
-      <w:proofErr w:type="spellStart"/>
-      <w:r>
-        <w:rPr>
-          <w:rFonts w:cs="Noto Sans Thai"/>
-        </w:rPr>
-        <w:lastRenderedPageBreak/>
-        <w:t>เพื่อประเมินประสิทธิภาพของ</w:t>
-      </w:r>
-      <w:proofErr w:type="spellEnd"/>
-      <w:r>
-        <w:rPr>
-          <w:rFonts w:cs="Noto Sans Thai"/>
-        </w:rPr>
-        <w:t xml:space="preserve"> AUTOSHEET </w:t>
-      </w:r>
-      <w:proofErr w:type="spellStart"/>
-      <w:r>
-        <w:rPr>
-          <w:rFonts w:cs="Noto Sans Thai"/>
-        </w:rPr>
-        <w:t>เมื่อเปรียบเทียบกับกระบวนการทำงานแบบ</w:t>
-      </w:r>
-      <w:proofErr w:type="spellEnd"/>
-      <w:r>
-        <w:rPr>
-          <w:rFonts w:cs="Noto Sans Thai"/>
-        </w:rPr>
-        <w:t xml:space="preserve"> Manual</w:t>
+      <w:r>
+        <w:t>4. เพื่อประเมินประสิทธิภาพของ AUTOSHEET เมื่อเปรียบเทียบกับกระบวนการทำงานแบบ Manual</w:t>
       </w:r>
     </w:p>
     <w:p>
@@ -6964,325 +6837,48 @@
     </w:p>
     <w:p>
       <w:pPr>
-        <w:pStyle w:val="ListNumber"/>
         <w:spacing w:after="60" w:line="269" w:lineRule="auto"/>
-        <w:ind w:left="567" w:hanging="198"/>
+        <w:ind w:left="360" w:hanging="360"/>
       </w:pPr>
-      <w:proofErr w:type="spellStart"/>
-      <w:r>
-        <w:rPr>
-          <w:rFonts w:cs="Noto Sans Thai"/>
-        </w:rPr>
-        <w:t>ศึกษาและพัฒนาการทำงานบนไฟล์</w:t>
-      </w:r>
-      <w:proofErr w:type="spellEnd"/>
-      <w:r>
-        <w:rPr>
-          <w:rFonts w:cs="Noto Sans Thai"/>
-        </w:rPr>
-        <w:t xml:space="preserve"> AutoCAD Drawing (DWG) </w:t>
-      </w:r>
-      <w:proofErr w:type="spellStart"/>
-      <w:r>
-        <w:rPr>
-          <w:rFonts w:cs="Noto Sans Thai"/>
-        </w:rPr>
-        <w:t>โดยเน้น</w:t>
-      </w:r>
-      <w:proofErr w:type="spellEnd"/>
-      <w:r>
-        <w:rPr>
-          <w:rFonts w:cs="Noto Sans Thai"/>
-        </w:rPr>
-        <w:t xml:space="preserve"> Paper Space Layout </w:t>
-      </w:r>
-      <w:proofErr w:type="spellStart"/>
-      <w:r>
-        <w:rPr>
-          <w:rFonts w:cs="Noto Sans Thai"/>
-        </w:rPr>
-        <w:t>และองค์ประกอบที่เกี่ยวข้องกับการจัดเตรียมแบบก่อนการจัดพิมพ์</w:t>
-      </w:r>
-      <w:proofErr w:type="spellEnd"/>
+      <w:r>
+        <w:t>1. ศึกษาและพัฒนาการทำงานบนไฟล์ AutoCAD Drawing (DWG) โดยเน้น Paper Space Layout และองค์ประกอบที่เกี่ยวข้องกับการจัดเตรียมแบบก่อนการจัดพิมพ์</w:t>
+      </w:r>
     </w:p>
     <w:p>
       <w:pPr>
-        <w:pStyle w:val="ListNumber"/>
         <w:spacing w:after="60" w:line="269" w:lineRule="auto"/>
-        <w:ind w:left="567" w:hanging="198"/>
+        <w:ind w:left="360" w:hanging="360"/>
       </w:pPr>
-      <w:proofErr w:type="spellStart"/>
-      <w:r>
-        <w:rPr>
-          <w:rFonts w:cs="Noto Sans Thai"/>
-        </w:rPr>
-        <w:t>ศึกษาพัฒนาการตั้งแต่เครื่องมือ</w:t>
-      </w:r>
-      <w:proofErr w:type="spellEnd"/>
-      <w:r>
-        <w:rPr>
-          <w:rFonts w:cs="Noto Sans Thai"/>
-        </w:rPr>
-        <w:t xml:space="preserve"> </w:t>
-      </w:r>
-      <w:proofErr w:type="spellStart"/>
-      <w:r>
-        <w:rPr>
-          <w:rFonts w:cs="Noto Sans Thai"/>
-        </w:rPr>
-        <w:t>AutoLISP</w:t>
-      </w:r>
-      <w:proofErr w:type="spellEnd"/>
-      <w:r>
-        <w:rPr>
-          <w:rFonts w:cs="Noto Sans Thai"/>
-        </w:rPr>
-        <w:t xml:space="preserve"> </w:t>
-      </w:r>
-      <w:proofErr w:type="spellStart"/>
-      <w:r>
-        <w:rPr>
-          <w:rFonts w:cs="Noto Sans Thai"/>
-        </w:rPr>
-        <w:t>เฉพาะงานที่ใช้แก้ปัญหาระหว่างการปฏิบัติงาน</w:t>
-      </w:r>
-      <w:proofErr w:type="spellEnd"/>
-      <w:r>
-        <w:rPr>
-          <w:rFonts w:cs="Noto Sans Thai"/>
-        </w:rPr>
-        <w:t xml:space="preserve"> </w:t>
-      </w:r>
-      <w:proofErr w:type="spellStart"/>
-      <w:r>
-        <w:rPr>
-          <w:rFonts w:cs="Noto Sans Thai"/>
-        </w:rPr>
-        <w:t>ไปจนถึงการบูรณาการฟังก์ชันที่เกี่ยวข้องเป็น</w:t>
-      </w:r>
-      <w:proofErr w:type="spellEnd"/>
-      <w:r>
-        <w:rPr>
-          <w:rFonts w:cs="Noto Sans Thai"/>
-        </w:rPr>
-        <w:t xml:space="preserve"> AUTOSHEET โดยเครื่องมือทดลองบางรายการในระยะแรกอาจไม่ได้ถูกรวมอยู่ในรุ่นประเมินผลสุดท้ายของ </w:t>
-      </w:r>
-      <w:proofErr w:type="spellStart"/>
-      <w:r>
-        <w:rPr>
-          <w:rFonts w:cs="Noto Sans Thai"/>
-        </w:rPr>
-        <w:t>AUTOSHEET</w:t>
-      </w:r>
-      <w:proofErr w:type="spellEnd"/>
+      <w:r>
+        <w:t>2. ศึกษาพัฒนาการตั้งแต่เครื่องมือ AutoLISP เฉพาะงานที่ใช้แก้ปัญหาระหว่างการปฏิบัติงาน ไปจนถึงการบูรณาการฟังก์ชันที่เกี่ยวข้องเป็น AUTOSHEET โดยเครื่องมือทดลองบางรายการในระยะแรกอาจไม่ได้ถูกรวมอยู่ในรุ่นประเมินผลสุดท้ายของ AUTOSHEET</w:t>
+      </w:r>
     </w:p>
     <w:p>
       <w:pPr>
-        <w:pStyle w:val="ListNumber"/>
         <w:spacing w:after="60" w:line="269" w:lineRule="auto"/>
-        <w:ind w:left="567" w:hanging="198"/>
+        <w:ind w:left="360" w:hanging="360"/>
       </w:pPr>
-      <w:proofErr w:type="spellStart"/>
-      <w:r>
-        <w:rPr>
-          <w:rFonts w:cs="Noto Sans Thai"/>
-        </w:rPr>
-        <w:t>ขอบเขตฟังก์ชันหลักของ</w:t>
-      </w:r>
-      <w:proofErr w:type="spellEnd"/>
-      <w:r>
-        <w:rPr>
-          <w:rFonts w:cs="Noto Sans Thai"/>
-        </w:rPr>
-        <w:t xml:space="preserve"> AUTOSHEET </w:t>
-      </w:r>
-      <w:proofErr w:type="spellStart"/>
-      <w:r>
-        <w:rPr>
-          <w:rFonts w:cs="Noto Sans Thai"/>
-        </w:rPr>
-        <w:t>ครอบคลุมการจัดการ</w:t>
-      </w:r>
-      <w:proofErr w:type="spellEnd"/>
-      <w:r>
-        <w:rPr>
-          <w:rFonts w:cs="Noto Sans Thai"/>
-        </w:rPr>
-        <w:t xml:space="preserve"> Title Block/Sheet Frame </w:t>
-      </w:r>
-      <w:proofErr w:type="spellStart"/>
-      <w:r>
-        <w:rPr>
-          <w:rFonts w:cs="Noto Sans Thai"/>
-        </w:rPr>
-        <w:t>ในรูปแบบที่รองรับ</w:t>
-      </w:r>
-      <w:proofErr w:type="spellEnd"/>
-      <w:r>
-        <w:rPr>
-          <w:rFonts w:cs="Noto Sans Thai"/>
-        </w:rPr>
-        <w:t xml:space="preserve">, Drawing Title, Drawing Code, </w:t>
-      </w:r>
-      <w:proofErr w:type="spellStart"/>
-      <w:r>
-        <w:rPr>
-          <w:rFonts w:cs="Noto Sans Thai"/>
-        </w:rPr>
-        <w:t>รูปแบบและขนาดตัวอักษร</w:t>
-      </w:r>
-      <w:proofErr w:type="spellEnd"/>
-      <w:r>
-        <w:rPr>
-          <w:rFonts w:cs="Noto Sans Thai"/>
-        </w:rPr>
-        <w:t xml:space="preserve">, Scale A3/A1, Paper/Plot Configuration, Plot Style, </w:t>
-      </w:r>
-      <w:proofErr w:type="spellStart"/>
-      <w:r>
-        <w:rPr>
-          <w:rFonts w:cs="Noto Sans Thai"/>
-        </w:rPr>
-        <w:t>การจัดการองค์ประกอบที่ไม่ต้องการบางประเภท</w:t>
-      </w:r>
-      <w:proofErr w:type="spellEnd"/>
-      <w:r>
-        <w:rPr>
-          <w:rFonts w:cs="Noto Sans Thai"/>
-        </w:rPr>
-        <w:t xml:space="preserve"> </w:t>
-      </w:r>
-      <w:proofErr w:type="spellStart"/>
-      <w:r>
-        <w:rPr>
-          <w:rFonts w:cs="Noto Sans Thai"/>
-        </w:rPr>
-        <w:t>และการตรวจสอบผลหลังการทำงาน</w:t>
-      </w:r>
-      <w:proofErr w:type="spellEnd"/>
+      <w:r>
+        <w:t>3. ขอบเขตฟังก์ชันหลักของ AUTOSHEET ครอบคลุมการจัดการ Title Block/Sheet Frame ในรูปแบบที่รองรับ, Drawing Title, Drawing Code, รูปแบบและขนาดตัวอักษร, Scale A3/A1, Paper/Plot Configuration, Plot Style, การจัดการองค์ประกอบที่ไม่ต้องการบางประเภท และการตรวจสอบผลหลังการทำงาน</w:t>
+      </w:r>
     </w:p>
     <w:p>
       <w:pPr>
-        <w:pStyle w:val="ListNumber"/>
         <w:spacing w:after="60" w:line="269" w:lineRule="auto"/>
-        <w:ind w:left="567" w:hanging="198"/>
+        <w:ind w:left="360" w:hanging="360"/>
       </w:pPr>
-      <w:proofErr w:type="spellStart"/>
-      <w:r>
-        <w:rPr>
-          <w:rFonts w:cs="Noto Sans Thai"/>
-        </w:rPr>
-        <w:t>พัฒนา</w:t>
-      </w:r>
-      <w:proofErr w:type="spellEnd"/>
-      <w:r>
-        <w:rPr>
-          <w:rFonts w:cs="Noto Sans Thai"/>
-        </w:rPr>
-        <w:t xml:space="preserve"> AUTOSHEET </w:t>
-      </w:r>
-      <w:proofErr w:type="spellStart"/>
-      <w:r>
-        <w:rPr>
-          <w:rFonts w:cs="Noto Sans Thai"/>
-        </w:rPr>
-        <w:t>ในลักษณะ</w:t>
-      </w:r>
-      <w:proofErr w:type="spellEnd"/>
-      <w:r>
-        <w:rPr>
-          <w:rFonts w:cs="Noto Sans Thai"/>
-        </w:rPr>
-        <w:t xml:space="preserve"> Prototype </w:t>
-      </w:r>
-      <w:proofErr w:type="spellStart"/>
-      <w:r>
-        <w:rPr>
-          <w:rFonts w:cs="Noto Sans Thai"/>
-        </w:rPr>
-        <w:t>โดยไม่ได้ตั้งเป้ารองรับ</w:t>
-      </w:r>
-      <w:proofErr w:type="spellEnd"/>
-      <w:r>
-        <w:rPr>
-          <w:rFonts w:cs="Noto Sans Thai"/>
-        </w:rPr>
-        <w:t xml:space="preserve"> Drawing </w:t>
-      </w:r>
-      <w:proofErr w:type="spellStart"/>
-      <w:r>
-        <w:rPr>
-          <w:rFonts w:cs="Noto Sans Thai"/>
-        </w:rPr>
-        <w:t>ทุกโครงสร้างหรือทดแทนการตรวจสอบโดยผู้ใช้งานทั้งหมด</w:t>
-      </w:r>
-      <w:proofErr w:type="spellEnd"/>
-      <w:r>
-        <w:rPr>
-          <w:rFonts w:cs="Noto Sans Thai"/>
-        </w:rPr>
-        <w:t xml:space="preserve"> โดยกรณีที่ตำแหน่งหรือโครงสร้างข้อมูลแตกต่างจากรูปแบบที่รองรับอาจต้องมี Manual Touch-up</w:t>
+      <w:r>
+        <w:t>4. พัฒนา AUTOSHEET ในลักษณะ Prototype โดยไม่ได้ตั้งเป้ารองรับ Drawing ทุกโครงสร้างหรือทดแทนการตรวจสอบโดยผู้ใช้งานทั้งหมด โดยกรณีที่ตำแหน่งหรือโครงสร้างข้อมูลแตกต่างจากรูปแบบที่รองรับอาจต้องมี Manual Touch-up</w:t>
       </w:r>
     </w:p>
     <w:p>
       <w:pPr>
-        <w:pStyle w:val="ListNumber"/>
         <w:spacing w:after="60" w:line="269" w:lineRule="auto"/>
-        <w:ind w:left="567" w:hanging="198"/>
+        <w:ind w:left="360" w:hanging="360"/>
       </w:pPr>
-      <w:proofErr w:type="spellStart"/>
-      <w:r>
-        <w:t>ประเมินผลโดยเปรียบเทียบกระบวนการ</w:t>
-      </w:r>
-      <w:proofErr w:type="spellEnd"/>
-      <w:r>
-        <w:t xml:space="preserve"> Manual </w:t>
-      </w:r>
-      <w:proofErr w:type="spellStart"/>
-      <w:r>
-        <w:t>กับกระบวนการอัตโนมัติที่กำหนดลำดับเป็น</w:t>
-      </w:r>
-      <w:proofErr w:type="spellEnd"/>
-      <w:r>
-        <w:t xml:space="preserve"> AUTOSHEET → A3TITLEBOXALL </w:t>
-      </w:r>
-      <w:proofErr w:type="spellStart"/>
-      <w:r>
-        <w:t>และกระบวนการ</w:t>
-      </w:r>
-      <w:proofErr w:type="spellEnd"/>
-      <w:r>
-        <w:t xml:space="preserve"> Auto-assisted </w:t>
-      </w:r>
-      <w:proofErr w:type="spellStart"/>
-      <w:r>
-        <w:t>ที่รวม</w:t>
-      </w:r>
-      <w:proofErr w:type="spellEnd"/>
-      <w:r>
-        <w:t xml:space="preserve"> Manual Touch-up </w:t>
-      </w:r>
-      <w:proofErr w:type="spellStart"/>
-      <w:r>
-        <w:t>เพื่อพิจารณาทั้งเวลา</w:t>
-      </w:r>
-      <w:proofErr w:type="spellEnd"/>
-      <w:r>
-        <w:t xml:space="preserve"> </w:t>
-      </w:r>
-      <w:proofErr w:type="spellStart"/>
-      <w:r>
-        <w:t>ความสอดคล้องกับข้อกำหนด</w:t>
-      </w:r>
-      <w:proofErr w:type="spellEnd"/>
-      <w:r>
-        <w:t xml:space="preserve"> </w:t>
-      </w:r>
-      <w:proofErr w:type="spellStart"/>
-      <w:r>
-        <w:t>และภาระงานที่ยังคงเหลืออยู่หลังระบบทำงาน</w:t>
-      </w:r>
-      <w:proofErr w:type="spellEnd"/>
+      <w:r>
+        <w:t>5. ประเมินผลโดยเปรียบเทียบกระบวนการ Manual กับกระบวนการอัตโนมัติที่กำหนดลำดับเป็น AUTOSHEET → A3TITLEBOXALL และกระบวนการ Auto-assisted ที่รวม Manual Touch-up เพื่อพิจารณาทั้งเวลา ความสอดคล้องกับข้อกำหนด และภาระงานที่ยังคงเหลืออยู่หลังระบบทำงาน</w:t>
+      </w:r>
     </w:p>
     <w:p>
       <w:pPr>
@@ -7452,231 +7048,48 @@
     </w:p>
     <w:p>
       <w:pPr>
-        <w:pStyle w:val="ListNumber"/>
         <w:spacing w:after="60" w:line="269" w:lineRule="auto"/>
-        <w:ind w:left="567" w:hanging="198"/>
+        <w:ind w:left="360" w:hanging="360"/>
       </w:pPr>
-      <w:proofErr w:type="spellStart"/>
-      <w:r>
-        <w:rPr>
-          <w:rFonts w:cs="Noto Sans Thai"/>
-        </w:rPr>
-        <w:t>ได้ต้นแบบ</w:t>
-      </w:r>
-      <w:proofErr w:type="spellEnd"/>
-      <w:r>
-        <w:rPr>
-          <w:rFonts w:cs="Noto Sans Thai"/>
-        </w:rPr>
-        <w:t xml:space="preserve"> AUTOSHEET </w:t>
-      </w:r>
-      <w:proofErr w:type="spellStart"/>
-      <w:r>
-        <w:rPr>
-          <w:rFonts w:cs="Noto Sans Thai"/>
-        </w:rPr>
-        <w:t>สำหรับช่วยลดขั้นตอนการทำงานซ้ำในการจัดเตรียม</w:t>
-      </w:r>
-      <w:proofErr w:type="spellEnd"/>
-      <w:r>
-        <w:rPr>
-          <w:rFonts w:cs="Noto Sans Thai"/>
-        </w:rPr>
-        <w:t xml:space="preserve"> Drawing </w:t>
-      </w:r>
-      <w:proofErr w:type="spellStart"/>
-      <w:r>
-        <w:rPr>
-          <w:rFonts w:cs="Noto Sans Thai"/>
-        </w:rPr>
-        <w:t>ก่อนการ</w:t>
-      </w:r>
-      <w:proofErr w:type="spellEnd"/>
-      <w:r>
-        <w:rPr>
-          <w:rFonts w:cs="Noto Sans Thai"/>
-        </w:rPr>
-        <w:t xml:space="preserve"> Plot</w:t>
+      <w:r>
+        <w:t>1. ได้ต้นแบบ AUTOSHEET สำหรับช่วยลดขั้นตอนการทำงานซ้ำในการจัดเตรียม Drawing ก่อนการ Plot</w:t>
       </w:r>
     </w:p>
     <w:p>
       <w:pPr>
-        <w:pStyle w:val="ListNumber"/>
         <w:spacing w:after="60" w:line="269" w:lineRule="auto"/>
-        <w:ind w:left="567" w:hanging="198"/>
+        <w:ind w:left="360" w:hanging="360"/>
       </w:pPr>
-      <w:proofErr w:type="spellStart"/>
-      <w:r>
-        <w:rPr>
-          <w:rFonts w:cs="Noto Sans Thai"/>
-        </w:rPr>
-        <w:lastRenderedPageBreak/>
-        <w:t>ช่วยเพิ่มความสม่ำเสมอของ</w:t>
-      </w:r>
-      <w:proofErr w:type="spellEnd"/>
-      <w:r>
-        <w:rPr>
-          <w:rFonts w:cs="Noto Sans Thai"/>
-        </w:rPr>
-        <w:t xml:space="preserve"> Drawing </w:t>
-      </w:r>
-      <w:proofErr w:type="spellStart"/>
-      <w:r>
-        <w:rPr>
-          <w:rFonts w:cs="Noto Sans Thai"/>
-        </w:rPr>
-        <w:t>ตามข้อกำหนดที่กำหนดจาก</w:t>
-      </w:r>
-      <w:proofErr w:type="spellEnd"/>
-      <w:r>
-        <w:rPr>
-          <w:rFonts w:cs="Noto Sans Thai"/>
-        </w:rPr>
-        <w:t xml:space="preserve"> Template, Approved Drawing </w:t>
-      </w:r>
-      <w:proofErr w:type="spellStart"/>
-      <w:r>
-        <w:rPr>
-          <w:rFonts w:cs="Noto Sans Thai"/>
-        </w:rPr>
-        <w:t>และข้อกำหนดของโครงการ</w:t>
-      </w:r>
-      <w:proofErr w:type="spellEnd"/>
+      <w:r>
+        <w:t>2. ช่วยเพิ่มความสม่ำเสมอของ Drawing ตามข้อกำหนดที่กำหนดจาก Template, Approved Drawing และข้อกำหนดของโครงการ</w:t>
+      </w:r>
     </w:p>
     <w:p>
       <w:pPr>
-        <w:pStyle w:val="ListNumber"/>
         <w:spacing w:after="60" w:line="269" w:lineRule="auto"/>
-        <w:ind w:left="567" w:hanging="198"/>
+        <w:ind w:left="360" w:hanging="360"/>
       </w:pPr>
-      <w:proofErr w:type="spellStart"/>
-      <w:r>
-        <w:rPr>
-          <w:rFonts w:cs="Noto Sans Thai"/>
-        </w:rPr>
-        <w:t>ลดจำนวนการดำเนินการที่ต้องทำซ้ำทีละ</w:t>
-      </w:r>
-      <w:proofErr w:type="spellEnd"/>
-      <w:r>
-        <w:rPr>
-          <w:rFonts w:cs="Noto Sans Thai"/>
-        </w:rPr>
-        <w:t xml:space="preserve"> Layout และช่วยให้ผู้ปฏิบัติงานสามารถมุ่งเน้นการตรวจสอบจุดที่ต้องใช้การพิจารณามากขึ้น</w:t>
+      <w:r>
+        <w:t>3. ลดจำนวนการดำเนินการที่ต้องทำซ้ำทีละ Layout และช่วยให้ผู้ปฏิบัติงานสามารถมุ่งเน้นการตรวจสอบจุดที่ต้องใช้การพิจารณามากขึ้น</w:t>
       </w:r>
     </w:p>
     <w:p>
       <w:pPr>
-        <w:pStyle w:val="ListNumber"/>
         <w:spacing w:after="60" w:line="269" w:lineRule="auto"/>
-        <w:ind w:left="567" w:hanging="198"/>
+        <w:ind w:left="360" w:hanging="360"/>
       </w:pPr>
-      <w:proofErr w:type="spellStart"/>
-      <w:r>
-        <w:rPr>
-          <w:rFonts w:cs="Noto Sans Thai"/>
-        </w:rPr>
-        <w:t>ได้ข้อมูลเกี่ยวกับขอบเขตของงานที่เหมาะสมต่อการทำ</w:t>
-      </w:r>
-      <w:proofErr w:type="spellEnd"/>
-      <w:r>
-        <w:rPr>
-          <w:rFonts w:cs="Noto Sans Thai"/>
-        </w:rPr>
-        <w:t xml:space="preserve"> Automation </w:t>
-      </w:r>
-      <w:proofErr w:type="spellStart"/>
-      <w:r>
-        <w:rPr>
-          <w:rFonts w:cs="Noto Sans Thai"/>
-        </w:rPr>
-        <w:t>รวมถึงข้อจำกัดของการจัดการ</w:t>
-      </w:r>
-      <w:proofErr w:type="spellEnd"/>
-      <w:r>
-        <w:rPr>
-          <w:rFonts w:cs="Noto Sans Thai"/>
-        </w:rPr>
-        <w:t xml:space="preserve"> Drawing </w:t>
-      </w:r>
-      <w:proofErr w:type="spellStart"/>
-      <w:r>
-        <w:rPr>
-          <w:rFonts w:cs="Noto Sans Thai"/>
-        </w:rPr>
-        <w:t>ที่มีโครงสร้างและตำแหน่งข้อมูลแตกต่างกัน</w:t>
-      </w:r>
-      <w:proofErr w:type="spellEnd"/>
+      <w:r>
+        <w:t>4. ได้ข้อมูลเกี่ยวกับขอบเขตของงานที่เหมาะสมต่อการทำ Automation รวมถึงข้อจำกัดของการจัดการ Drawing ที่มีโครงสร้างและตำแหน่งข้อมูลแตกต่างกัน</w:t>
+      </w:r>
     </w:p>
     <w:p>
       <w:pPr>
-        <w:pStyle w:val="ListNumber"/>
         <w:spacing w:after="60" w:line="269" w:lineRule="auto"/>
-        <w:ind w:left="567" w:hanging="198"/>
+        <w:ind w:left="360" w:hanging="360"/>
       </w:pPr>
-      <w:proofErr w:type="spellStart"/>
-      <w:r>
-        <w:rPr>
-          <w:rFonts w:cs="Noto Sans Thai"/>
-        </w:rPr>
-        <w:t>ได้แนวทางสำหรับพัฒนา</w:t>
-      </w:r>
-      <w:proofErr w:type="spellEnd"/>
-      <w:r>
-        <w:rPr>
-          <w:rFonts w:cs="Noto Sans Thai"/>
-        </w:rPr>
-        <w:t xml:space="preserve"> AUTOSHEET </w:t>
-      </w:r>
-      <w:proofErr w:type="spellStart"/>
-      <w:r>
-        <w:rPr>
-          <w:rFonts w:cs="Noto Sans Thai"/>
-        </w:rPr>
-        <w:t>ต่อไปให้มีความปลอดภัย</w:t>
-      </w:r>
-      <w:proofErr w:type="spellEnd"/>
-      <w:r>
-        <w:rPr>
-          <w:rFonts w:cs="Noto Sans Thai"/>
-        </w:rPr>
-        <w:t xml:space="preserve"> </w:t>
-      </w:r>
-      <w:proofErr w:type="spellStart"/>
-      <w:r>
-        <w:rPr>
-          <w:rFonts w:cs="Noto Sans Thai"/>
-        </w:rPr>
-        <w:t>ตรวจสอบได้</w:t>
-      </w:r>
-      <w:proofErr w:type="spellEnd"/>
-      <w:r>
-        <w:rPr>
-          <w:rFonts w:cs="Noto Sans Thai"/>
-        </w:rPr>
-        <w:t xml:space="preserve"> </w:t>
-      </w:r>
-      <w:proofErr w:type="spellStart"/>
-      <w:r>
-        <w:rPr>
-          <w:rFonts w:cs="Noto Sans Thai"/>
-        </w:rPr>
-        <w:t>และสามารถรองรับ</w:t>
-      </w:r>
-      <w:proofErr w:type="spellEnd"/>
-      <w:r>
-        <w:rPr>
-          <w:rFonts w:cs="Noto Sans Thai"/>
-        </w:rPr>
-        <w:t xml:space="preserve"> Drawing </w:t>
-      </w:r>
-      <w:proofErr w:type="spellStart"/>
-      <w:r>
-        <w:rPr>
-          <w:rFonts w:cs="Noto Sans Thai"/>
-        </w:rPr>
-        <w:t>รูปแบบอื่นได้มากขึ้น</w:t>
-      </w:r>
-      <w:proofErr w:type="spellEnd"/>
+      <w:r>
+        <w:t>5. ได้แนวทางสำหรับพัฒนา AUTOSHEET ต่อไปให้มีความปลอดภัย ตรวจสอบได้ และสามารถรองรับ Drawing รูปแบบอื่นได้มากขึ้น</w:t>
+      </w:r>
     </w:p>
     <w:p>
       <w:r>
@@ -21385,6 +20798,7 @@
       <w:pPr>
         <w:spacing w:after="120"/>
         <w:ind w:firstLine="432"/>
+        <w:jc w:val="left"/>
       </w:pPr>
       <w:proofErr w:type="spellStart"/>
       <w:r>
@@ -22058,6 +21472,7 @@
     <w:p>
       <w:pPr>
         <w:spacing w:after="120"/>
+        <w:jc w:val="left"/>
       </w:pPr>
       <w:proofErr w:type="spellStart"/>
       <w:r>
@@ -23526,6 +22941,7 @@
       <w:pPr>
         <w:spacing w:after="120"/>
         <w:ind w:firstLine="432"/>
+        <w:jc w:val="left"/>
       </w:pPr>
       <w:proofErr w:type="spellStart"/>
       <w:r>
@@ -23643,6 +23059,7 @@
     <w:p>
       <w:pPr>
         <w:spacing w:after="120"/>
+        <w:jc w:val="left"/>
       </w:pPr>
       <w:proofErr w:type="spellStart"/>
       <w:r>
@@ -23806,13 +23223,17 @@
       </w:r>
     </w:p>
     <w:p>
-      <w:pPr/>
+      <w:pPr>
+        <w:jc w:val="left"/>
+      </w:pPr>
       <w:r>
         <w:t>3) AUTOSHEET ถูกพัฒนาจาก LISP เฉพาะงานไปสู่ workflow ที่ใช้ AUTOSHEET ตามด้วย A3TITLEBOXALL และ Auto-only QA ก่อน Manual Final QA. ระบบรุ่นประเมินผลสามารถทำ Requirement ได้เต็มรูปแบบ 26 จาก 27 ข้อในทุก Test Case และหลัง Touch-up สามารถทำให้ Drawing ผ่านทั้ง 27 ข้อและอยู่ในสถานะ Ready to Plot.</w:t>
       </w:r>
     </w:p>
     <w:p>
-      <w:pPr/>
+      <w:pPr>
+        <w:jc w:val="left"/>
+      </w:pPr>
       <w:r>
         <w:t>4) การประเมิน T01–T05 ครอบคลุม 5 DWG รวม 15 Layout. Manual ใช้เวลารวม 29 นาที 11.52 วินาที ขณะที่ Auto-assisted workflow ซึ่งรวมเวลา Automation และ Manual Touch-up ใช้ 15 นาที 51.80 วินาที คิดเป็นการลดเวลารวมประมาณ 45.7% ในชุดทดสอบนี้. ผลดังกล่าวแสดงว่าระบบสามารถลดภาระงานซ้ำได้ แม้ยังไม่สามารถแทนที่ Final Visual QA ได้ทั้งหมด.</w:t>
       </w:r>
@@ -23841,7 +23262,9 @@
       </w:r>
     </w:p>
     <w:p>
-      <w:pPr/>
+      <w:pPr>
+        <w:jc w:val="left"/>
+      </w:pPr>
       <w:r>
         <w:t>ผลรวมลดเวลาประมาณ 45.7% ไม่ควรถูกตีความว่า AUTOSHEET จะลดเวลาได้เท่ากันกับ Drawing ทุกประเภท เนื่องจากแต่ละ Test Case มีจำนวน Layout และความซับซ้อนต่างกัน อย่างไรก็ตาม การที่ทุกกรณีสามารถลดเวลาจาก Manual และไปถึง Ready to Plot หลัง Touch-up แสดงให้เห็นศักยภาพของ workflow ในฐานะเครื่องมือช่วยเตรียมแบบ. ผลนี้สอดคล้องเชิงแนวคิดกับ Sofias et al. (2025) ที่แสดงให้เห็นประโยชน์ของ CAD/API automation ต่อ repetitive engineering tasks ใน workflow จริง.</w:t>
       </w:r>
@@ -23899,7 +23322,9 @@
       </w:r>
     </w:p>
     <w:p>
-      <w:pPr/>
+      <w:pPr>
+        <w:jc w:val="left"/>
+      </w:pPr>
       <w:r>
         <w:t>ประโยชน์ที่พิสูจน์ได้จากชุดทดสอบคือการลดเวลาการจัดเตรียม Drawing ก่อน Plot โดยยังคง Final QA ของผู้ปฏิบัติงานไว้. การลดเวลารวมประมาณ 45.7% ใน 15 Layout ช่วยลดภาระจากการแก้ property และ Plot Setting ซ้ำ ๆ และทำให้ผู้ปฏิบัติงานสามารถใช้เวลามากขึ้นกับการตรวจรายละเอียดที่ต้องอาศัย judgment.</w:t>
       </w:r>
@@ -23971,85 +23396,197 @@
       <w:proofErr w:type="spellEnd"/>
     </w:p>
     <w:p>
-      <w:pPr/>
+      <w:pPr>
+        <w:ind w:left="720" w:hanging="720"/>
+        <w:jc w:val="left"/>
+      </w:pPr>
       <w:r>
         <w:t>Autodesk. (n.d.-a). How to setup layouts in template drawing in AutoCAD. https://www.autodesk.com/support/technical/article/caas/sfdcarticles/sfdcarticles/How-to-setup-Layouts-in-template-drawing-in-AutoCAD.html</w:t>
       </w:r>
     </w:p>
     <w:p>
-      <w:pPr/>
+      <w:pPr>
+        <w:ind w:left="720" w:hanging="720"/>
+        <w:jc w:val="left"/>
+      </w:pPr>
       <w:r>
         <w:t>Autodesk. (n.d.-b). About AutoLISP applications. AutoCAD 2026 Help. https://help.autodesk.com/view/ACD/2026/ENU/</w:t>
       </w:r>
     </w:p>
     <w:p>
-      <w:pPr/>
+      <w:pPr>
+        <w:ind w:left="720" w:hanging="720"/>
+        <w:jc w:val="left"/>
+      </w:pPr>
       <w:r>
         <w:t>Autodesk. (n.d.-c). Introduction (AutoLISP). AutoCAD 2026 Help. https://help.autodesk.com/cloudhelp/2026/ENU/AutoCAD-AutoLISP/</w:t>
       </w:r>
     </w:p>
     <w:p>
-      <w:pPr/>
+      <w:pPr>
+        <w:ind w:left="720" w:hanging="720"/>
+        <w:jc w:val="left"/>
+      </w:pPr>
       <w:r>
         <w:t>Eastman, C., Lee, J.-M., Jeong, Y.-S., &amp; Lee, J.-K. (2009). Automatic rule-based checking of building designs. Automation in Construction, 18(8), 1011–1033. https://doi.org/10.1016/j.autcon.2009.07.002</w:t>
       </w:r>
     </w:p>
     <w:p>
-      <w:pPr/>
+      <w:pPr>
+        <w:ind w:left="720" w:hanging="720"/>
+        <w:jc w:val="left"/>
+      </w:pPr>
       <w:r>
         <w:t>International Organization for Standardization. (1979). ISO 5455:1979 Technical drawings—Scales. https://www.iso.org/standard/11500.html</w:t>
       </w:r>
     </w:p>
     <w:p>
-      <w:pPr/>
+      <w:pPr>
+        <w:ind w:left="720" w:hanging="720"/>
+        <w:jc w:val="left"/>
+      </w:pPr>
       <w:r>
         <w:t>International Organization for Standardization. (1999). ISO 5457:1999 Technical product documentation—Sizes and layout of drawing sheets. https://www.iso.org/standard/29017.html</w:t>
       </w:r>
     </w:p>
     <w:p>
-      <w:pPr/>
+      <w:pPr>
+        <w:ind w:left="720" w:hanging="720"/>
+        <w:jc w:val="left"/>
+      </w:pPr>
       <w:r>
         <w:t>International Organization for Standardization. (2004). ISO 7200:2004 Technical product documentation—Data fields in title blocks and document headers. https://www.iso.org/standard/35446.html</w:t>
       </w:r>
     </w:p>
     <w:p>
-      <w:pPr/>
+      <w:pPr>
+        <w:ind w:left="720" w:hanging="720"/>
+        <w:jc w:val="left"/>
+      </w:pPr>
       <w:r>
         <w:t>International Organization for Standardization. (2015). ISO 3098-1:2015 Technical product documentation—Lettering—Part 1: General requirements. https://www.iso.org/standard/65679.html</w:t>
       </w:r>
     </w:p>
     <w:p>
-      <w:pPr/>
+      <w:pPr>
+        <w:ind w:left="720" w:hanging="720"/>
+        <w:jc w:val="left"/>
+      </w:pPr>
       <w:r>
         <w:t>Murakami, T., Zhang, G., &amp; Nakajima, N. (1995). Research on computerized check of CAD drawings based on drafting rules. Journal of Graphic Science of Japan, 29(3), 3–9. https://doi.org/10.5989/jsgs.29.3_3</w:t>
       </w:r>
     </w:p>
     <w:p>
-      <w:pPr/>
+      <w:pPr>
+        <w:ind w:left="720" w:hanging="720"/>
+        <w:jc w:val="left"/>
+      </w:pPr>
       <w:r>
         <w:t>Parfitt, M. K., Syal, M. G., &amp; Hroarsson, H. (1993). Framework for an automated quality control system in working drawing production. In Computing in Civil and Building Engineering (pp. 1026–1033). ASCE.</w:t>
       </w:r>
     </w:p>
     <w:p>
-      <w:pPr/>
+      <w:pPr>
+        <w:ind w:left="720" w:hanging="720"/>
+        <w:jc w:val="left"/>
+      </w:pPr>
       <w:r>
         <w:t>Rica, E., Moreno-García, C. F., Álvarez, S., &amp; Serratosa, F. (2020). Reducing human effort in engineering drawing validation. Computers in Industry, 117, 103198. https://doi.org/10.1016/j.compind.2020.103198</w:t>
       </w:r>
     </w:p>
     <w:p>
-      <w:pPr/>
+      <w:pPr>
+        <w:ind w:left="720" w:hanging="720"/>
+        <w:jc w:val="left"/>
+      </w:pPr>
       <w:r>
         <w:t>Scheibel, B., Mangler, J., &amp; Rinderle-Ma, S. (2021). Extraction of dimension requirements from engineering drawings for supporting quality control in production processes. Computers in Industry, 129, 103442. https://doi.org/10.1016/j.compind.2021.103442</w:t>
       </w:r>
     </w:p>
     <w:p>
-      <w:pPr/>
+      <w:pPr>
+        <w:ind w:left="720" w:hanging="720"/>
+        <w:jc w:val="left"/>
+      </w:pPr>
       <w:r>
         <w:t>Sofias, K., Kanetaki, Z., Stergiou, C., Kantaros, A., Jacques, S., &amp; Ganetsos, T. (2025). Implementing CAD API automated processes in engineering design: A case study approach. Applied Sciences, 15(14), 7692. https://doi.org/10.3390/app15147692</w:t>
       </w:r>
     </w:p>
     <w:p>
-      <w:pPr/>
+      <w:pPr>
+        <w:spacing w:after="60"/>
+        <w:ind w:left="720" w:hanging="720"/>
+        <w:jc w:val="left"/>
+      </w:pPr>
+      <w:r>
+        <w:t>Autodesk. (2026a). AutoLISP Developer's Guide. AutoCAD 2026 Help. https://help.autodesk.com/cloudhelp/2026/ENU/AutoCAD-AutoLISP/files/GUID-265AADB3-FB89-4D34-AA9D-6ADF70FF7D4B.htm</w:t>
+      </w:r>
+    </w:p>
+    <w:p>
+      <w:pPr>
+        <w:spacing w:after="60"/>
+        <w:ind w:left="720" w:hanging="720"/>
+        <w:jc w:val="left"/>
+      </w:pPr>
+      <w:r>
+        <w:t>Autodesk. (2026b). Introduction (AutoLISP). AutoCAD 2026 Help. https://help.autodesk.com/cloudhelp/2026/CSY/AutoCAD-AutoLISP/files/GUID-A0E9D801-8BE9-4BF1-85E8-3807E15F3B71.htm</w:t>
+      </w:r>
+    </w:p>
+    <w:p>
+      <w:pPr>
+        <w:spacing w:after="60"/>
+        <w:ind w:left="720" w:hanging="720"/>
+        <w:jc w:val="left"/>
+      </w:pPr>
+      <w:r>
+        <w:t>International Organization for Standardization. (1979). Technical drawings — Scales (ISO 5455:1979). https://www.iso.org/standard/11500.html</w:t>
+      </w:r>
+    </w:p>
+    <w:p>
+      <w:pPr>
+        <w:spacing w:after="60"/>
+        <w:ind w:left="720" w:hanging="720"/>
+        <w:jc w:val="left"/>
+      </w:pPr>
+      <w:r>
+        <w:t>International Organization for Standardization. (1999). Technical product documentation — Sizes and layout of drawing sheets (ISO 5457:1999). https://www.iso.org/standard/29017.html</w:t>
+      </w:r>
+    </w:p>
+    <w:p>
+      <w:pPr>
+        <w:spacing w:after="60"/>
+        <w:ind w:left="720" w:hanging="720"/>
+        <w:jc w:val="left"/>
+      </w:pPr>
+      <w:r>
+        <w:t>International Organization for Standardization. (2004). Technical product documentation — Data fields in title blocks and document headers (ISO 7200:2004). https://www.iso.org/standard/35446.html</w:t>
+      </w:r>
+    </w:p>
+    <w:p>
+      <w:pPr>
+        <w:spacing w:after="60"/>
+        <w:ind w:left="720" w:hanging="720"/>
+        <w:jc w:val="left"/>
+      </w:pPr>
+      <w:r>
+        <w:t>International Organization for Standardization. (2015). Technical product documentation — Lettering — Part 1: General requirements (ISO 3098-1:2015). https://www.iso.org/standard/65679.html</w:t>
+      </w:r>
+    </w:p>
+    <w:p>
+      <w:pPr>
+        <w:spacing w:after="60"/>
+        <w:ind w:left="720" w:hanging="720"/>
+        <w:jc w:val="left"/>
+      </w:pPr>
+      <w:r>
+        <w:t>เอกสารมาตรฐานและแบบอ้างอิงของโครงการ. (2569). Template, Approved Drawing และ Plot Setting ที่ใช้เป็น Ground Truth ในโครงงาน AUTOSHEET [เอกสารภายในสถานประกอบการ ไม่เผยแพร่].</w:t>
+      </w:r>
+    </w:p>
+    <w:p>
+      <w:pPr>
+        <w:ind w:left="720" w:hanging="720"/>
+        <w:jc w:val="left"/>
+      </w:pPr>
       <w:r>
         <w:t>Solihin, W., &amp; Eastman, C. (2015). Classification of rules for automated BIM rule checking development. Automation in Construction, 53, 69–82. https://doi.org/10.1016/j.autcon.2015.03.003</w:t>
       </w:r>
@@ -27370,8 +26907,17 @@
 <w:hdr xmlns:wpc="http://schemas.microsoft.com/office/word/2010/wordprocessingCanvas" xmlns:cx="http://schemas.microsoft.com/office/drawing/2014/chartex" xmlns:cx1="http://schemas.microsoft.com/office/drawing/2015/9/8/chartex" xmlns:cx2="http://schemas.microsoft.com/office/drawing/2015/10/21/chartex" xmlns:cx3="http://schemas.microsoft.com/office/drawing/2016/5/9/chartex" xmlns:cx4="http://schemas.microsoft.com/office/drawing/2016/5/10/chartex" xmlns:cx5="http://schemas.microsoft.com/office/drawing/2016/5/11/chartex" xmlns:cx6="http://schemas.microsoft.com/office/drawing/2016/5/12/chartex" xmlns:cx7="http://schemas.microsoft.com/office/drawing/2016/5/13/chartex" xmlns:cx8="http://schemas.microsoft.com/office/drawing/2016/5/14/chartex" xmlns:mc="http://schemas.openxmlformats.org/markup-compatibility/2006" xmlns:aink="http://schemas.microsoft.com/office/drawing/2016/ink" xmlns:am3d="http://schemas.microsoft.com/office/drawing/2017/model3d" xmlns:o="urn:schemas-microsoft-com:office:office" xmlns:oel="http://schemas.microsoft.com/office/2019/extlst" xmlns:r="http://schemas.openxmlformats.org/officeDocument/2006/relationships" xmlns:m="http://schemas.openxmlformats.org/officeDocument/2006/math" xmlns:v="urn:schemas-microsoft-com:vml" xmlns:wp14="http://schemas.microsoft.com/office/word/2010/wordprocessingDrawing" xmlns:wp="http://schemas.openxmlformats.org/drawingml/2006/wordprocessingDrawing" xmlns:w10="urn:schemas-microsoft-com:office:word" xmlns:w="http://schemas.openxmlformats.org/wordprocessingml/2006/main" xmlns:w14="http://schemas.microsoft.com/office/word/2010/wordml" xmlns:w15="http://schemas.microsoft.com/office/word/2012/wordml" xmlns:w16cex="http://schemas.microsoft.com/office/word/2018/wordml/cex" xmlns:w16cid="http://schemas.microsoft.com/office/word/2016/wordml/cid" xmlns:w16="http://schemas.microsoft.com/office/word/2018/wordml" xmlns:w16du="http://schemas.microsoft.com/office/word/2023/wordml/word16du" xmlns:w16sdtdh="http://schemas.microsoft.com/office/word/2020/wordml/sdtdatahash" xmlns:w16sdtfl="http://schemas.microsoft.com/office/word/2024/wordml/sdtformatlock" xmlns:w16se="http://schemas.microsoft.com/office/word/2015/wordml/symex" xmlns:wpg="http://schemas.microsoft.com/office/word/2010/wordprocessingGroup" xmlns:wpi="http://schemas.microsoft.com/office/word/2010/wordprocessingInk" xmlns:wne="http://schemas.microsoft.com/office/word/2006/wordml" xmlns:wps="http://schemas.microsoft.com/office/word/2010/wordprocessingShape" mc:Ignorable="w14 w15 w16se w16cid w16 w16cex w16sdtdh w16sdtfl w16du wp14">
   <w:p>
     <w:pPr>
-      <w:pStyle w:val="Header"/>
+      <w:jc w:val="right"/>
     </w:pPr>
+    <w:fldSimple w:instr="PAGE">
+      <w:r>
+        <w:rPr>
+          <w:rFonts w:ascii="Arial" w:hAnsi="Arial" w:eastAsia="Arial" w:cs="Arial"/>
+          <w:sz w:val="22"/>
+        </w:rPr>
+        <w:t>1</w:t>
+      </w:r>
+    </w:fldSimple>
   </w:p>
 </w:hdr>
 </file>
@@ -27390,44 +26936,17 @@
 <w:hdr xmlns:wpc="http://schemas.microsoft.com/office/word/2010/wordprocessingCanvas" xmlns:cx="http://schemas.microsoft.com/office/drawing/2014/chartex" xmlns:cx1="http://schemas.microsoft.com/office/drawing/2015/9/8/chartex" xmlns:cx2="http://schemas.microsoft.com/office/drawing/2015/10/21/chartex" xmlns:cx3="http://schemas.microsoft.com/office/drawing/2016/5/9/chartex" xmlns:cx4="http://schemas.microsoft.com/office/drawing/2016/5/10/chartex" xmlns:cx5="http://schemas.microsoft.com/office/drawing/2016/5/11/chartex" xmlns:cx6="http://schemas.microsoft.com/office/drawing/2016/5/12/chartex" xmlns:cx7="http://schemas.microsoft.com/office/drawing/2016/5/13/chartex" xmlns:cx8="http://schemas.microsoft.com/office/drawing/2016/5/14/chartex" xmlns:mc="http://schemas.openxmlformats.org/markup-compatibility/2006" xmlns:aink="http://schemas.microsoft.com/office/drawing/2016/ink" xmlns:am3d="http://schemas.microsoft.com/office/drawing/2017/model3d" xmlns:o="urn:schemas-microsoft-com:office:office" xmlns:oel="http://schemas.microsoft.com/office/2019/extlst" xmlns:r="http://schemas.openxmlformats.org/officeDocument/2006/relationships" xmlns:m="http://schemas.openxmlformats.org/officeDocument/2006/math" xmlns:v="urn:schemas-microsoft-com:vml" xmlns:wp14="http://schemas.microsoft.com/office/word/2010/wordprocessingDrawing" xmlns:wp="http://schemas.openxmlformats.org/drawingml/2006/wordprocessingDrawing" xmlns:w10="urn:schemas-microsoft-com:office:word" xmlns:w="http://schemas.openxmlformats.org/wordprocessingml/2006/main" xmlns:w14="http://schemas.microsoft.com/office/word/2010/wordml" xmlns:w15="http://schemas.microsoft.com/office/word/2012/wordml" xmlns:w16cex="http://schemas.microsoft.com/office/word/2018/wordml/cex" xmlns:w16cid="http://schemas.microsoft.com/office/word/2016/wordml/cid" xmlns:w16="http://schemas.microsoft.com/office/word/2018/wordml" xmlns:w16du="http://schemas.microsoft.com/office/word/2023/wordml/word16du" xmlns:w16sdtdh="http://schemas.microsoft.com/office/word/2020/wordml/sdtdatahash" xmlns:w16sdtfl="http://schemas.microsoft.com/office/word/2024/wordml/sdtformatlock" xmlns:w16se="http://schemas.microsoft.com/office/word/2015/wordml/symex" xmlns:wpg="http://schemas.microsoft.com/office/word/2010/wordprocessingGroup" xmlns:wpi="http://schemas.microsoft.com/office/word/2010/wordprocessingInk" xmlns:wne="http://schemas.microsoft.com/office/word/2006/wordml" xmlns:wps="http://schemas.microsoft.com/office/word/2010/wordprocessingShape" mc:Ignorable="w14 w15 w16se w16cid w16 w16cex w16sdtdh w16sdtfl w16du wp14">
   <w:p>
     <w:pPr>
-      <w:pStyle w:val="Header"/>
       <w:jc w:val="right"/>
     </w:pPr>
-    <w:r>
-      <w:rPr>
-        <w:rFonts w:ascii="Times New Roman" w:eastAsia="Times New Roman" w:hAnsi="Times New Roman" w:cs="Times New Roman"/>
-        <w:sz w:val="22"/>
-      </w:rPr>
-      <w:fldChar w:fldCharType="begin"/>
-    </w:r>
-    <w:r>
-      <w:rPr>
-        <w:rFonts w:ascii="Times New Roman" w:eastAsia="Times New Roman" w:hAnsi="Times New Roman" w:cs="Times New Roman"/>
-        <w:sz w:val="22"/>
-      </w:rPr>
-      <w:instrText xml:space="preserve"> PAGE </w:instrText>
-    </w:r>
-    <w:r>
-      <w:rPr>
-        <w:rFonts w:ascii="Times New Roman" w:eastAsia="Times New Roman" w:hAnsi="Times New Roman" w:cs="Times New Roman"/>
-        <w:sz w:val="22"/>
-      </w:rPr>
-      <w:fldChar w:fldCharType="separate"/>
-    </w:r>
-    <w:r>
-      <w:rPr>
-        <w:rFonts w:ascii="Times New Roman" w:eastAsia="Times New Roman" w:hAnsi="Times New Roman" w:cs="Times New Roman"/>
-        <w:sz w:val="22"/>
-      </w:rPr>
-      <w:t>1</w:t>
-    </w:r>
-    <w:r>
-      <w:rPr>
-        <w:rFonts w:ascii="Times New Roman" w:eastAsia="Times New Roman" w:hAnsi="Times New Roman" w:cs="Times New Roman"/>
-        <w:sz w:val="22"/>
-      </w:rPr>
-      <w:fldChar w:fldCharType="end"/>
-    </w:r>
+    <w:fldSimple w:instr="PAGE">
+      <w:r>
+        <w:rPr>
+          <w:rFonts w:ascii="Arial" w:hAnsi="Arial" w:eastAsia="Arial" w:cs="Arial"/>
+          <w:sz w:val="22"/>
+        </w:rPr>
+        <w:t>1</w:t>
+      </w:r>
+    </w:fldSimple>
   </w:p>
 </w:hdr>
 </file>
@@ -27436,44 +26955,17 @@
 <w:hdr xmlns:wpc="http://schemas.microsoft.com/office/word/2010/wordprocessingCanvas" xmlns:cx="http://schemas.microsoft.com/office/drawing/2014/chartex" xmlns:cx1="http://schemas.microsoft.com/office/drawing/2015/9/8/chartex" xmlns:cx2="http://schemas.microsoft.com/office/drawing/2015/10/21/chartex" xmlns:cx3="http://schemas.microsoft.com/office/drawing/2016/5/9/chartex" xmlns:cx4="http://schemas.microsoft.com/office/drawing/2016/5/10/chartex" xmlns:cx5="http://schemas.microsoft.com/office/drawing/2016/5/11/chartex" xmlns:cx6="http://schemas.microsoft.com/office/drawing/2016/5/12/chartex" xmlns:cx7="http://schemas.microsoft.com/office/drawing/2016/5/13/chartex" xmlns:cx8="http://schemas.microsoft.com/office/drawing/2016/5/14/chartex" xmlns:mc="http://schemas.openxmlformats.org/markup-compatibility/2006" xmlns:aink="http://schemas.microsoft.com/office/drawing/2016/ink" xmlns:am3d="http://schemas.microsoft.com/office/drawing/2017/model3d" xmlns:o="urn:schemas-microsoft-com:office:office" xmlns:oel="http://schemas.microsoft.com/office/2019/extlst" xmlns:r="http://schemas.openxmlformats.org/officeDocument/2006/relationships" xmlns:m="http://schemas.openxmlformats.org/officeDocument/2006/math" xmlns:v="urn:schemas-microsoft-com:vml" xmlns:wp14="http://schemas.microsoft.com/office/word/2010/wordprocessingDrawing" xmlns:wp="http://schemas.openxmlformats.org/drawingml/2006/wordprocessingDrawing" xmlns:w10="urn:schemas-microsoft-com:office:word" xmlns:w="http://schemas.openxmlformats.org/wordprocessingml/2006/main" xmlns:w14="http://schemas.microsoft.com/office/word/2010/wordml" xmlns:w15="http://schemas.microsoft.com/office/word/2012/wordml" xmlns:w16cex="http://schemas.microsoft.com/office/word/2018/wordml/cex" xmlns:w16cid="http://schemas.microsoft.com/office/word/2016/wordml/cid" xmlns:w16="http://schemas.microsoft.com/office/word/2018/wordml" xmlns:w16du="http://schemas.microsoft.com/office/word/2023/wordml/word16du" xmlns:w16sdtdh="http://schemas.microsoft.com/office/word/2020/wordml/sdtdatahash" xmlns:w16sdtfl="http://schemas.microsoft.com/office/word/2024/wordml/sdtformatlock" xmlns:w16se="http://schemas.microsoft.com/office/word/2015/wordml/symex" xmlns:wpg="http://schemas.microsoft.com/office/word/2010/wordprocessingGroup" xmlns:wpi="http://schemas.microsoft.com/office/word/2010/wordprocessingInk" xmlns:wne="http://schemas.microsoft.com/office/word/2006/wordml" xmlns:wps="http://schemas.microsoft.com/office/word/2010/wordprocessingShape" mc:Ignorable="w14 w15 w16se w16cid w16 w16cex w16sdtdh w16sdtfl w16du wp14">
   <w:p>
     <w:pPr>
-      <w:pStyle w:val="Header"/>
       <w:jc w:val="right"/>
     </w:pPr>
-    <w:r>
-      <w:rPr>
-        <w:rFonts w:ascii="Times New Roman" w:eastAsia="Times New Roman" w:hAnsi="Times New Roman" w:cs="Times New Roman"/>
-        <w:sz w:val="22"/>
-      </w:rPr>
-      <w:fldChar w:fldCharType="begin"/>
-    </w:r>
-    <w:r>
-      <w:rPr>
-        <w:rFonts w:ascii="Times New Roman" w:eastAsia="Times New Roman" w:hAnsi="Times New Roman" w:cs="Times New Roman"/>
-        <w:sz w:val="22"/>
-      </w:rPr>
-      <w:instrText xml:space="preserve"> PAGE </w:instrText>
-    </w:r>
-    <w:r>
-      <w:rPr>
-        <w:rFonts w:ascii="Times New Roman" w:eastAsia="Times New Roman" w:hAnsi="Times New Roman" w:cs="Times New Roman"/>
-        <w:sz w:val="22"/>
-      </w:rPr>
-      <w:fldChar w:fldCharType="separate"/>
-    </w:r>
-    <w:r>
-      <w:rPr>
-        <w:rFonts w:ascii="Times New Roman" w:eastAsia="Times New Roman" w:hAnsi="Times New Roman" w:cs="Times New Roman"/>
-        <w:sz w:val="22"/>
-      </w:rPr>
-      <w:t>1</w:t>
-    </w:r>
-    <w:r>
-      <w:rPr>
-        <w:rFonts w:ascii="Times New Roman" w:eastAsia="Times New Roman" w:hAnsi="Times New Roman" w:cs="Times New Roman"/>
-        <w:sz w:val="22"/>
-      </w:rPr>
-      <w:fldChar w:fldCharType="end"/>
-    </w:r>
+    <w:fldSimple w:instr="PAGE">
+      <w:r>
+        <w:rPr>
+          <w:rFonts w:ascii="Arial" w:hAnsi="Arial" w:eastAsia="Arial" w:cs="Arial"/>
+          <w:sz w:val="22"/>
+        </w:rPr>
+        <w:t>1</w:t>
+      </w:r>
+    </w:fldSimple>
   </w:p>
 </w:hdr>
 </file>

</xml_diff>

<commit_message>
Refine report methodology, evaluation split, and APA references
</commit_message>
<xml_diff>
--- a/รายงานสหกิจ.docx
+++ b/รายงานสหกิจ.docx
@@ -6905,125 +6905,8 @@
         <w:spacing w:after="100"/>
         <w:ind w:firstLine="709"/>
       </w:pPr>
-      <w:proofErr w:type="spellStart"/>
-      <w:r>
-        <w:t>การศึกษานี้เริ่มจากการสำรวจกระบวนการจัดเตรียม</w:t>
-      </w:r>
-      <w:proofErr w:type="spellEnd"/>
-      <w:r>
-        <w:t xml:space="preserve"> Drawing </w:t>
-      </w:r>
-      <w:proofErr w:type="spellStart"/>
-      <w:r>
-        <w:t>ที่ดำเนินการด้วยวิธี</w:t>
-      </w:r>
-      <w:proofErr w:type="spellEnd"/>
-      <w:r>
-        <w:t xml:space="preserve"> Manual </w:t>
-      </w:r>
-      <w:proofErr w:type="spellStart"/>
-      <w:r>
-        <w:t>และวิเคราะห์ขั้นตอนที่เกิดซ้ำ</w:t>
-      </w:r>
-      <w:proofErr w:type="spellEnd"/>
-      <w:r>
-        <w:t xml:space="preserve"> </w:t>
-      </w:r>
-      <w:proofErr w:type="spellStart"/>
-      <w:r>
-        <w:t>จากนั้นพัฒนา</w:t>
-      </w:r>
-      <w:proofErr w:type="spellEnd"/>
-      <w:r>
-        <w:t xml:space="preserve"> </w:t>
-      </w:r>
-      <w:proofErr w:type="spellStart"/>
-      <w:r>
-        <w:t>AutoLISP</w:t>
-      </w:r>
-      <w:proofErr w:type="spellEnd"/>
-      <w:r>
-        <w:t xml:space="preserve"> </w:t>
-      </w:r>
-      <w:proofErr w:type="spellStart"/>
-      <w:r>
-        <w:t>ขนาดเล็กเพื่อช่วยตรวจสอบและแก้ปัญหาเฉพาะงาน</w:t>
-      </w:r>
-      <w:proofErr w:type="spellEnd"/>
-      <w:r>
-        <w:t xml:space="preserve"> </w:t>
-      </w:r>
-      <w:proofErr w:type="spellStart"/>
-      <w:r>
-        <w:t>ก่อนจะปรับปรุงคำสั่งเหล่านั้นจากผลการทดลองกับ</w:t>
-      </w:r>
-      <w:proofErr w:type="spellEnd"/>
-      <w:r>
-        <w:t xml:space="preserve"> Drawing </w:t>
-      </w:r>
-      <w:proofErr w:type="spellStart"/>
-      <w:r>
-        <w:t>จริงและรวบรวมฟังก์ชันที่เกี่ยวข้องเป็น</w:t>
-      </w:r>
-      <w:proofErr w:type="spellEnd"/>
-      <w:r>
-        <w:t xml:space="preserve"> AUTOSHEET </w:t>
-      </w:r>
-      <w:proofErr w:type="spellStart"/>
-      <w:r>
-        <w:t>ต่อมาได้กำหนดข้อกำหนดของ</w:t>
-      </w:r>
-      <w:proofErr w:type="spellEnd"/>
-      <w:r>
-        <w:t xml:space="preserve"> Drawing </w:t>
-      </w:r>
-      <w:proofErr w:type="spellStart"/>
-      <w:r>
-        <w:t>จาก</w:t>
-      </w:r>
-      <w:proofErr w:type="spellEnd"/>
-      <w:r>
-        <w:t xml:space="preserve"> Template, Approved Drawing </w:t>
-      </w:r>
-      <w:proofErr w:type="spellStart"/>
-      <w:r>
-        <w:t>และข้อกำหนดของโครงการเป็น</w:t>
-      </w:r>
-      <w:proofErr w:type="spellEnd"/>
-      <w:r>
-        <w:t xml:space="preserve"> Ground Truth </w:t>
-      </w:r>
-      <w:proofErr w:type="spellStart"/>
-      <w:r>
-        <w:t>แล้วประเมินด้วย</w:t>
-      </w:r>
-      <w:proofErr w:type="spellEnd"/>
-      <w:r>
-        <w:t xml:space="preserve"> Workflow </w:t>
-      </w:r>
-      <w:proofErr w:type="spellStart"/>
-      <w:r>
-        <w:t>คงที่</w:t>
-      </w:r>
-      <w:proofErr w:type="spellEnd"/>
-      <w:r>
-        <w:t xml:space="preserve"> AUTOSHEET → A3TITLEBOXALL → Auto-only QA → Manual Touch-up/Final QA </w:t>
-      </w:r>
-      <w:proofErr w:type="spellStart"/>
-      <w:r>
-        <w:t>โดยเปรียบเทียบกับกระบวนการ</w:t>
-      </w:r>
-      <w:proofErr w:type="spellEnd"/>
-      <w:r>
-        <w:t xml:space="preserve"> Manual </w:t>
-      </w:r>
-      <w:proofErr w:type="spellStart"/>
-      <w:r>
-        <w:t>ใน</w:t>
-      </w:r>
-      <w:proofErr w:type="spellEnd"/>
-      <w:r>
-        <w:t xml:space="preserve"> T01–T05</w:t>
+      <w:r>
+        <w:t>การศึกษานี้เริ่มจากการสำรวจกระบวนการจัดเตรียม Drawing ที่ดำเนินการด้วยวิธี Manual และวิเคราะห์ขั้นตอนที่เกิดซ้ำ จากนั้นพัฒนา AutoLISP ขนาดเล็กเพื่อช่วยตรวจสอบและแก้ปัญหาเฉพาะงาน ก่อนจะปรับปรุงคำสั่งเหล่านั้นจากผลการทดลองกับ Drawing จริงและรวบรวมฟังก์ชันที่เกี่ยวข้องเป็น AUTOSHEET ต่อมาได้กำหนดข้อกำหนดของ Drawing จาก Template, Approved Drawing และข้อกำหนดของโครงการเป็น Ground Truth โดยใช้ T01 เป็น Pilot สำหรับกำหนดและตรึง Protocol จากนั้นจึงใช้ T02–T05 เป็นชุดประเมินหลักภายใต้ Workflow คงที่ AUTOSHEET → A3TITLEBOXALL → Auto-only QA → Manual Touch-up/Final QA และเปรียบเทียบกับกระบวนการ Manual</w:t>
       </w:r>
     </w:p>
     <w:p>
@@ -14749,156 +14632,9 @@
       <w:proofErr w:type="spellEnd"/>
     </w:p>
     <w:p>
-      <w:proofErr w:type="spellStart"/>
-      <w:r>
-        <w:t>หลักการด้านความปลอดภัยที่ใช้ร่วมกับ</w:t>
-      </w:r>
-      <w:proofErr w:type="spellEnd"/>
-      <w:r>
-        <w:t xml:space="preserve"> Workflow </w:t>
-      </w:r>
-      <w:proofErr w:type="spellStart"/>
-      <w:r>
-        <w:t>ได้แก่</w:t>
-      </w:r>
-      <w:proofErr w:type="spellEnd"/>
-      <w:r>
-        <w:t xml:space="preserve"> </w:t>
-      </w:r>
-      <w:proofErr w:type="spellStart"/>
-      <w:r>
-        <w:t>การไม่เปลี่ยน</w:t>
-      </w:r>
-      <w:proofErr w:type="spellEnd"/>
-      <w:r>
-        <w:t xml:space="preserve"> Viewport Scale, View </w:t>
-      </w:r>
-      <w:proofErr w:type="spellStart"/>
-      <w:r>
-        <w:t>และ</w:t>
-      </w:r>
-      <w:proofErr w:type="spellEnd"/>
-      <w:r>
-        <w:t xml:space="preserve"> Lock </w:t>
-      </w:r>
-      <w:proofErr w:type="spellStart"/>
-      <w:r>
-        <w:t>โดยไม่จำเป็น</w:t>
-      </w:r>
-      <w:proofErr w:type="spellEnd"/>
-      <w:r>
-        <w:t xml:space="preserve">; </w:t>
-      </w:r>
-      <w:proofErr w:type="spellStart"/>
-      <w:r>
-        <w:t>การ</w:t>
-      </w:r>
-      <w:proofErr w:type="spellEnd"/>
-      <w:r>
-        <w:t xml:space="preserve"> Preserve Full Sheet Frame </w:t>
-      </w:r>
-      <w:proofErr w:type="spellStart"/>
-      <w:r>
-        <w:t>ใน</w:t>
-      </w:r>
-      <w:proofErr w:type="spellEnd"/>
-      <w:r>
-        <w:t xml:space="preserve"> Profile </w:t>
-      </w:r>
-      <w:proofErr w:type="spellStart"/>
-      <w:r>
-        <w:t>ที่ตรวจพบว่าเป็นกรอบทั้งแผ่น</w:t>
-      </w:r>
-      <w:proofErr w:type="spellEnd"/>
-      <w:r>
-        <w:t xml:space="preserve">; </w:t>
-      </w:r>
-      <w:proofErr w:type="spellStart"/>
-      <w:r>
-        <w:t>การ</w:t>
-      </w:r>
-      <w:proofErr w:type="spellEnd"/>
-      <w:r>
-        <w:t xml:space="preserve"> Skip </w:t>
-      </w:r>
-      <w:proofErr w:type="spellStart"/>
-      <w:r>
-        <w:t>และแจ้ง</w:t>
-      </w:r>
-      <w:proofErr w:type="spellEnd"/>
-      <w:r>
-        <w:t xml:space="preserve"> Warning </w:t>
-      </w:r>
-      <w:proofErr w:type="spellStart"/>
-      <w:r>
-        <w:t>เมื่อ</w:t>
-      </w:r>
-      <w:proofErr w:type="spellEnd"/>
-      <w:r>
-        <w:t xml:space="preserve"> Profile </w:t>
-      </w:r>
-      <w:proofErr w:type="spellStart"/>
-      <w:r>
-        <w:t>ไม่อยู่ในรูปแบบที่รองรับ</w:t>
-      </w:r>
-      <w:proofErr w:type="spellEnd"/>
-      <w:r>
-        <w:t xml:space="preserve">; </w:t>
-      </w:r>
-      <w:proofErr w:type="spellStart"/>
-      <w:r>
-        <w:lastRenderedPageBreak/>
-        <w:t>และการไม่บันทึกไฟล์โดยอัตโนมัติ</w:t>
-      </w:r>
-      <w:proofErr w:type="spellEnd"/>
-      <w:r>
-        <w:t xml:space="preserve"> </w:t>
-      </w:r>
-      <w:proofErr w:type="spellStart"/>
-      <w:r>
-        <w:t>เพื่อให้ผู้ใช้งานตรวจสอบผลก่อนตัดสินใจ</w:t>
-      </w:r>
-      <w:proofErr w:type="spellEnd"/>
-      <w:r>
-        <w:t xml:space="preserve"> Save </w:t>
-      </w:r>
-      <w:proofErr w:type="spellStart"/>
-      <w:r>
-        <w:t>ในการประเมิน</w:t>
-      </w:r>
-      <w:proofErr w:type="spellEnd"/>
-      <w:r>
-        <w:t xml:space="preserve"> T01–T05 </w:t>
-      </w:r>
-      <w:proofErr w:type="spellStart"/>
-      <w:r>
-        <w:t>จึงถือว่า</w:t>
-      </w:r>
-      <w:proofErr w:type="spellEnd"/>
-      <w:r>
-        <w:t xml:space="preserve"> “</w:t>
-      </w:r>
-      <w:proofErr w:type="spellStart"/>
-      <w:r>
-        <w:t>กระบวนการอัตโนมัติ</w:t>
-      </w:r>
-      <w:proofErr w:type="spellEnd"/>
-      <w:r>
-        <w:t xml:space="preserve">” </w:t>
-      </w:r>
-      <w:proofErr w:type="spellStart"/>
-      <w:r>
-        <w:t>หมายถึง</w:t>
-      </w:r>
-      <w:proofErr w:type="spellEnd"/>
-      <w:r>
-        <w:t xml:space="preserve"> AUTOSHEET → A3TITLEBOXALL </w:t>
-      </w:r>
-      <w:proofErr w:type="spellStart"/>
-      <w:r>
-        <w:t>ตามลำดับนี้เท่านั้น</w:t>
-      </w:r>
-      <w:proofErr w:type="spellEnd"/>
+      <w:r>
+        <w:t>หลักการด้านความปลอดภัยที่ใช้ร่วมกับ Workflow ได้แก่ การไม่เปลี่ยน Viewport Scale, View และ Lock โดยไม่จำเป็น; การ Preserve Full Sheet Frame ใน Profile ที่ตรวจพบว่าเป็นกรอบทั้งแผ่น; การ Skip และแจ้ง Warning เมื่อ Profile ไม่อยู่ในรูปแบบที่รองรับ; และการไม่บันทึกไฟล์โดยอัตโนมัติ เพื่อให้ผู้ใช้งานตรวจสอบผลก่อนตัดสินใจ Save ทั้ง Pilot T01 และชุดประเมินหลัก T02–T05 ใช้นิยามเดียวกันว่า “กระบวนการอัตโนมัติ” หมายถึง AUTOSHEET → A3TITLEBOXALL ตามลำดับนี้เท่านั้น</w:t>
+      </w:r>
     </w:p>
     <w:p>
       <w:pPr>
@@ -16949,554 +16685,90 @@
     </w:p>
     <w:p>
       <w:pPr>
-        <w:spacing w:after="100"/>
-        <w:ind w:firstLine="709"/>
+        <w:pStyle w:val="Heading2"/>
       </w:pPr>
-      <w:proofErr w:type="spellStart"/>
-      <w:r>
-        <w:t>การประเมินกำหนดให้เริ่มจาก</w:t>
-      </w:r>
-      <w:proofErr w:type="spellEnd"/>
-      <w:r>
-        <w:t xml:space="preserve"> Pilot Test </w:t>
-      </w:r>
-      <w:proofErr w:type="spellStart"/>
-      <w:r>
-        <w:t>หนึ่ง</w:t>
-      </w:r>
-      <w:proofErr w:type="spellEnd"/>
-      <w:r>
-        <w:t xml:space="preserve"> Drawing (T01) </w:t>
-      </w:r>
-      <w:proofErr w:type="spellStart"/>
-      <w:r>
-        <w:t>โดยใช้ไฟล์ต้นฉบับเดียวกันสร้างสำเนาอย่างน้อย</w:t>
-      </w:r>
-      <w:proofErr w:type="spellEnd"/>
-      <w:r>
-        <w:t xml:space="preserve"> 3 </w:t>
-      </w:r>
-      <w:proofErr w:type="spellStart"/>
-      <w:r>
-        <w:t>ชุด</w:t>
-      </w:r>
-      <w:proofErr w:type="spellEnd"/>
-      <w:r>
-        <w:t xml:space="preserve"> </w:t>
-      </w:r>
-      <w:proofErr w:type="spellStart"/>
-      <w:r>
-        <w:t>ได้แก่</w:t>
-      </w:r>
-      <w:proofErr w:type="spellEnd"/>
-      <w:r>
-        <w:t xml:space="preserve"> T01_ORIGINAL.dwg, T01_MANUAL.dwg </w:t>
-      </w:r>
-      <w:proofErr w:type="spellStart"/>
-      <w:r>
-        <w:t>และ</w:t>
-      </w:r>
-      <w:proofErr w:type="spellEnd"/>
-      <w:r>
-        <w:t xml:space="preserve"> T01_AUTO.dwg </w:t>
-      </w:r>
-      <w:proofErr w:type="spellStart"/>
-      <w:r>
-        <w:t>เพื่อให้</w:t>
-      </w:r>
-      <w:proofErr w:type="spellEnd"/>
-      <w:r>
-        <w:t xml:space="preserve"> Manual </w:t>
-      </w:r>
-      <w:proofErr w:type="spellStart"/>
-      <w:r>
-        <w:t>และ</w:t>
-      </w:r>
-      <w:proofErr w:type="spellEnd"/>
-      <w:r>
-        <w:t xml:space="preserve"> AUTOSHEET </w:t>
-      </w:r>
-      <w:proofErr w:type="spellStart"/>
-      <w:r>
-        <w:t>เริ่มจากเงื่อนไขเดียวกัน</w:t>
-      </w:r>
-      <w:proofErr w:type="spellEnd"/>
-      <w:r>
-        <w:t xml:space="preserve"> Original </w:t>
-      </w:r>
-      <w:proofErr w:type="spellStart"/>
-      <w:r>
-        <w:t>จะเก็บไว้โดยไม่แก้ไขเพื่อใช้ตรวจย้อนกลับ</w:t>
-      </w:r>
-      <w:proofErr w:type="spellEnd"/>
-      <w:r>
-        <w:t xml:space="preserve"> </w:t>
-      </w:r>
-      <w:proofErr w:type="spellStart"/>
-      <w:r>
-        <w:t>ส่วน</w:t>
-      </w:r>
-      <w:proofErr w:type="spellEnd"/>
-      <w:r>
-        <w:t xml:space="preserve"> Manual </w:t>
-      </w:r>
-      <w:proofErr w:type="spellStart"/>
-      <w:r>
-        <w:t>และ</w:t>
-      </w:r>
-      <w:proofErr w:type="spellEnd"/>
-      <w:r>
-        <w:t xml:space="preserve"> Auto </w:t>
-      </w:r>
-      <w:proofErr w:type="spellStart"/>
-      <w:r>
-        <w:t>ใช้สำหรับดำเนินงานตามเงื่อนไขทดลอง</w:t>
-      </w:r>
-      <w:proofErr w:type="spellEnd"/>
+      <w:r>
+        <w:t>3.9.1 Pilot Test และการ Freeze วิธีประเมิน</w:t>
+      </w:r>
+    </w:p>
+    <w:p>
+      <w:pPr/>
+      <w:r>
+        <w:t>การประเมินเริ่มจาก T01 ซึ่งกำหนดให้เป็น Pilot Test เพื่อทดสอบความเป็นไปได้ของ protocol ตรวจจุดผิดพลาดของ workflow และกำหนดลำดับคำสั่งสุดท้าย โดยใช้ไฟล์ต้นฉบับเดียวกันสร้างสำเนาสำหรับ Manual และ Auto-assisted Workflow เมื่อ Pilot พบประเด็น R25 และยืนยันลำดับ AUTOSHEET → A3TITLEBOXALL แล้ว วิธีประเมินจึงถูก Freeze ก่อนเริ่มชุดประเมินหลัก ดังนั้น T01 ใช้เป็นหลักฐานเชิงพัฒนาและตัวอย่าง Before/Auto/Final แต่ไม่รวมอยู่ในสถิติหลักของประสิทธิภาพระบบ.</w:t>
+      </w:r>
     </w:p>
     <w:p>
       <w:pPr>
-        <w:spacing w:after="60" w:line="269" w:lineRule="auto"/>
-        <w:ind w:left="567" w:hanging="198"/>
+        <w:pStyle w:val="Heading2"/>
       </w:pPr>
       <w:r>
-        <w:t xml:space="preserve">1. Manual: </w:t>
-      </w:r>
-      <w:proofErr w:type="spellStart"/>
-      <w:r>
-        <w:t>ดำเนินการด้วยวิธีเดิมจน</w:t>
-      </w:r>
-      <w:proofErr w:type="spellEnd"/>
-      <w:r>
-        <w:t xml:space="preserve"> Drawing </w:t>
-      </w:r>
-      <w:proofErr w:type="spellStart"/>
-      <w:r>
-        <w:t>อยู่ในสถานะพร้อม</w:t>
-      </w:r>
-      <w:proofErr w:type="spellEnd"/>
-      <w:r>
-        <w:t xml:space="preserve"> Plot/</w:t>
-      </w:r>
-      <w:proofErr w:type="spellStart"/>
-      <w:r>
-        <w:t>ส่งมอบ</w:t>
-      </w:r>
-      <w:proofErr w:type="spellEnd"/>
+        <w:t>3.9.2 การเลือกชุดประเมินหลัก</w:t>
+      </w:r>
+    </w:p>
+    <w:p>
+      <w:pPr/>
+      <w:r>
+        <w:t>ชุดประเมินหลักประกอบด้วย T02–T05 จำนวน 4 ไฟล์ รวม 14 Layout คัดเลือกแบบ purposive sampling หลังจาก Freeze workflow เพื่อให้ครอบคลุมไฟล์ที่มีจำนวน Layout แตกต่างกัน 2–5 Layout และมีองค์ประกอบเป้าหมายของระบบ เช่น Title Block, Scale, Plot Setting และ Cleanup อยู่ในขอบเขตที่ประเมิน การคัดเลือกนี้มีวัตถุประสงค์เพื่อประเมินต้นแบบในบริบทงานจริง ไม่ได้ออกแบบให้เป็นตัวอย่างสุ่มที่แทน Drawing ทั้ง 300–500 ไฟล์ในเชิงสถิติ และไม่มีการเปลี่ยน Algorithm ตามผล T02–T05 ระหว่างการประเมิน.</w:t>
+      </w:r>
     </w:p>
     <w:p>
       <w:pPr>
-        <w:spacing w:after="60" w:line="269" w:lineRule="auto"/>
-        <w:ind w:left="567" w:hanging="198"/>
+        <w:pStyle w:val="Heading2"/>
       </w:pPr>
       <w:r>
-        <w:t xml:space="preserve">2. Automated workflow: </w:t>
-      </w:r>
-      <w:proofErr w:type="spellStart"/>
-      <w:r>
-        <w:t>รัน</w:t>
-      </w:r>
-      <w:proofErr w:type="spellEnd"/>
-      <w:r>
-        <w:t xml:space="preserve"> AUTOSHEET </w:t>
-      </w:r>
-      <w:proofErr w:type="spellStart"/>
-      <w:r>
-        <w:t>แล้วรัน</w:t>
-      </w:r>
-      <w:proofErr w:type="spellEnd"/>
-      <w:r>
-        <w:t xml:space="preserve"> A3TITLEBOXALL </w:t>
-      </w:r>
-      <w:proofErr w:type="spellStart"/>
-      <w:r>
-        <w:t>ตามลำดับ</w:t>
-      </w:r>
-      <w:proofErr w:type="spellEnd"/>
-      <w:r>
-        <w:t xml:space="preserve"> </w:t>
-      </w:r>
-      <w:proofErr w:type="spellStart"/>
-      <w:r>
-        <w:t>จากนั้นประเมิน</w:t>
-      </w:r>
-      <w:proofErr w:type="spellEnd"/>
-      <w:r>
-        <w:t xml:space="preserve"> R01–R27 </w:t>
-      </w:r>
-      <w:proofErr w:type="spellStart"/>
-      <w:r>
-        <w:t>โดยยังไม่แก้ไขด้วยมือ</w:t>
-      </w:r>
-      <w:proofErr w:type="spellEnd"/>
+        <w:t>3.9.3 Timing Protocol และเกณฑ์ Ready to Plot</w:t>
+      </w:r>
+    </w:p>
+    <w:p>
+      <w:pPr/>
+      <w:r>
+        <w:t>การทดลองดำเนินโดยผู้พัฒนาระบบคนเดียวในสภาพแวดล้อมการทำงานเดียวกัน เพื่อให้เงื่อนไขระหว่าง Manual และ Auto-assisted ใกล้เคียงกัน T_manual เริ่มจับเมื่อเริ่มดำเนินการกับสำเนาไฟล์ต้นฉบับและหยุดเมื่อผู้ปฏิบัติงานตรวจครบทุก Layout และพิจารณาว่า Ready to Plot; T_auto เริ่มก่อนเรียก AUTOSHEET และหยุดเมื่อ A3TITLEBOXALL ทำงานเสร็จ; T_touchup เริ่มหลังตรวจผล Auto-only และหยุดเมื่อแก้จุดที่ยังไม่ผ่านพร้อมทำ Final Visual QA ครบทุก Layout.</w:t>
+      </w:r>
+    </w:p>
+    <w:p>
+      <w:pPr/>
+      <w:r>
+        <w:t>ในแต่ละ case ลำดับการทดลองเป็น Manual ก่อน Auto-assisted จึงอาจเกิด order/learning effect เพราะผู้ทดลองคุ้นเคยกับ Drawing มากขึ้นในช่วงหลัง ประเด็นนี้ถูกระบุเป็นข้อจำกัดและไม่มีการใช้ repeated measurement เพื่อประมาณความแปรปรวนเชิงสถิติ.</w:t>
+      </w:r>
     </w:p>
     <w:p>
       <w:pPr>
-        <w:spacing w:after="60" w:line="269" w:lineRule="auto"/>
-        <w:ind w:left="567" w:hanging="198"/>
+        <w:pStyle w:val="Heading2"/>
       </w:pPr>
       <w:r>
-        <w:t xml:space="preserve">3. Auto-assisted + Manual Touch-up: </w:t>
-      </w:r>
-      <w:proofErr w:type="spellStart"/>
-      <w:r>
-        <w:t>หลังจบ</w:t>
-      </w:r>
-      <w:proofErr w:type="spellEnd"/>
-      <w:r>
-        <w:t xml:space="preserve"> AUTOSHEET → A3TITLEBOXALL </w:t>
-      </w:r>
-      <w:proofErr w:type="spellStart"/>
-      <w:r>
-        <w:t>ให้แก้เฉพาะจุดที่ยังไม่ผ่านเต็มรูปแบบและตรวจทุก</w:t>
-      </w:r>
-      <w:proofErr w:type="spellEnd"/>
-      <w:r>
-        <w:t xml:space="preserve"> Layout </w:t>
-      </w:r>
-      <w:proofErr w:type="spellStart"/>
-      <w:r>
-        <w:t>จนพร้อม</w:t>
-      </w:r>
-      <w:proofErr w:type="spellEnd"/>
-      <w:r>
-        <w:t xml:space="preserve"> Plot/</w:t>
-      </w:r>
-      <w:proofErr w:type="spellStart"/>
-      <w:r>
-        <w:t>ส่งมอบ</w:t>
-      </w:r>
-      <w:proofErr w:type="spellEnd"/>
+        <w:t>3.9.4 QA Protocol และนิยาม R08</w:t>
+      </w:r>
+    </w:p>
+    <w:p>
+      <w:pPr/>
+      <w:r>
+        <w:t>หลัง AUTOSHEET → A3TITLEBOXALL จะประเมิน R01–R27 โดยยังไม่แก้ด้วยมือ ใช้สถานะ PASS, PARTIAL, WARN, FAIL และ N/A สำหรับ R08 Scale Alignment กำหนด operational definition ว่า Scale A1 ต้องอยู่ใต้ Scale A3 และจัดแนวตาม arrangement ของ Approved Drawing/Template โดยไม่เหลื่อมหรือแยกออกจาก Scale group อย่างเห็นได้ชัด เนื่องจาก Ground Truth ด้านตำแหน่งเป็นเกณฑ์เชิงภาพตามแบบอ้างอิงและไม่ได้กำหนด tolerance เป็นมิลลิเมตร จึงรายงาน R08 เป็น PARTIAL เมื่อค่าและรูปแบบข้อความถูกต้องแต่ตำแหน่งยังต้องปรับด้วยผู้ใช้.</w:t>
+      </w:r>
     </w:p>
     <w:p>
       <w:pPr>
-        <w:spacing w:after="100"/>
-        <w:ind w:firstLine="709"/>
+        <w:pStyle w:val="Heading2"/>
       </w:pPr>
-      <w:proofErr w:type="spellStart"/>
-      <w:r>
-        <w:t>ตัวชี้วัดหลักประกอบด้วย</w:t>
-      </w:r>
-      <w:proofErr w:type="spellEnd"/>
-      <w:r>
-        <w:t xml:space="preserve"> (1) </w:t>
-      </w:r>
-      <w:proofErr w:type="spellStart"/>
-      <w:r>
-        <w:t>เวลาในการดำเนินงาน</w:t>
-      </w:r>
-      <w:proofErr w:type="spellEnd"/>
-      <w:r>
-        <w:t xml:space="preserve"> (2) Standard Compliance (3) Automation Coverage </w:t>
-      </w:r>
-      <w:proofErr w:type="spellStart"/>
-      <w:r>
-        <w:t>และ</w:t>
-      </w:r>
-      <w:proofErr w:type="spellEnd"/>
-      <w:r>
-        <w:t xml:space="preserve"> (4) Residual Manual Work </w:t>
-      </w:r>
-      <w:proofErr w:type="spellStart"/>
-      <w:r>
-        <w:t>โดยสถานะ</w:t>
-      </w:r>
-      <w:proofErr w:type="spellEnd"/>
-      <w:r>
-        <w:t xml:space="preserve"> QA </w:t>
-      </w:r>
-      <w:proofErr w:type="spellStart"/>
-      <w:r>
-        <w:t>รายข้อใช้</w:t>
-      </w:r>
-      <w:proofErr w:type="spellEnd"/>
-      <w:r>
-        <w:t xml:space="preserve"> PASS, PARTIAL, WARN, FAIL </w:t>
-      </w:r>
-      <w:proofErr w:type="spellStart"/>
-      <w:r>
-        <w:t>และ</w:t>
-      </w:r>
-      <w:proofErr w:type="spellEnd"/>
-      <w:r>
-        <w:t xml:space="preserve"> N/A </w:t>
-      </w:r>
-      <w:proofErr w:type="spellStart"/>
-      <w:r>
-        <w:t>จำนวน</w:t>
-      </w:r>
-      <w:proofErr w:type="spellEnd"/>
-      <w:r>
-        <w:t xml:space="preserve"> User Operations </w:t>
-      </w:r>
-      <w:proofErr w:type="spellStart"/>
-      <w:r>
-        <w:t>ใช้เป็นข้อมูลประกอบในกรณีที่บันทึกได้ครบ</w:t>
-      </w:r>
-      <w:proofErr w:type="spellEnd"/>
-      <w:r>
-        <w:t xml:space="preserve"> </w:t>
-      </w:r>
-      <w:proofErr w:type="spellStart"/>
-      <w:r>
-        <w:t>แต่ไม่ใช้เป็นตัวชี้วัดรวมหลักของ</w:t>
-      </w:r>
-      <w:proofErr w:type="spellEnd"/>
-      <w:r>
-        <w:t xml:space="preserve"> T01–T05 </w:t>
-      </w:r>
-      <w:proofErr w:type="spellStart"/>
-      <w:r>
-        <w:t>เนื่องจากไม่ได้บันทึกอย่างสม่ำเสมอทุกกรณี</w:t>
-      </w:r>
-      <w:proofErr w:type="spellEnd"/>
+      <w:r>
+        <w:t>3.9.5 ตัวชี้วัดและการวิเคราะห์</w:t>
+      </w:r>
     </w:p>
     <w:p>
-      <w:proofErr w:type="spellStart"/>
-      <w:r>
-        <w:t>กำหนดเวลา</w:t>
-      </w:r>
-      <w:proofErr w:type="spellEnd"/>
-      <w:r>
-        <w:t xml:space="preserve"> </w:t>
-      </w:r>
-      <w:proofErr w:type="spellStart"/>
-      <w:r>
-        <w:t>T_manual</w:t>
-      </w:r>
-      <w:proofErr w:type="spellEnd"/>
-      <w:r>
-        <w:t xml:space="preserve"> </w:t>
-      </w:r>
-      <w:proofErr w:type="spellStart"/>
-      <w:r>
-        <w:t>เป็นเวลาตั้งแต่เริ่มกระบวนการ</w:t>
-      </w:r>
-      <w:proofErr w:type="spellEnd"/>
-      <w:r>
-        <w:t xml:space="preserve"> Manual </w:t>
-      </w:r>
-      <w:proofErr w:type="spellStart"/>
-      <w:r>
-        <w:t>จน</w:t>
-      </w:r>
-      <w:proofErr w:type="spellEnd"/>
-      <w:r>
-        <w:t xml:space="preserve"> Drawing </w:t>
-      </w:r>
-      <w:proofErr w:type="spellStart"/>
-      <w:r>
-        <w:t>พร้อม</w:t>
-      </w:r>
-      <w:proofErr w:type="spellEnd"/>
-      <w:r>
-        <w:t xml:space="preserve"> Plot/</w:t>
-      </w:r>
-      <w:proofErr w:type="spellStart"/>
-      <w:r>
-        <w:t>ส่งมอบ</w:t>
-      </w:r>
-      <w:proofErr w:type="spellEnd"/>
-      <w:r>
-        <w:t xml:space="preserve">; </w:t>
-      </w:r>
-      <w:proofErr w:type="spellStart"/>
-      <w:r>
-        <w:t>T_auto</w:t>
-      </w:r>
-      <w:proofErr w:type="spellEnd"/>
-      <w:r>
-        <w:t xml:space="preserve"> </w:t>
-      </w:r>
-      <w:proofErr w:type="spellStart"/>
-      <w:r>
-        <w:t>เป็นเวลาตั้งแต่เริ่ม</w:t>
-      </w:r>
-      <w:proofErr w:type="spellEnd"/>
-      <w:r>
-        <w:t xml:space="preserve"> AUTOSHEET </w:t>
-      </w:r>
-      <w:proofErr w:type="spellStart"/>
-      <w:r>
-        <w:t>จน</w:t>
-      </w:r>
-      <w:proofErr w:type="spellEnd"/>
-      <w:r>
-        <w:t xml:space="preserve"> A3TITLEBOXALL </w:t>
-      </w:r>
-      <w:proofErr w:type="spellStart"/>
-      <w:r>
-        <w:t>ทำงานเสร็จตามลำดับที่กำหนด</w:t>
-      </w:r>
-      <w:proofErr w:type="spellEnd"/>
-      <w:r>
-        <w:t xml:space="preserve">; </w:t>
-      </w:r>
-      <w:proofErr w:type="spellStart"/>
-      <w:r>
-        <w:t>T_touchup</w:t>
-      </w:r>
-      <w:proofErr w:type="spellEnd"/>
-      <w:r>
-        <w:t xml:space="preserve"> </w:t>
-      </w:r>
-      <w:proofErr w:type="spellStart"/>
-      <w:r>
-        <w:t>เป็นเวลาที่ผู้ใช้งานใช้ตรวจและแก้ไขหลังจบกระบวนการอัตโนมัติ</w:t>
-      </w:r>
-      <w:proofErr w:type="spellEnd"/>
-      <w:r>
-        <w:t xml:space="preserve">; </w:t>
-      </w:r>
-      <w:proofErr w:type="spellStart"/>
-      <w:r>
-        <w:t>และ</w:t>
-      </w:r>
-      <w:proofErr w:type="spellEnd"/>
-      <w:r>
-        <w:t xml:space="preserve"> </w:t>
-      </w:r>
-      <w:proofErr w:type="spellStart"/>
-      <w:r>
-        <w:t>T_auto+touchup</w:t>
-      </w:r>
-      <w:proofErr w:type="spellEnd"/>
-      <w:r>
-        <w:t xml:space="preserve"> = </w:t>
-      </w:r>
-      <w:proofErr w:type="spellStart"/>
-      <w:r>
-        <w:t>T_auto</w:t>
-      </w:r>
-      <w:proofErr w:type="spellEnd"/>
-      <w:r>
-        <w:t xml:space="preserve"> + </w:t>
-      </w:r>
-      <w:proofErr w:type="spellStart"/>
-      <w:r>
-        <w:t>T_touchup</w:t>
-      </w:r>
-      <w:proofErr w:type="spellEnd"/>
-      <w:r>
-        <w:t xml:space="preserve"> </w:t>
-      </w:r>
-      <w:proofErr w:type="spellStart"/>
-      <w:r>
-        <w:t>ซึ่งเป็นตัวชี้วัดหลักสำหรับเปรียบเทียบกับ</w:t>
-      </w:r>
-      <w:proofErr w:type="spellEnd"/>
-      <w:r>
-        <w:t xml:space="preserve"> Manual </w:t>
-      </w:r>
-      <w:proofErr w:type="spellStart"/>
-      <w:r>
-        <w:t>เนื่องจากสะท้อนเวลาที่ต้องใช้จริงจนงานพร้อม</w:t>
-      </w:r>
-      <w:proofErr w:type="spellEnd"/>
-      <w:r>
-        <w:t xml:space="preserve"> Plot</w:t>
+      <w:pPr/>
+      <w:r>
+        <w:t>ตัวชี้วัดหลักประกอบด้วย (1) เวลา Manual, Auto และ Touch-up (2) Full-compliance status ของ R01–R27 (3) Automation Coverage และ (4) Residual Manual Work โดยจำนวน User Operations ใช้เป็นข้อมูลประกอบเฉพาะ Pilot เนื่องจากไม่ได้บันทึกอย่างสม่ำเสมอทุก case.</w:t>
       </w:r>
     </w:p>
     <w:p>
-      <w:r>
-        <w:lastRenderedPageBreak/>
-        <w:t>Effective Time Reduction (%) = [(</w:t>
-      </w:r>
-      <w:proofErr w:type="spellStart"/>
-      <w:r>
-        <w:t>T_manual</w:t>
-      </w:r>
-      <w:proofErr w:type="spellEnd"/>
-      <w:r>
-        <w:t xml:space="preserve"> - </w:t>
-      </w:r>
-      <w:proofErr w:type="spellStart"/>
-      <w:r>
-        <w:t>T_auto+touchup</w:t>
-      </w:r>
-      <w:proofErr w:type="spellEnd"/>
-      <w:r>
-        <w:t xml:space="preserve">) / </w:t>
-      </w:r>
-      <w:proofErr w:type="spellStart"/>
-      <w:r>
-        <w:t>T_manual</w:t>
-      </w:r>
-      <w:proofErr w:type="spellEnd"/>
-      <w:r>
-        <w:t xml:space="preserve">] × 100 </w:t>
-      </w:r>
-      <w:proofErr w:type="spellStart"/>
-      <w:r>
-        <w:t>และ</w:t>
-      </w:r>
-      <w:proofErr w:type="spellEnd"/>
-      <w:r>
-        <w:t xml:space="preserve"> Standard Compliance (%) = (</w:t>
-      </w:r>
-      <w:proofErr w:type="spellStart"/>
-      <w:r>
-        <w:t>จำนวนข้อที่</w:t>
-      </w:r>
-      <w:proofErr w:type="spellEnd"/>
-      <w:r>
-        <w:t xml:space="preserve"> PASS / </w:t>
-      </w:r>
-      <w:proofErr w:type="spellStart"/>
-      <w:r>
-        <w:t>จำนวนข้อที่</w:t>
-      </w:r>
-      <w:proofErr w:type="spellEnd"/>
-      <w:r>
-        <w:t xml:space="preserve"> Applicable) × 100 </w:t>
-      </w:r>
-      <w:proofErr w:type="spellStart"/>
-      <w:r>
-        <w:t>โดย</w:t>
-      </w:r>
-      <w:proofErr w:type="spellEnd"/>
-      <w:r>
-        <w:t xml:space="preserve"> T01 </w:t>
-      </w:r>
-      <w:proofErr w:type="spellStart"/>
-      <w:r>
-        <w:t>ใช้เป็น</w:t>
-      </w:r>
-      <w:proofErr w:type="spellEnd"/>
-      <w:r>
-        <w:t xml:space="preserve"> Pilot </w:t>
-      </w:r>
-      <w:proofErr w:type="spellStart"/>
-      <w:r>
-        <w:t>เพื่อยืนยันขั้นตอนและ</w:t>
-      </w:r>
-      <w:proofErr w:type="spellEnd"/>
-      <w:r>
-        <w:t xml:space="preserve"> Freeze Workflow </w:t>
-      </w:r>
-      <w:proofErr w:type="spellStart"/>
-      <w:r>
-        <w:t>จากนั้นใช้วิธีเดียวกันกับ</w:t>
-      </w:r>
-      <w:proofErr w:type="spellEnd"/>
-      <w:r>
-        <w:t xml:space="preserve"> T02–T05 </w:t>
-      </w:r>
-      <w:proofErr w:type="spellStart"/>
-      <w:r>
-        <w:t>รวมทั้งหมด</w:t>
-      </w:r>
-      <w:proofErr w:type="spellEnd"/>
-      <w:r>
-        <w:t xml:space="preserve"> 5 </w:t>
-      </w:r>
-      <w:proofErr w:type="spellStart"/>
-      <w:r>
-        <w:t>ไฟล์และ</w:t>
-      </w:r>
-      <w:proofErr w:type="spellEnd"/>
-      <w:r>
-        <w:t xml:space="preserve"> 15 Layout</w:t>
+      <w:pPr/>
+      <w:r>
+        <w:t>Effective Time Reduction (%) = [(T_manual - T_auto+touchup) / T_manual] × 100 โดย T_auto+touchup = T_auto + T_touchup การสรุปผลหลักใช้ descriptive statistics ของ T02–T05 ได้แก่ pooled time reduction, median และ range ของ time reduction ราย case ไม่ทำ inferential statistical test เนื่องจากมีเพียง 4 evaluation cases และแต่ละ case วัดเวลาหนึ่งรอบ.</w:t>
+      </w:r>
+    </w:p>
+    <w:p>
+      <w:pPr/>
+      <w:r>
+        <w:t>ด้านความลับ ภาพ Drawing ในรายงานใช้การ crop/redact และใช้รหัส Evidence ภายในแทนชื่อไฟล์จริงเมื่อรายละเอียดไม่จำเป็นต่อการอธิบายผล Full evidence ถูกเก็บแยกใน Evidence Pack ภายในเพื่อให้ตรวจสอบย้อนหลังได้ภายใต้สิทธิ์ของสถานประกอบการ.</w:t>
       </w:r>
     </w:p>
     <w:p>
@@ -17562,245 +16834,15 @@
       <w:proofErr w:type="spellEnd"/>
     </w:p>
     <w:p>
-      <w:pPr>
-        <w:spacing w:after="100"/>
-        <w:ind w:firstLine="709"/>
-      </w:pPr>
-      <w:proofErr w:type="spellStart"/>
-      <w:r>
-        <w:t>หลัง</w:t>
-      </w:r>
-      <w:proofErr w:type="spellEnd"/>
-      <w:r>
-        <w:t xml:space="preserve"> Pilot T01 </w:t>
-      </w:r>
-      <w:proofErr w:type="spellStart"/>
-      <w:r>
-        <w:t>กำหนดให้แก้เฉพาะข้อผิดพลาดที่เป็น</w:t>
-      </w:r>
-      <w:proofErr w:type="spellEnd"/>
-      <w:r>
-        <w:t xml:space="preserve"> Blocker </w:t>
-      </w:r>
-      <w:proofErr w:type="spellStart"/>
-      <w:r>
-        <w:t>หรือมีความเสี่ยงต่อความถูกต้องของ</w:t>
-      </w:r>
-      <w:proofErr w:type="spellEnd"/>
-      <w:r>
-        <w:t xml:space="preserve"> Drawing </w:t>
-      </w:r>
-      <w:proofErr w:type="spellStart"/>
-      <w:r>
-        <w:t>เช่น</w:t>
-      </w:r>
-      <w:proofErr w:type="spellEnd"/>
-      <w:r>
-        <w:t xml:space="preserve"> </w:t>
-      </w:r>
-      <w:proofErr w:type="spellStart"/>
-      <w:r>
-        <w:t>ลบ</w:t>
-      </w:r>
-      <w:proofErr w:type="spellEnd"/>
-      <w:r>
-        <w:t xml:space="preserve"> Object </w:t>
-      </w:r>
-      <w:proofErr w:type="spellStart"/>
-      <w:r>
-        <w:t>ผิด</w:t>
-      </w:r>
-      <w:proofErr w:type="spellEnd"/>
-      <w:r>
-        <w:t xml:space="preserve">, </w:t>
-      </w:r>
-      <w:proofErr w:type="spellStart"/>
-      <w:r>
-        <w:t>ทำให้</w:t>
-      </w:r>
-      <w:proofErr w:type="spellEnd"/>
-      <w:r>
-        <w:t xml:space="preserve"> Scale value </w:t>
-      </w:r>
-      <w:proofErr w:type="spellStart"/>
-      <w:r>
-        <w:t>ผิด</w:t>
-      </w:r>
-      <w:proofErr w:type="spellEnd"/>
-      <w:r>
-        <w:t xml:space="preserve">, Plot Setting </w:t>
-      </w:r>
-      <w:proofErr w:type="spellStart"/>
-      <w:r>
-        <w:t>ผิด</w:t>
-      </w:r>
-      <w:proofErr w:type="spellEnd"/>
-      <w:r>
-        <w:t xml:space="preserve">, </w:t>
-      </w:r>
-      <w:proofErr w:type="spellStart"/>
-      <w:r>
-        <w:t>ทำให้กรอบแบบหรือ</w:t>
-      </w:r>
-      <w:proofErr w:type="spellEnd"/>
-      <w:r>
-        <w:t xml:space="preserve"> Viewport </w:t>
-      </w:r>
-      <w:proofErr w:type="spellStart"/>
-      <w:r>
-        <w:t>เสียหาย</w:t>
-      </w:r>
-      <w:proofErr w:type="spellEnd"/>
-      <w:r>
-        <w:t xml:space="preserve"> </w:t>
-      </w:r>
-      <w:proofErr w:type="spellStart"/>
-      <w:r>
-        <w:t>หรือทำให้ไฟล์ไม่สามารถใช้ต่อได้</w:t>
-      </w:r>
-      <w:proofErr w:type="spellEnd"/>
-      <w:r>
-        <w:t xml:space="preserve"> </w:t>
-      </w:r>
-      <w:proofErr w:type="spellStart"/>
-      <w:r>
-        <w:t>ส่วน</w:t>
-      </w:r>
-      <w:proofErr w:type="spellEnd"/>
-      <w:r>
-        <w:t xml:space="preserve"> R08 </w:t>
-      </w:r>
-      <w:proofErr w:type="spellStart"/>
-      <w:r>
-        <w:t>ซึ่งเป็นปัญหาการจัดตำแหน่งข้อความ</w:t>
-      </w:r>
-      <w:proofErr w:type="spellEnd"/>
-      <w:r>
-        <w:t xml:space="preserve"> Scale A3/A1 </w:t>
-      </w:r>
-      <w:proofErr w:type="spellStart"/>
-      <w:r>
-        <w:t>โดยที่ค่าและรูปแบบมาตราส่วนยังถูกต้อง</w:t>
-      </w:r>
-      <w:proofErr w:type="spellEnd"/>
-      <w:r>
-        <w:t xml:space="preserve"> </w:t>
-      </w:r>
-      <w:proofErr w:type="spellStart"/>
-      <w:r>
-        <w:t>ถูกจัดเป็นข้อจำกัดแบบ</w:t>
-      </w:r>
-      <w:proofErr w:type="spellEnd"/>
-      <w:r>
-        <w:t xml:space="preserve"> Partially Automated </w:t>
-      </w:r>
-      <w:proofErr w:type="spellStart"/>
-      <w:r>
-        <w:t>และวัดเป็น</w:t>
-      </w:r>
-      <w:proofErr w:type="spellEnd"/>
-      <w:r>
-        <w:t xml:space="preserve"> Residual Manual Work </w:t>
-      </w:r>
-      <w:proofErr w:type="spellStart"/>
-      <w:r>
-        <w:t>แทนการแก้</w:t>
-      </w:r>
-      <w:proofErr w:type="spellEnd"/>
-      <w:r>
-        <w:t xml:space="preserve"> Algorithm </w:t>
-      </w:r>
-      <w:proofErr w:type="spellStart"/>
-      <w:r>
-        <w:t>ต่อระหว่าง</w:t>
-      </w:r>
-      <w:proofErr w:type="spellEnd"/>
-      <w:r>
-        <w:t xml:space="preserve"> Evaluation</w:t>
+      <w:pPr/>
+      <w:r>
+        <w:t>หลัง Pilot T01 กำหนดให้แก้เฉพาะข้อผิดพลาดที่เป็น Blocker หรือมีความเสี่ยงต่อความถูกต้องของ Drawing เช่น ลบ Object ผิด ทำให้ Scale value ผิด Plot Setting ผิด ทำให้กรอบแบบหรือ Viewport เสียหาย หรือทำให้ไฟล์ไม่สามารถใช้ต่อได้ ส่วน R08 ซึ่งเป็นปัญหาการจัดตำแหน่งข้อความ Scale A3/A1 โดยที่ค่าและรูปแบบมาตราส่วนยังถูกต้อง ถูกจัดเป็นข้อจำกัดแบบ Partially Automated และวัดเป็น Residual Manual Work แทนการแก้ Algorithm ต่อระหว่างชุดประเมินหลัก T02–T05.</w:t>
       </w:r>
     </w:p>
     <w:p>
-      <w:proofErr w:type="spellStart"/>
-      <w:r>
-        <w:t>เมื่อ</w:t>
-      </w:r>
-      <w:proofErr w:type="spellEnd"/>
-      <w:r>
-        <w:t xml:space="preserve"> T01 </w:t>
-      </w:r>
-      <w:proofErr w:type="spellStart"/>
-      <w:r>
-        <w:t>รอบ</w:t>
-      </w:r>
-      <w:proofErr w:type="spellEnd"/>
-      <w:r>
-        <w:t xml:space="preserve"> Final </w:t>
-      </w:r>
-      <w:proofErr w:type="spellStart"/>
-      <w:r>
-        <w:t>ไม่พบ</w:t>
-      </w:r>
-      <w:proofErr w:type="spellEnd"/>
-      <w:r>
-        <w:t xml:space="preserve"> Blocker </w:t>
-      </w:r>
-      <w:proofErr w:type="spellStart"/>
-      <w:r>
-        <w:t>อื่น</w:t>
-      </w:r>
-      <w:proofErr w:type="spellEnd"/>
-      <w:r>
-        <w:t xml:space="preserve"> </w:t>
-      </w:r>
-      <w:proofErr w:type="spellStart"/>
-      <w:r>
-        <w:t>จึง</w:t>
-      </w:r>
-      <w:proofErr w:type="spellEnd"/>
-      <w:r>
-        <w:t xml:space="preserve"> Freeze </w:t>
-      </w:r>
-      <w:proofErr w:type="spellStart"/>
-      <w:r>
-        <w:t>วิธีประเมินเป็น</w:t>
-      </w:r>
-      <w:proofErr w:type="spellEnd"/>
-      <w:r>
-        <w:t xml:space="preserve"> Evaluation Workflow V1.0 </w:t>
-      </w:r>
-      <w:proofErr w:type="spellStart"/>
-      <w:r>
-        <w:t>โดยใช้ลำดับ</w:t>
-      </w:r>
-      <w:proofErr w:type="spellEnd"/>
-      <w:r>
-        <w:t xml:space="preserve"> AUTOSHEET → A3TITLEBOXALL → Auto-only QA → Manual Touch-up/Final QA </w:t>
-      </w:r>
-      <w:proofErr w:type="spellStart"/>
-      <w:r>
-        <w:t>และใช้ลำดับเดียวกันกับ</w:t>
-      </w:r>
-      <w:proofErr w:type="spellEnd"/>
-      <w:r>
-        <w:t xml:space="preserve"> T02–T05 </w:t>
-      </w:r>
-      <w:proofErr w:type="spellStart"/>
-      <w:r>
-        <w:t>โดยไม่เปลี่ยน</w:t>
-      </w:r>
-      <w:proofErr w:type="spellEnd"/>
-      <w:r>
-        <w:t xml:space="preserve"> Algorithm </w:t>
-      </w:r>
-      <w:proofErr w:type="spellStart"/>
-      <w:r>
-        <w:t>ระหว่างชุดประเมินผล</w:t>
-      </w:r>
-      <w:proofErr w:type="spellEnd"/>
-    </w:p>
-    <w:p>
-      <w:r>
-        <w:br w:type="page"/>
+      <w:pPr/>
+      <w:r>
+        <w:t>เมื่อ T01 รอบ Final ไม่พบ Blocker อื่น จึง Freeze วิธีประเมินเป็น Evaluation Workflow V1.0 โดยใช้ลำดับ AUTOSHEET → A3TITLEBOXALL → Auto-only QA → Manual Touch-up/Final QA จากนั้นใช้ลำดับเดียวกันกับ T02–T05 และไม่เปลี่ยน Algorithm ระหว่างชุดประเมินหลัก เพื่อแยกข้อมูลที่ใช้ปรับ protocol ออกจากข้อมูลที่ใช้สรุปประสิทธิภาพระบบ.</w:t>
       </w:r>
     </w:p>
     <w:p>
@@ -17874,139 +16916,9 @@
       <w:pPr>
         <w:spacing w:after="120"/>
       </w:pPr>
-      <w:proofErr w:type="spellStart"/>
-      <w:r>
-        <w:t>รุ่นที่ใช้ในการประเมินผลถูกกำหนดเป็น</w:t>
-      </w:r>
-      <w:proofErr w:type="spellEnd"/>
-      <w:r>
-        <w:t xml:space="preserve"> Workflow </w:t>
-      </w:r>
-      <w:proofErr w:type="spellStart"/>
-      <w:r>
-        <w:t>คงที่</w:t>
-      </w:r>
-      <w:proofErr w:type="spellEnd"/>
-      <w:r>
-        <w:t xml:space="preserve"> </w:t>
-      </w:r>
-      <w:proofErr w:type="spellStart"/>
-      <w:r>
-        <w:t>ประกอบด้วยการรัน</w:t>
-      </w:r>
-      <w:proofErr w:type="spellEnd"/>
-      <w:r>
-        <w:t xml:space="preserve"> AUTOSHEET </w:t>
-      </w:r>
-      <w:proofErr w:type="spellStart"/>
-      <w:r>
-        <w:t>ก่อน</w:t>
-      </w:r>
-      <w:proofErr w:type="spellEnd"/>
-      <w:r>
-        <w:t xml:space="preserve"> </w:t>
-      </w:r>
-      <w:proofErr w:type="spellStart"/>
-      <w:r>
-        <w:t>แล้วรัน</w:t>
-      </w:r>
-      <w:proofErr w:type="spellEnd"/>
-      <w:r>
-        <w:t xml:space="preserve"> A3TITLEBOXALL </w:t>
-      </w:r>
-      <w:proofErr w:type="spellStart"/>
-      <w:r>
-        <w:t>ต่อทันที</w:t>
-      </w:r>
-      <w:proofErr w:type="spellEnd"/>
-      <w:r>
-        <w:t xml:space="preserve"> </w:t>
-      </w:r>
-      <w:proofErr w:type="spellStart"/>
-      <w:r>
-        <w:t>จากนั้นตรวจ</w:t>
-      </w:r>
-      <w:proofErr w:type="spellEnd"/>
-      <w:r>
-        <w:t xml:space="preserve"> R01–R27 </w:t>
-      </w:r>
-      <w:proofErr w:type="spellStart"/>
-      <w:r>
-        <w:t>ก่อนเข้าสู่</w:t>
-      </w:r>
-      <w:proofErr w:type="spellEnd"/>
-      <w:r>
-        <w:t xml:space="preserve"> Manual Touch-up </w:t>
-      </w:r>
-      <w:proofErr w:type="spellStart"/>
-      <w:r>
-        <w:t>และ</w:t>
-      </w:r>
-      <w:proofErr w:type="spellEnd"/>
-      <w:r>
-        <w:t xml:space="preserve"> Final QA </w:t>
-      </w:r>
-      <w:proofErr w:type="spellStart"/>
-      <w:r>
-        <w:t>ลำดับดังกล่าวถูกใช้เหมือนกันใน</w:t>
-      </w:r>
-      <w:proofErr w:type="spellEnd"/>
-      <w:r>
-        <w:t xml:space="preserve"> T01–T05 </w:t>
-      </w:r>
-      <w:proofErr w:type="spellStart"/>
-      <w:r>
-        <w:t>และห้ามสลับคำสั่ง</w:t>
-      </w:r>
-      <w:proofErr w:type="spellEnd"/>
-      <w:r>
-        <w:t xml:space="preserve"> </w:t>
-      </w:r>
-      <w:proofErr w:type="spellStart"/>
-      <w:r>
-        <w:t>เนื่องจาก</w:t>
-      </w:r>
-      <w:proofErr w:type="spellEnd"/>
-      <w:r>
-        <w:t xml:space="preserve"> A3TITLEBOXALL </w:t>
-      </w:r>
-      <w:proofErr w:type="spellStart"/>
-      <w:r>
-        <w:t>เป็นขั้นตอนที่ทำให้การจัดการ</w:t>
-      </w:r>
-      <w:proofErr w:type="spellEnd"/>
-      <w:r>
-        <w:t xml:space="preserve"> Title Block </w:t>
-      </w:r>
-      <w:proofErr w:type="spellStart"/>
-      <w:r>
-        <w:t>และ</w:t>
-      </w:r>
-      <w:proofErr w:type="spellEnd"/>
-      <w:r>
-        <w:t xml:space="preserve"> Source/Workspace Path </w:t>
-      </w:r>
-      <w:proofErr w:type="spellStart"/>
-      <w:r>
-        <w:t>ตาม</w:t>
-      </w:r>
-      <w:proofErr w:type="spellEnd"/>
-      <w:r>
-        <w:t xml:space="preserve"> R25 </w:t>
-      </w:r>
-      <w:proofErr w:type="spellStart"/>
-      <w:r>
-        <w:t>ครบถ้วนใน</w:t>
-      </w:r>
-      <w:proofErr w:type="spellEnd"/>
-      <w:r>
-        <w:t xml:space="preserve"> Workflow </w:t>
-      </w:r>
-      <w:proofErr w:type="spellStart"/>
-      <w:r>
-        <w:t>ที่ทดสอบจริง</w:t>
-      </w:r>
-      <w:proofErr w:type="spellEnd"/>
+      <w:r>
+        <w:t>Workflow สำหรับการประเมินถูกตรึงหลัง Pilot T01 โดยประกอบด้วยการรัน AUTOSHEET ก่อน แล้วรัน A3TITLEBOXALL ต่อทันที จากนั้นตรวจ R01–R27 ก่อนเข้าสู่ Manual Touch-up และ Final QA ลำดับเดียวกันนี้ถูกใช้กับชุดประเมินหลัก T02–T05 และห้ามสลับคำสั่ง เนื่องจาก A3TITLEBOXALL เป็นขั้นตอนที่ทำให้การจัดการ Title Block และ Source/Workspace Path ตาม R25 ครบถ้วนใน Workflow ที่ทดสอบจริง</w:t>
+      </w:r>
     </w:p>
     <w:p>
       <w:pPr>
@@ -18127,15 +17039,7 @@
             <w:vAlign w:val="center"/>
           </w:tcPr>
           <w:p>
-            <w:pPr>
-              <w:jc w:val="center"/>
-            </w:pPr>
-            <w:r>
-              <w:rPr>
-                <w:rFonts w:cs="Noto Sans Thai"/>
-                <w:b/>
-                <w:sz w:val="17"/>
-              </w:rPr>
+            <w:r>
               <w:t>Function</w:t>
             </w:r>
           </w:p>
@@ -18153,15 +17057,7 @@
             <w:vAlign w:val="center"/>
           </w:tcPr>
           <w:p>
-            <w:pPr>
-              <w:jc w:val="center"/>
-            </w:pPr>
-            <w:r>
-              <w:rPr>
-                <w:rFonts w:cs="Noto Sans Thai"/>
-                <w:b/>
-                <w:sz w:val="17"/>
-              </w:rPr>
+            <w:r>
               <w:t>Fully Automated</w:t>
             </w:r>
           </w:p>
@@ -18179,15 +17075,7 @@
             <w:vAlign w:val="center"/>
           </w:tcPr>
           <w:p>
-            <w:pPr>
-              <w:jc w:val="center"/>
-            </w:pPr>
-            <w:r>
-              <w:rPr>
-                <w:rFonts w:cs="Noto Sans Thai"/>
-                <w:b/>
-                <w:sz w:val="17"/>
-              </w:rPr>
+            <w:r>
               <w:t>Partially Automated</w:t>
             </w:r>
           </w:p>
@@ -18205,15 +17093,7 @@
             <w:vAlign w:val="center"/>
           </w:tcPr>
           <w:p>
-            <w:pPr>
-              <w:jc w:val="center"/>
-            </w:pPr>
-            <w:r>
-              <w:rPr>
-                <w:rFonts w:cs="Noto Sans Thai"/>
-                <w:b/>
-                <w:sz w:val="17"/>
-              </w:rPr>
+            <w:r>
               <w:t>Manual Required</w:t>
             </w:r>
           </w:p>
@@ -18231,19 +17111,9 @@
             <w:vAlign w:val="center"/>
           </w:tcPr>
           <w:p>
-            <w:pPr>
-              <w:jc w:val="center"/>
-            </w:pPr>
-            <w:proofErr w:type="spellStart"/>
-            <w:r>
-              <w:rPr>
-                <w:rFonts w:cs="Noto Sans Thai"/>
-                <w:b/>
-                <w:sz w:val="17"/>
-              </w:rPr>
+            <w:r>
               <w:t>หมายเหตุ</w:t>
             </w:r>
-            <w:proofErr w:type="spellEnd"/>
           </w:p>
         </w:tc>
       </w:tr>
@@ -18265,10 +17135,6 @@
           </w:tcPr>
           <w:p>
             <w:r>
-              <w:rPr>
-                <w:rFonts w:cs="Noto Sans Thai"/>
-                <w:sz w:val="17"/>
-              </w:rPr>
               <w:t>Title Block / Frame</w:t>
             </w:r>
           </w:p>
@@ -18286,9 +17152,6 @@
           </w:tcPr>
           <w:p>
             <w:r>
-              <w:rPr>
-                <w:sz w:val="17"/>
-              </w:rPr>
               <w:t>Yes</w:t>
             </w:r>
           </w:p>
@@ -18306,9 +17169,6 @@
           </w:tcPr>
           <w:p>
             <w:r>
-              <w:rPr>
-                <w:sz w:val="17"/>
-              </w:rPr>
               <w:t>No</w:t>
             </w:r>
           </w:p>
@@ -18326,9 +17186,6 @@
           </w:tcPr>
           <w:p>
             <w:r>
-              <w:rPr>
-                <w:sz w:val="17"/>
-              </w:rPr>
               <w:t>No</w:t>
             </w:r>
           </w:p>
@@ -18345,19 +17202,8 @@
             <w:vAlign w:val="center"/>
           </w:tcPr>
           <w:p>
-            <w:proofErr w:type="spellStart"/>
-            <w:r>
-              <w:rPr>
-                <w:sz w:val="17"/>
-              </w:rPr>
-              <w:t>ผ่านใน</w:t>
-            </w:r>
-            <w:proofErr w:type="spellEnd"/>
-            <w:r>
-              <w:rPr>
-                <w:sz w:val="17"/>
-              </w:rPr>
-              <w:t xml:space="preserve"> Workflow AUTOSHEET → A3TITLEBOXALL</w:t>
+            <w:r>
+              <w:t>ผ่านใน Workflow AUTOSHEET → A3TITLEBOXALL</w:t>
             </w:r>
           </w:p>
         </w:tc>
@@ -18380,10 +17226,6 @@
           </w:tcPr>
           <w:p>
             <w:r>
-              <w:rPr>
-                <w:rFonts w:cs="Noto Sans Thai"/>
-                <w:sz w:val="17"/>
-              </w:rPr>
               <w:t>Font / Text Height</w:t>
             </w:r>
           </w:p>
@@ -18401,9 +17243,6 @@
           </w:tcPr>
           <w:p>
             <w:r>
-              <w:rPr>
-                <w:sz w:val="17"/>
-              </w:rPr>
               <w:t>Yes</w:t>
             </w:r>
           </w:p>
@@ -18421,9 +17260,6 @@
           </w:tcPr>
           <w:p>
             <w:r>
-              <w:rPr>
-                <w:sz w:val="17"/>
-              </w:rPr>
               <w:t>No</w:t>
             </w:r>
           </w:p>
@@ -18441,9 +17277,6 @@
           </w:tcPr>
           <w:p>
             <w:r>
-              <w:rPr>
-                <w:sz w:val="17"/>
-              </w:rPr>
               <w:t>No</w:t>
             </w:r>
           </w:p>
@@ -18461,19 +17294,8 @@
           </w:tcPr>
           <w:p>
             <w:r>
-              <w:rPr>
-                <w:sz w:val="17"/>
-              </w:rPr>
-              <w:t xml:space="preserve">R01–R03 </w:t>
-            </w:r>
-            <w:proofErr w:type="spellStart"/>
-            <w:r>
-              <w:rPr>
-                <w:sz w:val="17"/>
-              </w:rPr>
-              <w:t>ผ่านทุกกรณี</w:t>
-            </w:r>
-            <w:proofErr w:type="spellEnd"/>
+              <w:t>R01–R03 ผ่านทุกกรณี</w:t>
+            </w:r>
           </w:p>
         </w:tc>
       </w:tr>
@@ -18495,10 +17317,6 @@
           </w:tcPr>
           <w:p>
             <w:r>
-              <w:rPr>
-                <w:rFonts w:cs="Noto Sans Thai"/>
-                <w:sz w:val="17"/>
-              </w:rPr>
               <w:t>Drawing Code</w:t>
             </w:r>
           </w:p>
@@ -18516,9 +17334,6 @@
           </w:tcPr>
           <w:p>
             <w:r>
-              <w:rPr>
-                <w:sz w:val="17"/>
-              </w:rPr>
               <w:t>Yes</w:t>
             </w:r>
           </w:p>
@@ -18536,9 +17351,6 @@
           </w:tcPr>
           <w:p>
             <w:r>
-              <w:rPr>
-                <w:sz w:val="17"/>
-              </w:rPr>
               <w:t>No</w:t>
             </w:r>
           </w:p>
@@ -18556,9 +17368,6 @@
           </w:tcPr>
           <w:p>
             <w:r>
-              <w:rPr>
-                <w:sz w:val="17"/>
-              </w:rPr>
               <w:t>No</w:t>
             </w:r>
           </w:p>
@@ -18576,19 +17385,8 @@
           </w:tcPr>
           <w:p>
             <w:r>
-              <w:rPr>
-                <w:sz w:val="17"/>
-              </w:rPr>
-              <w:t xml:space="preserve">R04 </w:t>
-            </w:r>
-            <w:proofErr w:type="spellStart"/>
-            <w:r>
-              <w:rPr>
-                <w:sz w:val="17"/>
-              </w:rPr>
-              <w:t>ผ่านทุกกรณี</w:t>
-            </w:r>
-            <w:proofErr w:type="spellEnd"/>
+              <w:t>R04 ผ่านทุกกรณี</w:t>
+            </w:r>
           </w:p>
         </w:tc>
       </w:tr>
@@ -18610,10 +17408,6 @@
           </w:tcPr>
           <w:p>
             <w:r>
-              <w:rPr>
-                <w:rFonts w:cs="Noto Sans Thai"/>
-                <w:sz w:val="17"/>
-              </w:rPr>
               <w:t>Paper / Plot Setting</w:t>
             </w:r>
           </w:p>
@@ -18631,9 +17425,6 @@
           </w:tcPr>
           <w:p>
             <w:r>
-              <w:rPr>
-                <w:sz w:val="17"/>
-              </w:rPr>
               <w:t>Yes</w:t>
             </w:r>
           </w:p>
@@ -18651,9 +17442,6 @@
           </w:tcPr>
           <w:p>
             <w:r>
-              <w:rPr>
-                <w:sz w:val="17"/>
-              </w:rPr>
               <w:t>No</w:t>
             </w:r>
           </w:p>
@@ -18671,9 +17459,6 @@
           </w:tcPr>
           <w:p>
             <w:r>
-              <w:rPr>
-                <w:sz w:val="17"/>
-              </w:rPr>
               <w:t>No</w:t>
             </w:r>
           </w:p>
@@ -18691,19 +17476,8 @@
           </w:tcPr>
           <w:p>
             <w:r>
-              <w:rPr>
-                <w:sz w:val="17"/>
-              </w:rPr>
-              <w:t xml:space="preserve">R09–R19 </w:t>
-            </w:r>
-            <w:proofErr w:type="spellStart"/>
-            <w:r>
-              <w:rPr>
-                <w:sz w:val="17"/>
-              </w:rPr>
-              <w:t>ผ่านทุกกรณี</w:t>
-            </w:r>
-            <w:proofErr w:type="spellEnd"/>
+              <w:t>R09–R19 ผ่านทุกกรณี</w:t>
+            </w:r>
           </w:p>
         </w:tc>
       </w:tr>
@@ -18725,10 +17499,6 @@
           </w:tcPr>
           <w:p>
             <w:r>
-              <w:rPr>
-                <w:rFonts w:cs="Noto Sans Thai"/>
-                <w:sz w:val="17"/>
-              </w:rPr>
               <w:t>Scale Content</w:t>
             </w:r>
           </w:p>
@@ -18746,9 +17516,6 @@
           </w:tcPr>
           <w:p>
             <w:r>
-              <w:rPr>
-                <w:sz w:val="17"/>
-              </w:rPr>
               <w:t>Yes</w:t>
             </w:r>
           </w:p>
@@ -18766,9 +17533,6 @@
           </w:tcPr>
           <w:p>
             <w:r>
-              <w:rPr>
-                <w:sz w:val="17"/>
-              </w:rPr>
               <w:t>No</w:t>
             </w:r>
           </w:p>
@@ -18786,9 +17550,6 @@
           </w:tcPr>
           <w:p>
             <w:r>
-              <w:rPr>
-                <w:sz w:val="17"/>
-              </w:rPr>
               <w:t>No</w:t>
             </w:r>
           </w:p>
@@ -18806,19 +17567,8 @@
           </w:tcPr>
           <w:p>
             <w:r>
-              <w:rPr>
-                <w:sz w:val="17"/>
-              </w:rPr>
-              <w:t xml:space="preserve">R06–R07 </w:t>
-            </w:r>
-            <w:proofErr w:type="spellStart"/>
-            <w:r>
-              <w:rPr>
-                <w:sz w:val="17"/>
-              </w:rPr>
-              <w:t>ผ่านทุกกรณี</w:t>
-            </w:r>
-            <w:proofErr w:type="spellEnd"/>
+              <w:t>R06–R07 ผ่านทุกกรณี</w:t>
+            </w:r>
           </w:p>
         </w:tc>
       </w:tr>
@@ -18840,10 +17590,6 @@
           </w:tcPr>
           <w:p>
             <w:r>
-              <w:rPr>
-                <w:rFonts w:cs="Noto Sans Thai"/>
-                <w:sz w:val="17"/>
-              </w:rPr>
               <w:t>Scale Alignment</w:t>
             </w:r>
           </w:p>
@@ -18861,9 +17607,6 @@
           </w:tcPr>
           <w:p>
             <w:r>
-              <w:rPr>
-                <w:sz w:val="17"/>
-              </w:rPr>
               <w:t>No</w:t>
             </w:r>
           </w:p>
@@ -18881,9 +17624,6 @@
           </w:tcPr>
           <w:p>
             <w:r>
-              <w:rPr>
-                <w:sz w:val="17"/>
-              </w:rPr>
               <w:t>Yes</w:t>
             </w:r>
           </w:p>
@@ -18901,9 +17641,6 @@
           </w:tcPr>
           <w:p>
             <w:r>
-              <w:rPr>
-                <w:sz w:val="17"/>
-              </w:rPr>
               <w:t>Yes</w:t>
             </w:r>
           </w:p>
@@ -18921,38 +17658,7 @@
           </w:tcPr>
           <w:p>
             <w:r>
-              <w:rPr>
-                <w:sz w:val="17"/>
-              </w:rPr>
-              <w:t xml:space="preserve">R08 </w:t>
-            </w:r>
-            <w:proofErr w:type="spellStart"/>
-            <w:r>
-              <w:rPr>
-                <w:sz w:val="17"/>
-              </w:rPr>
-              <w:t>ต้องเลื่อน</w:t>
-            </w:r>
-            <w:proofErr w:type="spellEnd"/>
-            <w:r>
-              <w:rPr>
-                <w:sz w:val="17"/>
-              </w:rPr>
-              <w:t xml:space="preserve"> A3/A1 </w:t>
-            </w:r>
-            <w:proofErr w:type="spellStart"/>
-            <w:r>
-              <w:rPr>
-                <w:sz w:val="17"/>
-              </w:rPr>
-              <w:t>ด้วยมือใน</w:t>
-            </w:r>
-            <w:proofErr w:type="spellEnd"/>
-            <w:r>
-              <w:rPr>
-                <w:sz w:val="17"/>
-              </w:rPr>
-              <w:t xml:space="preserve"> T01–T05</w:t>
+              <w:t>R08 ต้องเลื่อน A3/A1 ด้วยมือใน T02–T05; Pilot T01 พบรูปแบบเดียวกัน</w:t>
             </w:r>
           </w:p>
         </w:tc>
@@ -18975,10 +17681,6 @@
           </w:tcPr>
           <w:p>
             <w:r>
-              <w:rPr>
-                <w:rFonts w:cs="Noto Sans Thai"/>
-                <w:sz w:val="17"/>
-              </w:rPr>
               <w:t>Cleanup</w:t>
             </w:r>
           </w:p>
@@ -18996,9 +17698,6 @@
           </w:tcPr>
           <w:p>
             <w:r>
-              <w:rPr>
-                <w:sz w:val="17"/>
-              </w:rPr>
               <w:t>Yes</w:t>
             </w:r>
           </w:p>
@@ -19016,9 +17715,6 @@
           </w:tcPr>
           <w:p>
             <w:r>
-              <w:rPr>
-                <w:sz w:val="17"/>
-              </w:rPr>
               <w:t>No</w:t>
             </w:r>
           </w:p>
@@ -19036,9 +17732,6 @@
           </w:tcPr>
           <w:p>
             <w:r>
-              <w:rPr>
-                <w:sz w:val="17"/>
-              </w:rPr>
               <w:t>No</w:t>
             </w:r>
           </w:p>
@@ -19056,38 +17749,7 @@
           </w:tcPr>
           <w:p>
             <w:r>
-              <w:rPr>
-                <w:sz w:val="17"/>
-              </w:rPr>
-              <w:t xml:space="preserve">R24–R25 </w:t>
-            </w:r>
-            <w:proofErr w:type="spellStart"/>
-            <w:r>
-              <w:rPr>
-                <w:sz w:val="17"/>
-              </w:rPr>
-              <w:t>ผ่าน</w:t>
-            </w:r>
-            <w:proofErr w:type="spellEnd"/>
-            <w:r>
-              <w:rPr>
-                <w:sz w:val="17"/>
-              </w:rPr>
-              <w:t xml:space="preserve">; R25 </w:t>
-            </w:r>
-            <w:proofErr w:type="spellStart"/>
-            <w:r>
-              <w:rPr>
-                <w:sz w:val="17"/>
-              </w:rPr>
-              <w:t>สำเร็จด้วย</w:t>
-            </w:r>
-            <w:proofErr w:type="spellEnd"/>
-            <w:r>
-              <w:rPr>
-                <w:sz w:val="17"/>
-              </w:rPr>
-              <w:t xml:space="preserve"> A3TITLEBOXALL</w:t>
+              <w:t>R24–R25 ผ่าน; R25 สำเร็จด้วย A3TITLEBOXALL</w:t>
             </w:r>
           </w:p>
         </w:tc>
@@ -19110,10 +17772,6 @@
           </w:tcPr>
           <w:p>
             <w:r>
-              <w:rPr>
-                <w:rFonts w:cs="Noto Sans Thai"/>
-                <w:sz w:val="17"/>
-              </w:rPr>
               <w:t>Final Layout QA</w:t>
             </w:r>
           </w:p>
@@ -19131,9 +17789,6 @@
           </w:tcPr>
           <w:p>
             <w:r>
-              <w:rPr>
-                <w:sz w:val="17"/>
-              </w:rPr>
               <w:t>No</w:t>
             </w:r>
           </w:p>
@@ -19151,9 +17806,6 @@
           </w:tcPr>
           <w:p>
             <w:r>
-              <w:rPr>
-                <w:sz w:val="17"/>
-              </w:rPr>
               <w:t>No</w:t>
             </w:r>
           </w:p>
@@ -19171,9 +17823,6 @@
           </w:tcPr>
           <w:p>
             <w:r>
-              <w:rPr>
-                <w:sz w:val="17"/>
-              </w:rPr>
               <w:t>Yes</w:t>
             </w:r>
           </w:p>
@@ -19190,42 +17839,9 @@
             <w:vAlign w:val="center"/>
           </w:tcPr>
           <w:p>
-            <w:proofErr w:type="spellStart"/>
-            <w:r>
-              <w:rPr>
-                <w:sz w:val="17"/>
-              </w:rPr>
-              <w:t>กำหนดให้ตรวจทุก</w:t>
-            </w:r>
-            <w:proofErr w:type="spellEnd"/>
-            <w:r>
-              <w:rPr>
-                <w:sz w:val="17"/>
-              </w:rPr>
-              <w:t xml:space="preserve"> Layout </w:t>
-            </w:r>
-            <w:proofErr w:type="spellStart"/>
-            <w:r>
-              <w:rPr>
-                <w:sz w:val="17"/>
-              </w:rPr>
-              <w:t>ก่อน</w:t>
-            </w:r>
-            <w:proofErr w:type="spellEnd"/>
-            <w:r>
-              <w:rPr>
-                <w:sz w:val="17"/>
-              </w:rPr>
-              <w:t xml:space="preserve"> Plot </w:t>
-            </w:r>
-            <w:proofErr w:type="spellStart"/>
-            <w:r>
-              <w:rPr>
-                <w:sz w:val="17"/>
-              </w:rPr>
-              <w:t>โดยผู้ใช้งาน</w:t>
-            </w:r>
-            <w:proofErr w:type="spellEnd"/>
+            <w:r>
+              <w:t>กำหนดให้ตรวจทุก Layout ก่อน Plot โดยผู้ใช้งาน</w:t>
+            </w:r>
           </w:p>
         </w:tc>
       </w:tr>
@@ -19239,9 +17855,6 @@
           </w:tcPr>
           <w:p>
             <w:r>
-              <w:rPr>
-                <w:sz w:val="17"/>
-              </w:rPr>
               <w:t>Viewport / Safety</w:t>
             </w:r>
           </w:p>
@@ -19252,9 +17865,6 @@
           </w:tcPr>
           <w:p>
             <w:r>
-              <w:rPr>
-                <w:sz w:val="17"/>
-              </w:rPr>
               <w:t>Yes</w:t>
             </w:r>
           </w:p>
@@ -19265,9 +17875,6 @@
           </w:tcPr>
           <w:p>
             <w:r>
-              <w:rPr>
-                <w:sz w:val="17"/>
-              </w:rPr>
               <w:t>No</w:t>
             </w:r>
           </w:p>
@@ -19278,9 +17885,6 @@
           </w:tcPr>
           <w:p>
             <w:r>
-              <w:rPr>
-                <w:sz w:val="17"/>
-              </w:rPr>
               <w:t>No</w:t>
             </w:r>
           </w:p>
@@ -19291,33 +17895,8 @@
           </w:tcPr>
           <w:p>
             <w:r>
-              <w:rPr>
-                <w:sz w:val="17"/>
-              </w:rPr>
-              <w:t xml:space="preserve">R20–R23 </w:t>
-            </w:r>
-            <w:proofErr w:type="spellStart"/>
-            <w:r>
-              <w:rPr>
-                <w:sz w:val="17"/>
-              </w:rPr>
-              <w:t>และ</w:t>
-            </w:r>
-            <w:proofErr w:type="spellEnd"/>
-            <w:r>
-              <w:rPr>
-                <w:sz w:val="17"/>
-              </w:rPr>
-              <w:t xml:space="preserve"> R26–R27 </w:t>
-            </w:r>
-            <w:proofErr w:type="spellStart"/>
-            <w:r>
-              <w:rPr>
-                <w:sz w:val="17"/>
-              </w:rPr>
-              <w:t>ผ่านทุกกรณี</w:t>
-            </w:r>
-            <w:proofErr w:type="spellEnd"/>
+              <w:t>R20–R23 และ R26–R27 ผ่านทุกกรณี</w:t>
+            </w:r>
           </w:p>
         </w:tc>
       </w:tr>
@@ -19493,13 +18072,7 @@
             <w:vAlign w:val="center"/>
           </w:tcPr>
           <w:p>
-            <w:pPr>
-              <w:jc w:val="center"/>
-            </w:pPr>
-            <w:r>
-              <w:rPr>
-                <w:sz w:val="17"/>
-              </w:rPr>
+            <w:r>
               <w:t>Test</w:t>
             </w:r>
           </w:p>
@@ -19518,14 +18091,7 @@
             <w:vAlign w:val="center"/>
           </w:tcPr>
           <w:p>
-            <w:pPr>
-              <w:jc w:val="center"/>
-            </w:pPr>
-            <w:r>
-              <w:rPr>
-                <w:rFonts w:ascii="Arial" w:hAnsi="Arial"/>
-                <w:sz w:val="17"/>
-              </w:rPr>
+            <w:r>
               <w:t>Layouts</w:t>
             </w:r>
           </w:p>
@@ -19544,14 +18110,7 @@
             <w:vAlign w:val="center"/>
           </w:tcPr>
           <w:p>
-            <w:pPr>
-              <w:jc w:val="center"/>
-            </w:pPr>
-            <w:r>
-              <w:rPr>
-                <w:rFonts w:ascii="Arial" w:hAnsi="Arial"/>
-                <w:sz w:val="17"/>
-              </w:rPr>
+            <w:r>
               <w:t>Manual</w:t>
             </w:r>
           </w:p>
@@ -19570,14 +18129,7 @@
             <w:vAlign w:val="center"/>
           </w:tcPr>
           <w:p>
-            <w:pPr>
-              <w:jc w:val="center"/>
-            </w:pPr>
-            <w:r>
-              <w:rPr>
-                <w:rFonts w:ascii="Arial" w:hAnsi="Arial"/>
-                <w:sz w:val="17"/>
-              </w:rPr>
+            <w:r>
               <w:t>Auto</w:t>
             </w:r>
           </w:p>
@@ -19596,14 +18148,7 @@
             <w:vAlign w:val="center"/>
           </w:tcPr>
           <w:p>
-            <w:pPr>
-              <w:jc w:val="center"/>
-            </w:pPr>
-            <w:r>
-              <w:rPr>
-                <w:rFonts w:ascii="Arial" w:hAnsi="Arial"/>
-                <w:sz w:val="17"/>
-              </w:rPr>
+            <w:r>
               <w:t>Touch-up</w:t>
             </w:r>
           </w:p>
@@ -19622,18 +18167,9 @@
             <w:vAlign w:val="center"/>
           </w:tcPr>
           <w:p>
-            <w:pPr>
-              <w:jc w:val="center"/>
-            </w:pPr>
-            <w:proofErr w:type="spellStart"/>
-            <w:r>
-              <w:rPr>
-                <w:rFonts w:ascii="Arial" w:hAnsi="Arial"/>
-                <w:sz w:val="17"/>
-              </w:rPr>
+            <w:r>
               <w:t>Auto+Touch</w:t>
             </w:r>
-            <w:proofErr w:type="spellEnd"/>
           </w:p>
         </w:tc>
         <w:tc>
@@ -19650,14 +18186,7 @@
             <w:vAlign w:val="center"/>
           </w:tcPr>
           <w:p>
-            <w:pPr>
-              <w:jc w:val="center"/>
-            </w:pPr>
-            <w:r>
-              <w:rPr>
-                <w:rFonts w:ascii="Arial" w:hAnsi="Arial"/>
-                <w:sz w:val="17"/>
-              </w:rPr>
+            <w:r>
               <w:t>Reduce %</w:t>
             </w:r>
           </w:p>
@@ -19681,14 +18210,8 @@
             <w:vAlign w:val="center"/>
           </w:tcPr>
           <w:p>
-            <w:pPr>
-              <w:jc w:val="center"/>
-            </w:pPr>
-            <w:r>
-              <w:rPr>
-                <w:sz w:val="17"/>
-              </w:rPr>
-              <w:t>T01</w:t>
+            <w:r>
+              <w:t>T01 (Pilot)</w:t>
             </w:r>
           </w:p>
         </w:tc>
@@ -19705,14 +18228,7 @@
             <w:vAlign w:val="center"/>
           </w:tcPr>
           <w:p>
-            <w:pPr>
-              <w:jc w:val="center"/>
-            </w:pPr>
-            <w:r>
-              <w:rPr>
-                <w:rFonts w:ascii="Arial" w:hAnsi="Arial"/>
-                <w:sz w:val="17"/>
-              </w:rPr>
+            <w:r>
               <w:t>1</w:t>
             </w:r>
           </w:p>
@@ -19730,14 +18246,7 @@
             <w:vAlign w:val="center"/>
           </w:tcPr>
           <w:p>
-            <w:pPr>
-              <w:jc w:val="center"/>
-            </w:pPr>
-            <w:r>
-              <w:rPr>
-                <w:rFonts w:ascii="Arial" w:hAnsi="Arial"/>
-                <w:sz w:val="17"/>
-              </w:rPr>
+            <w:r>
               <w:t>02:05.42</w:t>
             </w:r>
           </w:p>
@@ -19755,14 +18264,7 @@
             <w:vAlign w:val="center"/>
           </w:tcPr>
           <w:p>
-            <w:pPr>
-              <w:jc w:val="center"/>
-            </w:pPr>
-            <w:r>
-              <w:rPr>
-                <w:rFonts w:ascii="Arial" w:hAnsi="Arial"/>
-                <w:sz w:val="17"/>
-              </w:rPr>
+            <w:r>
               <w:t>00:11.38</w:t>
             </w:r>
           </w:p>
@@ -19780,14 +18282,7 @@
             <w:vAlign w:val="center"/>
           </w:tcPr>
           <w:p>
-            <w:pPr>
-              <w:jc w:val="center"/>
-            </w:pPr>
-            <w:r>
-              <w:rPr>
-                <w:rFonts w:ascii="Arial" w:hAnsi="Arial"/>
-                <w:sz w:val="17"/>
-              </w:rPr>
+            <w:r>
               <w:t>00:43.08</w:t>
             </w:r>
           </w:p>
@@ -19805,14 +18300,7 @@
             <w:vAlign w:val="center"/>
           </w:tcPr>
           <w:p>
-            <w:pPr>
-              <w:jc w:val="center"/>
-            </w:pPr>
-            <w:r>
-              <w:rPr>
-                <w:rFonts w:ascii="Arial" w:hAnsi="Arial"/>
-                <w:sz w:val="17"/>
-              </w:rPr>
+            <w:r>
               <w:t>00:54.46</w:t>
             </w:r>
           </w:p>
@@ -19830,15 +18318,8 @@
             <w:vAlign w:val="center"/>
           </w:tcPr>
           <w:p>
-            <w:pPr>
-              <w:jc w:val="center"/>
-            </w:pPr>
-            <w:r>
-              <w:rPr>
-                <w:rFonts w:ascii="Arial" w:hAnsi="Arial"/>
-                <w:sz w:val="17"/>
-              </w:rPr>
-              <w:t>56.6</w:t>
+            <w:r>
+              <w:t>56.6*</w:t>
             </w:r>
           </w:p>
         </w:tc>
@@ -19861,13 +18342,7 @@
             <w:vAlign w:val="center"/>
           </w:tcPr>
           <w:p>
-            <w:pPr>
-              <w:jc w:val="center"/>
-            </w:pPr>
-            <w:r>
-              <w:rPr>
-                <w:sz w:val="17"/>
-              </w:rPr>
+            <w:r>
               <w:t>T02</w:t>
             </w:r>
           </w:p>
@@ -19885,14 +18360,7 @@
             <w:vAlign w:val="center"/>
           </w:tcPr>
           <w:p>
-            <w:pPr>
-              <w:jc w:val="center"/>
-            </w:pPr>
-            <w:r>
-              <w:rPr>
-                <w:rFonts w:ascii="Arial" w:hAnsi="Arial"/>
-                <w:sz w:val="17"/>
-              </w:rPr>
+            <w:r>
               <w:t>4</w:t>
             </w:r>
           </w:p>
@@ -19910,14 +18378,7 @@
             <w:vAlign w:val="center"/>
           </w:tcPr>
           <w:p>
-            <w:pPr>
-              <w:jc w:val="center"/>
-            </w:pPr>
-            <w:r>
-              <w:rPr>
-                <w:rFonts w:ascii="Arial" w:hAnsi="Arial"/>
-                <w:sz w:val="17"/>
-              </w:rPr>
+            <w:r>
               <w:t>09:11.24</w:t>
             </w:r>
           </w:p>
@@ -19935,14 +18396,7 @@
             <w:vAlign w:val="center"/>
           </w:tcPr>
           <w:p>
-            <w:pPr>
-              <w:jc w:val="center"/>
-            </w:pPr>
-            <w:r>
-              <w:rPr>
-                <w:rFonts w:ascii="Arial" w:hAnsi="Arial"/>
-                <w:sz w:val="17"/>
-              </w:rPr>
+            <w:r>
               <w:t>00:11.56</w:t>
             </w:r>
           </w:p>
@@ -19960,14 +18414,7 @@
             <w:vAlign w:val="center"/>
           </w:tcPr>
           <w:p>
-            <w:pPr>
-              <w:jc w:val="center"/>
-            </w:pPr>
-            <w:r>
-              <w:rPr>
-                <w:rFonts w:ascii="Arial" w:hAnsi="Arial"/>
-                <w:sz w:val="17"/>
-              </w:rPr>
+            <w:r>
               <w:t>04:48.34</w:t>
             </w:r>
           </w:p>
@@ -19985,14 +18432,7 @@
             <w:vAlign w:val="center"/>
           </w:tcPr>
           <w:p>
-            <w:pPr>
-              <w:jc w:val="center"/>
-            </w:pPr>
-            <w:r>
-              <w:rPr>
-                <w:rFonts w:ascii="Arial" w:hAnsi="Arial"/>
-                <w:sz w:val="17"/>
-              </w:rPr>
+            <w:r>
               <w:t>04:59.90</w:t>
             </w:r>
           </w:p>
@@ -20010,14 +18450,7 @@
             <w:vAlign w:val="center"/>
           </w:tcPr>
           <w:p>
-            <w:pPr>
-              <w:jc w:val="center"/>
-            </w:pPr>
-            <w:r>
-              <w:rPr>
-                <w:rFonts w:ascii="Arial" w:hAnsi="Arial"/>
-                <w:sz w:val="17"/>
-              </w:rPr>
+            <w:r>
               <w:t>45.6</w:t>
             </w:r>
           </w:p>
@@ -20041,13 +18474,7 @@
             <w:vAlign w:val="center"/>
           </w:tcPr>
           <w:p>
-            <w:pPr>
-              <w:jc w:val="center"/>
-            </w:pPr>
-            <w:r>
-              <w:rPr>
-                <w:sz w:val="17"/>
-              </w:rPr>
+            <w:r>
               <w:t>T03</w:t>
             </w:r>
           </w:p>
@@ -20065,14 +18492,7 @@
             <w:vAlign w:val="center"/>
           </w:tcPr>
           <w:p>
-            <w:pPr>
-              <w:jc w:val="center"/>
-            </w:pPr>
-            <w:r>
-              <w:rPr>
-                <w:rFonts w:ascii="Arial" w:hAnsi="Arial"/>
-                <w:sz w:val="17"/>
-              </w:rPr>
+            <w:r>
               <w:t>3</w:t>
             </w:r>
           </w:p>
@@ -20090,14 +18510,7 @@
             <w:vAlign w:val="center"/>
           </w:tcPr>
           <w:p>
-            <w:pPr>
-              <w:jc w:val="center"/>
-            </w:pPr>
-            <w:r>
-              <w:rPr>
-                <w:rFonts w:ascii="Arial" w:hAnsi="Arial"/>
-                <w:sz w:val="17"/>
-              </w:rPr>
+            <w:r>
               <w:t>06:21.30</w:t>
             </w:r>
           </w:p>
@@ -20115,14 +18528,7 @@
             <w:vAlign w:val="center"/>
           </w:tcPr>
           <w:p>
-            <w:pPr>
-              <w:jc w:val="center"/>
-            </w:pPr>
-            <w:r>
-              <w:rPr>
-                <w:rFonts w:ascii="Arial" w:hAnsi="Arial"/>
-                <w:sz w:val="17"/>
-              </w:rPr>
+            <w:r>
               <w:t>00:12.54</w:t>
             </w:r>
           </w:p>
@@ -20140,14 +18546,7 @@
             <w:vAlign w:val="center"/>
           </w:tcPr>
           <w:p>
-            <w:pPr>
-              <w:jc w:val="center"/>
-            </w:pPr>
-            <w:r>
-              <w:rPr>
-                <w:rFonts w:ascii="Arial" w:hAnsi="Arial"/>
-                <w:sz w:val="17"/>
-              </w:rPr>
+            <w:r>
               <w:t>04:01.52</w:t>
             </w:r>
           </w:p>
@@ -20165,14 +18564,7 @@
             <w:vAlign w:val="center"/>
           </w:tcPr>
           <w:p>
-            <w:pPr>
-              <w:jc w:val="center"/>
-            </w:pPr>
-            <w:r>
-              <w:rPr>
-                <w:rFonts w:ascii="Arial" w:hAnsi="Arial"/>
-                <w:sz w:val="17"/>
-              </w:rPr>
+            <w:r>
               <w:t>04:14.06</w:t>
             </w:r>
           </w:p>
@@ -20190,14 +18582,7 @@
             <w:vAlign w:val="center"/>
           </w:tcPr>
           <w:p>
-            <w:pPr>
-              <w:jc w:val="center"/>
-            </w:pPr>
-            <w:r>
-              <w:rPr>
-                <w:rFonts w:ascii="Arial" w:hAnsi="Arial"/>
-                <w:sz w:val="17"/>
-              </w:rPr>
+            <w:r>
               <w:t>33.4</w:t>
             </w:r>
           </w:p>
@@ -20221,13 +18606,7 @@
             <w:vAlign w:val="center"/>
           </w:tcPr>
           <w:p>
-            <w:pPr>
-              <w:jc w:val="center"/>
-            </w:pPr>
-            <w:r>
-              <w:rPr>
-                <w:sz w:val="17"/>
-              </w:rPr>
+            <w:r>
               <w:t>T04</w:t>
             </w:r>
           </w:p>
@@ -20245,14 +18624,7 @@
             <w:vAlign w:val="center"/>
           </w:tcPr>
           <w:p>
-            <w:pPr>
-              <w:jc w:val="center"/>
-            </w:pPr>
-            <w:r>
-              <w:rPr>
-                <w:rFonts w:ascii="Arial" w:hAnsi="Arial"/>
-                <w:sz w:val="17"/>
-              </w:rPr>
+            <w:r>
               <w:t>2</w:t>
             </w:r>
           </w:p>
@@ -20270,14 +18642,7 @@
             <w:vAlign w:val="center"/>
           </w:tcPr>
           <w:p>
-            <w:pPr>
-              <w:jc w:val="center"/>
-            </w:pPr>
-            <w:r>
-              <w:rPr>
-                <w:rFonts w:ascii="Arial" w:hAnsi="Arial"/>
-                <w:sz w:val="17"/>
-              </w:rPr>
+            <w:r>
               <w:t>04:29.30</w:t>
             </w:r>
           </w:p>
@@ -20295,14 +18660,7 @@
             <w:vAlign w:val="center"/>
           </w:tcPr>
           <w:p>
-            <w:pPr>
-              <w:jc w:val="center"/>
-            </w:pPr>
-            <w:r>
-              <w:rPr>
-                <w:rFonts w:ascii="Arial" w:hAnsi="Arial"/>
-                <w:sz w:val="17"/>
-              </w:rPr>
+            <w:r>
               <w:t>00:12.36</w:t>
             </w:r>
           </w:p>
@@ -20320,14 +18678,7 @@
             <w:vAlign w:val="center"/>
           </w:tcPr>
           <w:p>
-            <w:pPr>
-              <w:jc w:val="center"/>
-            </w:pPr>
-            <w:r>
-              <w:rPr>
-                <w:rFonts w:ascii="Arial" w:hAnsi="Arial"/>
-                <w:sz w:val="17"/>
-              </w:rPr>
+            <w:r>
               <w:t>01:48.54</w:t>
             </w:r>
           </w:p>
@@ -20345,14 +18696,7 @@
             <w:vAlign w:val="center"/>
           </w:tcPr>
           <w:p>
-            <w:pPr>
-              <w:jc w:val="center"/>
-            </w:pPr>
-            <w:r>
-              <w:rPr>
-                <w:rFonts w:ascii="Arial" w:hAnsi="Arial"/>
-                <w:sz w:val="17"/>
-              </w:rPr>
+            <w:r>
               <w:t>02:00.90</w:t>
             </w:r>
           </w:p>
@@ -20370,14 +18714,7 @@
             <w:vAlign w:val="center"/>
           </w:tcPr>
           <w:p>
-            <w:pPr>
-              <w:jc w:val="center"/>
-            </w:pPr>
-            <w:r>
-              <w:rPr>
-                <w:rFonts w:ascii="Arial" w:hAnsi="Arial"/>
-                <w:sz w:val="17"/>
-              </w:rPr>
+            <w:r>
               <w:t>55.1</w:t>
             </w:r>
           </w:p>
@@ -20401,13 +18738,7 @@
             <w:vAlign w:val="center"/>
           </w:tcPr>
           <w:p>
-            <w:pPr>
-              <w:jc w:val="center"/>
-            </w:pPr>
-            <w:r>
-              <w:rPr>
-                <w:sz w:val="17"/>
-              </w:rPr>
+            <w:r>
               <w:t>T05</w:t>
             </w:r>
           </w:p>
@@ -20425,14 +18756,7 @@
             <w:vAlign w:val="center"/>
           </w:tcPr>
           <w:p>
-            <w:pPr>
-              <w:jc w:val="center"/>
-            </w:pPr>
-            <w:r>
-              <w:rPr>
-                <w:rFonts w:ascii="Arial" w:hAnsi="Arial"/>
-                <w:sz w:val="17"/>
-              </w:rPr>
+            <w:r>
               <w:t>5</w:t>
             </w:r>
           </w:p>
@@ -20450,14 +18774,7 @@
             <w:vAlign w:val="center"/>
           </w:tcPr>
           <w:p>
-            <w:pPr>
-              <w:jc w:val="center"/>
-            </w:pPr>
-            <w:r>
-              <w:rPr>
-                <w:rFonts w:ascii="Arial" w:hAnsi="Arial"/>
-                <w:sz w:val="17"/>
-              </w:rPr>
+            <w:r>
               <w:t>07:04.26</w:t>
             </w:r>
           </w:p>
@@ -20475,14 +18792,7 @@
             <w:vAlign w:val="center"/>
           </w:tcPr>
           <w:p>
-            <w:pPr>
-              <w:jc w:val="center"/>
-            </w:pPr>
-            <w:r>
-              <w:rPr>
-                <w:rFonts w:ascii="Arial" w:hAnsi="Arial"/>
-                <w:sz w:val="17"/>
-              </w:rPr>
+            <w:r>
               <w:t>00:23.54</w:t>
             </w:r>
           </w:p>
@@ -20500,14 +18810,7 @@
             <w:vAlign w:val="center"/>
           </w:tcPr>
           <w:p>
-            <w:pPr>
-              <w:jc w:val="center"/>
-            </w:pPr>
-            <w:r>
-              <w:rPr>
-                <w:rFonts w:ascii="Arial" w:hAnsi="Arial"/>
-                <w:sz w:val="17"/>
-              </w:rPr>
+            <w:r>
               <w:t>03:18.94</w:t>
             </w:r>
           </w:p>
@@ -20525,14 +18828,7 @@
             <w:vAlign w:val="center"/>
           </w:tcPr>
           <w:p>
-            <w:pPr>
-              <w:jc w:val="center"/>
-            </w:pPr>
-            <w:r>
-              <w:rPr>
-                <w:rFonts w:ascii="Arial" w:hAnsi="Arial"/>
-                <w:sz w:val="17"/>
-              </w:rPr>
+            <w:r>
               <w:t>03:42.48</w:t>
             </w:r>
           </w:p>
@@ -20550,14 +18846,7 @@
             <w:vAlign w:val="center"/>
           </w:tcPr>
           <w:p>
-            <w:pPr>
-              <w:jc w:val="center"/>
-            </w:pPr>
-            <w:r>
-              <w:rPr>
-                <w:rFonts w:ascii="Arial" w:hAnsi="Arial"/>
-                <w:sz w:val="17"/>
-              </w:rPr>
+            <w:r>
               <w:t>47.6</w:t>
             </w:r>
           </w:p>
@@ -20573,18 +18862,9 @@
             <w:noWrap/>
           </w:tcPr>
           <w:p>
-            <w:pPr>
-              <w:jc w:val="center"/>
-            </w:pPr>
-            <w:proofErr w:type="spellStart"/>
-            <w:r>
-              <w:rPr>
-                <w:b/>
-                <w:sz w:val="17"/>
-              </w:rPr>
-              <w:t>รวม</w:t>
-            </w:r>
-            <w:proofErr w:type="spellEnd"/>
+            <w:r>
+              <w:t>Evaluation T02–T05</w:t>
+            </w:r>
           </w:p>
         </w:tc>
         <w:tc>
@@ -20593,16 +18873,8 @@
             <w:noWrap/>
           </w:tcPr>
           <w:p>
-            <w:pPr>
-              <w:jc w:val="center"/>
-            </w:pPr>
-            <w:r>
-              <w:rPr>
-                <w:rFonts w:ascii="Arial" w:hAnsi="Arial"/>
-                <w:b/>
-                <w:sz w:val="17"/>
-              </w:rPr>
-              <w:t>15</w:t>
+            <w:r>
+              <w:t>14</w:t>
             </w:r>
           </w:p>
         </w:tc>
@@ -20612,16 +18884,8 @@
             <w:noWrap/>
           </w:tcPr>
           <w:p>
-            <w:pPr>
-              <w:jc w:val="center"/>
-            </w:pPr>
-            <w:r>
-              <w:rPr>
-                <w:rFonts w:ascii="Arial" w:hAnsi="Arial"/>
-                <w:b/>
-                <w:sz w:val="17"/>
-              </w:rPr>
-              <w:t>29:11.52</w:t>
+            <w:r>
+              <w:t>27:06.10</w:t>
             </w:r>
           </w:p>
         </w:tc>
@@ -20631,16 +18895,8 @@
             <w:noWrap/>
           </w:tcPr>
           <w:p>
-            <w:pPr>
-              <w:jc w:val="center"/>
-            </w:pPr>
-            <w:r>
-              <w:rPr>
-                <w:rFonts w:ascii="Arial" w:hAnsi="Arial"/>
-                <w:b/>
-                <w:sz w:val="17"/>
-              </w:rPr>
-              <w:t>01:11.38</w:t>
+            <w:r>
+              <w:t>01:00.00</w:t>
             </w:r>
           </w:p>
         </w:tc>
@@ -20650,16 +18906,8 @@
             <w:noWrap/>
           </w:tcPr>
           <w:p>
-            <w:pPr>
-              <w:jc w:val="center"/>
-            </w:pPr>
-            <w:r>
-              <w:rPr>
-                <w:rFonts w:ascii="Arial" w:hAnsi="Arial"/>
-                <w:b/>
-                <w:sz w:val="17"/>
-              </w:rPr>
-              <w:t>14:40.42</w:t>
+            <w:r>
+              <w:t>13:57.34</w:t>
             </w:r>
           </w:p>
         </w:tc>
@@ -20669,16 +18917,8 @@
             <w:noWrap/>
           </w:tcPr>
           <w:p>
-            <w:pPr>
-              <w:jc w:val="center"/>
-            </w:pPr>
-            <w:r>
-              <w:rPr>
-                <w:rFonts w:ascii="Arial" w:hAnsi="Arial"/>
-                <w:b/>
-                <w:sz w:val="17"/>
-              </w:rPr>
-              <w:t>15:51.80</w:t>
+            <w:r>
+              <w:t>14:57.34</w:t>
             </w:r>
           </w:p>
         </w:tc>
@@ -20688,16 +18928,8 @@
             <w:noWrap/>
           </w:tcPr>
           <w:p>
-            <w:pPr>
-              <w:jc w:val="center"/>
-            </w:pPr>
-            <w:r>
-              <w:rPr>
-                <w:rFonts w:ascii="Arial" w:hAnsi="Arial"/>
-                <w:b/>
-                <w:sz w:val="17"/>
-              </w:rPr>
-              <w:t>45.7</w:t>
+            <w:r>
+              <w:t>44.8</w:t>
             </w:r>
           </w:p>
         </w:tc>
@@ -20800,157 +19032,8 @@
         <w:ind w:firstLine="432"/>
         <w:jc w:val="left"/>
       </w:pPr>
-      <w:proofErr w:type="spellStart"/>
-      <w:r>
-        <w:t>เมื่อรวมทั้ง</w:t>
-      </w:r>
-      <w:proofErr w:type="spellEnd"/>
-      <w:r>
-        <w:t xml:space="preserve"> 5 </w:t>
-      </w:r>
-      <w:proofErr w:type="spellStart"/>
-      <w:r>
-        <w:t>กรณี</w:t>
-      </w:r>
-      <w:proofErr w:type="spellEnd"/>
-      <w:r>
-        <w:t xml:space="preserve"> </w:t>
-      </w:r>
-      <w:proofErr w:type="spellStart"/>
-      <w:r>
-        <w:t>จำนวน</w:t>
-      </w:r>
-      <w:proofErr w:type="spellEnd"/>
-      <w:r>
-        <w:t xml:space="preserve"> 15 Layout </w:t>
-      </w:r>
-      <w:proofErr w:type="spellStart"/>
-      <w:r>
-        <w:t>กระบวนการ</w:t>
-      </w:r>
-      <w:proofErr w:type="spellEnd"/>
-      <w:r>
-        <w:t xml:space="preserve"> Manual </w:t>
-      </w:r>
-      <w:proofErr w:type="spellStart"/>
-      <w:r>
-        <w:t>ใช้เวลารวม</w:t>
-      </w:r>
-      <w:proofErr w:type="spellEnd"/>
-      <w:r>
-        <w:t xml:space="preserve"> 29 </w:t>
-      </w:r>
-      <w:proofErr w:type="spellStart"/>
-      <w:r>
-        <w:t>นาที</w:t>
-      </w:r>
-      <w:proofErr w:type="spellEnd"/>
-      <w:r>
-        <w:t xml:space="preserve"> 11.52 </w:t>
-      </w:r>
-      <w:proofErr w:type="spellStart"/>
-      <w:r>
-        <w:t>วินาที</w:t>
-      </w:r>
-      <w:proofErr w:type="spellEnd"/>
-      <w:r>
-        <w:t xml:space="preserve"> </w:t>
-      </w:r>
-      <w:proofErr w:type="spellStart"/>
-      <w:r>
-        <w:t>ขณะที่</w:t>
-      </w:r>
-      <w:proofErr w:type="spellEnd"/>
-      <w:r>
-        <w:t xml:space="preserve"> Auto-assisted Workflow </w:t>
-      </w:r>
-      <w:proofErr w:type="spellStart"/>
-      <w:r>
-        <w:t>ใช้เวลารวม</w:t>
-      </w:r>
-      <w:proofErr w:type="spellEnd"/>
-      <w:r>
-        <w:t xml:space="preserve"> 15 </w:t>
-      </w:r>
-      <w:proofErr w:type="spellStart"/>
-      <w:r>
-        <w:t>นาที</w:t>
-      </w:r>
-      <w:proofErr w:type="spellEnd"/>
-      <w:r>
-        <w:t xml:space="preserve"> 51.80 </w:t>
-      </w:r>
-      <w:proofErr w:type="spellStart"/>
-      <w:r>
-        <w:t>วินาที</w:t>
-      </w:r>
-      <w:proofErr w:type="spellEnd"/>
-      <w:r>
-        <w:t xml:space="preserve"> </w:t>
-      </w:r>
-      <w:proofErr w:type="spellStart"/>
-      <w:r>
-        <w:t>คิดเป็นการลดเวลารวมแบบถ่วงตามงานประมาณ</w:t>
-      </w:r>
-      <w:proofErr w:type="spellEnd"/>
-      <w:r>
-        <w:t xml:space="preserve"> 45.7% </w:t>
-      </w:r>
-      <w:proofErr w:type="spellStart"/>
-      <w:r>
-        <w:t>หรือใช้เวลาประมาณ</w:t>
-      </w:r>
-      <w:proofErr w:type="spellEnd"/>
-      <w:r>
-        <w:t xml:space="preserve"> 1.84 </w:t>
-      </w:r>
-      <w:proofErr w:type="spellStart"/>
-      <w:r>
-        <w:t>เท่าเร็วกว่ากระบวนการ</w:t>
-      </w:r>
-      <w:proofErr w:type="spellEnd"/>
-      <w:r>
-        <w:t xml:space="preserve"> Manual </w:t>
-      </w:r>
-      <w:proofErr w:type="spellStart"/>
-      <w:r>
-        <w:t>โดยเวลาของคำสั่งอัตโนมัติรวมทั้งหมดมีเพียง</w:t>
-      </w:r>
-      <w:proofErr w:type="spellEnd"/>
-      <w:r>
-        <w:t xml:space="preserve"> 1 </w:t>
-      </w:r>
-      <w:proofErr w:type="spellStart"/>
-      <w:r>
-        <w:t>นาที</w:t>
-      </w:r>
-      <w:proofErr w:type="spellEnd"/>
-      <w:r>
-        <w:t xml:space="preserve"> 11.38 </w:t>
-      </w:r>
-      <w:proofErr w:type="spellStart"/>
-      <w:r>
-        <w:t>วินาที</w:t>
-      </w:r>
-      <w:proofErr w:type="spellEnd"/>
-      <w:r>
-        <w:t xml:space="preserve"> </w:t>
-      </w:r>
-      <w:proofErr w:type="spellStart"/>
-      <w:r>
-        <w:t>ส่วนเวลาที่เหลือส่วนใหญ่เป็น</w:t>
-      </w:r>
-      <w:proofErr w:type="spellEnd"/>
-      <w:r>
-        <w:t xml:space="preserve"> Manual Touch-up </w:t>
-      </w:r>
-      <w:proofErr w:type="spellStart"/>
-      <w:r>
-        <w:t>และ</w:t>
-      </w:r>
-      <w:proofErr w:type="spellEnd"/>
-      <w:r>
-        <w:t xml:space="preserve"> Final QA</w:t>
+      <w:r>
+        <w:t>T01 แสดงไว้เป็น Pilot เพื่อให้เห็นกระบวนการพัฒนา protocol แต่สถิติหลักคำนวณจากชุดประเมิน T02–T05 จำนวน 4 ไฟล์ รวม 14 Layout กระบวนการ Manual ใช้เวลารวม 27 นาที 6.10 วินาที ขณะที่ Auto-assisted Workflow ใช้เวลารวม 14 นาที 57.34 วินาที คิดเป็น pooled time reduction 44.8% และใช้เวลาประมาณ 55.2% ของ Manual Workflow การลดเวลาราย case อยู่ในช่วง 33.4–55.1% และมีค่ามัธยฐาน 46.6% เวลาของคำสั่งอัตโนมัติ T02–T05 รวม 1 นาทีพอดี ส่วนเวลาที่เหลือส่วนใหญ่เป็น Manual Touch-up และ Final QA.</w:t>
       </w:r>
     </w:p>
     <w:p>
@@ -21010,10 +19093,6 @@
           </w:tcPr>
           <w:p>
             <w:r>
-              <w:rPr>
-                <w:b/>
-                <w:sz w:val="19"/>
-              </w:rPr>
               <w:t>Requirement Group</w:t>
             </w:r>
           </w:p>
@@ -21025,21 +19104,8 @@
             <w:vAlign w:val="center"/>
           </w:tcPr>
           <w:p>
-            <w:proofErr w:type="spellStart"/>
-            <w:r>
-              <w:rPr>
-                <w:b/>
-                <w:sz w:val="19"/>
-              </w:rPr>
-              <w:t>ผลหลัง</w:t>
-            </w:r>
-            <w:proofErr w:type="spellEnd"/>
-            <w:r>
-              <w:rPr>
-                <w:b/>
-                <w:sz w:val="19"/>
-              </w:rPr>
-              <w:t xml:space="preserve"> Auto workflow</w:t>
+            <w:r>
+              <w:t>ผลหลัง Auto workflow (T02–T05)</w:t>
             </w:r>
           </w:p>
         </w:tc>
@@ -21050,21 +19116,8 @@
             <w:vAlign w:val="center"/>
           </w:tcPr>
           <w:p>
-            <w:proofErr w:type="spellStart"/>
-            <w:r>
-              <w:rPr>
-                <w:b/>
-                <w:sz w:val="19"/>
-              </w:rPr>
-              <w:t>ผลหลัง</w:t>
-            </w:r>
-            <w:proofErr w:type="spellEnd"/>
-            <w:r>
-              <w:rPr>
-                <w:b/>
-                <w:sz w:val="19"/>
-              </w:rPr>
-              <w:t xml:space="preserve"> Touch-up</w:t>
+            <w:r>
+              <w:t>ผลหลัง Touch-up</w:t>
             </w:r>
           </w:p>
         </w:tc>
@@ -21075,15 +19128,9 @@
             <w:vAlign w:val="center"/>
           </w:tcPr>
           <w:p>
-            <w:proofErr w:type="spellStart"/>
-            <w:r>
-              <w:rPr>
-                <w:b/>
-                <w:sz w:val="19"/>
-              </w:rPr>
+            <w:r>
               <w:t>ข้อสังเกต</w:t>
             </w:r>
-            <w:proofErr w:type="spellEnd"/>
           </w:p>
         </w:tc>
       </w:tr>
@@ -21098,9 +19145,6 @@
           </w:tcPr>
           <w:p>
             <w:r>
-              <w:rPr>
-                <w:sz w:val="19"/>
-              </w:rPr>
               <w:t>R01–R07</w:t>
             </w:r>
           </w:p>
@@ -21112,10 +19156,7 @@
           </w:tcPr>
           <w:p>
             <w:r>
-              <w:rPr>
-                <w:sz w:val="19"/>
-              </w:rPr>
-              <w:t>PASS 5/5</w:t>
+              <w:t>PASS 4/4</w:t>
             </w:r>
           </w:p>
         </w:tc>
@@ -21126,10 +19167,7 @@
           </w:tcPr>
           <w:p>
             <w:r>
-              <w:rPr>
-                <w:sz w:val="19"/>
-              </w:rPr>
-              <w:t>PASS 5/5</w:t>
+              <w:t>PASS 4/4</w:t>
             </w:r>
           </w:p>
         </w:tc>
@@ -21140,24 +19178,7 @@
           </w:tcPr>
           <w:p>
             <w:r>
-              <w:rPr>
-                <w:sz w:val="19"/>
-              </w:rPr>
-              <w:t xml:space="preserve">Font/Title/Code/Scale content </w:t>
-            </w:r>
-            <w:proofErr w:type="spellStart"/>
-            <w:r>
-              <w:rPr>
-                <w:sz w:val="19"/>
-              </w:rPr>
-              <w:t>ผ่านตาม</w:t>
-            </w:r>
-            <w:proofErr w:type="spellEnd"/>
-            <w:r>
-              <w:rPr>
-                <w:sz w:val="19"/>
-              </w:rPr>
-              <w:t xml:space="preserve"> Ground Truth</w:t>
+              <w:t>Font/Title/Code/Scale content ผ่านตาม Ground Truth</w:t>
             </w:r>
           </w:p>
         </w:tc>
@@ -21173,9 +19194,6 @@
           </w:tcPr>
           <w:p>
             <w:r>
-              <w:rPr>
-                <w:sz w:val="19"/>
-              </w:rPr>
               <w:t>R08 Scale Alignment</w:t>
             </w:r>
           </w:p>
@@ -21187,10 +19205,7 @@
           </w:tcPr>
           <w:p>
             <w:r>
-              <w:rPr>
-                <w:sz w:val="19"/>
-              </w:rPr>
-              <w:t>PARTIAL 5/5</w:t>
+              <w:t>PARTIAL 4/4</w:t>
             </w:r>
           </w:p>
         </w:tc>
@@ -21201,10 +19216,7 @@
           </w:tcPr>
           <w:p>
             <w:r>
-              <w:rPr>
-                <w:sz w:val="19"/>
-              </w:rPr>
-              <w:t>PASS 5/5</w:t>
+              <w:t>PASS 4/4</w:t>
             </w:r>
           </w:p>
         </w:tc>
@@ -21214,28 +19226,9 @@
             <w:vAlign w:val="center"/>
           </w:tcPr>
           <w:p>
-            <w:proofErr w:type="spellStart"/>
-            <w:r>
-              <w:rPr>
-                <w:sz w:val="19"/>
-              </w:rPr>
-              <w:t>ต้องเลื่อนข้อความ</w:t>
-            </w:r>
-            <w:proofErr w:type="spellEnd"/>
-            <w:r>
-              <w:rPr>
-                <w:sz w:val="19"/>
-              </w:rPr>
-              <w:t xml:space="preserve"> A3/A1 </w:t>
-            </w:r>
-            <w:proofErr w:type="spellStart"/>
-            <w:r>
-              <w:rPr>
-                <w:sz w:val="19"/>
-              </w:rPr>
-              <w:t>ด้วยมือทุกกรณี</w:t>
-            </w:r>
-            <w:proofErr w:type="spellEnd"/>
+            <w:r>
+              <w:t>ต้องเลื่อนข้อความ A3/A1 ด้วยมือทุกกรณี</w:t>
+            </w:r>
           </w:p>
         </w:tc>
       </w:tr>
@@ -21250,9 +19243,6 @@
           </w:tcPr>
           <w:p>
             <w:r>
-              <w:rPr>
-                <w:sz w:val="19"/>
-              </w:rPr>
               <w:t>R09–R27</w:t>
             </w:r>
           </w:p>
@@ -21264,10 +19254,7 @@
           </w:tcPr>
           <w:p>
             <w:r>
-              <w:rPr>
-                <w:sz w:val="19"/>
-              </w:rPr>
-              <w:t>PASS 5/5</w:t>
+              <w:t>PASS 4/4</w:t>
             </w:r>
           </w:p>
         </w:tc>
@@ -21278,10 +19265,7 @@
           </w:tcPr>
           <w:p>
             <w:r>
-              <w:rPr>
-                <w:sz w:val="19"/>
-              </w:rPr>
-              <w:t>PASS 5/5</w:t>
+              <w:t>PASS 4/4</w:t>
             </w:r>
           </w:p>
         </w:tc>
@@ -21291,33 +19275,8 @@
             <w:vAlign w:val="center"/>
           </w:tcPr>
           <w:p>
-            <w:proofErr w:type="spellStart"/>
-            <w:r>
-              <w:rPr>
-                <w:sz w:val="19"/>
-              </w:rPr>
-              <w:t>รวม</w:t>
-            </w:r>
-            <w:proofErr w:type="spellEnd"/>
-            <w:r>
-              <w:rPr>
-                <w:sz w:val="19"/>
-              </w:rPr>
-              <w:t xml:space="preserve"> R25 </w:t>
-            </w:r>
-            <w:proofErr w:type="spellStart"/>
-            <w:r>
-              <w:rPr>
-                <w:sz w:val="19"/>
-              </w:rPr>
-              <w:t>ซึ่งสำเร็จหลัง</w:t>
-            </w:r>
-            <w:proofErr w:type="spellEnd"/>
-            <w:r>
-              <w:rPr>
-                <w:sz w:val="19"/>
-              </w:rPr>
-              <w:t xml:space="preserve"> A3TITLEBOXALL</w:t>
+            <w:r>
+              <w:t>รวม R25 ซึ่งสำเร็จหลัง A3TITLEBOXALL</w:t>
             </w:r>
           </w:p>
         </w:tc>
@@ -21333,10 +19292,7 @@
           </w:tcPr>
           <w:p>
             <w:r>
-              <w:rPr>
-                <w:sz w:val="19"/>
-              </w:rPr>
-              <w:t>Full-pass ratio</w:t>
+              <w:t>Full-compliance ratio</w:t>
             </w:r>
           </w:p>
         </w:tc>
@@ -21347,9 +19303,6 @@
           </w:tcPr>
           <w:p>
             <w:r>
-              <w:rPr>
-                <w:sz w:val="19"/>
-              </w:rPr>
               <w:t>26/27 = 96.3%</w:t>
             </w:r>
           </w:p>
@@ -21361,9 +19314,6 @@
           </w:tcPr>
           <w:p>
             <w:r>
-              <w:rPr>
-                <w:sz w:val="19"/>
-              </w:rPr>
               <w:t>27/27 = 100%</w:t>
             </w:r>
           </w:p>
@@ -21374,47 +19324,8 @@
             <w:vAlign w:val="center"/>
           </w:tcPr>
           <w:p>
-            <w:proofErr w:type="spellStart"/>
-            <w:r>
-              <w:rPr>
-                <w:sz w:val="19"/>
-              </w:rPr>
-              <w:t>คำนวณเมื่อ</w:t>
-            </w:r>
-            <w:proofErr w:type="spellEnd"/>
-            <w:r>
-              <w:rPr>
-                <w:sz w:val="19"/>
-              </w:rPr>
-              <w:t xml:space="preserve"> Requirement </w:t>
-            </w:r>
-            <w:proofErr w:type="spellStart"/>
-            <w:r>
-              <w:rPr>
-                <w:sz w:val="19"/>
-              </w:rPr>
-              <w:t>ทั้ง</w:t>
-            </w:r>
-            <w:proofErr w:type="spellEnd"/>
-            <w:r>
-              <w:rPr>
-                <w:sz w:val="19"/>
-              </w:rPr>
-              <w:t xml:space="preserve"> 27 </w:t>
-            </w:r>
-            <w:proofErr w:type="spellStart"/>
-            <w:r>
-              <w:rPr>
-                <w:sz w:val="19"/>
-              </w:rPr>
-              <w:t>ข้อ</w:t>
-            </w:r>
-            <w:proofErr w:type="spellEnd"/>
-            <w:r>
-              <w:rPr>
-                <w:sz w:val="19"/>
-              </w:rPr>
-              <w:t xml:space="preserve"> applicable</w:t>
+            <w:r>
+              <w:t>รายงานเป็น full compliance; R08 แยกเป็น PARTIAL</w:t>
             </w:r>
           </w:p>
         </w:tc>
@@ -21426,47 +19337,8 @@
         <w:spacing w:after="160"/>
         <w:jc w:val="center"/>
       </w:pPr>
-      <w:proofErr w:type="spellStart"/>
-      <w:r>
-        <w:rPr>
-          <w:sz w:val="22"/>
-        </w:rPr>
-        <w:t>ตาราง</w:t>
-      </w:r>
-      <w:proofErr w:type="spellEnd"/>
-      <w:r>
-        <w:rPr>
-          <w:sz w:val="22"/>
-        </w:rPr>
-        <w:t xml:space="preserve"> 4.3 </w:t>
-      </w:r>
-      <w:proofErr w:type="spellStart"/>
-      <w:r>
-        <w:rPr>
-          <w:sz w:val="22"/>
-        </w:rPr>
-        <w:t>ผล</w:t>
-      </w:r>
-      <w:proofErr w:type="spellEnd"/>
-      <w:r>
-        <w:rPr>
-          <w:sz w:val="22"/>
-        </w:rPr>
-        <w:t xml:space="preserve"> Standard Compliance </w:t>
-      </w:r>
-      <w:proofErr w:type="spellStart"/>
-      <w:r>
-        <w:rPr>
-          <w:sz w:val="22"/>
-        </w:rPr>
-        <w:t>ของชุดประเมิน</w:t>
-      </w:r>
-      <w:proofErr w:type="spellEnd"/>
-      <w:r>
-        <w:rPr>
-          <w:sz w:val="22"/>
-        </w:rPr>
-        <w:t xml:space="preserve"> T01–T05</w:t>
+      <w:r>
+        <w:t>ตาราง 4.3 ผล Full-compliance ของชุดประเมินหลัก T02–T05</w:t>
       </w:r>
     </w:p>
     <w:p>
@@ -21607,10 +19479,6 @@
           </w:tcPr>
           <w:p>
             <w:r>
-              <w:rPr>
-                <w:b/>
-                <w:sz w:val="19"/>
-              </w:rPr>
               <w:t>Test</w:t>
             </w:r>
           </w:p>
@@ -21623,10 +19491,6 @@
           </w:tcPr>
           <w:p>
             <w:r>
-              <w:rPr>
-                <w:b/>
-                <w:sz w:val="19"/>
-              </w:rPr>
               <w:t>Layouts</w:t>
             </w:r>
           </w:p>
@@ -21639,10 +19503,6 @@
           </w:tcPr>
           <w:p>
             <w:r>
-              <w:rPr>
-                <w:b/>
-                <w:sz w:val="19"/>
-              </w:rPr>
               <w:t>Touch-up Time</w:t>
             </w:r>
           </w:p>
@@ -21655,10 +19515,6 @@
           </w:tcPr>
           <w:p>
             <w:r>
-              <w:rPr>
-                <w:b/>
-                <w:sz w:val="19"/>
-              </w:rPr>
               <w:t>Residual Manual Work</w:t>
             </w:r>
           </w:p>
@@ -21671,10 +19527,6 @@
           </w:tcPr>
           <w:p>
             <w:r>
-              <w:rPr>
-                <w:b/>
-                <w:sz w:val="19"/>
-              </w:rPr>
               <w:t>Final Status</w:t>
             </w:r>
           </w:p>
@@ -21691,10 +19543,7 @@
           </w:tcPr>
           <w:p>
             <w:r>
-              <w:rPr>
-                <w:sz w:val="19"/>
-              </w:rPr>
-              <w:t>T01</w:t>
+              <w:t>T01 (Pilot)</w:t>
             </w:r>
           </w:p>
         </w:tc>
@@ -21705,9 +19554,6 @@
           </w:tcPr>
           <w:p>
             <w:r>
-              <w:rPr>
-                <w:sz w:val="19"/>
-              </w:rPr>
               <w:t>1</w:t>
             </w:r>
           </w:p>
@@ -21719,9 +19565,6 @@
           </w:tcPr>
           <w:p>
             <w:r>
-              <w:rPr>
-                <w:sz w:val="19"/>
-              </w:rPr>
               <w:t>00:43.08</w:t>
             </w:r>
           </w:p>
@@ -21732,19 +19575,8 @@
             <w:vAlign w:val="center"/>
           </w:tcPr>
           <w:p>
-            <w:proofErr w:type="spellStart"/>
-            <w:r>
-              <w:rPr>
-                <w:sz w:val="19"/>
-              </w:rPr>
-              <w:t>จัดตำแหน่ง</w:t>
-            </w:r>
-            <w:proofErr w:type="spellEnd"/>
-            <w:r>
-              <w:rPr>
-                <w:sz w:val="19"/>
-              </w:rPr>
-              <w:t xml:space="preserve"> Scale A3/A1 + Final visual QA</w:t>
+            <w:r>
+              <w:t>จัดตำแหน่ง Scale A3/A1 + Final visual QA</w:t>
             </w:r>
           </w:p>
         </w:tc>
@@ -21755,9 +19587,6 @@
           </w:tcPr>
           <w:p>
             <w:r>
-              <w:rPr>
-                <w:sz w:val="19"/>
-              </w:rPr>
               <w:t>Ready to Plot</w:t>
             </w:r>
           </w:p>
@@ -21774,9 +19603,6 @@
           </w:tcPr>
           <w:p>
             <w:r>
-              <w:rPr>
-                <w:sz w:val="19"/>
-              </w:rPr>
               <w:t>T02</w:t>
             </w:r>
           </w:p>
@@ -21788,9 +19614,6 @@
           </w:tcPr>
           <w:p>
             <w:r>
-              <w:rPr>
-                <w:sz w:val="19"/>
-              </w:rPr>
               <w:t>4</w:t>
             </w:r>
           </w:p>
@@ -21802,9 +19625,6 @@
           </w:tcPr>
           <w:p>
             <w:r>
-              <w:rPr>
-                <w:sz w:val="19"/>
-              </w:rPr>
               <w:t>04:48.34</w:t>
             </w:r>
           </w:p>
@@ -21815,33 +19635,8 @@
             <w:vAlign w:val="center"/>
           </w:tcPr>
           <w:p>
-            <w:proofErr w:type="spellStart"/>
-            <w:r>
-              <w:rPr>
-                <w:sz w:val="19"/>
-              </w:rPr>
-              <w:t>จัดตำแหน่ง</w:t>
-            </w:r>
-            <w:proofErr w:type="spellEnd"/>
-            <w:r>
-              <w:rPr>
-                <w:sz w:val="19"/>
-              </w:rPr>
-              <w:t xml:space="preserve"> Scale A3/A1 </w:t>
-            </w:r>
-            <w:proofErr w:type="spellStart"/>
-            <w:r>
-              <w:rPr>
-                <w:sz w:val="19"/>
-              </w:rPr>
-              <w:t>ในหลาย</w:t>
-            </w:r>
-            <w:proofErr w:type="spellEnd"/>
-            <w:r>
-              <w:rPr>
-                <w:sz w:val="19"/>
-              </w:rPr>
-              <w:t xml:space="preserve"> Layout + Final visual QA</w:t>
+            <w:r>
+              <w:t>จัดตำแหน่ง Scale A3/A1 ในหลาย Layout + Final visual QA</w:t>
             </w:r>
           </w:p>
         </w:tc>
@@ -21852,9 +19647,6 @@
           </w:tcPr>
           <w:p>
             <w:r>
-              <w:rPr>
-                <w:sz w:val="19"/>
-              </w:rPr>
               <w:t>Ready to Plot</w:t>
             </w:r>
           </w:p>
@@ -21871,9 +19663,6 @@
           </w:tcPr>
           <w:p>
             <w:r>
-              <w:rPr>
-                <w:sz w:val="19"/>
-              </w:rPr>
               <w:t>T03</w:t>
             </w:r>
           </w:p>
@@ -21885,9 +19674,6 @@
           </w:tcPr>
           <w:p>
             <w:r>
-              <w:rPr>
-                <w:sz w:val="19"/>
-              </w:rPr>
               <w:t>3</w:t>
             </w:r>
           </w:p>
@@ -21899,9 +19685,6 @@
           </w:tcPr>
           <w:p>
             <w:r>
-              <w:rPr>
-                <w:sz w:val="19"/>
-              </w:rPr>
               <w:t>04:01.52</w:t>
             </w:r>
           </w:p>
@@ -21912,19 +19695,8 @@
             <w:vAlign w:val="center"/>
           </w:tcPr>
           <w:p>
-            <w:proofErr w:type="spellStart"/>
-            <w:r>
-              <w:rPr>
-                <w:sz w:val="19"/>
-              </w:rPr>
-              <w:t>จัดตำแหน่ง</w:t>
-            </w:r>
-            <w:proofErr w:type="spellEnd"/>
-            <w:r>
-              <w:rPr>
-                <w:sz w:val="19"/>
-              </w:rPr>
-              <w:t xml:space="preserve"> Scale A3/A1 + Final visual QA</w:t>
+            <w:r>
+              <w:t>จัดตำแหน่ง Scale A3/A1 + Final visual QA</w:t>
             </w:r>
           </w:p>
         </w:tc>
@@ -21935,9 +19707,6 @@
           </w:tcPr>
           <w:p>
             <w:r>
-              <w:rPr>
-                <w:sz w:val="19"/>
-              </w:rPr>
               <w:t>Ready to Plot</w:t>
             </w:r>
           </w:p>
@@ -21954,9 +19723,6 @@
           </w:tcPr>
           <w:p>
             <w:r>
-              <w:rPr>
-                <w:sz w:val="19"/>
-              </w:rPr>
               <w:t>T04</w:t>
             </w:r>
           </w:p>
@@ -21968,9 +19734,6 @@
           </w:tcPr>
           <w:p>
             <w:r>
-              <w:rPr>
-                <w:sz w:val="19"/>
-              </w:rPr>
               <w:t>2</w:t>
             </w:r>
           </w:p>
@@ -21982,9 +19745,6 @@
           </w:tcPr>
           <w:p>
             <w:r>
-              <w:rPr>
-                <w:sz w:val="19"/>
-              </w:rPr>
               <w:t>01:48.54</w:t>
             </w:r>
           </w:p>
@@ -21995,19 +19755,8 @@
             <w:vAlign w:val="center"/>
           </w:tcPr>
           <w:p>
-            <w:proofErr w:type="spellStart"/>
-            <w:r>
-              <w:rPr>
-                <w:sz w:val="19"/>
-              </w:rPr>
-              <w:t>จัดตำแหน่ง</w:t>
-            </w:r>
-            <w:proofErr w:type="spellEnd"/>
-            <w:r>
-              <w:rPr>
-                <w:sz w:val="19"/>
-              </w:rPr>
-              <w:t xml:space="preserve"> Scale A3/A1 + Final visual QA</w:t>
+            <w:r>
+              <w:t>จัดตำแหน่ง Scale A3/A1 + Final visual QA</w:t>
             </w:r>
           </w:p>
         </w:tc>
@@ -22018,9 +19767,6 @@
           </w:tcPr>
           <w:p>
             <w:r>
-              <w:rPr>
-                <w:sz w:val="19"/>
-              </w:rPr>
               <w:t>Ready to Plot</w:t>
             </w:r>
           </w:p>
@@ -22037,9 +19783,6 @@
           </w:tcPr>
           <w:p>
             <w:r>
-              <w:rPr>
-                <w:sz w:val="19"/>
-              </w:rPr>
               <w:t>T05</w:t>
             </w:r>
           </w:p>
@@ -22051,9 +19794,6 @@
           </w:tcPr>
           <w:p>
             <w:r>
-              <w:rPr>
-                <w:sz w:val="19"/>
-              </w:rPr>
               <w:t>5</w:t>
             </w:r>
           </w:p>
@@ -22065,9 +19805,6 @@
           </w:tcPr>
           <w:p>
             <w:r>
-              <w:rPr>
-                <w:sz w:val="19"/>
-              </w:rPr>
               <w:t>03:18.94</w:t>
             </w:r>
           </w:p>
@@ -22078,33 +19815,8 @@
             <w:vAlign w:val="center"/>
           </w:tcPr>
           <w:p>
-            <w:proofErr w:type="spellStart"/>
-            <w:r>
-              <w:rPr>
-                <w:sz w:val="19"/>
-              </w:rPr>
-              <w:t>จัดตำแหน่ง</w:t>
-            </w:r>
-            <w:proofErr w:type="spellEnd"/>
-            <w:r>
-              <w:rPr>
-                <w:sz w:val="19"/>
-              </w:rPr>
-              <w:t xml:space="preserve"> Scale A3/A1 </w:t>
-            </w:r>
-            <w:proofErr w:type="spellStart"/>
-            <w:r>
-              <w:rPr>
-                <w:sz w:val="19"/>
-              </w:rPr>
-              <w:t>ในหลาย</w:t>
-            </w:r>
-            <w:proofErr w:type="spellEnd"/>
-            <w:r>
-              <w:rPr>
-                <w:sz w:val="19"/>
-              </w:rPr>
-              <w:t xml:space="preserve"> Layout + Final visual QA</w:t>
+            <w:r>
+              <w:t>จัดตำแหน่ง Scale A3/A1 ในหลาย Layout + Final visual QA</w:t>
             </w:r>
           </w:p>
         </w:tc>
@@ -22115,9 +19827,6 @@
           </w:tcPr>
           <w:p>
             <w:r>
-              <w:rPr>
-                <w:sz w:val="19"/>
-              </w:rPr>
               <w:t>Ready to Plot</w:t>
             </w:r>
           </w:p>
@@ -22158,39 +19867,7 @@
         <w:spacing w:after="120"/>
       </w:pPr>
       <w:r>
-        <w:t xml:space="preserve">Residual Manual Work </w:t>
-      </w:r>
-      <w:proofErr w:type="spellStart"/>
-      <w:r>
-        <w:t>ที่เกิดซ้ำในทุกกรณีคือการจัดตำแหน่งข้อความมาตราส่วน</w:t>
-      </w:r>
-      <w:proofErr w:type="spellEnd"/>
-      <w:r>
-        <w:t xml:space="preserve"> A3/A1 </w:t>
-      </w:r>
-      <w:proofErr w:type="spellStart"/>
-      <w:r>
-        <w:t>ตาม</w:t>
-      </w:r>
-      <w:proofErr w:type="spellEnd"/>
-      <w:r>
-        <w:t xml:space="preserve"> R08 </w:t>
-      </w:r>
-      <w:proofErr w:type="spellStart"/>
-      <w:r>
-        <w:t>และการตรวจด้วยสายตาก่อน</w:t>
-      </w:r>
-      <w:proofErr w:type="spellEnd"/>
-      <w:r>
-        <w:t xml:space="preserve"> Plot </w:t>
-      </w:r>
-      <w:proofErr w:type="spellStart"/>
-      <w:r>
-        <w:t>ไม่พบข้อกำหนดอื่นที่ต้องแก้ด้วยมืออย่างสม่ำเสมอใน</w:t>
-      </w:r>
-      <w:proofErr w:type="spellEnd"/>
-      <w:r>
-        <w:t xml:space="preserve"> T01–T05</w:t>
+        <w:t>Residual Manual Work ที่เกิดซ้ำในชุดประเมินหลัก T02–T05 คือการจัดตำแหน่งข้อความมาตราส่วน A3/A1 ตาม R08 และการตรวจด้วยสายตาก่อน Plot ไม่พบข้อกำหนดอื่นที่ต้องแก้ด้วยมืออย่างสม่ำเสมอในชุดประเมินหลัก โดย Pilot T01 พบรูปแบบเดียวกัน.</w:t>
       </w:r>
     </w:p>
     <w:p>
@@ -22228,191 +19905,16 @@
       <w:pPr>
         <w:spacing w:after="120"/>
       </w:pPr>
-      <w:proofErr w:type="spellStart"/>
-      <w:r>
-        <w:t>ไม่พบ</w:t>
-      </w:r>
-      <w:proofErr w:type="spellEnd"/>
-      <w:r>
-        <w:t xml:space="preserve"> Destructive Failure </w:t>
-      </w:r>
-      <w:proofErr w:type="spellStart"/>
-      <w:r>
-        <w:t>ในชุดประเมิน</w:t>
-      </w:r>
-      <w:proofErr w:type="spellEnd"/>
-      <w:r>
-        <w:t xml:space="preserve"> T01–T05 </w:t>
-      </w:r>
-      <w:proofErr w:type="spellStart"/>
-      <w:r>
-        <w:t>เช่น</w:t>
-      </w:r>
-      <w:proofErr w:type="spellEnd"/>
-      <w:r>
-        <w:t xml:space="preserve"> </w:t>
-      </w:r>
-      <w:proofErr w:type="spellStart"/>
-      <w:r>
-        <w:t>การลบกรอบแบบผิด</w:t>
-      </w:r>
-      <w:proofErr w:type="spellEnd"/>
-      <w:r>
-        <w:t xml:space="preserve"> </w:t>
-      </w:r>
-      <w:proofErr w:type="spellStart"/>
-      <w:r>
-        <w:t>การเปลี่ยน</w:t>
-      </w:r>
-      <w:proofErr w:type="spellEnd"/>
-      <w:r>
-        <w:t xml:space="preserve"> Viewport Scale/View/Lock </w:t>
-      </w:r>
-      <w:proofErr w:type="spellStart"/>
-      <w:r>
-        <w:t>โดยไม่ตั้งใจ</w:t>
-      </w:r>
-      <w:proofErr w:type="spellEnd"/>
-      <w:r>
-        <w:t xml:space="preserve"> </w:t>
-      </w:r>
-      <w:proofErr w:type="spellStart"/>
-      <w:r>
-        <w:t>หรือ</w:t>
-      </w:r>
-      <w:proofErr w:type="spellEnd"/>
-      <w:r>
-        <w:t xml:space="preserve"> Plot Setting </w:t>
-      </w:r>
-      <w:proofErr w:type="spellStart"/>
-      <w:r>
-        <w:t>ผิดจาก</w:t>
-      </w:r>
-      <w:proofErr w:type="spellEnd"/>
-      <w:r>
-        <w:t xml:space="preserve"> Ground Truth </w:t>
-      </w:r>
-      <w:proofErr w:type="spellStart"/>
-      <w:r>
-        <w:t>ข้อจำกัดที่พบซ้ำคือ</w:t>
-      </w:r>
-      <w:proofErr w:type="spellEnd"/>
-      <w:r>
-        <w:t xml:space="preserve"> R08 Scale Alignment </w:t>
-      </w:r>
-      <w:proofErr w:type="spellStart"/>
-      <w:r>
-        <w:t>ซึ่งถูกจัดเป็น</w:t>
-      </w:r>
-      <w:proofErr w:type="spellEnd"/>
-      <w:r>
-        <w:t xml:space="preserve"> PARTIAL </w:t>
-      </w:r>
-      <w:proofErr w:type="spellStart"/>
-      <w:r>
-        <w:t>ไม่ใช่</w:t>
-      </w:r>
-      <w:proofErr w:type="spellEnd"/>
-      <w:r>
-        <w:t xml:space="preserve"> Failure </w:t>
-      </w:r>
-      <w:proofErr w:type="spellStart"/>
-      <w:r>
-        <w:t>ของค่า</w:t>
-      </w:r>
-      <w:proofErr w:type="spellEnd"/>
-      <w:r>
-        <w:t xml:space="preserve"> Scale </w:t>
-      </w:r>
-      <w:proofErr w:type="spellStart"/>
-      <w:r>
-        <w:t>เนื่องจาก</w:t>
-      </w:r>
-      <w:proofErr w:type="spellEnd"/>
-      <w:r>
-        <w:t xml:space="preserve"> Scale content </w:t>
-      </w:r>
-      <w:proofErr w:type="spellStart"/>
-      <w:r>
-        <w:t>และรูปแบบ</w:t>
-      </w:r>
-      <w:proofErr w:type="spellEnd"/>
-      <w:r>
-        <w:t xml:space="preserve"> A3/A1 </w:t>
-      </w:r>
-      <w:proofErr w:type="spellStart"/>
-      <w:r>
-        <w:t>ถูกต้อง</w:t>
-      </w:r>
-      <w:proofErr w:type="spellEnd"/>
-      <w:r>
-        <w:t xml:space="preserve"> </w:t>
-      </w:r>
-      <w:proofErr w:type="spellStart"/>
-      <w:r>
-        <w:t>แต่ตำแหน่งข้อความต้องเลื่อนด้วยมือ</w:t>
-      </w:r>
-      <w:proofErr w:type="spellEnd"/>
+      <w:r>
+        <w:t>ไม่พบ Destructive Failure ในชุดประเมินหลัก T02–T05 เช่น การลบกรอบแบบผิด การเปลี่ยน Viewport Scale/View/Lock โดยไม่ตั้งใจ หรือ Plot Setting ผิดจาก Ground Truth ข้อจำกัดที่พบซ้ำคือ R08 Scale Alignment ซึ่งถูกจัดเป็น PARTIAL ไม่ใช่ Failure ของค่า Scale เนื่องจาก Scale content และรูปแบบ A3/A1 ถูกต้อง แต่ตำแหน่งข้อความต้องเลื่อนด้วยมือ.</w:t>
+      </w:r>
     </w:p>
     <w:p>
       <w:pPr>
         <w:spacing w:after="120"/>
       </w:pPr>
-      <w:proofErr w:type="spellStart"/>
-      <w:r>
-        <w:t>นอกจากนี้</w:t>
-      </w:r>
-      <w:proofErr w:type="spellEnd"/>
-      <w:r>
-        <w:t xml:space="preserve"> </w:t>
-      </w:r>
-      <w:proofErr w:type="spellStart"/>
-      <w:r>
-        <w:t>การลบ</w:t>
-      </w:r>
-      <w:proofErr w:type="spellEnd"/>
-      <w:r>
-        <w:t xml:space="preserve"> Source/Workspace Path (R25) </w:t>
-      </w:r>
-      <w:proofErr w:type="spellStart"/>
-      <w:r>
-        <w:t>จะผ่านเมื่อใช้</w:t>
-      </w:r>
-      <w:proofErr w:type="spellEnd"/>
-      <w:r>
-        <w:t xml:space="preserve"> Workflow </w:t>
-      </w:r>
-      <w:proofErr w:type="spellStart"/>
-      <w:r>
-        <w:t>ตามลำดับ</w:t>
-      </w:r>
-      <w:proofErr w:type="spellEnd"/>
-      <w:r>
-        <w:t xml:space="preserve"> AUTOSHEET → A3TITLEBOXALL </w:t>
-      </w:r>
-      <w:proofErr w:type="spellStart"/>
-      <w:r>
-        <w:t>เท่านั้น</w:t>
-      </w:r>
-      <w:proofErr w:type="spellEnd"/>
-      <w:r>
-        <w:t xml:space="preserve"> </w:t>
-      </w:r>
-      <w:proofErr w:type="spellStart"/>
-      <w:r>
-        <w:t>จึงกำหนดลำดับดังกล่าวเป็นส่วนหนึ่งของ</w:t>
-      </w:r>
-      <w:proofErr w:type="spellEnd"/>
-      <w:r>
-        <w:t xml:space="preserve"> Evaluation Workflow </w:t>
-      </w:r>
-      <w:proofErr w:type="spellStart"/>
-      <w:r>
-        <w:t>และใช้เหมือนกันทุก</w:t>
-      </w:r>
-      <w:proofErr w:type="spellEnd"/>
-      <w:r>
-        <w:t xml:space="preserve"> Test Case</w:t>
+      <w:r>
+        <w:t>นอกจากนี้ การลบ Source/Workspace Path (R25) จะผ่านเมื่อใช้ Workflow ตามลำดับ AUTOSHEET → A3TITLEBOXALL เท่านั้น จึงกำหนดลำดับดังกล่าวเป็นส่วนหนึ่งของ Evaluation Workflow และใช้เหมือนกันใน T02–T05 หลังจาก Freeze ที่ Pilot T01.</w:t>
       </w:r>
     </w:p>
     <w:p>
@@ -22943,117 +20445,8 @@
         <w:ind w:firstLine="432"/>
         <w:jc w:val="left"/>
       </w:pPr>
-      <w:proofErr w:type="spellStart"/>
-      <w:r>
-        <w:t>การประเมิน</w:t>
-      </w:r>
-      <w:proofErr w:type="spellEnd"/>
-      <w:r>
-        <w:t xml:space="preserve"> T01–T05 </w:t>
-      </w:r>
-      <w:proofErr w:type="spellStart"/>
-      <w:r>
-        <w:t>ครอบคลุม</w:t>
-      </w:r>
-      <w:proofErr w:type="spellEnd"/>
-      <w:r>
-        <w:t xml:space="preserve"> 5 </w:t>
-      </w:r>
-      <w:proofErr w:type="spellStart"/>
-      <w:r>
-        <w:t>ไฟล์</w:t>
-      </w:r>
-      <w:proofErr w:type="spellEnd"/>
-      <w:r>
-        <w:t xml:space="preserve"> </w:t>
-      </w:r>
-      <w:proofErr w:type="spellStart"/>
-      <w:r>
-        <w:t>รวม</w:t>
-      </w:r>
-      <w:proofErr w:type="spellEnd"/>
-      <w:r>
-        <w:t xml:space="preserve"> 15 Layout </w:t>
-      </w:r>
-      <w:proofErr w:type="spellStart"/>
-      <w:r>
-        <w:t>กระบวนการ</w:t>
-      </w:r>
-      <w:proofErr w:type="spellEnd"/>
-      <w:r>
-        <w:t xml:space="preserve"> Manual </w:t>
-      </w:r>
-      <w:proofErr w:type="spellStart"/>
-      <w:r>
-        <w:t>ใช้เวลารวม</w:t>
-      </w:r>
-      <w:proofErr w:type="spellEnd"/>
-      <w:r>
-        <w:t xml:space="preserve"> 29:11.52 </w:t>
-      </w:r>
-      <w:proofErr w:type="spellStart"/>
-      <w:r>
-        <w:t>นาที</w:t>
-      </w:r>
-      <w:proofErr w:type="spellEnd"/>
-      <w:r>
-        <w:t xml:space="preserve"> </w:t>
-      </w:r>
-      <w:proofErr w:type="spellStart"/>
-      <w:r>
-        <w:t>ขณะที่</w:t>
-      </w:r>
-      <w:proofErr w:type="spellEnd"/>
-      <w:r>
-        <w:t xml:space="preserve"> Auto-assisted Workflow </w:t>
-      </w:r>
-      <w:proofErr w:type="spellStart"/>
-      <w:r>
-        <w:t>ซึ่งประกอบด้วย</w:t>
-      </w:r>
-      <w:proofErr w:type="spellEnd"/>
-      <w:r>
-        <w:t xml:space="preserve"> AUTOSHEET → A3TITLEBOXALL → Manual Touch-up/Final QA </w:t>
-      </w:r>
-      <w:proofErr w:type="spellStart"/>
-      <w:r>
-        <w:t>ใช้เวลารวม</w:t>
-      </w:r>
-      <w:proofErr w:type="spellEnd"/>
-      <w:r>
-        <w:t xml:space="preserve"> 15:51.80 </w:t>
-      </w:r>
-      <w:proofErr w:type="spellStart"/>
-      <w:r>
-        <w:t>นาที</w:t>
-      </w:r>
-      <w:proofErr w:type="spellEnd"/>
-      <w:r>
-        <w:t xml:space="preserve"> </w:t>
-      </w:r>
-      <w:proofErr w:type="spellStart"/>
-      <w:r>
-        <w:t>ลดเวลารวมได้ประมาณ</w:t>
-      </w:r>
-      <w:proofErr w:type="spellEnd"/>
-      <w:r>
-        <w:t xml:space="preserve"> 45.7% </w:t>
-      </w:r>
-      <w:proofErr w:type="spellStart"/>
-      <w:r>
-        <w:t>และทำงานเร็วขึ้นประมาณ</w:t>
-      </w:r>
-      <w:proofErr w:type="spellEnd"/>
-      <w:r>
-        <w:t xml:space="preserve"> 1.84 </w:t>
-      </w:r>
-      <w:proofErr w:type="spellStart"/>
-      <w:r>
-        <w:t>เท่าเมื่อพิจารณาเวลาจน</w:t>
-      </w:r>
-      <w:proofErr w:type="spellEnd"/>
-      <w:r>
-        <w:t xml:space="preserve"> Ready to Plot</w:t>
+      <w:r>
+        <w:t>เมื่อแยก T01 เป็น Pilot ชุดประเมินหลัก T02–T05 ครอบคลุม 4 ไฟล์ รวม 14 Layout กระบวนการ Manual ใช้เวลารวม 27:06.10 นาที ขณะที่ Auto-assisted Workflow ซึ่งประกอบด้วย AUTOSHEET → A3TITLEBOXALL → Manual Touch-up/Final QA ใช้เวลารวม 14:57.34 นาที ลดเวลารวมได้ประมาณ 44.8% ในชุดประเมินนี้ โดยค่าลดเวลาราย case มีมัธยฐาน 46.6% และช่วง 33.4–55.1%.</w:t>
       </w:r>
     </w:p>
     <w:p>
@@ -23207,39 +20600,32 @@
     <w:p>
       <w:pPr/>
       <w:r>
-        <w:t>โครงงานนี้มีวัตถุประสงค์เพื่อศึกษากระบวนการจัดเตรียมและตรวจสอบแบบวิศวกรรมก่อนการ Plot วิเคราะห์งานซ้ำที่สามารถทำ Automation พัฒนาต้นแบบ AUTOSHEET ด้วย AutoLISP และประเมินผลเมื่อเทียบกับกระบวนการ Manual. ผลการดำเนินงานสามารถสรุปตามวัตถุประสงค์ได้ดังนี้:</w:t>
+        <w:t>โครงงานนี้กำหนดวัตถุประสงค์ไว้ 4 ข้อ และผลการดำเนินงานสามารถสรุปตามวัตถุประสงค์ได้ดังนี้</w:t>
       </w:r>
     </w:p>
     <w:p>
       <w:pPr/>
       <w:r>
-        <w:t>1) จากการศึกษากระบวนการเดิมพบว่าการจัดเตรียม Drawing จำนวนมากต้องดำเนินการซ้ำในหลาย Layout ทั้งการแก้ Title Block, Drawing Code, Font, Scale, Paper, Plot Setting และการลบข้อมูลที่ไม่ต้องการ จึงเหมาะกับการวิเคราะห์ในรูป Requirement ที่สามารถตรวจสอบและดำเนินการซ้ำอย่างเป็นระบบ.</w:t>
+        <w:t>วัตถุประสงค์ข้อที่ 1 เพื่อศึกษากระบวนการจัดเตรียมและตรวจสอบแบบวิศวกรรมใน AutoCAD ก่อนการจัดพิมพ์หรือส่งมอบ ผลจากการศึกษากระบวนการทำงานจริงพบว่าการเตรียม Drawing ต้องตรวจองค์ประกอบหลายรายการในแต่ละ Layout ได้แก่ Title Block, Drawing Title, Drawing Code, Font, Scale, Paper, Plot Setting และข้อมูลที่ไม่ต้องการ กระบวนการเดิมมีงานซ้ำจำนวนมากโดยเฉพาะเมื่อไฟล์มีหลาย Layout ซึ่งนำไปสู่การกำหนด Manual Workflow และ Ground Truth สำหรับการประเมินในโครงงาน.</w:t>
       </w:r>
     </w:p>
     <w:p>
       <w:pPr/>
       <w:r>
-        <w:t>2) งานที่มี Target ชัดเจน เช่น Font, Text Height, Width Factor, Drawing Code, Paper, Plotter, CTB และ File Path สามารถกำหนดเป็น rule และดำเนินการอัตโนมัติได้ ส่วน Scale Alignment (R08) สามารถปรับเนื้อหาและรูปแบบได้แต่ยังต้อง Manual Touch-up ด้านตำแหน่ง.</w:t>
-      </w:r>
-    </w:p>
-    <w:p>
-      <w:pPr>
-        <w:jc w:val="left"/>
-      </w:pPr>
-      <w:r>
-        <w:t>3) AUTOSHEET ถูกพัฒนาจาก LISP เฉพาะงานไปสู่ workflow ที่ใช้ AUTOSHEET ตามด้วย A3TITLEBOXALL และ Auto-only QA ก่อน Manual Final QA. ระบบรุ่นประเมินผลสามารถทำ Requirement ได้เต็มรูปแบบ 26 จาก 27 ข้อในทุก Test Case และหลัง Touch-up สามารถทำให้ Drawing ผ่านทั้ง 27 ข้อและอยู่ในสถานะ Ready to Plot.</w:t>
-      </w:r>
-    </w:p>
-    <w:p>
-      <w:pPr>
-        <w:jc w:val="left"/>
-      </w:pPr>
-      <w:r>
-        <w:t>4) การประเมิน T01–T05 ครอบคลุม 5 DWG รวม 15 Layout. Manual ใช้เวลารวม 29 นาที 11.52 วินาที ขณะที่ Auto-assisted workflow ซึ่งรวมเวลา Automation และ Manual Touch-up ใช้ 15 นาที 51.80 วินาที คิดเป็นการลดเวลารวมประมาณ 45.7% ในชุดทดสอบนี้. ผลดังกล่าวแสดงว่าระบบสามารถลดภาระงานซ้ำได้ แม้ยังไม่สามารถแทนที่ Final Visual QA ได้ทั้งหมด.</w:t>
+        <w:t>วัตถุประสงค์ข้อที่ 2 เพื่อวิเคราะห์ขั้นตอนการทำงานซ้ำที่สามารถประยุกต์ใช้ระบบอัตโนมัติ ผลการวิเคราะห์แยกงานออกเป็นงานที่สามารถนิยามเป็นกฎได้ชัดเจน งานที่ automate ได้บางส่วน และงานที่ยังต้องอาศัยการพิจารณาของผู้ใช้ ข้อกำหนด R01–R27 ถูกใช้เป็น Requirement Master โดยพบว่ากฎด้าน property และ configuration เช่น Font, Text Height, Drawing Code, Paper และ Plot Setting เหมาะต่อการทำ automation มากกว่ากฎที่ขึ้นกับตำแหน่งเชิงเรขาคณิต.</w:t>
       </w:r>
     </w:p>
     <w:p>
       <w:pPr/>
+      <w:r>
+        <w:t>วัตถุประสงค์ข้อที่ 3 เพื่อพัฒนาต้นแบบ AUTOSHEET ด้วย AutoLISP สำหรับช่วยปรับมาตรฐานและตรวจสอบ Drawing ระบบถูกพัฒนาจาก LISP เฉพาะงานหลายรุ่นและปรับปรุงจากผลทดสอบจริงจนเป็น workflow ที่ใช้ AUTOSHEET ตามด้วย A3TITLEBOXALL จากนั้นจึงตรวจ Auto-only QA และ Manual Touch-up/Final QA หลัง Freeze workflow ไม่พบ destructive failure ในชุดประเมินหลัก T02–T05 และหลัง Manual Touch-up ทุก case อยู่ในสถานะ Ready to Plot.</w:t>
+      </w:r>
+    </w:p>
+    <w:p>
+      <w:pPr/>
+      <w:r>
+        <w:t>วัตถุประสงค์ข้อที่ 4 เพื่อประเมินประสิทธิภาพเมื่อเทียบกับกระบวนการ Manual หลังใช้ T01 เป็น Pilot และ Freeze protocol ชุดประเมินหลัก T02–T05 จำนวน 4 ไฟล์ รวม 14 Layout พบว่า Manual ใช้เวลารวม 27 นาที 6.10 วินาที ขณะที่ Auto-assisted Workflow ใช้เวลารวม 14 นาที 57.34 วินาที ลดเวลารวมประมาณ 44.8% ในชุดประเมินนี้ ด้าน Full-compliance ระบบผ่านข้อกำหนดเต็มรูปแบบ 26 จาก 27 ข้อหลัง automated workflow ในทุก case โดย R08 Scale Alignment เป็น PARTIAL และเมื่อทำ Manual Touch-up แล้วทุกกรณีผ่าน 27/27 applicable requirements และพร้อม Plot.</w:t>
+      </w:r>
     </w:p>
     <w:p>
       <w:pPr>
@@ -23252,31 +20638,26 @@
     <w:p>
       <w:pPr/>
       <w:r>
-        <w:t>ผลการทดลองแสดงให้เห็นว่าประสิทธิผลของ Automation ขึ้นอยู่กับลักษณะของ Requirement. R01–R07 และ R09–R27 ซึ่งส่วนใหญ่เป็น property-based หรือ condition-based rules สามารถตรวจและแก้ได้สม่ำเสมอในทั้ง 5 Test Cases ขณะที่ R08 เกิด Partial result ซ้ำในทุกกรณี. Pattern ดังกล่าวสอดคล้องกับแนวคิดของ Solihin and Eastman (2015) ที่ชี้ว่าความซับซ้อนของกฎและเงื่อนไขเชิงบริบทมีผลโดยตรงต่อความสามารถในการทำ automated rule checking.</w:t>
+        <w:t>ผลการทดลองแสดงให้เห็นว่าการแปลง Requirement ที่มีเงื่อนไขชัดเจนเป็นกฎของระบบสามารถช่วยให้การตรวจและปรับ Drawing มีความสม่ำเสมอมากขึ้น ผลนี้สอดคล้องกับแนวคิดของ Murakami et al. (1995) ที่ใช้ drafting rules สำหรับ computerized checking และสอดคล้องในเชิงแนวคิดกับกรอบ rule-based checking ของ Eastman et al. (2009) ซึ่งแยกกระบวนการเตรียมข้อมูล กฎ การประมวลผล และผลการตรวจออกเป็นขั้นตอน.</w:t>
       </w:r>
     </w:p>
     <w:p>
       <w:pPr/>
       <w:r>
-        <w:t>เมื่อพิจารณาด้านเวลา พบว่า runtime ของคำสั่งอัตโนมัติอยู่ในระดับวินาที แต่เวลา Auto-assisted ที่ใช้เป็น KPI หลักยังต้องรวม Manual Touch-up และ Final QA. การเลือกใช้เวลารวมจนถึง Ready to Plot ทำให้การเปรียบเทียบกับ Manual มีความเป็นธรรมมากกว่าการเปรียบเทียบ runtime ของ script เพียงอย่างเดียว. แนวทางนี้สอดคล้องกับแนวคิดของ Rica et al. (2020) ซึ่งเสนอให้ Automation ลดภาระของผู้ตรวจโดยไม่ตัด human validation ออกจากกระบวนการ.</w:t>
-      </w:r>
-    </w:p>
-    <w:p>
-      <w:pPr>
-        <w:jc w:val="left"/>
-      </w:pPr>
-      <w:r>
-        <w:t>ผลรวมลดเวลาประมาณ 45.7% ไม่ควรถูกตีความว่า AUTOSHEET จะลดเวลาได้เท่ากันกับ Drawing ทุกประเภท เนื่องจากแต่ละ Test Case มีจำนวน Layout และความซับซ้อนต่างกัน อย่างไรก็ตาม การที่ทุกกรณีสามารถลดเวลาจาก Manual และไปถึง Ready to Plot หลัง Touch-up แสดงให้เห็นศักยภาพของ workflow ในฐานะเครื่องมือช่วยเตรียมแบบ. ผลนี้สอดคล้องเชิงแนวคิดกับ Sofias et al. (2025) ที่แสดงให้เห็นประโยชน์ของ CAD/API automation ต่อ repetitive engineering tasks ใน workflow จริง.</w:t>
+        <w:t>R08 เกิดซ้ำในชุดประเมินหลัก T02–T05 ทั้ง 4/4 cases และพบรูปแบบเดียวกันใน Pilot T01 ช่วยให้เห็นความแตกต่างระหว่าง rule เชิง property กับ rule เชิง geometry อย่างชัดเจน Font, Text Height, Drawing Code และ Plot Setting สามารถกำหนด target value และตรวจสอบตรง ๆ ได้ ขณะที่ Scale Alignment ต้องพิจารณาความสัมพันธ์เชิงตำแหน่งของข้อความกับองค์ประกอบรอบข้าง จึงมีความซับซ้อนมากกว่า ประเด็นนี้สอดคล้องในเชิงแนวคิดกับ Solihin and Eastman (2015) ที่ชี้ว่ากฎสำหรับ automated checking มีระดับความซับซ้อนและ prerequisite แตกต่างกัน แม้งานดังกล่าวศึกษา BIM ไม่ใช่ 2D AutoCAD.</w:t>
       </w:r>
     </w:p>
     <w:p>
       <w:pPr/>
       <w:r>
-        <w:t>อีกประเด็นหนึ่งคือการรักษาความปลอดภัยของ Drawing. กรณี Full Sheet Frame ทำให้เห็นว่าการ automate โดยตั้งสมมติฐานกับ Block ทุกชนิดอาจก่อให้เกิด destructive edit ได้ จึงต้องมีขั้นตอน Scan, Diagnostic, Preserve และ Skip+Warn. ประเด็นนี้ทำให้ AUTOSHEET มีลักษณะเป็น assisted workflow มากกว่าระบบที่แก้ทุก Drawing โดยอัตโนมัติโดยไม่มีการตรวจสอบ.</w:t>
+        <w:t>ผลด้านเวลาควรพิจารณาจาก Auto-assisted Workflow ซึ่งรวม Manual Touch-up ไม่ใช่เฉพาะ runtime ของ LISP เพราะเป้าหมายเชิงปฏิบัติคือเวลาไปถึง Ready to Plot แนวคิดนี้สอดคล้องกับ Rica et al. (2020) ที่คงบทบาทของวิศวกรไว้ในขั้น human validation และมุ่งลด human effort ในส่วนที่ระบบอัตโนมัติสามารถช่วยได้ ในทำนองเดียวกัน AUTOSHEET ไม่ได้มีเป้าหมายแทนที่ผู้ปฏิบัติงาน แต่ลดงานซ้ำก่อน Final QA.</w:t>
       </w:r>
     </w:p>
     <w:p>
       <w:pPr/>
+      <w:r>
+        <w:t>Sofias et al. (2025) แสดงการใช้ CAD API automation กับ recurrent engineering tasks ใน workflow จริงและประเมินผลด้วย case studies ซึ่งเป็นแนวทางที่ใกล้เคียงกับการประเมิน AUTOSHEET ในระดับวิธีวิจัย อย่างไรก็ตาม ผลเชิงตัวเลขของแต่ละงานไม่สามารถนำมาเปรียบเทียบตรง ๆ ได้ เนื่องจากโปรแกรม งาน และชุดข้อมูลแตกต่างกัน รายงานนี้จึงใช้ผล T02–T05 เป็นหลักฐานหลักของประสิทธิภาพ AUTOSHEET หลัง Freeze และใช้ T01 เป็น Pilot evidence ส่วนงานวิจัยภายนอกใช้สนับสนุนกรอบแนวคิดเท่านั้น.</w:t>
+      </w:r>
     </w:p>
     <w:p>
       <w:pPr>
@@ -23289,29 +20670,26 @@
     <w:p>
       <w:pPr/>
       <w:r>
-        <w:t>ข้อจำกัดของผลการศึกษาควรพิจารณาควบคู่กับตัวเลขประสิทธิภาพ. ชุดประเมินประกอบด้วย 5 DWG รวม 15 Layout ซึ่งเพียงพอสำหรับการประเมินต้นแบบในบริบทสหกิจ แต่ยังไม่ครอบคลุม Drawing profile ทุกชนิด. Drawing ที่ใช้ทดสอบมาจากลักษณะงานที่ใกล้เคียงกัน จึงไม่ควรสรุปผลแทน Drawing ในทุกโครงการหรือทุกสาขาวิศวกรรม.</w:t>
+        <w:t>การประเมินของโครงงานมีข้อจำกัดที่ต้องคำนึงถึงในการตีความผล ประการแรก T01 เป็น Pilot และไม่รวมในสถิติหลัก ส่วนชุดประเมินหลักประกอบด้วย T02–T05 จำนวน 4 ไฟล์ รวม 14 Layout ซึ่งเหมาะสำหรับ case-study evaluation ของต้นแบบ แต่ยังไม่ครอบคลุม Drawing profile ทุกประเภท การเลือกตัวอย่างเป็น purposive sampling จากบริบทงานที่เกี่ยวข้องกัน จึงไม่ควรสรุปว่าอัตราการลดเวลา 44.8% จะเกิดขึ้นกับ Drawing ทุกชนิดหรือเป็นตัวแทนของ DWG ทั้งหมดในองค์กร.</w:t>
       </w:r>
     </w:p>
     <w:p>
       <w:pPr/>
       <w:r>
-        <w:t>ผู้พัฒนาเป็นผู้ดำเนินการทดสอบและจับเวลาเอง และแต่ละ Test Case วัดเวลาเพียงหนึ่งรอบ จึงอาจมีผลจากความชำนาญของผู้ปฏิบัติงาน ความคุ้นเคยกับ Drawing และความคลาดเคลื่อนจากการจับเวลาด้วย Stopwatch. การศึกษาต่อควรใช้ผู้ทดสอบมากกว่าหนึ่งคนและทำ repeated trials เพื่อประเมินความแปรปรวนของเวลา.</w:t>
+        <w:t>ประการที่สอง ผู้พัฒนาระบบเป็นผู้ดำเนินการทดลอง Manual และ Auto-assisted Workflow เอง และใช้ลำดับ Manual ก่อน Auto-assisted ในแต่ละ case จึงมีโอกาสเกิด operator bias และ order/learning effect จากความคุ้นเคยกับ Drawing นอกจากนี้แต่ละ case วัดเวลาเพียงหนึ่งรอบหลักและไม่มี repeated measurement จึงไม่สามารถประมาณความแปรปรวนหรือทำ inferential statistical test ได้ ผลด้านเวลาจึงควรตีความเป็น descriptive case-study evidence ไม่ใช่ benchmark สากล.</w:t>
       </w:r>
     </w:p>
     <w:p>
       <w:pPr/>
       <w:r>
-        <w:t>ด้านความสามารถของระบบ R08 Scale Alignment ยังต้อง Manual Touch-up ในทุกกรณี แม้ค่ามาตราส่วนและรูปแบบตัวอักษรจะถูกต้อง. นอกจากนี้ workflow ที่ประเมินต้องใช้ลำดับ AUTOSHEET → A3TITLEBOXALL จึงยังไม่ใช่คำสั่งเดียวที่ครอบคลุมทุกขั้นตอน และระบบยังต้องพึ่งพา Final Visual QA ก่อน Plot.</w:t>
+        <w:t>ประการที่สาม ระบบยังต้องใช้ลำดับคำสั่ง AUTOSHEET → A3TITLEBOXALL เพื่อให้ Requirement R25 ผ่าน และ R08 Scale Alignment ยังต้อง Manual Touch-up ในทุก case ของชุดประเมินหลัก Final Visual QA จึงยังจำเป็นเพื่อป้องกันความผิดปกติที่ rule-based check อาจไม่ครอบคลุม ข้อจำกัดเหล่านี้สะท้อนว่า AUTOSHEET เป็นต้นแบบระบบสนับสนุนผู้ปฏิบัติงาน ไม่ใช่ระบบ Fully Autonomous.</w:t>
       </w:r>
     </w:p>
     <w:p>
       <w:pPr/>
       <w:r>
-        <w:t>มาตรฐานเฉพาะโครงการ เช่น Cordia SHX, Text Height 0.0015 และ SIPHYA_LT_R1.ctb ถูกกำหนดจาก Ground Truth ภายในโครงการ ไม่ใช่ข้อกำหนดสากล จึงต้องสร้าง profile หรือ configuration ใหม่หากนำระบบไปใช้กับโครงการที่มีมาตรฐานต่างออกไป.</w:t>
-      </w:r>
-    </w:p>
-    <w:p>
-      <w:pPr/>
+        <w:t>ประการที่สี่ การยืนยัน Ready to Plot และการตรวจ QA ในการทดลองนี้ดำเนินการโดยผู้พัฒนาระบบเอง ยังไม่มี independent reviewer ตรวจผลทุก case จึงควรเพิ่มการตรวจรับโดยพนักงานที่ปรึกษาหรือผู้ใช้งานอื่นในงานต่อเนื่อง. ด้านการนำเสนอข้อมูล รายงานฉบับนี้จำกัดการเปิดเผยรายละเอียด Drawing ตามข้อกำหนดด้านความลับของสถานประกอบการ ภาพตัวอย่างจึงถูกครอบตัดหรือปกปิดข้อมูลที่ไม่จำเป็นต่อการอธิบายผล ขณะที่หลักฐานเต็มถูกเก็บใน Evidence Pack ภายใน.</w:t>
+      </w:r>
     </w:p>
     <w:p>
       <w:pPr>
@@ -23322,27 +20700,22 @@
       </w:r>
     </w:p>
     <w:p>
-      <w:pPr>
-        <w:jc w:val="left"/>
-      </w:pPr>
-      <w:r>
-        <w:t>ประโยชน์ที่พิสูจน์ได้จากชุดทดสอบคือการลดเวลาการจัดเตรียม Drawing ก่อน Plot โดยยังคง Final QA ของผู้ปฏิบัติงานไว้. การลดเวลารวมประมาณ 45.7% ใน 15 Layout ช่วยลดภาระจากการแก้ property และ Plot Setting ซ้ำ ๆ และทำให้ผู้ปฏิบัติงานสามารถใช้เวลามากขึ้นกับการตรวจรายละเอียดที่ต้องอาศัย judgment.</w:t>
+      <w:pPr/>
+      <w:r>
+        <w:t>ประโยชน์ที่พิสูจน์ได้จากชุดประเมินหลัก T02–T05 คือการลดเวลาจนถึง Ready to Plot จาก 27:06.10 นาที เหลือ 14:57.34 นาที หรือประมาณ 44.8% โดยการคำนวณรวมเวลาของ AUTOSHEET, A3TITLEBOXALL และ Manual Touch-up แล้ว จึงสะท้อนเวลาที่ผู้ใช้ต้องใช้จริงมากกว่าการรายงานเฉพาะ runtime ของ automation. ค่าลดเวลาราย case มีมัธยฐาน 46.6% และช่วง 33.4–55.1%.</w:t>
       </w:r>
     </w:p>
     <w:p>
       <w:pPr/>
       <w:r>
-        <w:t>การกำหนด Requirement R01–R27 ยังช่วยเปลี่ยนความรู้ที่เดิมอาศัยประสบการณ์ของผู้ปฏิบัติงานให้เป็น checklist ที่ตรวจสอบได้ ทำให้การส่งต่องาน การตรวจย้อนกลับ และการพัฒนาระบบต่อมีโครงสร้างชัดเจนขึ้น. นอกจากนี้ Scan, Diagnostic และ Preserve/Skip+Warn ช่วยลดความเสี่ยงจากการแก้ไข Drawing ที่ไม่ตรงกับ profile ที่ระบบรู้จัก.</w:t>
+        <w:t>ด้านคุณภาพ กระบวนการอัตโนมัติทำให้ Requirement ที่เป็นกฎชัดเจนถูกตรวจและปรับอย่างสม่ำเสมอในชุดประเมินหลัก T02–T05 โดยผ่านเต็มรูปแบบ 26 จาก 27 ข้อก่อน touch-up ในทุก case และหลัง Final QA ทุกกรณีอยู่ในสถานะ Ready to Plot ประโยชน์สำคัญจึงไม่ใช่เพียงความเร็ว แต่รวมถึงการลดโอกาสที่ผู้ใช้จะข้ามขั้นตอนที่เกิดซ้ำ เช่น การตั้งค่า Plot หรือการปรับรูปแบบข้อมูลในหลาย Layout.</w:t>
       </w:r>
     </w:p>
     <w:p>
       <w:pPr/>
       <w:r>
-        <w:t>ในเชิงการพัฒนางานภายในองค์กร AUTOSHEET สามารถใช้เป็นต้นแบบสำหรับสร้างเครื่องมือ CAD automation อื่นที่ยึดหลัก Ground Truth → Rule → Apply → QA → Human Final Check แทนการ automate ทุกอย่างในครั้งเดียว.</w:t>
-      </w:r>
-    </w:p>
-    <w:p>
-      <w:pPr/>
+        <w:t>ในเชิงการทำงานของสถานประกอบการ AUTOSHEET ยังช่วยแยกงานออกเป็นส่วนที่ระบบทำได้อัตโนมัติและส่วนที่ต้องให้ผู้ใช้ใช้เวลาในการพิจารณา ส่งผลให้ผู้ปฏิบัติงานสามารถให้ความสำคัญกับ Final QA และจุดที่ต้องใช้ judgment มากกว่าการทำ operation เดิมซ้ำหลายครั้ง.</w:t>
+      </w:r>
     </w:p>
     <w:p>
       <w:pPr>
@@ -23355,29 +20728,26 @@
     <w:p>
       <w:pPr/>
       <w:r>
-        <w:t>แนวทางพัฒนาระยะถัดไปควรให้ความสำคัญกับ R08 โดยเปลี่ยนจากการจัดตำแหน่งด้วยกฎคงที่ไปสู่การอ้างอิง geometry ของ Title Block, bounding box, anchor point หรือ relative alignment เพื่อให้ระบบปรับตำแหน่ง A3/A1 ได้แม่นยำขึ้นใน Drawing ที่มี layout แตกต่างกัน.</w:t>
+        <w:t>แนวทางพัฒนาระยะถัดไปควรให้ความสำคัญกับ R08 Scale Alignment โดยพัฒนาการจัดวางข้อความจาก rule ที่อิงค่าคงที่ไปสู่การตรวจ geometry และ bounding box ของข้อความและองค์ประกอบรอบข้าง เพื่อรองรับกรณีที่ตำแหน่ง Title/Scale แตกต่างกันระหว่าง Drawing โดยควรคงกลไก preview หรือ diagnostic ก่อน destructive edit เพื่อรักษาความปลอดภัย.</w:t>
       </w:r>
     </w:p>
     <w:p>
       <w:pPr/>
       <w:r>
-        <w:t>ควรรวม AUTOSHEET และ A3TITLEBOXALL ให้เป็น workflow ที่เรียกใช้จาก command เดียวหรือ controller เดียว พร้อมบันทึก log ของแต่ละ Requirement ต่อ Layout เพื่อให้มีหลักฐาน runtime, PASS/PARTIAL/FAIL และรายการ Manual Touch-up โดยอัตโนมัติ.</w:t>
+        <w:t>ควรแยก Drawing profile และ Project Standard ออกจาก code หลักให้เป็น configuration ที่ปรับได้ เช่น Font, Text Height, Title Block profile, CTB, Paper และกฎที่ใช้กับแต่ละโครงการ วิธีนี้จะลดการ hard-code และทำให้ระบบนำไปใช้กับ Drawing variant อื่นได้ง่ายขึ้น.</w:t>
       </w:r>
     </w:p>
     <w:p>
       <w:pPr/>
       <w:r>
-        <w:t>ด้านการรองรับโครงการอื่น ควรแยกค่ามาตรฐานออกจาก code เป็น configurable profile เช่น Font, Height, Plotter, Paper, CTB, Scale format และ Title Block mapping เพื่อให้เปลี่ยนมาตรฐานโดยไม่ต้องแก้ source code. ระบบควรมี profile validation และ unknown-profile handling ที่ชัดเจน.</w:t>
+        <w:t>อีกแนวทางหนึ่งคือเพิ่ม audit trail และรายงานผลหลังรัน เช่น Requirement ใดผ่าน ไม่ผ่าน หรือถูกข้าม พร้อมเหตุผล และบันทึกเวลาหรือจำนวนรายการที่แก้ เพื่อให้ผู้ตรวจสอบสามารถย้อนดูผลการทำงานได้โดยไม่ต้องพึ่งความจำของผู้ใช้ นอกจากนี้อาจพัฒนาชุด regression test จาก Drawing ที่ได้รับอนุญาตให้ใช้ทดสอบ เพื่อป้องกันการแก้ code ในอนาคตแล้วกระทบ Requirement ที่เคยผ่าน.</w:t>
       </w:r>
     </w:p>
     <w:p>
       <w:pPr/>
       <w:r>
-        <w:t>ด้านการประเมิน ควรขยายจำนวน Drawing และความหลากหลายของ profile ใช้ผู้ทดสอบหลายคน ทำ repeated timing และรายงานค่าเฉลี่ย/ส่วนเบี่ยงเบนมาตรฐาน รวมถึงเก็บ operation count หรือ event log อัตโนมัติ. แนวทางดังกล่าวจะช่วยประเมินทั้งประสิทธิภาพ ความเสถียร และความสามารถในการขยายระบบได้ดีกว่าการใช้เวลาเพียงตัวเดียว.</w:t>
-      </w:r>
-    </w:p>
-    <w:p>
-      <w:pPr/>
+        <w:t>การพัฒนาในอนาคตควรเพิ่ม Evaluation Set ที่มีความหลากหลายทั้งจำนวน Layout, Title Block profile และประเภท Drawing รวมถึงทำ repeated timing, สลับลำดับการทดลองหรือใช้ผู้ทดสอบหลายคน และให้ independent reviewer เช่น พนักงานที่ปรึกษาตรวจสถานะ Ready to Plot เพื่อประเมินทั้ง repeatability, usability และ generalizability ของระบบได้ชัดเจนขึ้น.</w:t>
+      </w:r>
     </w:p>
     <w:p>
       <w:pPr>

</xml_diff>